<commit_message>
docs: streamline public PDF package
</commit_message>
<xml_diff>
--- a/docs/platform/PLATFORM_EXPLAINED_RU.docx
+++ b/docs/platform/PLATFORM_EXPLAINED_RU.docx
@@ -4,399 +4,662 @@
   <w:body>
     <w:p>
       <w:pPr>
+        <w:spacing w:after="60" w:line="283" w:lineRule="auto"/>
         <w:jc w:val="center"/>
       </w:pPr>
       <w:r>
         <w:rPr>
-          <w:rFonts w:ascii="DejaVu Sans" w:hAnsi="DejaVu Sans" w:eastAsia="DejaVu Sans"/>
+          <w:rFonts w:ascii="Arial" w:hAnsi="Arial" w:eastAsia="Arial"/>
           <w:b/>
-          <w:color w:val="00965A"/>
-          <w:sz w:val="48"/>
+          <w:i w:val="0"/>
+          <w:color w:val="087F5B"/>
+          <w:sz w:val="18"/>
         </w:rPr>
-        <w:t>AgriPartners</w:t>
+        <w:t>AGRIPARTNERS</w:t>
       </w:r>
     </w:p>
     <w:p>
       <w:pPr>
+        <w:spacing w:after="80" w:line="283" w:lineRule="auto"/>
         <w:jc w:val="center"/>
       </w:pPr>
       <w:r>
         <w:rPr>
-          <w:rFonts w:ascii="DejaVu Sans" w:hAnsi="DejaVu Sans" w:eastAsia="DejaVu Sans"/>
+          <w:rFonts w:ascii="Arial" w:hAnsi="Arial" w:eastAsia="Arial"/>
           <w:b/>
-          <w:sz w:val="32"/>
+          <w:i w:val="0"/>
+          <w:color w:val="17324D"/>
+          <w:sz w:val="50"/>
         </w:rPr>
-        <w:t>Концепция платформы, модель финансирования и выгоды для участников</w:t>
+        <w:t>Платформа AgriPartners — краткое объяснение</w:t>
       </w:r>
     </w:p>
     <w:p>
       <w:pPr>
+        <w:spacing w:after="280" w:line="283" w:lineRule="auto"/>
         <w:jc w:val="center"/>
       </w:pPr>
       <w:r>
         <w:rPr>
-          <w:rFonts w:ascii="DejaVu Sans" w:hAnsi="DejaVu Sans" w:eastAsia="DejaVu Sans"/>
-          <w:i/>
-          <w:sz w:val="22"/>
+          <w:rFonts w:ascii="Arial" w:hAnsi="Arial" w:eastAsia="Arial"/>
+          <w:b w:val="0"/>
+          <w:i w:val="0"/>
+          <w:color w:val="5E6B78"/>
+          <w:sz w:val="25"/>
         </w:rPr>
-        <w:t>Русская версия 2.0 с простыми пояснениями английских терминов</w:t>
+        <w:t>Alpha v1.2 · прозрачные процессы агроинвестирования · NEAR Testnet</w:t>
       </w:r>
     </w:p>
     <w:tbl>
       <w:tblPr>
         <w:tblW w:type="auto" w:w="0"/>
-        <w:jc w:val="center"/>
+        <w:jc w:val="left"/>
+        <w:tblLayout w:type="fixed"/>
         <w:tblLook w:firstColumn="1" w:firstRow="1" w:lastColumn="0" w:lastRow="0" w:noHBand="0" w:noVBand="1" w:val="04A0"/>
+        <w:tblW w:w="9360" w:type="dxa"/>
+        <w:tblInd w:w="120" w:type="dxa"/>
       </w:tblPr>
       <w:tblGrid>
-        <w:gridCol w:w="10224"/>
+        <w:gridCol w:w="9360"/>
       </w:tblGrid>
       <w:tr>
         <w:tc>
           <w:tcPr>
-            <w:tcW w:type="dxa" w:w="10224"/>
-            <w:shd w:fill="EAF4EF"/>
+            <w:tcW w:type="dxa" w:w="9360"/>
+            <w:tcW w:w="9360" w:type="dxa"/>
+            <w:vAlign w:val="center"/>
+            <w:shd w:fill="E8F5EF"/>
           </w:tcPr>
           <w:p>
+            <w:pPr>
+              <w:spacing w:after="0"/>
+            </w:pPr>
             <w:r>
               <w:rPr>
-                <w:rFonts w:ascii="DejaVu Sans" w:hAnsi="DejaVu Sans" w:eastAsia="DejaVu Sans"/>
+                <w:rFonts w:ascii="Arial" w:hAnsi="Arial" w:eastAsia="Arial"/>
                 <w:b/>
-                <w:color w:val="005A36"/>
-                <w:sz w:val="20"/>
+                <w:i w:val="0"/>
+                <w:color w:val="056246"/>
+                <w:sz w:val="19"/>
               </w:rPr>
-              <w:t>Как читать этот документ</w:t>
-              <w:br/>
-            </w:r>
-            <w:r>
-              <w:rPr>
-                <w:rFonts w:ascii="DejaVu Sans" w:hAnsi="DejaVu Sans" w:eastAsia="DejaVu Sans"/>
-                <w:sz w:val="18"/>
-              </w:rPr>
-              <w:t>Если рядом с английским термином указано пояснение в скобках, его нужно понимать как простое русское объяснение смысла. Например, Testnet - это тестовая сеть, где система проверяется без настоящих денег.</w:t>
+              <w:t>AgriPartners — Alpha-платформа для организации сельскохозяйственных проектов, подтверждений, отчётности и прозрачности для инвестора. Это презентация и Testnet-демонстрация, а не действующая инвестиционная платформа, кастодиальный сервис или система реальных расчётов.</w:t>
             </w:r>
           </w:p>
         </w:tc>
       </w:tr>
     </w:tbl>
-    <w:p/>
     <w:p>
       <w:pPr>
-        <w:pStyle w:val="Heading1"/>
+        <w:spacing w:after="40" w:line="283" w:lineRule="auto"/>
       </w:pPr>
       <w:r>
         <w:rPr>
-          <w:rFonts w:ascii="DejaVu Sans" w:hAnsi="DejaVu Sans" w:eastAsia="DejaVu Sans"/>
-          <w:color w:val="005F41"/>
+          <w:rFonts w:ascii="Arial" w:hAnsi="Arial" w:eastAsia="Arial"/>
+          <w:b w:val="0"/>
+          <w:i w:val="0"/>
+          <w:color w:val="17212B"/>
+          <w:sz w:val="2"/>
         </w:rPr>
-        <w:t>1. Краткое резюме</w:t>
-      </w:r>
-    </w:p>
-    <w:p>
-      <w:r>
-        <w:rPr>
-          <w:rFonts w:ascii="DejaVu Sans" w:hAnsi="DejaVu Sans" w:eastAsia="DejaVu Sans"/>
-          <w:sz w:val="20"/>
-        </w:rPr>
-        <w:t>AgriPartners - это платформа для прозрачного управления инвестиционными процессами в сельском хозяйстве. Слово Platform (платформа) здесь означает интернет-систему, через которую инвесторы, фермеры и администраторы видят сделки, отчеты, статусы и финансовую картину проекта.</w:t>
-      </w:r>
-    </w:p>
-    <w:p>
-      <w:r>
-        <w:rPr>
-          <w:rFonts w:ascii="DejaVu Sans" w:hAnsi="DejaVu Sans" w:eastAsia="DejaVu Sans"/>
-          <w:sz w:val="20"/>
-        </w:rPr>
-        <w:t>Главная идея AgriPartners не в том, чтобы просто «привлечь криптовалюту». Главная идея - создать понятный и проверяемый рабочий процесс: от выбора сельскохозяйственного проекта до отчетности фермера и возврата результата инвестору.</w:t>
-      </w:r>
-    </w:p>
-    <w:p>
-      <w:r>
-        <w:rPr>
-          <w:rFonts w:ascii="DejaVu Sans" w:hAnsi="DejaVu Sans" w:eastAsia="DejaVu Sans"/>
-          <w:sz w:val="20"/>
-        </w:rPr>
-        <w:t>На текущем этапе AgriPartners находится в Alpha (альфа-версии). Простыми словами, Alpha - это ранняя рабочая версия продукта, которую можно показывать партнерам, тестировать, улучшать и использовать для обратной связи, но не считать полностью готовой коммерческой системой.</w:t>
-      </w:r>
-    </w:p>
-    <w:p>
-      <w:r>
-        <w:rPr>
-          <w:rFonts w:ascii="DejaVu Sans" w:hAnsi="DejaVu Sans" w:eastAsia="DejaVu Sans"/>
-          <w:sz w:val="20"/>
-        </w:rPr>
-        <w:t>Платформа использует NEAR Testnet. NEAR - это блокчейн-экосистема, а Testnet (тестовая сеть) - безопасная учебная сеть, где можно проверять логику без настоящих денег и без риска для инвесторов или фермеров.</w:t>
       </w:r>
     </w:p>
     <w:p>
       <w:pPr>
-        <w:pStyle w:val="Heading1"/>
+        <w:pStyle w:val="Heading2"/>
       </w:pPr>
       <w:r>
         <w:rPr>
-          <w:rFonts w:ascii="DejaVu Sans" w:hAnsi="DejaVu Sans" w:eastAsia="DejaVu Sans"/>
-          <w:color w:val="005F41"/>
+          <w:rFonts w:ascii="Arial" w:hAnsi="Arial" w:eastAsia="Arial"/>
+          <w:b/>
+          <w:i w:val="0"/>
+          <w:color w:val="056246"/>
+          <w:sz w:val="26"/>
         </w:rPr>
-        <w:t>2. Какую проблему решает AgriPartners</w:t>
-      </w:r>
-    </w:p>
-    <w:p>
-      <w:r>
-        <w:rPr>
-          <w:rFonts w:ascii="DejaVu Sans" w:hAnsi="DejaVu Sans" w:eastAsia="DejaVu Sans"/>
-          <w:sz w:val="20"/>
-        </w:rPr>
-        <w:t>В сельском хозяйстве инвестиционные процессы часто ведутся через таблицы, сообщения, PDF-договоры и устные договоренности. Инвестору сложно понять, где находятся деньги, что уже куплено, начался ли производственный цикл и есть ли отчет от фермера.</w:t>
-      </w:r>
-    </w:p>
-    <w:p>
-      <w:r>
-        <w:rPr>
-          <w:rFonts w:ascii="DejaVu Sans" w:hAnsi="DejaVu Sans" w:eastAsia="DejaVu Sans"/>
-          <w:sz w:val="20"/>
-        </w:rPr>
-        <w:t>Фермеру также сложно: нужно объяснять, что сделано, когда получены средства, какие расходы были понесены и когда ждать результат. Администратор вынужден вручную сводить информацию из разных источников.</w:t>
-      </w:r>
-    </w:p>
-    <w:p>
-      <w:r>
-        <w:rPr>
-          <w:rFonts w:ascii="DejaVu Sans" w:hAnsi="DejaVu Sans" w:eastAsia="DejaVu Sans"/>
-          <w:sz w:val="20"/>
-        </w:rPr>
-        <w:t>AgriPartners объединяет эти процессы в единый Workflow (рабочий процесс). Простыми словами, Workflow - это последовательность действий: создать проект, показать его инвестору, подтвердить финансирование, начать цикл, принять отчет, зафиксировать результат.</w:t>
+        <w:t>Проблема и продукт</w:t>
       </w:r>
     </w:p>
     <w:p>
       <w:pPr>
-        <w:pStyle w:val="Heading1"/>
+        <w:pStyle w:val="ListBullet"/>
+        <w:spacing w:after="80"/>
+        <w:ind w:left="540" w:hanging="271"/>
       </w:pPr>
       <w:r>
         <w:rPr>
-          <w:rFonts w:ascii="DejaVu Sans" w:hAnsi="DejaVu Sans" w:eastAsia="DejaVu Sans"/>
-          <w:color w:val="005F41"/>
-        </w:rPr>
-        <w:t>3. Почему сельское хозяйство</w:t>
-      </w:r>
-    </w:p>
-    <w:p>
-      <w:r>
-        <w:rPr>
-          <w:rFonts w:ascii="DejaVu Sans" w:hAnsi="DejaVu Sans" w:eastAsia="DejaVu Sans"/>
+          <w:rFonts w:ascii="Arial" w:hAnsi="Arial" w:eastAsia="Arial"/>
+          <w:b w:val="0"/>
+          <w:i w:val="0"/>
+          <w:color w:val="17212B"/>
           <w:sz w:val="20"/>
         </w:rPr>
-        <w:t>Сельское хозяйство - это реальный сектор экономики. Здесь есть физические активы: животные, теплицы, урожай, корма, оборудование, земля и производственные циклы. Поэтому этот сектор хорошо подходит для модели прозрачного учета и отчетности.</w:t>
-      </w:r>
-    </w:p>
-    <w:p>
-      <w:r>
-        <w:rPr>
-          <w:rFonts w:ascii="DejaVu Sans" w:hAnsi="DejaVu Sans" w:eastAsia="DejaVu Sans"/>
-          <w:sz w:val="20"/>
-        </w:rPr>
-        <w:t>В контексте Web3 такие активы часто называют RWA (Real World Assets). Простыми словами, RWA - это реальные активы из обычной экономики, которые можно описать, учесть и представить в цифровой системе.</w:t>
-      </w:r>
-    </w:p>
-    <w:p>
-      <w:r>
-        <w:rPr>
-          <w:rFonts w:ascii="DejaVu Sans" w:hAnsi="DejaVu Sans" w:eastAsia="DejaVu Sans"/>
-          <w:sz w:val="20"/>
-        </w:rPr>
-        <w:t>Для AgriPartners RWA - это не модный термин. Это практическая идея: сельскохозяйственный проект должен быть понятен инвестору, фермеру и администратору, а его история должна быть проверяемой.</w:t>
+        <w:t>Агропроекты трудно оценивать, когда бюджеты, этапы, отчёты и подтверждения разрознены.</w:t>
       </w:r>
     </w:p>
     <w:p>
       <w:pPr>
-        <w:pStyle w:val="Heading1"/>
+        <w:pStyle w:val="ListBullet"/>
+        <w:spacing w:after="80"/>
+        <w:ind w:left="540" w:hanging="271"/>
       </w:pPr>
       <w:r>
         <w:rPr>
-          <w:rFonts w:ascii="DejaVu Sans" w:hAnsi="DejaVu Sans" w:eastAsia="DejaVu Sans"/>
-          <w:color w:val="005F41"/>
-        </w:rPr>
-        <w:t>4. Почему блокчейн и NEAR</w:t>
-      </w:r>
-    </w:p>
-    <w:p>
-      <w:r>
-        <w:rPr>
-          <w:rFonts w:ascii="DejaVu Sans" w:hAnsi="DejaVu Sans" w:eastAsia="DejaVu Sans"/>
+          <w:rFonts w:ascii="Arial" w:hAnsi="Arial" w:eastAsia="Arial"/>
+          <w:b w:val="0"/>
+          <w:i w:val="0"/>
+          <w:color w:val="17212B"/>
           <w:sz w:val="20"/>
         </w:rPr>
-        <w:t>Blockchain (блокчейн) - это цифровой журнал записей, где события можно фиксировать так, чтобы их было сложно задним числом изменить незаметно. Простыми словами, блокчейн помогает создать доверие к истории событий.</w:t>
-      </w:r>
-    </w:p>
-    <w:p>
-      <w:r>
-        <w:rPr>
-          <w:rFonts w:ascii="DejaVu Sans" w:hAnsi="DejaVu Sans" w:eastAsia="DejaVu Sans"/>
-          <w:sz w:val="20"/>
-        </w:rPr>
-        <w:t>NEAR выбран как инфраструктурная среда для экспериментов, потому что он подходит для построения приложений, где важны учет событий, кошельки пользователей, смарт-контракты и интеграция с Web3-сообществом.</w:t>
-      </w:r>
-    </w:p>
-    <w:p>
-      <w:r>
-        <w:rPr>
-          <w:rFonts w:ascii="DejaVu Sans" w:hAnsi="DejaVu Sans" w:eastAsia="DejaVu Sans"/>
-          <w:sz w:val="20"/>
-        </w:rPr>
-        <w:t>Web3 (веб3) означает новый тип интернет-приложений, где пользователи могут взаимодействовать через кошельки, цифровые активы и блокчейн-записи, а не только через обычные логины и пароли.</w:t>
-      </w:r>
-    </w:p>
-    <w:tbl>
-      <w:tblPr>
-        <w:tblW w:type="auto" w:w="0"/>
-        <w:jc w:val="center"/>
-        <w:tblLook w:firstColumn="1" w:firstRow="1" w:lastColumn="0" w:lastRow="0" w:noHBand="0" w:noVBand="1" w:val="04A0"/>
-      </w:tblPr>
-      <w:tblGrid>
-        <w:gridCol w:w="10224"/>
-      </w:tblGrid>
-      <w:tr>
-        <w:tc>
-          <w:tcPr>
-            <w:tcW w:type="dxa" w:w="10224"/>
-            <w:shd w:fill="EAF4EF"/>
-          </w:tcPr>
-          <w:p>
-            <w:r>
-              <w:rPr>
-                <w:rFonts w:ascii="DejaVu Sans" w:hAnsi="DejaVu Sans" w:eastAsia="DejaVu Sans"/>
-                <w:b/>
-                <w:color w:val="005A36"/>
-                <w:sz w:val="20"/>
-              </w:rPr>
-              <w:t>Простыми словами</w:t>
-              <w:br/>
-            </w:r>
-            <w:r>
-              <w:rPr>
-                <w:rFonts w:ascii="DejaVu Sans" w:hAnsi="DejaVu Sans" w:eastAsia="DejaVu Sans"/>
-                <w:sz w:val="18"/>
-              </w:rPr>
-              <w:t>NEAR для AgriPartners - это не просто криптовалюта. Это техническая среда, где можно проверять прозрачные инвестиционные рабочие процессы, цифровые подтверждения и будущую автоматизацию.</w:t>
-            </w:r>
-          </w:p>
-        </w:tc>
-      </w:tr>
-    </w:tbl>
-    <w:p/>
-    <w:p>
-      <w:pPr>
-        <w:pStyle w:val="Heading1"/>
-      </w:pPr>
-      <w:r>
-        <w:rPr>
-          <w:rFonts w:ascii="DejaVu Sans" w:hAnsi="DejaVu Sans" w:eastAsia="DejaVu Sans"/>
-          <w:color w:val="005F41"/>
-        </w:rPr>
-        <w:t>5. Первоначальная идея движения средств</w:t>
-      </w:r>
-    </w:p>
-    <w:p>
-      <w:r>
-        <w:rPr>
-          <w:rFonts w:ascii="DejaVu Sans" w:hAnsi="DejaVu Sans" w:eastAsia="DejaVu Sans"/>
-          <w:sz w:val="20"/>
-        </w:rPr>
-        <w:t>Изначальная модель может выглядеть так: инвестор использует NEAR или другой цифровой актив, затем средства могут быть конвертированы в USDT, далее в USD или местную валюту, после чего фермер получает финансирование для покупки животных, кормов или оборудования.</w:t>
-      </w:r>
-    </w:p>
-    <w:p>
-      <w:r>
-        <w:rPr>
-          <w:rFonts w:ascii="DejaVu Sans" w:hAnsi="DejaVu Sans" w:eastAsia="DejaVu Sans"/>
-          <w:sz w:val="20"/>
-        </w:rPr>
-        <w:t>USDT (Tether) - это Stablecoin (стейблкоин). Простыми словами, стейблкоин - это криптовалюта, которая старается сохранять стоимость около 1 доллара США. USD - это обычный доллар США.</w:t>
-      </w:r>
-    </w:p>
-    <w:p>
-      <w:r>
-        <w:rPr>
-          <w:rFonts w:ascii="DejaVu Sans" w:hAnsi="DejaVu Sans" w:eastAsia="DejaVu Sans"/>
-          <w:sz w:val="20"/>
-        </w:rPr>
-        <w:t>Такая схема технически возможна, но на практике она требует юридической, налоговой, банковской и комплаенс-проверки. Compliance (комплаенс) означает соблюдение правил: законов, требований банков, KYC и AML.</w:t>
-      </w:r>
-    </w:p>
-    <w:p>
-      <w:r>
-        <w:rPr>
-          <w:rFonts w:ascii="DejaVu Sans" w:hAnsi="DejaVu Sans" w:eastAsia="DejaVu Sans"/>
-          <w:sz w:val="20"/>
-        </w:rPr>
-        <w:t>KYC (Know Your Customer) - это проверка личности клиента. AML (Anti-Money Laundering) - это правила против отмывания денег. Простыми словами, если платформа работает с реальными деньгами, она должна понимать, кто отправляет средства, кто получает средства и зачем.</w:t>
+        <w:t>Инвестору нужна своевременная прозрачность без прямого управления операциями и переводов местным участникам.</w:t>
       </w:r>
     </w:p>
     <w:p>
       <w:pPr>
-        <w:pStyle w:val="Heading1"/>
+        <w:pStyle w:val="ListBullet"/>
+        <w:spacing w:after="80"/>
+        <w:ind w:left="540" w:hanging="271"/>
       </w:pPr>
       <w:r>
         <w:rPr>
-          <w:rFonts w:ascii="DejaVu Sans" w:hAnsi="DejaVu Sans" w:eastAsia="DejaVu Sans"/>
-          <w:color w:val="005F41"/>
+          <w:rFonts w:ascii="Arial" w:hAnsi="Arial" w:eastAsia="Arial"/>
+          <w:b w:val="0"/>
+          <w:i w:val="0"/>
+          <w:color w:val="17212B"/>
+          <w:sz w:val="20"/>
         </w:rPr>
-        <w:t>6. Упрощенная схема движения средств</w:t>
+        <w:t>Оператору нужен понятный фиатный процесс получения средств, подтверждения работ и возврата выручки.</w:t>
       </w:r>
     </w:p>
     <w:tbl>
       <w:tblPr>
         <w:tblStyle w:val="TableGrid"/>
         <w:tblW w:type="auto" w:w="0"/>
-        <w:jc w:val="center"/>
+        <w:jc w:val="left"/>
+        <w:tblLayout w:type="fixed"/>
         <w:tblLook w:firstColumn="1" w:firstRow="1" w:lastColumn="0" w:lastRow="0" w:noHBand="0" w:noVBand="1" w:val="04A0"/>
+        <w:tblW w:w="9360" w:type="dxa"/>
+        <w:tblInd w:w="120" w:type="dxa"/>
       </w:tblPr>
       <w:tblGrid>
-        <w:gridCol w:w="3408"/>
-        <w:gridCol w:w="3408"/>
-        <w:gridCol w:w="3408"/>
+        <w:gridCol w:w="2700"/>
+        <w:gridCol w:w="6660"/>
       </w:tblGrid>
       <w:tr>
         <w:tc>
           <w:tcPr>
-            <w:tcW w:type="dxa" w:w="3408"/>
-            <w:shd w:fill="006B4A"/>
+            <w:tcW w:type="dxa" w:w="4680"/>
+            <w:tcW w:w="2700" w:type="dxa"/>
+            <w:vAlign w:val="center"/>
+            <w:shd w:fill="056246"/>
           </w:tcPr>
           <w:p>
+            <w:pPr>
+              <w:spacing w:after="0"/>
+              <w:jc w:val="center"/>
+            </w:pPr>
             <w:r>
               <w:rPr>
-                <w:rFonts w:ascii="DejaVu Sans" w:hAnsi="DejaVu Sans" w:eastAsia="DejaVu Sans"/>
-                <w:sz w:val="18"/>
-              </w:rPr>
-            </w:r>
-            <w:r>
-              <w:rPr>
-                <w:rFonts w:ascii="DejaVu Sans" w:hAnsi="DejaVu Sans" w:eastAsia="DejaVu Sans"/>
+                <w:rFonts w:ascii="Arial" w:hAnsi="Arial" w:eastAsia="Arial"/>
                 <w:b/>
+                <w:i w:val="0"/>
                 <w:color w:val="FFFFFF"/>
                 <w:sz w:val="18"/>
               </w:rPr>
-              <w:t>Шаг</w:t>
+              <w:t>Возможность</w:t>
             </w:r>
           </w:p>
         </w:tc>
         <w:tc>
           <w:tcPr>
-            <w:tcW w:type="dxa" w:w="3408"/>
-            <w:shd w:fill="006B4A"/>
+            <w:tcW w:type="dxa" w:w="4680"/>
+            <w:tcW w:w="6660" w:type="dxa"/>
+            <w:vAlign w:val="center"/>
+            <w:shd w:fill="056246"/>
           </w:tcPr>
           <w:p>
+            <w:pPr>
+              <w:spacing w:after="0"/>
+              <w:jc w:val="center"/>
+            </w:pPr>
             <w:r>
               <w:rPr>
-                <w:rFonts w:ascii="DejaVu Sans" w:hAnsi="DejaVu Sans" w:eastAsia="DejaVu Sans"/>
+                <w:rFonts w:ascii="Arial" w:hAnsi="Arial" w:eastAsia="Arial"/>
+                <w:b/>
+                <w:i w:val="0"/>
+                <w:color w:val="FFFFFF"/>
                 <w:sz w:val="18"/>
               </w:rPr>
+              <w:t>Ценность</w:t>
             </w:r>
+          </w:p>
+        </w:tc>
+      </w:tr>
+      <w:tr>
+        <w:tc>
+          <w:tcPr>
+            <w:tcW w:type="dxa" w:w="2700"/>
+          </w:tcPr>
+          <w:p>
+            <w:pPr>
+              <w:spacing w:after="0"/>
+              <w:jc w:val="left"/>
+            </w:pPr>
             <w:r>
               <w:rPr>
-                <w:rFonts w:ascii="DejaVu Sans" w:hAnsi="DejaVu Sans" w:eastAsia="DejaVu Sans"/>
+                <w:rFonts w:ascii="Arial" w:hAnsi="Arial" w:eastAsia="Arial"/>
+                <w:b w:val="0"/>
+                <w:i w:val="0"/>
+                <w:color w:val="17212B"/>
+                <w:sz w:val="18"/>
+              </w:rPr>
+              <w:t>Рабочее пространство проекта</w:t>
+            </w:r>
+          </w:p>
+        </w:tc>
+        <w:tc>
+          <w:tcPr>
+            <w:tcW w:type="dxa" w:w="6660"/>
+          </w:tcPr>
+          <w:p>
+            <w:pPr>
+              <w:spacing w:after="0"/>
+              <w:jc w:val="center"/>
+            </w:pPr>
+            <w:r>
+              <w:rPr>
+                <w:rFonts w:ascii="Arial" w:hAnsi="Arial" w:eastAsia="Arial"/>
+                <w:b w:val="0"/>
+                <w:i w:val="0"/>
+                <w:color w:val="17212B"/>
+                <w:sz w:val="18"/>
+              </w:rPr>
+              <w:t>Бюджет, этапы, подтверждения, отчёты, риски и статус в одном процессе.</w:t>
+            </w:r>
+          </w:p>
+        </w:tc>
+      </w:tr>
+      <w:tr>
+        <w:tc>
+          <w:tcPr>
+            <w:tcW w:type="dxa" w:w="2700"/>
+            <w:shd w:fill="F2F4F7"/>
+          </w:tcPr>
+          <w:p>
+            <w:pPr>
+              <w:spacing w:after="0"/>
+              <w:jc w:val="left"/>
+            </w:pPr>
+            <w:r>
+              <w:rPr>
+                <w:rFonts w:ascii="Arial" w:hAnsi="Arial" w:eastAsia="Arial"/>
+                <w:b w:val="0"/>
+                <w:i w:val="0"/>
+                <w:color w:val="17212B"/>
+                <w:sz w:val="18"/>
+              </w:rPr>
+              <w:t>Кабинет инвестора</w:t>
+            </w:r>
+          </w:p>
+        </w:tc>
+        <w:tc>
+          <w:tcPr>
+            <w:tcW w:type="dxa" w:w="6660"/>
+            <w:shd w:fill="F2F4F7"/>
+          </w:tcPr>
+          <w:p>
+            <w:pPr>
+              <w:spacing w:after="0"/>
+              <w:jc w:val="center"/>
+            </w:pPr>
+            <w:r>
+              <w:rPr>
+                <w:rFonts w:ascii="Arial" w:hAnsi="Arial" w:eastAsia="Arial"/>
+                <w:b w:val="0"/>
+                <w:i w:val="0"/>
+                <w:color w:val="17212B"/>
+                <w:sz w:val="18"/>
+              </w:rPr>
+              <w:t>Понятный прогресс и аудиторский след без прямого операционного контроля.</w:t>
+            </w:r>
+          </w:p>
+        </w:tc>
+      </w:tr>
+      <w:tr>
+        <w:tc>
+          <w:tcPr>
+            <w:tcW w:type="dxa" w:w="2700"/>
+          </w:tcPr>
+          <w:p>
+            <w:pPr>
+              <w:spacing w:after="0"/>
+              <w:jc w:val="left"/>
+            </w:pPr>
+            <w:r>
+              <w:rPr>
+                <w:rFonts w:ascii="Arial" w:hAnsi="Arial" w:eastAsia="Arial"/>
+                <w:b w:val="0"/>
+                <w:i w:val="0"/>
+                <w:color w:val="17212B"/>
+                <w:sz w:val="18"/>
+              </w:rPr>
+              <w:t>Процесс оператора</w:t>
+            </w:r>
+          </w:p>
+        </w:tc>
+        <w:tc>
+          <w:tcPr>
+            <w:tcW w:type="dxa" w:w="6660"/>
+          </w:tcPr>
+          <w:p>
+            <w:pPr>
+              <w:spacing w:after="0"/>
+              <w:jc w:val="center"/>
+            </w:pPr>
+            <w:r>
+              <w:rPr>
+                <w:rFonts w:ascii="Arial" w:hAnsi="Arial" w:eastAsia="Arial"/>
+                <w:b w:val="0"/>
+                <w:i w:val="0"/>
+                <w:color w:val="17212B"/>
+                <w:sz w:val="18"/>
+              </w:rPr>
+              <w:t>Фиатные поступления, операционные подтверждения и документы.</w:t>
+            </w:r>
+          </w:p>
+        </w:tc>
+      </w:tr>
+      <w:tr>
+        <w:tc>
+          <w:tcPr>
+            <w:tcW w:type="dxa" w:w="2700"/>
+            <w:shd w:fill="F2F4F7"/>
+          </w:tcPr>
+          <w:p>
+            <w:pPr>
+              <w:spacing w:after="0"/>
+              <w:jc w:val="left"/>
+            </w:pPr>
+            <w:r>
+              <w:rPr>
+                <w:rFonts w:ascii="Arial" w:hAnsi="Arial" w:eastAsia="Arial"/>
+                <w:b w:val="0"/>
+                <w:i w:val="0"/>
+                <w:color w:val="17212B"/>
+                <w:sz w:val="18"/>
+              </w:rPr>
+              <w:t>Режим презентации</w:t>
+            </w:r>
+          </w:p>
+        </w:tc>
+        <w:tc>
+          <w:tcPr>
+            <w:tcW w:type="dxa" w:w="6660"/>
+            <w:shd w:fill="F2F4F7"/>
+          </w:tcPr>
+          <w:p>
+            <w:pPr>
+              <w:spacing w:after="0"/>
+              <w:jc w:val="center"/>
+            </w:pPr>
+            <w:r>
+              <w:rPr>
+                <w:rFonts w:ascii="Arial" w:hAnsi="Arial" w:eastAsia="Arial"/>
+                <w:b w:val="0"/>
+                <w:i w:val="0"/>
+                <w:color w:val="17212B"/>
+                <w:sz w:val="18"/>
+              </w:rPr>
+              <w:t>Управляемая демонстрация Alpha v1.2 для инвесторов, партнёров и грантовых экспертов.</w:t>
+            </w:r>
+          </w:p>
+        </w:tc>
+      </w:tr>
+    </w:tbl>
+    <w:p>
+      <w:pPr>
+        <w:pStyle w:val="Heading2"/>
+      </w:pPr>
+      <w:r>
+        <w:rPr>
+          <w:rFonts w:ascii="Arial" w:hAnsi="Arial" w:eastAsia="Arial"/>
+          <w:b/>
+          <w:i w:val="0"/>
+          <w:color w:val="056246"/>
+          <w:sz w:val="26"/>
+        </w:rPr>
+        <w:t>Что показывает Alpha v1.2</w:t>
+      </w:r>
+    </w:p>
+    <w:p>
+      <w:pPr>
+        <w:pStyle w:val="ListBullet"/>
+        <w:spacing w:after="80"/>
+        <w:ind w:left="540" w:hanging="271"/>
+      </w:pPr>
+      <w:r>
+        <w:rPr>
+          <w:rFonts w:ascii="Arial" w:hAnsi="Arial" w:eastAsia="Arial"/>
+          <w:b w:val="0"/>
+          <w:i w:val="0"/>
+          <w:color w:val="17212B"/>
+          <w:sz w:val="20"/>
+        </w:rPr>
+        <w:t>Ролевой процесс и публичную презентацию.</w:t>
+      </w:r>
+    </w:p>
+    <w:p>
+      <w:pPr>
+        <w:pStyle w:val="ListBullet"/>
+        <w:spacing w:after="80"/>
+        <w:ind w:left="540" w:hanging="271"/>
+      </w:pPr>
+      <w:r>
+        <w:rPr>
+          <w:rFonts w:ascii="Arial" w:hAnsi="Arial" w:eastAsia="Arial"/>
+          <w:b w:val="0"/>
+          <w:i w:val="0"/>
+          <w:color w:val="17212B"/>
+          <w:sz w:val="20"/>
+        </w:rPr>
+        <w:t>Концепции проекта, расходов, подтверждений и отчётности.</w:t>
+      </w:r>
+    </w:p>
+    <w:p>
+      <w:pPr>
+        <w:pStyle w:val="ListBullet"/>
+        <w:spacing w:after="80"/>
+        <w:ind w:left="540" w:hanging="271"/>
+      </w:pPr>
+      <w:r>
+        <w:rPr>
+          <w:rFonts w:ascii="Arial" w:hAnsi="Arial" w:eastAsia="Arial"/>
+          <w:b w:val="0"/>
+          <w:i w:val="0"/>
+          <w:color w:val="17212B"/>
+          <w:sz w:val="20"/>
+        </w:rPr>
+        <w:t>События NEAR Testnet для демо-аудита и автоматизации на стороне Эстонии/инвестора.</w:t>
+      </w:r>
+    </w:p>
+    <w:p>
+      <w:pPr>
+        <w:pStyle w:val="ListBullet"/>
+        <w:spacing w:after="80"/>
+        <w:ind w:left="540" w:hanging="271"/>
+      </w:pPr>
+      <w:r>
+        <w:rPr>
+          <w:rFonts w:ascii="Arial" w:hAnsi="Arial" w:eastAsia="Arial"/>
+          <w:b w:val="0"/>
+          <w:i w:val="0"/>
+          <w:color w:val="17212B"/>
+          <w:sz w:val="20"/>
+        </w:rPr>
+        <w:t>Основу для проверки партнёрами и будущего формально утверждённого пилота.</w:t>
+      </w:r>
+    </w:p>
+    <w:p>
+      <w:r>
+        <w:br w:type="page"/>
+      </w:r>
+    </w:p>
+    <w:p>
+      <w:pPr>
+        <w:spacing w:after="60" w:line="283" w:lineRule="auto"/>
+        <w:jc w:val="center"/>
+      </w:pPr>
+      <w:r>
+        <w:rPr>
+          <w:rFonts w:ascii="Arial" w:hAnsi="Arial" w:eastAsia="Arial"/>
+          <w:b/>
+          <w:i w:val="0"/>
+          <w:color w:val="087F5B"/>
+          <w:sz w:val="18"/>
+        </w:rPr>
+        <w:t>AGRIPARTNERS</w:t>
+      </w:r>
+    </w:p>
+    <w:p>
+      <w:pPr>
+        <w:spacing w:after="80" w:line="283" w:lineRule="auto"/>
+        <w:jc w:val="center"/>
+      </w:pPr>
+      <w:r>
+        <w:rPr>
+          <w:rFonts w:ascii="Arial" w:hAnsi="Arial" w:eastAsia="Arial"/>
+          <w:b/>
+          <w:i w:val="0"/>
+          <w:color w:val="17324D"/>
+          <w:sz w:val="50"/>
+        </w:rPr>
+        <w:t>Обязательная финансовая и юридическая граница</w:t>
+      </w:r>
+    </w:p>
+    <w:p>
+      <w:pPr>
+        <w:spacing w:after="280" w:line="283" w:lineRule="auto"/>
+        <w:jc w:val="center"/>
+      </w:pPr>
+      <w:r>
+        <w:rPr>
+          <w:rFonts w:ascii="Arial" w:hAnsi="Arial" w:eastAsia="Arial"/>
+          <w:b w:val="0"/>
+          <w:i w:val="0"/>
+          <w:color w:val="5E6B78"/>
+          <w:sz w:val="25"/>
+        </w:rPr>
+        <w:t>Alpha v1.2 · прозрачные процессы агроинвестирования · NEAR Testnet</w:t>
+      </w:r>
+    </w:p>
+    <w:tbl>
+      <w:tblPr>
+        <w:tblW w:type="auto" w:w="0"/>
+        <w:jc w:val="left"/>
+        <w:tblLayout w:type="fixed"/>
+        <w:tblLook w:firstColumn="1" w:firstRow="1" w:lastColumn="0" w:lastRow="0" w:noHBand="0" w:noVBand="1" w:val="04A0"/>
+        <w:tblW w:w="9360" w:type="dxa"/>
+        <w:tblInd w:w="120" w:type="dxa"/>
+      </w:tblPr>
+      <w:tblGrid>
+        <w:gridCol w:w="9360"/>
+      </w:tblGrid>
+      <w:tr>
+        <w:tc>
+          <w:tcPr>
+            <w:tcW w:type="dxa" w:w="9360"/>
+            <w:tcW w:w="9360" w:type="dxa"/>
+            <w:vAlign w:val="center"/>
+            <w:shd w:fill="E8F5EF"/>
+          </w:tcPr>
+          <w:p>
+            <w:pPr>
+              <w:spacing w:after="0"/>
+            </w:pPr>
+            <w:r>
+              <w:rPr>
+                <w:rFonts w:ascii="Arial" w:hAnsi="Arial" w:eastAsia="Arial"/>
                 <w:b/>
+                <w:i w:val="0"/>
+                <w:color w:val="056246"/>
+                <w:sz w:val="19"/>
+              </w:rPr>
+              <w:t>Внешний инвестор → AgriPartners OÜ (Эстония) → одобренная конвертация и зачисленный фиат → оператор откормочного комплекса в Узбекистане по отдельному письменному договору. Криптовалюта остаётся в Эстонии. Оператор, роль Farmer, поставщики и сотрудники в Узбекистане получают и возвращают только фиат.</w:t>
+            </w:r>
+          </w:p>
+        </w:tc>
+      </w:tr>
+    </w:tbl>
+    <w:p>
+      <w:pPr>
+        <w:spacing w:after="40" w:line="283" w:lineRule="auto"/>
+      </w:pPr>
+      <w:r>
+        <w:rPr>
+          <w:rFonts w:ascii="Arial" w:hAnsi="Arial" w:eastAsia="Arial"/>
+          <w:b w:val="0"/>
+          <w:i w:val="0"/>
+          <w:color w:val="17212B"/>
+          <w:sz w:val="2"/>
+        </w:rPr>
+      </w:r>
+    </w:p>
+    <w:tbl>
+      <w:tblPr>
+        <w:tblStyle w:val="TableGrid"/>
+        <w:tblW w:type="auto" w:w="0"/>
+        <w:jc w:val="left"/>
+        <w:tblLayout w:type="fixed"/>
+        <w:tblLook w:firstColumn="1" w:firstRow="1" w:lastColumn="0" w:lastRow="0" w:noHBand="0" w:noVBand="1" w:val="04A0"/>
+        <w:tblW w:w="9360" w:type="dxa"/>
+        <w:tblInd w:w="120" w:type="dxa"/>
+      </w:tblPr>
+      <w:tblGrid>
+        <w:gridCol w:w="1800"/>
+        <w:gridCol w:w="4080"/>
+        <w:gridCol w:w="3480"/>
+      </w:tblGrid>
+      <w:tr>
+        <w:tc>
+          <w:tcPr>
+            <w:tcW w:type="dxa" w:w="3120"/>
+            <w:tcW w:w="1800" w:type="dxa"/>
+            <w:vAlign w:val="center"/>
+            <w:shd w:fill="056246"/>
+          </w:tcPr>
+          <w:p>
+            <w:pPr>
+              <w:spacing w:after="0"/>
+              <w:jc w:val="center"/>
+            </w:pPr>
+            <w:r>
+              <w:rPr>
+                <w:rFonts w:ascii="Arial" w:hAnsi="Arial" w:eastAsia="Arial"/>
+                <w:b/>
+                <w:i w:val="0"/>
                 <w:color w:val="FFFFFF"/>
-                <w:sz w:val="18"/>
+                <w:sz w:val="16"/>
+              </w:rPr>
+              <w:t>Этап</w:t>
+            </w:r>
+          </w:p>
+        </w:tc>
+        <w:tc>
+          <w:tcPr>
+            <w:tcW w:type="dxa" w:w="3120"/>
+            <w:tcW w:w="4080" w:type="dxa"/>
+            <w:vAlign w:val="center"/>
+            <w:shd w:fill="056246"/>
+          </w:tcPr>
+          <w:p>
+            <w:pPr>
+              <w:spacing w:after="0"/>
+              <w:jc w:val="center"/>
+            </w:pPr>
+            <w:r>
+              <w:rPr>
+                <w:rFonts w:ascii="Arial" w:hAnsi="Arial" w:eastAsia="Arial"/>
+                <w:b/>
+                <w:i w:val="0"/>
+                <w:color w:val="FFFFFF"/>
+                <w:sz w:val="16"/>
               </w:rPr>
               <w:t>Что происходит</w:t>
             </w:r>
@@ -404,24 +667,25 @@
         </w:tc>
         <w:tc>
           <w:tcPr>
-            <w:tcW w:type="dxa" w:w="3408"/>
-            <w:shd w:fill="006B4A"/>
+            <w:tcW w:type="dxa" w:w="3120"/>
+            <w:tcW w:w="3480" w:type="dxa"/>
+            <w:vAlign w:val="center"/>
+            <w:shd w:fill="056246"/>
           </w:tcPr>
           <w:p>
+            <w:pPr>
+              <w:spacing w:after="0"/>
+              <w:jc w:val="center"/>
+            </w:pPr>
             <w:r>
               <w:rPr>
-                <w:rFonts w:ascii="DejaVu Sans" w:hAnsi="DejaVu Sans" w:eastAsia="DejaVu Sans"/>
-                <w:sz w:val="18"/>
+                <w:rFonts w:ascii="Arial" w:hAnsi="Arial" w:eastAsia="Arial"/>
+                <w:b/>
+                <w:i w:val="0"/>
+                <w:color w:val="FFFFFF"/>
+                <w:sz w:val="16"/>
               </w:rPr>
-            </w:r>
-            <w:r>
-              <w:rPr>
-                <w:rFonts w:ascii="DejaVu Sans" w:hAnsi="DejaVu Sans" w:eastAsia="DejaVu Sans"/>
-                <w:b/>
-                <w:color w:val="FFFFFF"/>
-                <w:sz w:val="18"/>
-              </w:rPr>
-              <w:t>Как понимать простыми словами</w:t>
+              <w:t>Официальные подтверждения</w:t>
             </w:r>
           </w:p>
         </w:tc>
@@ -429,64 +693,64 @@
       <w:tr>
         <w:tc>
           <w:tcPr>
-            <w:tcW w:type="dxa" w:w="3408"/>
+            <w:tcW w:type="dxa" w:w="1800"/>
           </w:tcPr>
           <w:p>
+            <w:pPr>
+              <w:spacing w:after="0"/>
+              <w:jc w:val="left"/>
+            </w:pPr>
             <w:r>
               <w:rPr>
-                <w:rFonts w:ascii="DejaVu Sans" w:hAnsi="DejaVu Sans" w:eastAsia="DejaVu Sans"/>
-                <w:sz w:val="18"/>
+                <w:rFonts w:ascii="Arial" w:hAnsi="Arial" w:eastAsia="Arial"/>
+                <w:b w:val="0"/>
+                <w:i w:val="0"/>
+                <w:color w:val="17212B"/>
+                <w:sz w:val="16"/>
               </w:rPr>
-            </w:r>
-            <w:r>
-              <w:rPr>
-                <w:rFonts w:ascii="DejaVu Sans" w:hAnsi="DejaVu Sans" w:eastAsia="DejaVu Sans"/>
-                <w:b w:val="0"/>
-                <w:sz w:val="18"/>
-              </w:rPr>
-              <w:t>1</w:t>
+              <w:t>1. Финансирование</w:t>
             </w:r>
           </w:p>
         </w:tc>
         <w:tc>
           <w:tcPr>
-            <w:tcW w:type="dxa" w:w="3408"/>
+            <w:tcW w:type="dxa" w:w="4080"/>
           </w:tcPr>
           <w:p>
+            <w:pPr>
+              <w:spacing w:after="0"/>
+              <w:jc w:val="center"/>
+            </w:pPr>
             <w:r>
               <w:rPr>
-                <w:rFonts w:ascii="DejaVu Sans" w:hAnsi="DejaVu Sans" w:eastAsia="DejaVu Sans"/>
-                <w:sz w:val="18"/>
+                <w:rFonts w:ascii="Arial" w:hAnsi="Arial" w:eastAsia="Arial"/>
+                <w:b w:val="0"/>
+                <w:i w:val="0"/>
+                <w:color w:val="17212B"/>
+                <w:sz w:val="16"/>
               </w:rPr>
-            </w:r>
-            <w:r>
-              <w:rPr>
-                <w:rFonts w:ascii="DejaVu Sans" w:hAnsi="DejaVu Sans" w:eastAsia="DejaVu Sans"/>
-                <w:b w:val="0"/>
-                <w:sz w:val="18"/>
-              </w:rPr>
-              <w:t>Investor (инвестор) выбирает проект</w:t>
+              <w:t>Инвестор заключает договор с AgriPartners OÜ; разрешённые средства поступают в Эстонии.</w:t>
             </w:r>
           </w:p>
         </w:tc>
         <w:tc>
           <w:tcPr>
-            <w:tcW w:type="dxa" w:w="3408"/>
+            <w:tcW w:type="dxa" w:w="3480"/>
           </w:tcPr>
           <w:p>
+            <w:pPr>
+              <w:spacing w:after="0"/>
+              <w:jc w:val="center"/>
+            </w:pPr>
             <w:r>
               <w:rPr>
-                <w:rFonts w:ascii="DejaVu Sans" w:hAnsi="DejaVu Sans" w:eastAsia="DejaVu Sans"/>
-                <w:sz w:val="18"/>
+                <w:rFonts w:ascii="Arial" w:hAnsi="Arial" w:eastAsia="Arial"/>
+                <w:b w:val="0"/>
+                <w:i w:val="0"/>
+                <w:color w:val="17212B"/>
+                <w:sz w:val="16"/>
               </w:rPr>
-            </w:r>
-            <w:r>
-              <w:rPr>
-                <w:rFonts w:ascii="DejaVu Sans" w:hAnsi="DejaVu Sans" w:eastAsia="DejaVu Sans"/>
-                <w:b w:val="0"/>
-                <w:sz w:val="18"/>
-              </w:rPr>
-              <w:t>Человек или организация решает профинансировать сельхозпроект.</w:t>
+              <w:t>Договор, записи провайдера и учёта</w:t>
             </w:r>
           </w:p>
         </w:tc>
@@ -494,64 +758,67 @@
       <w:tr>
         <w:tc>
           <w:tcPr>
-            <w:tcW w:type="dxa" w:w="3408"/>
+            <w:tcW w:type="dxa" w:w="1800"/>
+            <w:shd w:fill="F2F4F7"/>
           </w:tcPr>
           <w:p>
+            <w:pPr>
+              <w:spacing w:after="0"/>
+              <w:jc w:val="left"/>
+            </w:pPr>
             <w:r>
               <w:rPr>
-                <w:rFonts w:ascii="DejaVu Sans" w:hAnsi="DejaVu Sans" w:eastAsia="DejaVu Sans"/>
-                <w:sz w:val="18"/>
+                <w:rFonts w:ascii="Arial" w:hAnsi="Arial" w:eastAsia="Arial"/>
+                <w:b w:val="0"/>
+                <w:i w:val="0"/>
+                <w:color w:val="17212B"/>
+                <w:sz w:val="16"/>
               </w:rPr>
-            </w:r>
-            <w:r>
-              <w:rPr>
-                <w:rFonts w:ascii="DejaVu Sans" w:hAnsi="DejaVu Sans" w:eastAsia="DejaVu Sans"/>
-                <w:b w:val="0"/>
-                <w:sz w:val="18"/>
-              </w:rPr>
-              <w:t>2</w:t>
+              <w:t>2. Конвертация</w:t>
             </w:r>
           </w:p>
         </w:tc>
         <w:tc>
           <w:tcPr>
-            <w:tcW w:type="dxa" w:w="3408"/>
+            <w:tcW w:type="dxa" w:w="4080"/>
+            <w:shd w:fill="F2F4F7"/>
           </w:tcPr>
           <w:p>
+            <w:pPr>
+              <w:spacing w:after="0"/>
+              <w:jc w:val="center"/>
+            </w:pPr>
             <w:r>
               <w:rPr>
-                <w:rFonts w:ascii="DejaVu Sans" w:hAnsi="DejaVu Sans" w:eastAsia="DejaVu Sans"/>
-                <w:sz w:val="18"/>
+                <w:rFonts w:ascii="Arial" w:hAnsi="Arial" w:eastAsia="Arial"/>
+                <w:b w:val="0"/>
+                <w:i w:val="0"/>
+                <w:color w:val="17212B"/>
+                <w:sz w:val="16"/>
               </w:rPr>
-            </w:r>
-            <w:r>
-              <w:rPr>
-                <w:rFonts w:ascii="DejaVu Sans" w:hAnsi="DejaVu Sans" w:eastAsia="DejaVu Sans"/>
-                <w:b w:val="0"/>
-                <w:sz w:val="18"/>
-              </w:rPr>
-              <w:t>Средства могут быть внесены через NEAR, USDT или другой канал</w:t>
+              <w:t>Разрешённая криптовалюта конвертируется через одобренную инфраструктуру; фиат должен быть зачислен.</w:t>
             </w:r>
           </w:p>
         </w:tc>
         <w:tc>
           <w:tcPr>
-            <w:tcW w:type="dxa" w:w="3408"/>
+            <w:tcW w:type="dxa" w:w="3480"/>
+            <w:shd w:fill="F2F4F7"/>
           </w:tcPr>
           <w:p>
+            <w:pPr>
+              <w:spacing w:after="0"/>
+              <w:jc w:val="center"/>
+            </w:pPr>
             <w:r>
               <w:rPr>
-                <w:rFonts w:ascii="DejaVu Sans" w:hAnsi="DejaVu Sans" w:eastAsia="DejaVu Sans"/>
-                <w:sz w:val="18"/>
+                <w:rFonts w:ascii="Arial" w:hAnsi="Arial" w:eastAsia="Arial"/>
+                <w:b w:val="0"/>
+                <w:i w:val="0"/>
+                <w:color w:val="17212B"/>
+                <w:sz w:val="16"/>
               </w:rPr>
-            </w:r>
-            <w:r>
-              <w:rPr>
-                <w:rFonts w:ascii="DejaVu Sans" w:hAnsi="DejaVu Sans" w:eastAsia="DejaVu Sans"/>
-                <w:b w:val="0"/>
-                <w:sz w:val="18"/>
-              </w:rPr>
-              <w:t>Источник финансирования может быть криптовалютным или традиционным.</w:t>
+              <w:t>Провайдер, банк и сверка</w:t>
             </w:r>
           </w:p>
         </w:tc>
@@ -559,64 +826,64 @@
       <w:tr>
         <w:tc>
           <w:tcPr>
-            <w:tcW w:type="dxa" w:w="3408"/>
+            <w:tcW w:type="dxa" w:w="1800"/>
           </w:tcPr>
           <w:p>
+            <w:pPr>
+              <w:spacing w:after="0"/>
+              <w:jc w:val="left"/>
+            </w:pPr>
             <w:r>
               <w:rPr>
-                <w:rFonts w:ascii="DejaVu Sans" w:hAnsi="DejaVu Sans" w:eastAsia="DejaVu Sans"/>
-                <w:sz w:val="18"/>
+                <w:rFonts w:ascii="Arial" w:hAnsi="Arial" w:eastAsia="Arial"/>
+                <w:b w:val="0"/>
+                <w:i w:val="0"/>
+                <w:color w:val="17212B"/>
+                <w:sz w:val="16"/>
               </w:rPr>
-            </w:r>
-            <w:r>
-              <w:rPr>
-                <w:rFonts w:ascii="DejaVu Sans" w:hAnsi="DejaVu Sans" w:eastAsia="DejaVu Sans"/>
-                <w:b w:val="0"/>
-                <w:sz w:val="18"/>
-              </w:rPr>
-              <w:t>3</w:t>
+              <w:t>3. Финансирование оператора</w:t>
             </w:r>
           </w:p>
         </w:tc>
         <w:tc>
           <w:tcPr>
-            <w:tcW w:type="dxa" w:w="3408"/>
+            <w:tcW w:type="dxa" w:w="4080"/>
           </w:tcPr>
           <w:p>
+            <w:pPr>
+              <w:spacing w:after="0"/>
+              <w:jc w:val="center"/>
+            </w:pPr>
             <w:r>
               <w:rPr>
-                <w:rFonts w:ascii="DejaVu Sans" w:hAnsi="DejaVu Sans" w:eastAsia="DejaVu Sans"/>
-                <w:sz w:val="18"/>
+                <w:rFonts w:ascii="Arial" w:hAnsi="Arial" w:eastAsia="Arial"/>
+                <w:b w:val="0"/>
+                <w:i w:val="0"/>
+                <w:color w:val="17212B"/>
+                <w:sz w:val="16"/>
               </w:rPr>
-            </w:r>
-            <w:r>
-              <w:rPr>
-                <w:rFonts w:ascii="DejaVu Sans" w:hAnsi="DejaVu Sans" w:eastAsia="DejaVu Sans"/>
-                <w:b w:val="0"/>
-                <w:sz w:val="18"/>
-              </w:rPr>
-              <w:t>Конвертация в USD или местную валюту</w:t>
+              <w:t>AgriPartners OÜ переводит оператору в Узбекистане только фиат по отдельному договору.</w:t>
             </w:r>
           </w:p>
         </w:tc>
         <w:tc>
           <w:tcPr>
-            <w:tcW w:type="dxa" w:w="3408"/>
+            <w:tcW w:type="dxa" w:w="3480"/>
           </w:tcPr>
           <w:p>
+            <w:pPr>
+              <w:spacing w:after="0"/>
+              <w:jc w:val="center"/>
+            </w:pPr>
             <w:r>
               <w:rPr>
-                <w:rFonts w:ascii="DejaVu Sans" w:hAnsi="DejaVu Sans" w:eastAsia="DejaVu Sans"/>
-                <w:sz w:val="18"/>
+                <w:rFonts w:ascii="Arial" w:hAnsi="Arial" w:eastAsia="Arial"/>
+                <w:b w:val="0"/>
+                <w:i w:val="0"/>
+                <w:color w:val="17212B"/>
+                <w:sz w:val="16"/>
               </w:rPr>
-            </w:r>
-            <w:r>
-              <w:rPr>
-                <w:rFonts w:ascii="DejaVu Sans" w:hAnsi="DejaVu Sans" w:eastAsia="DejaVu Sans"/>
-                <w:b w:val="0"/>
-                <w:sz w:val="18"/>
-              </w:rPr>
-              <w:t>Для покупки реальных товаров фермеру чаще всего нужны обычные деньги.</w:t>
+              <w:t>Договор оператора и банковские записи</w:t>
             </w:r>
           </w:p>
         </w:tc>
@@ -624,64 +891,67 @@
       <w:tr>
         <w:tc>
           <w:tcPr>
-            <w:tcW w:type="dxa" w:w="3408"/>
+            <w:tcW w:type="dxa" w:w="1800"/>
+            <w:shd w:fill="F2F4F7"/>
           </w:tcPr>
           <w:p>
+            <w:pPr>
+              <w:spacing w:after="0"/>
+              <w:jc w:val="left"/>
+            </w:pPr>
             <w:r>
               <w:rPr>
-                <w:rFonts w:ascii="DejaVu Sans" w:hAnsi="DejaVu Sans" w:eastAsia="DejaVu Sans"/>
-                <w:sz w:val="18"/>
+                <w:rFonts w:ascii="Arial" w:hAnsi="Arial" w:eastAsia="Arial"/>
+                <w:b w:val="0"/>
+                <w:i w:val="0"/>
+                <w:color w:val="17212B"/>
+                <w:sz w:val="16"/>
               </w:rPr>
-            </w:r>
-            <w:r>
-              <w:rPr>
-                <w:rFonts w:ascii="DejaVu Sans" w:hAnsi="DejaVu Sans" w:eastAsia="DejaVu Sans"/>
-                <w:b w:val="0"/>
-                <w:sz w:val="18"/>
-              </w:rPr>
-              <w:t>4</w:t>
+              <w:t>4. Операции</w:t>
             </w:r>
           </w:p>
         </w:tc>
         <w:tc>
           <w:tcPr>
-            <w:tcW w:type="dxa" w:w="3408"/>
+            <w:tcW w:type="dxa" w:w="4080"/>
+            <w:shd w:fill="F2F4F7"/>
           </w:tcPr>
           <w:p>
+            <w:pPr>
+              <w:spacing w:after="0"/>
+              <w:jc w:val="center"/>
+            </w:pPr>
             <w:r>
               <w:rPr>
-                <w:rFonts w:ascii="DejaVu Sans" w:hAnsi="DejaVu Sans" w:eastAsia="DejaVu Sans"/>
-                <w:sz w:val="18"/>
+                <w:rFonts w:ascii="Arial" w:hAnsi="Arial" w:eastAsia="Arial"/>
+                <w:b w:val="0"/>
+                <w:i w:val="0"/>
+                <w:color w:val="17212B"/>
+                <w:sz w:val="16"/>
               </w:rPr>
-            </w:r>
-            <w:r>
-              <w:rPr>
-                <w:rFonts w:ascii="DejaVu Sans" w:hAnsi="DejaVu Sans" w:eastAsia="DejaVu Sans"/>
-                <w:b w:val="0"/>
-                <w:sz w:val="18"/>
-              </w:rPr>
-              <w:t>Farmer (фермер) получает финансирование</w:t>
+              <w:t>Оператор выполняет работы и предоставляет отчёты, счета и подтверждения.</w:t>
             </w:r>
           </w:p>
         </w:tc>
         <w:tc>
           <w:tcPr>
-            <w:tcW w:type="dxa" w:w="3408"/>
+            <w:tcW w:type="dxa" w:w="3480"/>
+            <w:shd w:fill="F2F4F7"/>
           </w:tcPr>
           <w:p>
+            <w:pPr>
+              <w:spacing w:after="0"/>
+              <w:jc w:val="center"/>
+            </w:pPr>
             <w:r>
               <w:rPr>
-                <w:rFonts w:ascii="DejaVu Sans" w:hAnsi="DejaVu Sans" w:eastAsia="DejaVu Sans"/>
-                <w:sz w:val="18"/>
+                <w:rFonts w:ascii="Arial" w:hAnsi="Arial" w:eastAsia="Arial"/>
+                <w:b w:val="0"/>
+                <w:i w:val="0"/>
+                <w:color w:val="17212B"/>
+                <w:sz w:val="16"/>
               </w:rPr>
-            </w:r>
-            <w:r>
-              <w:rPr>
-                <w:rFonts w:ascii="DejaVu Sans" w:hAnsi="DejaVu Sans" w:eastAsia="DejaVu Sans"/>
-                <w:b w:val="0"/>
-                <w:sz w:val="18"/>
-              </w:rPr>
-              <w:t>Фермер покупает животных, корма, оборудование или запускает цикл.</w:t>
+              <w:t>Операционные, ветеринарные и бухгалтерские документы</w:t>
             </w:r>
           </w:p>
         </w:tc>
@@ -689,64 +959,64 @@
       <w:tr>
         <w:tc>
           <w:tcPr>
-            <w:tcW w:type="dxa" w:w="3408"/>
+            <w:tcW w:type="dxa" w:w="1800"/>
           </w:tcPr>
           <w:p>
+            <w:pPr>
+              <w:spacing w:after="0"/>
+              <w:jc w:val="left"/>
+            </w:pPr>
             <w:r>
               <w:rPr>
-                <w:rFonts w:ascii="DejaVu Sans" w:hAnsi="DejaVu Sans" w:eastAsia="DejaVu Sans"/>
-                <w:sz w:val="18"/>
+                <w:rFonts w:ascii="Arial" w:hAnsi="Arial" w:eastAsia="Arial"/>
+                <w:b w:val="0"/>
+                <w:i w:val="0"/>
+                <w:color w:val="17212B"/>
+                <w:sz w:val="16"/>
               </w:rPr>
-            </w:r>
-            <w:r>
-              <w:rPr>
-                <w:rFonts w:ascii="DejaVu Sans" w:hAnsi="DejaVu Sans" w:eastAsia="DejaVu Sans"/>
-                <w:b w:val="0"/>
-                <w:sz w:val="18"/>
-              </w:rPr>
-              <w:t>5</w:t>
+              <w:t>5. Выручка</w:t>
             </w:r>
           </w:p>
         </w:tc>
         <w:tc>
           <w:tcPr>
-            <w:tcW w:type="dxa" w:w="3408"/>
+            <w:tcW w:type="dxa" w:w="4080"/>
           </w:tcPr>
           <w:p>
+            <w:pPr>
+              <w:spacing w:after="0"/>
+              <w:jc w:val="center"/>
+            </w:pPr>
             <w:r>
               <w:rPr>
-                <w:rFonts w:ascii="DejaVu Sans" w:hAnsi="DejaVu Sans" w:eastAsia="DejaVu Sans"/>
-                <w:sz w:val="18"/>
+                <w:rFonts w:ascii="Arial" w:hAnsi="Arial" w:eastAsia="Arial"/>
+                <w:b w:val="0"/>
+                <w:i w:val="0"/>
+                <w:color w:val="17212B"/>
+                <w:sz w:val="16"/>
               </w:rPr>
-            </w:r>
-            <w:r>
-              <w:rPr>
-                <w:rFonts w:ascii="DejaVu Sans" w:hAnsi="DejaVu Sans" w:eastAsia="DejaVu Sans"/>
-                <w:b w:val="0"/>
-                <w:sz w:val="18"/>
-              </w:rPr>
-              <w:t>Reporting (отчетность)</w:t>
+              <w:t>Узбекистан возвращает разрешённую выручку только по фиатным каналам.</w:t>
             </w:r>
           </w:p>
         </w:tc>
         <w:tc>
           <w:tcPr>
-            <w:tcW w:type="dxa" w:w="3408"/>
+            <w:tcW w:type="dxa" w:w="3480"/>
           </w:tcPr>
           <w:p>
+            <w:pPr>
+              <w:spacing w:after="0"/>
+              <w:jc w:val="center"/>
+            </w:pPr>
             <w:r>
               <w:rPr>
-                <w:rFonts w:ascii="DejaVu Sans" w:hAnsi="DejaVu Sans" w:eastAsia="DejaVu Sans"/>
-                <w:sz w:val="18"/>
+                <w:rFonts w:ascii="Arial" w:hAnsi="Arial" w:eastAsia="Arial"/>
+                <w:b w:val="0"/>
+                <w:i w:val="0"/>
+                <w:color w:val="17212B"/>
+                <w:sz w:val="16"/>
               </w:rPr>
-            </w:r>
-            <w:r>
-              <w:rPr>
-                <w:rFonts w:ascii="DejaVu Sans" w:hAnsi="DejaVu Sans" w:eastAsia="DejaVu Sans"/>
-                <w:b w:val="0"/>
-                <w:sz w:val="18"/>
-              </w:rPr>
-              <w:t>Фермер показывает, что сделано и как идет проект.</w:t>
+              <w:t>Банк, бухгалтерия и сверка</w:t>
             </w:r>
           </w:p>
         </w:tc>
@@ -754,1198 +1024,237 @@
       <w:tr>
         <w:tc>
           <w:tcPr>
-            <w:tcW w:type="dxa" w:w="3408"/>
+            <w:tcW w:type="dxa" w:w="1800"/>
+            <w:shd w:fill="F2F4F7"/>
           </w:tcPr>
           <w:p>
+            <w:pPr>
+              <w:spacing w:after="0"/>
+              <w:jc w:val="left"/>
+            </w:pPr>
             <w:r>
               <w:rPr>
-                <w:rFonts w:ascii="DejaVu Sans" w:hAnsi="DejaVu Sans" w:eastAsia="DejaVu Sans"/>
-                <w:sz w:val="18"/>
+                <w:rFonts w:ascii="Arial" w:hAnsi="Arial" w:eastAsia="Arial"/>
+                <w:b w:val="0"/>
+                <w:i w:val="0"/>
+                <w:color w:val="17212B"/>
+                <w:sz w:val="16"/>
               </w:rPr>
-            </w:r>
-            <w:r>
-              <w:rPr>
-                <w:rFonts w:ascii="DejaVu Sans" w:hAnsi="DejaVu Sans" w:eastAsia="DejaVu Sans"/>
-                <w:b w:val="0"/>
-                <w:sz w:val="18"/>
-              </w:rPr>
-              <w:t>6</w:t>
+              <w:t>6. Расчёт</w:t>
             </w:r>
           </w:p>
         </w:tc>
         <w:tc>
           <w:tcPr>
-            <w:tcW w:type="dxa" w:w="3408"/>
+            <w:tcW w:type="dxa" w:w="4080"/>
+            <w:shd w:fill="F2F4F7"/>
           </w:tcPr>
           <w:p>
+            <w:pPr>
+              <w:spacing w:after="0"/>
+              <w:jc w:val="center"/>
+            </w:pPr>
             <w:r>
               <w:rPr>
-                <w:rFonts w:ascii="DejaVu Sans" w:hAnsi="DejaVu Sans" w:eastAsia="DejaVu Sans"/>
-                <w:sz w:val="18"/>
+                <w:rFonts w:ascii="Arial" w:hAnsi="Arial" w:eastAsia="Arial"/>
+                <w:b w:val="0"/>
+                <w:i w:val="0"/>
+                <w:color w:val="17212B"/>
+                <w:sz w:val="16"/>
               </w:rPr>
-            </w:r>
-            <w:r>
-              <w:rPr>
-                <w:rFonts w:ascii="DejaVu Sans" w:hAnsi="DejaVu Sans" w:eastAsia="DejaVu Sans"/>
-                <w:b w:val="0"/>
-                <w:sz w:val="18"/>
-              </w:rPr>
-              <w:t>Returns (возврат результата)</w:t>
+              <w:t>AgriPartners OÜ определяет расчёт с инвестором по действующим договорам.</w:t>
             </w:r>
           </w:p>
         </w:tc>
         <w:tc>
           <w:tcPr>
-            <w:tcW w:type="dxa" w:w="3408"/>
+            <w:tcW w:type="dxa" w:w="3480"/>
+            <w:shd w:fill="F2F4F7"/>
           </w:tcPr>
           <w:p>
+            <w:pPr>
+              <w:spacing w:after="0"/>
+              <w:jc w:val="center"/>
+            </w:pPr>
             <w:r>
               <w:rPr>
-                <w:rFonts w:ascii="DejaVu Sans" w:hAnsi="DejaVu Sans" w:eastAsia="DejaVu Sans"/>
-                <w:sz w:val="18"/>
+                <w:rFonts w:ascii="Arial" w:hAnsi="Arial" w:eastAsia="Arial"/>
+                <w:b w:val="0"/>
+                <w:i w:val="0"/>
+                <w:color w:val="17212B"/>
+                <w:sz w:val="16"/>
               </w:rPr>
-            </w:r>
-            <w:r>
-              <w:rPr>
-                <w:rFonts w:ascii="DejaVu Sans" w:hAnsi="DejaVu Sans" w:eastAsia="DejaVu Sans"/>
-                <w:b w:val="0"/>
-                <w:sz w:val="18"/>
-              </w:rPr>
-              <w:t>Инвестор видит итог, доходность, возврат или следующий цикл.</w:t>
+              <w:t>Договоры, учёт и документы расчёта</w:t>
             </w:r>
           </w:p>
         </w:tc>
       </w:tr>
     </w:tbl>
-    <w:p/>
     <w:tbl>
       <w:tblPr>
         <w:tblW w:type="auto" w:w="0"/>
-        <w:jc w:val="center"/>
+        <w:jc w:val="left"/>
+        <w:tblLayout w:type="fixed"/>
         <w:tblLook w:firstColumn="1" w:firstRow="1" w:lastColumn="0" w:lastRow="0" w:noHBand="0" w:noVBand="1" w:val="04A0"/>
+        <w:tblW w:w="9360" w:type="dxa"/>
+        <w:tblInd w:w="120" w:type="dxa"/>
       </w:tblPr>
       <w:tblGrid>
-        <w:gridCol w:w="10224"/>
+        <w:gridCol w:w="9360"/>
       </w:tblGrid>
       <w:tr>
         <w:tc>
           <w:tcPr>
-            <w:tcW w:type="dxa" w:w="10224"/>
-            <w:shd w:fill="EAF4EF"/>
+            <w:tcW w:type="dxa" w:w="9360"/>
+            <w:tcW w:w="9360" w:type="dxa"/>
+            <w:vAlign w:val="center"/>
+            <w:shd w:fill="E8F5EF"/>
           </w:tcPr>
           <w:p>
+            <w:pPr>
+              <w:spacing w:after="0"/>
+            </w:pPr>
             <w:r>
               <w:rPr>
-                <w:rFonts w:ascii="DejaVu Sans" w:hAnsi="DejaVu Sans" w:eastAsia="DejaVu Sans"/>
+                <w:rFonts w:ascii="Arial" w:hAnsi="Arial" w:eastAsia="Arial"/>
                 <w:b/>
-                <w:color w:val="005A36"/>
-                <w:sz w:val="20"/>
+                <w:i w:val="0"/>
+                <w:color w:val="056246"/>
+                <w:sz w:val="19"/>
               </w:rPr>
-              <w:t>Важно</w:t>
-              <w:br/>
-            </w:r>
-            <w:r>
-              <w:rPr>
-                <w:rFonts w:ascii="DejaVu Sans" w:hAnsi="DejaVu Sans" w:eastAsia="DejaVu Sans"/>
-                <w:sz w:val="18"/>
-              </w:rPr>
-              <w:t>В Alpha-версии AgriPartners не должен описываться как готовая система хранения средств, выплат или расчетов. Правильнее говорить: платформа моделирует и демонстрирует прозрачный рабочий процесс на NEAR Testnet.</w:t>
+              <w:t>Запись NEAR не заменяет договоры, банковские выписки, бухгалтерский учёт, сверку, счета и доказательство зачисления фиата. Прямые криптопереводы участникам в Узбекистане запрещены.</w:t>
             </w:r>
           </w:p>
         </w:tc>
       </w:tr>
     </w:tbl>
-    <w:p/>
     <w:p>
       <w:pPr>
-        <w:pStyle w:val="Heading1"/>
+        <w:spacing w:after="40" w:line="283" w:lineRule="auto"/>
       </w:pPr>
       <w:r>
         <w:rPr>
-          <w:rFonts w:ascii="DejaVu Sans" w:hAnsi="DejaVu Sans" w:eastAsia="DejaVu Sans"/>
-          <w:color w:val="005F41"/>
+          <w:rFonts w:ascii="Arial" w:hAnsi="Arial" w:eastAsia="Arial"/>
+          <w:b w:val="0"/>
+          <w:i w:val="0"/>
+          <w:color w:val="17212B"/>
+          <w:sz w:val="2"/>
         </w:rPr>
-        <w:t>7. Почему не только USDT</w:t>
       </w:r>
     </w:p>
     <w:p>
       <w:r>
-        <w:rPr>
-          <w:rFonts w:ascii="DejaVu Sans" w:hAnsi="DejaVu Sans" w:eastAsia="DejaVu Sans"/>
-          <w:sz w:val="20"/>
-        </w:rPr>
-        <w:t>Можно спросить: если USDT уже похож на доллар, зачем нужен NEAR? Ответ: USDT может быть удобен как средство расчетов, но AgriPartners решает более широкую задачу - управление процессом, событиями, отчетностью и прозрачностью.</w:t>
-      </w:r>
-    </w:p>
-    <w:p>
-      <w:r>
-        <w:rPr>
-          <w:rFonts w:ascii="DejaVu Sans" w:hAnsi="DejaVu Sans" w:eastAsia="DejaVu Sans"/>
-          <w:sz w:val="20"/>
-        </w:rPr>
-        <w:t>NEAR может использоваться не только как актив. NEAR может быть инфраструктурой для Smart Contracts (смарт-контрактов), Wallet (кошельков), цифровых подтверждений и истории событий.</w:t>
-      </w:r>
-    </w:p>
-    <w:p>
-      <w:r>
-        <w:rPr>
-          <w:rFonts w:ascii="DejaVu Sans" w:hAnsi="DejaVu Sans" w:eastAsia="DejaVu Sans"/>
-          <w:sz w:val="20"/>
-        </w:rPr>
-        <w:t>Smart Contract (смарт-контракт) - это программа в блокчейне, которая выполняет заранее заданные правила. Простыми словами: если выполнено условие, система может автоматически зафиксировать событие или разрешить следующий шаг.</w:t>
-      </w:r>
-    </w:p>
-    <w:p>
-      <w:r>
-        <w:rPr>
-          <w:rFonts w:ascii="DejaVu Sans" w:hAnsi="DejaVu Sans" w:eastAsia="DejaVu Sans"/>
-          <w:sz w:val="20"/>
-        </w:rPr>
-        <w:t>Wallet (криптокошелек) - это цифровой кошелек пользователя. Через него пользователь подтверждает действия в Web3-системе.</w:t>
+        <w:br w:type="page"/>
       </w:r>
     </w:p>
     <w:p>
       <w:pPr>
-        <w:pStyle w:val="Heading1"/>
+        <w:spacing w:after="60" w:line="283" w:lineRule="auto"/>
+        <w:jc w:val="center"/>
       </w:pPr>
       <w:r>
         <w:rPr>
-          <w:rFonts w:ascii="DejaVu Sans" w:hAnsi="DejaVu Sans" w:eastAsia="DejaVu Sans"/>
-          <w:color w:val="005F41"/>
+          <w:rFonts w:ascii="Arial" w:hAnsi="Arial" w:eastAsia="Arial"/>
+          <w:b/>
+          <w:i w:val="0"/>
+          <w:color w:val="087F5B"/>
+          <w:sz w:val="18"/>
         </w:rPr>
-        <w:t>8. Текущая архитектура Alpha</w:t>
-      </w:r>
-    </w:p>
-    <w:p>
-      <w:r>
-        <w:rPr>
-          <w:rFonts w:ascii="DejaVu Sans" w:hAnsi="DejaVu Sans" w:eastAsia="DejaVu Sans"/>
-          <w:sz w:val="20"/>
-        </w:rPr>
-        <w:t>В текущей Alpha v1.2 AgriPartners уже включает несколько ключевых модулей. Module (модуль) - это отдельная часть системы, которая выполняет конкретную функцию.</w:t>
+        <w:t>AGRIPARTNERS</w:t>
       </w:r>
     </w:p>
     <w:p>
       <w:pPr>
-        <w:pStyle w:val="ListBullet"/>
+        <w:spacing w:after="80" w:line="283" w:lineRule="auto"/>
+        <w:jc w:val="center"/>
       </w:pPr>
       <w:r>
         <w:rPr>
-          <w:rFonts w:ascii="DejaVu Sans" w:hAnsi="DejaVu Sans" w:eastAsia="DejaVu Sans"/>
-          <w:sz w:val="20"/>
+          <w:rFonts w:ascii="Arial" w:hAnsi="Arial" w:eastAsia="Arial"/>
+          <w:b/>
+          <w:i w:val="0"/>
+          <w:color w:val="17324D"/>
+          <w:sz w:val="50"/>
         </w:rPr>
-        <w:t>Investor Portal (кабинет инвестора) - место, где инвестор видит сделки, статусы, отчеты и финансовую информацию.</w:t>
+        <w:t>Роли и ценность</w:t>
       </w:r>
     </w:p>
     <w:p>
       <w:pPr>
-        <w:pStyle w:val="ListBullet"/>
+        <w:spacing w:after="280" w:line="283" w:lineRule="auto"/>
+        <w:jc w:val="center"/>
       </w:pPr>
       <w:r>
         <w:rPr>
-          <w:rFonts w:ascii="DejaVu Sans" w:hAnsi="DejaVu Sans" w:eastAsia="DejaVu Sans"/>
-          <w:sz w:val="20"/>
+          <w:rFonts w:ascii="Arial" w:hAnsi="Arial" w:eastAsia="Arial"/>
+          <w:b w:val="0"/>
+          <w:i w:val="0"/>
+          <w:color w:val="5E6B78"/>
+          <w:sz w:val="25"/>
         </w:rPr>
-        <w:t>Farmer Portal (кабинет фермера) - место, где фермер видит свои активные сделки, циклы и отправляет отчеты.</w:t>
-      </w:r>
-    </w:p>
-    <w:p>
-      <w:pPr>
-        <w:pStyle w:val="ListBullet"/>
-      </w:pPr>
-      <w:r>
-        <w:rPr>
-          <w:rFonts w:ascii="DejaVu Sans" w:hAnsi="DejaVu Sans" w:eastAsia="DejaVu Sans"/>
-          <w:sz w:val="20"/>
-        </w:rPr>
-        <w:t>Admin Portal (административная панель) - инструмент оператора платформы для контроля сделок и статусов.</w:t>
-      </w:r>
-    </w:p>
-    <w:p>
-      <w:pPr>
-        <w:pStyle w:val="ListBullet"/>
-      </w:pPr>
-      <w:r>
-        <w:rPr>
-          <w:rFonts w:ascii="DejaVu Sans" w:hAnsi="DejaVu Sans" w:eastAsia="DejaVu Sans"/>
-          <w:sz w:val="20"/>
-        </w:rPr>
-        <w:t>Treasury Dashboard (панель казначейства) - экран для учета и анализа финансовых потоков.</w:t>
-      </w:r>
-    </w:p>
-    <w:p>
-      <w:pPr>
-        <w:pStyle w:val="ListBullet"/>
-      </w:pPr>
-      <w:r>
-        <w:rPr>
-          <w:rFonts w:ascii="DejaVu Sans" w:hAnsi="DejaVu Sans" w:eastAsia="DejaVu Sans"/>
-          <w:sz w:val="20"/>
-        </w:rPr>
-        <w:t>Treasury Shadow Accounting (теневой учет казначейства) - модель учета, которая показывает финансовую логику без утверждения, что платформа уже хранит или выплачивает реальные средства.</w:t>
-      </w:r>
-    </w:p>
-    <w:p>
-      <w:pPr>
-        <w:pStyle w:val="ListBullet"/>
-      </w:pPr>
-      <w:r>
-        <w:rPr>
-          <w:rFonts w:ascii="DejaVu Sans" w:hAnsi="DejaVu Sans" w:eastAsia="DejaVu Sans"/>
-          <w:sz w:val="20"/>
-        </w:rPr>
-        <w:t>Presentation Mode (режим презентации) - демонстрационный режим для инвесторов, партнеров и экосистемы NEAR.</w:t>
-      </w:r>
-    </w:p>
-    <w:p>
-      <w:pPr>
-        <w:pStyle w:val="ListBullet"/>
-      </w:pPr>
-      <w:r>
-        <w:rPr>
-          <w:rFonts w:ascii="DejaVu Sans" w:hAnsi="DejaVu Sans" w:eastAsia="DejaVu Sans"/>
-          <w:sz w:val="20"/>
-        </w:rPr>
-        <w:t>NEAR Testnet Integration (интеграция с тестовой сетью NEAR) - подключение к тестовой блокчейн-среде для проверки логики.</w:t>
-      </w:r>
-    </w:p>
-    <w:p>
-      <w:pPr>
-        <w:pStyle w:val="Heading1"/>
-      </w:pPr>
-      <w:r>
-        <w:rPr>
-          <w:rFonts w:ascii="DejaVu Sans" w:hAnsi="DejaVu Sans" w:eastAsia="DejaVu Sans"/>
-          <w:color w:val="005F41"/>
-        </w:rPr>
-        <w:t>9. Какие модели финансирования возможны</w:t>
-      </w:r>
-    </w:p>
-    <w:p>
-      <w:r>
-        <w:rPr>
-          <w:rFonts w:ascii="DejaVu Sans" w:hAnsi="DejaVu Sans" w:eastAsia="DejaVu Sans"/>
-          <w:sz w:val="20"/>
-        </w:rPr>
-        <w:t>AgriPartners не обязан ограничиваться только одной моделью финансирования. Платформа может работать как операционная система для разных вариантов.</w:t>
-      </w:r>
-    </w:p>
-    <w:p>
-      <w:pPr>
-        <w:pStyle w:val="ListBullet"/>
-      </w:pPr>
-      <w:r>
-        <w:rPr>
-          <w:rFonts w:ascii="DejaVu Sans" w:hAnsi="DejaVu Sans" w:eastAsia="DejaVu Sans"/>
-          <w:sz w:val="20"/>
-        </w:rPr>
-        <w:t>Crypto-first модель: инвестор использует криптовалюту, например NEAR или USDT, а дальнейшая конвертация делается через партнерскую инфраструктуру.</w:t>
-      </w:r>
-    </w:p>
-    <w:p>
-      <w:pPr>
-        <w:pStyle w:val="ListBullet"/>
-      </w:pPr>
-      <w:r>
-        <w:rPr>
-          <w:rFonts w:ascii="DejaVu Sans" w:hAnsi="DejaVu Sans" w:eastAsia="DejaVu Sans"/>
-          <w:sz w:val="20"/>
-        </w:rPr>
-        <w:t>Hybrid модель: инвестор может переводить средства традиционным способом, а блокчейн используется для прозрачной фиксации событий и отчетов.</w:t>
-      </w:r>
-    </w:p>
-    <w:p>
-      <w:pPr>
-        <w:pStyle w:val="ListBullet"/>
-      </w:pPr>
-      <w:r>
-        <w:rPr>
-          <w:rFonts w:ascii="DejaVu Sans" w:hAnsi="DejaVu Sans" w:eastAsia="DejaVu Sans"/>
-          <w:sz w:val="20"/>
-        </w:rPr>
-        <w:t>Bank-partner модель: банк или платежный партнер отвечает за реальные денежные переводы, а AgriPartners ведет цифровой workflow и отчетность.</w:t>
-      </w:r>
-    </w:p>
-    <w:p>
-      <w:pPr>
-        <w:pStyle w:val="ListBullet"/>
-      </w:pPr>
-      <w:r>
-        <w:rPr>
-          <w:rFonts w:ascii="DejaVu Sans" w:hAnsi="DejaVu Sans" w:eastAsia="DejaVu Sans"/>
-          <w:sz w:val="20"/>
-        </w:rPr>
-        <w:t>White Label модель: другая организация использует AgriPartners под своим брендом. White Label означает, что технология предоставляется партнеру, а внешне может выглядеть как его собственная платформа.</w:t>
-      </w:r>
-    </w:p>
-    <w:p>
-      <w:pPr>
-        <w:pStyle w:val="ListBullet"/>
-      </w:pPr>
-      <w:r>
-        <w:rPr>
-          <w:rFonts w:ascii="DejaVu Sans" w:hAnsi="DejaVu Sans" w:eastAsia="DejaVu Sans"/>
-          <w:sz w:val="20"/>
-        </w:rPr>
-        <w:t>SaaS модель: AgriPartners предоставляет доступ к платформе за подписку или сервисную плату. SaaS означает Software as a Service, то есть программное обеспечение как услуга.</w:t>
-      </w:r>
-    </w:p>
-    <w:p>
-      <w:pPr>
-        <w:pStyle w:val="ListBullet"/>
-      </w:pPr>
-      <w:r>
-        <w:rPr>
-          <w:rFonts w:ascii="DejaVu Sans" w:hAnsi="DejaVu Sans" w:eastAsia="DejaVu Sans"/>
-          <w:sz w:val="20"/>
-        </w:rPr>
-        <w:t>Data &amp; Analytics модель: со временем платформа может предоставлять аналитику по проектам, рискам, доходности и отчетности. Analytics означает анализ данных для принятия решений.</w:t>
-      </w:r>
-    </w:p>
-    <w:p>
-      <w:pPr>
-        <w:pStyle w:val="Heading1"/>
-      </w:pPr>
-      <w:r>
-        <w:rPr>
-          <w:rFonts w:ascii="DejaVu Sans" w:hAnsi="DejaVu Sans" w:eastAsia="DejaVu Sans"/>
-          <w:color w:val="005F41"/>
-        </w:rPr>
-        <w:t>10. Выгоды для инвестора</w:t>
-      </w:r>
-    </w:p>
-    <w:p>
-      <w:r>
-        <w:rPr>
-          <w:rFonts w:ascii="DejaVu Sans" w:hAnsi="DejaVu Sans" w:eastAsia="DejaVu Sans"/>
-          <w:sz w:val="20"/>
-        </w:rPr>
-        <w:t>Investor (инвестор) получает больше прозрачности. Он может видеть, какой проект финансируется, кто фермер, какой статус сделки, есть ли отчет и какой ожидается результат.</w:t>
-      </w:r>
-    </w:p>
-    <w:p>
-      <w:pPr>
-        <w:pStyle w:val="ListBullet"/>
-      </w:pPr>
-      <w:r>
-        <w:rPr>
-          <w:rFonts w:ascii="DejaVu Sans" w:hAnsi="DejaVu Sans" w:eastAsia="DejaVu Sans"/>
-          <w:sz w:val="20"/>
-        </w:rPr>
-        <w:t>Единый кабинет вместо разрозненных сообщений и таблиц.</w:t>
-      </w:r>
-    </w:p>
-    <w:p>
-      <w:pPr>
-        <w:pStyle w:val="ListBullet"/>
-      </w:pPr>
-      <w:r>
-        <w:rPr>
-          <w:rFonts w:ascii="DejaVu Sans" w:hAnsi="DejaVu Sans" w:eastAsia="DejaVu Sans"/>
-          <w:sz w:val="20"/>
-        </w:rPr>
-        <w:t>Понимание статуса проекта: создан, профинансирован, активен, завершен.</w:t>
-      </w:r>
-    </w:p>
-    <w:p>
-      <w:pPr>
-        <w:pStyle w:val="ListBullet"/>
-      </w:pPr>
-      <w:r>
-        <w:rPr>
-          <w:rFonts w:ascii="DejaVu Sans" w:hAnsi="DejaVu Sans" w:eastAsia="DejaVu Sans"/>
-          <w:sz w:val="20"/>
-        </w:rPr>
-        <w:t>Доступ к отчетам фермера.</w:t>
-      </w:r>
-    </w:p>
-    <w:p>
-      <w:pPr>
-        <w:pStyle w:val="ListBullet"/>
-      </w:pPr>
-      <w:r>
-        <w:rPr>
-          <w:rFonts w:ascii="DejaVu Sans" w:hAnsi="DejaVu Sans" w:eastAsia="DejaVu Sans"/>
-          <w:sz w:val="20"/>
-        </w:rPr>
-        <w:t>Возможность видеть историю проекта.</w:t>
-      </w:r>
-    </w:p>
-    <w:p>
-      <w:pPr>
-        <w:pStyle w:val="ListBullet"/>
-      </w:pPr>
-      <w:r>
-        <w:rPr>
-          <w:rFonts w:ascii="DejaVu Sans" w:hAnsi="DejaVu Sans" w:eastAsia="DejaVu Sans"/>
-          <w:sz w:val="20"/>
-        </w:rPr>
-        <w:t>Потенциальная интеграция с блокчейн-записями для проверки событий.</w:t>
-      </w:r>
-    </w:p>
-    <w:p>
-      <w:r>
-        <w:rPr>
-          <w:rFonts w:ascii="DejaVu Sans" w:hAnsi="DejaVu Sans" w:eastAsia="DejaVu Sans"/>
-          <w:sz w:val="20"/>
-        </w:rPr>
-        <w:t>ROI (Return on Investment) - это доходность инвестиций. Простыми словами, ROI показывает, сколько инвестор заработал относительно вложенной суммы. APR (Annual Percentage Rate) - годовая процентная доходность, то есть примерная доходность в пересчете на год.</w:t>
-      </w:r>
-    </w:p>
-    <w:p>
-      <w:pPr>
-        <w:pStyle w:val="Heading1"/>
-      </w:pPr>
-      <w:r>
-        <w:rPr>
-          <w:rFonts w:ascii="DejaVu Sans" w:hAnsi="DejaVu Sans" w:eastAsia="DejaVu Sans"/>
-          <w:color w:val="005F41"/>
-        </w:rPr>
-        <w:t>11. Выгоды для фермера</w:t>
-      </w:r>
-    </w:p>
-    <w:p>
-      <w:r>
-        <w:rPr>
-          <w:rFonts w:ascii="DejaVu Sans" w:hAnsi="DejaVu Sans" w:eastAsia="DejaVu Sans"/>
-          <w:sz w:val="20"/>
-        </w:rPr>
-        <w:t>Farmer (фермер) получает более структурированный способ работать с инвесторами. Ему не нужно каждый раз объяснять все вручную: проект, циклы, отчеты и подтверждения можно вести внутри платформы.</w:t>
-      </w:r>
-    </w:p>
-    <w:p>
-      <w:pPr>
-        <w:pStyle w:val="ListBullet"/>
-      </w:pPr>
-      <w:r>
-        <w:rPr>
-          <w:rFonts w:ascii="DejaVu Sans" w:hAnsi="DejaVu Sans" w:eastAsia="DejaVu Sans"/>
-          <w:sz w:val="20"/>
-        </w:rPr>
-        <w:t>Фермер может показать историю своей работы.</w:t>
-      </w:r>
-    </w:p>
-    <w:p>
-      <w:pPr>
-        <w:pStyle w:val="ListBullet"/>
-      </w:pPr>
-      <w:r>
-        <w:rPr>
-          <w:rFonts w:ascii="DejaVu Sans" w:hAnsi="DejaVu Sans" w:eastAsia="DejaVu Sans"/>
-          <w:sz w:val="20"/>
-        </w:rPr>
-        <w:t>Фермер получает цифровую репутацию.</w:t>
-      </w:r>
-    </w:p>
-    <w:p>
-      <w:pPr>
-        <w:pStyle w:val="ListBullet"/>
-      </w:pPr>
-      <w:r>
-        <w:rPr>
-          <w:rFonts w:ascii="DejaVu Sans" w:hAnsi="DejaVu Sans" w:eastAsia="DejaVu Sans"/>
-          <w:sz w:val="20"/>
-        </w:rPr>
-        <w:t>Фермеру проще готовить отчеты по циклам.</w:t>
-      </w:r>
-    </w:p>
-    <w:p>
-      <w:pPr>
-        <w:pStyle w:val="ListBullet"/>
-      </w:pPr>
-      <w:r>
-        <w:rPr>
-          <w:rFonts w:ascii="DejaVu Sans" w:hAnsi="DejaVu Sans" w:eastAsia="DejaVu Sans"/>
-          <w:sz w:val="20"/>
-        </w:rPr>
-        <w:t>Инвесторам легче доверять фермеру, если информация прозрачна.</w:t>
-      </w:r>
-    </w:p>
-    <w:p>
-      <w:pPr>
-        <w:pStyle w:val="ListBullet"/>
-      </w:pPr>
-      <w:r>
-        <w:rPr>
-          <w:rFonts w:ascii="DejaVu Sans" w:hAnsi="DejaVu Sans" w:eastAsia="DejaVu Sans"/>
-          <w:sz w:val="20"/>
-        </w:rPr>
-        <w:t>В будущем успешные фермеры могут получать финансирование быстрее.</w:t>
-      </w:r>
-    </w:p>
-    <w:p>
-      <w:pPr>
-        <w:pStyle w:val="Heading1"/>
-      </w:pPr>
-      <w:r>
-        <w:rPr>
-          <w:rFonts w:ascii="DejaVu Sans" w:hAnsi="DejaVu Sans" w:eastAsia="DejaVu Sans"/>
-          <w:color w:val="005F41"/>
-        </w:rPr>
-        <w:t>12. Выгоды для администратора платформы</w:t>
-      </w:r>
-    </w:p>
-    <w:p>
-      <w:r>
-        <w:rPr>
-          <w:rFonts w:ascii="DejaVu Sans" w:hAnsi="DejaVu Sans" w:eastAsia="DejaVu Sans"/>
-          <w:sz w:val="20"/>
-        </w:rPr>
-        <w:t>Administrator (администратор) - это человек или команда, которая управляет процессом внутри платформы. Администратор видит сделки, статусы, отчеты, роли пользователей и финансовую логику.</w:t>
-      </w:r>
-    </w:p>
-    <w:p>
-      <w:pPr>
-        <w:pStyle w:val="ListBullet"/>
-      </w:pPr>
-      <w:r>
-        <w:rPr>
-          <w:rFonts w:ascii="DejaVu Sans" w:hAnsi="DejaVu Sans" w:eastAsia="DejaVu Sans"/>
-          <w:sz w:val="20"/>
-        </w:rPr>
-        <w:t>Меньше ручной работы с таблицами.</w:t>
-      </w:r>
-    </w:p>
-    <w:p>
-      <w:pPr>
-        <w:pStyle w:val="ListBullet"/>
-      </w:pPr>
-      <w:r>
-        <w:rPr>
-          <w:rFonts w:ascii="DejaVu Sans" w:hAnsi="DejaVu Sans" w:eastAsia="DejaVu Sans"/>
-          <w:sz w:val="20"/>
-        </w:rPr>
-        <w:t>Единая история сделок.</w:t>
-      </w:r>
-    </w:p>
-    <w:p>
-      <w:pPr>
-        <w:pStyle w:val="ListBullet"/>
-      </w:pPr>
-      <w:r>
-        <w:rPr>
-          <w:rFonts w:ascii="DejaVu Sans" w:hAnsi="DejaVu Sans" w:eastAsia="DejaVu Sans"/>
-          <w:sz w:val="20"/>
-        </w:rPr>
-        <w:t>Более понятный контроль статусов.</w:t>
-      </w:r>
-    </w:p>
-    <w:p>
-      <w:pPr>
-        <w:pStyle w:val="ListBullet"/>
-      </w:pPr>
-      <w:r>
-        <w:rPr>
-          <w:rFonts w:ascii="DejaVu Sans" w:hAnsi="DejaVu Sans" w:eastAsia="DejaVu Sans"/>
-          <w:sz w:val="20"/>
-        </w:rPr>
-        <w:t>Удобная подготовка материалов для инвесторов.</w:t>
-      </w:r>
-    </w:p>
-    <w:p>
-      <w:pPr>
-        <w:pStyle w:val="ListBullet"/>
-      </w:pPr>
-      <w:r>
-        <w:rPr>
-          <w:rFonts w:ascii="DejaVu Sans" w:hAnsi="DejaVu Sans" w:eastAsia="DejaVu Sans"/>
-          <w:sz w:val="20"/>
-        </w:rPr>
-        <w:t>Audit Trail (аудиторский след) - история действий, по которой можно понять, кто и когда что сделал.</w:t>
-      </w:r>
-    </w:p>
-    <w:p>
-      <w:pPr>
-        <w:pStyle w:val="Heading1"/>
-      </w:pPr>
-      <w:r>
-        <w:rPr>
-          <w:rFonts w:ascii="DejaVu Sans" w:hAnsi="DejaVu Sans" w:eastAsia="DejaVu Sans"/>
-          <w:color w:val="005F41"/>
-        </w:rPr>
-        <w:t>13. Выгоды для экосистемы NEAR</w:t>
-      </w:r>
-    </w:p>
-    <w:p>
-      <w:r>
-        <w:rPr>
-          <w:rFonts w:ascii="DejaVu Sans" w:hAnsi="DejaVu Sans" w:eastAsia="DejaVu Sans"/>
-          <w:sz w:val="20"/>
-        </w:rPr>
-        <w:t>Для NEAR экосистемы AgriPartners может стать примером практического применения блокчейна в реальном секторе. Это не только торговля токенами, а use case (практический сценарий использования) для сельского хозяйства, инвестиций и отчетности.</w:t>
-      </w:r>
-    </w:p>
-    <w:p>
-      <w:pPr>
-        <w:pStyle w:val="ListBullet"/>
-      </w:pPr>
-      <w:r>
-        <w:rPr>
-          <w:rFonts w:ascii="DejaVu Sans" w:hAnsi="DejaVu Sans" w:eastAsia="DejaVu Sans"/>
-          <w:sz w:val="20"/>
-        </w:rPr>
-        <w:t>Показывает RWA-направление в сельском хозяйстве.</w:t>
-      </w:r>
-    </w:p>
-    <w:p>
-      <w:pPr>
-        <w:pStyle w:val="ListBullet"/>
-      </w:pPr>
-      <w:r>
-        <w:rPr>
-          <w:rFonts w:ascii="DejaVu Sans" w:hAnsi="DejaVu Sans" w:eastAsia="DejaVu Sans"/>
-          <w:sz w:val="20"/>
-        </w:rPr>
-        <w:t>Демонстрирует применение NEAR Testnet для реальных процессов.</w:t>
-      </w:r>
-    </w:p>
-    <w:p>
-      <w:pPr>
-        <w:pStyle w:val="ListBullet"/>
-      </w:pPr>
-      <w:r>
-        <w:rPr>
-          <w:rFonts w:ascii="DejaVu Sans" w:hAnsi="DejaVu Sans" w:eastAsia="DejaVu Sans"/>
-          <w:sz w:val="20"/>
-        </w:rPr>
-        <w:t>Создает потенциальный путь к партнерствам с фермерами, инвесторами и организациями.</w:t>
-      </w:r>
-    </w:p>
-    <w:p>
-      <w:pPr>
-        <w:pStyle w:val="ListBullet"/>
-      </w:pPr>
-      <w:r>
-        <w:rPr>
-          <w:rFonts w:ascii="DejaVu Sans" w:hAnsi="DejaVu Sans" w:eastAsia="DejaVu Sans"/>
-          <w:sz w:val="20"/>
-        </w:rPr>
-        <w:t>Помогает экосистеме показать, что блокчейн может использоваться для прозрачных рабочих процессов, а не только для спекуляций.</w:t>
-      </w:r>
-    </w:p>
-    <w:p>
-      <w:pPr>
-        <w:pStyle w:val="Heading1"/>
-      </w:pPr>
-      <w:r>
-        <w:rPr>
-          <w:rFonts w:ascii="DejaVu Sans" w:hAnsi="DejaVu Sans" w:eastAsia="DejaVu Sans"/>
-          <w:color w:val="005F41"/>
-        </w:rPr>
-        <w:t>14. Выгоды для банков, партнеров и регуляторов</w:t>
-      </w:r>
-    </w:p>
-    <w:p>
-      <w:r>
-        <w:rPr>
-          <w:rFonts w:ascii="DejaVu Sans" w:hAnsi="DejaVu Sans" w:eastAsia="DejaVu Sans"/>
-          <w:sz w:val="20"/>
-        </w:rPr>
-        <w:t>Банки и регуляторы обычно осторожно относятся к криптовалютам. Поэтому AgriPartners должен показывать не только технологию, но и управляемость процесса: кто участвует, откуда деньги, куда они идут, какие отчеты есть и какие правила соблюдаются.</w:t>
-      </w:r>
-    </w:p>
-    <w:p>
-      <w:pPr>
-        <w:pStyle w:val="ListBullet"/>
-      </w:pPr>
-      <w:r>
-        <w:rPr>
-          <w:rFonts w:ascii="DejaVu Sans" w:hAnsi="DejaVu Sans" w:eastAsia="DejaVu Sans"/>
-          <w:sz w:val="20"/>
-        </w:rPr>
-        <w:t>Банки могут быть платежными партнерами для конвертации и расчетов.</w:t>
-      </w:r>
-    </w:p>
-    <w:p>
-      <w:pPr>
-        <w:pStyle w:val="ListBullet"/>
-      </w:pPr>
-      <w:r>
-        <w:rPr>
-          <w:rFonts w:ascii="DejaVu Sans" w:hAnsi="DejaVu Sans" w:eastAsia="DejaVu Sans"/>
-          <w:sz w:val="20"/>
-        </w:rPr>
-        <w:t>Юристы могут помочь определить допустимую модель работы.</w:t>
-      </w:r>
-    </w:p>
-    <w:p>
-      <w:pPr>
-        <w:pStyle w:val="ListBullet"/>
-      </w:pPr>
-      <w:r>
-        <w:rPr>
-          <w:rFonts w:ascii="DejaVu Sans" w:hAnsi="DejaVu Sans" w:eastAsia="DejaVu Sans"/>
-          <w:sz w:val="20"/>
-        </w:rPr>
-        <w:t>Государственные органы могут видеть более прозрачную отчетность по агропроектам.</w:t>
-      </w:r>
-    </w:p>
-    <w:p>
-      <w:pPr>
-        <w:pStyle w:val="ListBullet"/>
-      </w:pPr>
-      <w:r>
-        <w:rPr>
-          <w:rFonts w:ascii="DejaVu Sans" w:hAnsi="DejaVu Sans" w:eastAsia="DejaVu Sans"/>
-          <w:sz w:val="20"/>
-        </w:rPr>
-        <w:t>Партнеры могут использовать платформу как инструмент контроля и отчетности.</w:t>
-      </w:r>
-    </w:p>
-    <w:p>
-      <w:pPr>
-        <w:pStyle w:val="Heading1"/>
-      </w:pPr>
-      <w:r>
-        <w:rPr>
-          <w:rFonts w:ascii="DejaVu Sans" w:hAnsi="DejaVu Sans" w:eastAsia="DejaVu Sans"/>
-          <w:color w:val="005F41"/>
-        </w:rPr>
-        <w:t>15. Юридические и регуляторные ограничения</w:t>
-      </w:r>
-    </w:p>
-    <w:p>
-      <w:r>
-        <w:rPr>
-          <w:rFonts w:ascii="DejaVu Sans" w:hAnsi="DejaVu Sans" w:eastAsia="DejaVu Sans"/>
-          <w:sz w:val="20"/>
-        </w:rPr>
-        <w:t>Если AgriPartners в будущем будет работать с реальными деньгами, криптовалютой, USDT или выплатами, потребуется юридическая модель. Это может включать KYC, AML, договоры, налоговый учет, ограничения по юрисдикциям и правила защиты инвесторов.</w:t>
-      </w:r>
-    </w:p>
-    <w:p>
-      <w:r>
-        <w:rPr>
-          <w:rFonts w:ascii="DejaVu Sans" w:hAnsi="DejaVu Sans" w:eastAsia="DejaVu Sans"/>
-          <w:sz w:val="20"/>
-        </w:rPr>
-        <w:t>Поэтому на текущем этапе правильнее позиционировать AgriPartners как Alpha/Testnet платформу для прозрачных инвестиционных workflow, а не как готовый инвестиционный, платежный, депозитарный или расчетный сервис.</w:t>
-      </w:r>
-    </w:p>
-    <w:tbl>
-      <w:tblPr>
-        <w:tblW w:type="auto" w:w="0"/>
-        <w:jc w:val="center"/>
-        <w:tblLook w:firstColumn="1" w:firstRow="1" w:lastColumn="0" w:lastRow="0" w:noHBand="0" w:noVBand="1" w:val="04A0"/>
-      </w:tblPr>
-      <w:tblGrid>
-        <w:gridCol w:w="10224"/>
-      </w:tblGrid>
-      <w:tr>
-        <w:tc>
-          <w:tcPr>
-            <w:tcW w:type="dxa" w:w="10224"/>
-            <w:shd w:fill="EAF4EF"/>
-          </w:tcPr>
-          <w:p>
-            <w:r>
-              <w:rPr>
-                <w:rFonts w:ascii="DejaVu Sans" w:hAnsi="DejaVu Sans" w:eastAsia="DejaVu Sans"/>
-                <w:b/>
-                <w:color w:val="005A36"/>
-                <w:sz w:val="20"/>
-              </w:rPr>
-              <w:t>Простыми словами</w:t>
-              <w:br/>
-            </w:r>
-            <w:r>
-              <w:rPr>
-                <w:rFonts w:ascii="DejaVu Sans" w:hAnsi="DejaVu Sans" w:eastAsia="DejaVu Sans"/>
-                <w:sz w:val="18"/>
-              </w:rPr>
-              <w:t>Сейчас важно показывать ценность платформы: прозрачность, отчетность, роли, статусы и проверяемость. Реальные платежи и выплаты должны внедряться только после юридической и партнерской подготовки.</w:t>
-            </w:r>
-          </w:p>
-        </w:tc>
-      </w:tr>
-    </w:tbl>
-    <w:p/>
-    <w:p>
-      <w:pPr>
-        <w:pStyle w:val="Heading1"/>
-      </w:pPr>
-      <w:r>
-        <w:rPr>
-          <w:rFonts w:ascii="DejaVu Sans" w:hAnsi="DejaVu Sans" w:eastAsia="DejaVu Sans"/>
-          <w:color w:val="005F41"/>
-        </w:rPr>
-        <w:t>16. Частые вопросы заинтересованных сторон</w:t>
-      </w:r>
-    </w:p>
-    <w:p>
-      <w:r>
-        <w:rPr>
-          <w:rFonts w:ascii="DejaVu Sans" w:hAnsi="DejaVu Sans" w:eastAsia="DejaVu Sans"/>
-          <w:b/>
-          <w:sz w:val="20"/>
-        </w:rPr>
-        <w:t>Q: AgriPartners - это криптовалютный проект?</w:t>
-      </w:r>
-    </w:p>
-    <w:p>
-      <w:r>
-        <w:rPr>
-          <w:rFonts w:ascii="DejaVu Sans" w:hAnsi="DejaVu Sans" w:eastAsia="DejaVu Sans"/>
-          <w:sz w:val="20"/>
-        </w:rPr>
-        <w:t>A: Не только. Это платформа для прозрачных сельскохозяйственных инвестиционных процессов. Криптовалюта и блокчейн могут быть частью инфраструктуры, но главная ценность - прозрачность workflow и отчетности.</w:t>
-      </w:r>
-    </w:p>
-    <w:p>
-      <w:r>
-        <w:rPr>
-          <w:rFonts w:ascii="DejaVu Sans" w:hAnsi="DejaVu Sans" w:eastAsia="DejaVu Sans"/>
-          <w:b/>
-          <w:sz w:val="20"/>
-        </w:rPr>
-        <w:t>Q: Можно ли финансировать проекты через NEAR?</w:t>
-      </w:r>
-    </w:p>
-    <w:p>
-      <w:r>
-        <w:rPr>
-          <w:rFonts w:ascii="DejaVu Sans" w:hAnsi="DejaVu Sans" w:eastAsia="DejaVu Sans"/>
-          <w:sz w:val="20"/>
-        </w:rPr>
-        <w:t>A: Технически такой вариант возможен, но для реального использования нужны юридическая модель, KYC/AML, партнеры для конвертации и понятные правила расчетов.</w:t>
-      </w:r>
-    </w:p>
-    <w:p>
-      <w:r>
-        <w:rPr>
-          <w:rFonts w:ascii="DejaVu Sans" w:hAnsi="DejaVu Sans" w:eastAsia="DejaVu Sans"/>
-          <w:b/>
-          <w:sz w:val="20"/>
-        </w:rPr>
-        <w:t>Q: Почему не использовать только USDT?</w:t>
-      </w:r>
-    </w:p>
-    <w:p>
-      <w:r>
-        <w:rPr>
-          <w:rFonts w:ascii="DejaVu Sans" w:hAnsi="DejaVu Sans" w:eastAsia="DejaVu Sans"/>
-          <w:sz w:val="20"/>
-        </w:rPr>
-        <w:t>A: USDT может быть удобным средством расчетов, но он не решает всю задачу: нужно управлять сделками, отчетами, статусами, ролями и историей событий.</w:t>
-      </w:r>
-    </w:p>
-    <w:p>
-      <w:r>
-        <w:rPr>
-          <w:rFonts w:ascii="DejaVu Sans" w:hAnsi="DejaVu Sans" w:eastAsia="DejaVu Sans"/>
-          <w:b/>
-          <w:sz w:val="20"/>
-        </w:rPr>
-        <w:t>Q: AgriPartners хранит деньги пользователей?</w:t>
-      </w:r>
-    </w:p>
-    <w:p>
-      <w:r>
-        <w:rPr>
-          <w:rFonts w:ascii="DejaVu Sans" w:hAnsi="DejaVu Sans" w:eastAsia="DejaVu Sans"/>
-          <w:sz w:val="20"/>
-        </w:rPr>
-        <w:t>A: В текущей Alpha/Testnet версии AgriPartners не должен позиционироваться как сервис хранения или выплаты реальных средств. Он демонстрирует рабочую логику и учет.</w:t>
-      </w:r>
-    </w:p>
-    <w:p>
-      <w:r>
-        <w:rPr>
-          <w:rFonts w:ascii="DejaVu Sans" w:hAnsi="DejaVu Sans" w:eastAsia="DejaVu Sans"/>
-          <w:b/>
-          <w:sz w:val="20"/>
-        </w:rPr>
-        <w:t>Q: Зачем фермеру такая система?</w:t>
-      </w:r>
-    </w:p>
-    <w:p>
-      <w:r>
-        <w:rPr>
-          <w:rFonts w:ascii="DejaVu Sans" w:hAnsi="DejaVu Sans" w:eastAsia="DejaVu Sans"/>
-          <w:sz w:val="20"/>
-        </w:rPr>
-        <w:t>A: Фермер получает структурированный способ показывать проект, подтверждать этапы и формировать репутацию для будущего финансирования.</w:t>
-      </w:r>
-    </w:p>
-    <w:p>
-      <w:r>
-        <w:rPr>
-          <w:rFonts w:ascii="DejaVu Sans" w:hAnsi="DejaVu Sans" w:eastAsia="DejaVu Sans"/>
-          <w:b/>
-          <w:sz w:val="20"/>
-        </w:rPr>
-        <w:t>Q: Зачем инвестору такая система?</w:t>
-      </w:r>
-    </w:p>
-    <w:p>
-      <w:r>
-        <w:rPr>
-          <w:rFonts w:ascii="DejaVu Sans" w:hAnsi="DejaVu Sans" w:eastAsia="DejaVu Sans"/>
-          <w:sz w:val="20"/>
-        </w:rPr>
-        <w:t>A: Инвестор получает больше прозрачности: он видит проект, статус, отчеты, ожидаемый результат и историю действий.</w:t>
-      </w:r>
-    </w:p>
-    <w:p>
-      <w:r>
-        <w:rPr>
-          <w:rFonts w:ascii="DejaVu Sans" w:hAnsi="DejaVu Sans" w:eastAsia="DejaVu Sans"/>
-          <w:b/>
-          <w:sz w:val="20"/>
-        </w:rPr>
-        <w:t>Q: Можно ли использовать платформу без криптовалюты?</w:t>
-      </w:r>
-    </w:p>
-    <w:p>
-      <w:r>
-        <w:rPr>
-          <w:rFonts w:ascii="DejaVu Sans" w:hAnsi="DejaVu Sans" w:eastAsia="DejaVu Sans"/>
-          <w:sz w:val="20"/>
-        </w:rPr>
-        <w:t>A: Да, возможно. Платформа может поддерживать гибридную модель, где деньги идут через банк или партнера, а блокчейн используется для прозрачности событий.</w:t>
-      </w:r>
-    </w:p>
-    <w:p>
-      <w:r>
-        <w:rPr>
-          <w:rFonts w:ascii="DejaVu Sans" w:hAnsi="DejaVu Sans" w:eastAsia="DejaVu Sans"/>
-          <w:b/>
-          <w:sz w:val="20"/>
-        </w:rPr>
-        <w:t>Q: Что означает Testnet?</w:t>
-      </w:r>
-    </w:p>
-    <w:p>
-      <w:r>
-        <w:rPr>
-          <w:rFonts w:ascii="DejaVu Sans" w:hAnsi="DejaVu Sans" w:eastAsia="DejaVu Sans"/>
-          <w:sz w:val="20"/>
-        </w:rPr>
-        <w:t>A: Testnet - это тестовая сеть. Простыми словами, это безопасная среда, где можно проверять систему без настоящих денег.</w:t>
-      </w:r>
-    </w:p>
-    <w:p>
-      <w:r>
-        <w:rPr>
-          <w:rFonts w:ascii="DejaVu Sans" w:hAnsi="DejaVu Sans" w:eastAsia="DejaVu Sans"/>
-          <w:b/>
-          <w:sz w:val="20"/>
-        </w:rPr>
-        <w:t>Q: Когда возможен Mainnet?</w:t>
-      </w:r>
-    </w:p>
-    <w:p>
-      <w:r>
-        <w:rPr>
-          <w:rFonts w:ascii="DejaVu Sans" w:hAnsi="DejaVu Sans" w:eastAsia="DejaVu Sans"/>
-          <w:sz w:val="20"/>
-        </w:rPr>
-        <w:t>A: Mainnet - это основная сеть с реальными активами. Переход к Mainnet возможен только после технической, юридической и партнерской готовности.</w:t>
-      </w:r>
-    </w:p>
-    <w:p>
-      <w:r>
-        <w:rPr>
-          <w:rFonts w:ascii="DejaVu Sans" w:hAnsi="DejaVu Sans" w:eastAsia="DejaVu Sans"/>
-          <w:b/>
-          <w:sz w:val="20"/>
-        </w:rPr>
-        <w:t>Q: Что получает NEAR экосистема?</w:t>
-      </w:r>
-    </w:p>
-    <w:p>
-      <w:r>
-        <w:rPr>
-          <w:rFonts w:ascii="DejaVu Sans" w:hAnsi="DejaVu Sans" w:eastAsia="DejaVu Sans"/>
-          <w:sz w:val="20"/>
-        </w:rPr>
-        <w:t>A: NEAR получает реальный пример применения блокчейна в сельском хозяйстве, RWA, отчетности и прозрачных инвестиционных процессах.</w:t>
-      </w:r>
-    </w:p>
-    <w:p>
-      <w:pPr>
-        <w:pStyle w:val="Heading1"/>
-      </w:pPr>
-      <w:r>
-        <w:rPr>
-          <w:rFonts w:ascii="DejaVu Sans" w:hAnsi="DejaVu Sans" w:eastAsia="DejaVu Sans"/>
-          <w:color w:val="005F41"/>
-        </w:rPr>
-        <w:t>17. Дорожная карта развития</w:t>
-      </w:r>
-    </w:p>
-    <w:p>
-      <w:r>
-        <w:rPr>
-          <w:rFonts w:ascii="DejaVu Sans" w:hAnsi="DejaVu Sans" w:eastAsia="DejaVu Sans"/>
-          <w:sz w:val="20"/>
-        </w:rPr>
-        <w:t>Roadmap (дорожная карта) - это план развития продукта по этапам. Для AgriPartners логичная дорожная карта выглядит так:</w:t>
-      </w:r>
-    </w:p>
-    <w:p>
-      <w:pPr>
-        <w:pStyle w:val="ListNumber"/>
-      </w:pPr>
-      <w:r>
-        <w:rPr>
-          <w:rFonts w:ascii="DejaVu Sans" w:hAnsi="DejaVu Sans" w:eastAsia="DejaVu Sans"/>
-          <w:sz w:val="20"/>
-        </w:rPr>
-        <w:t>Alpha/Testnet: демонстрация рабочих процессов, ролей, отчетности и тестовой блокчейн-логики.</w:t>
-      </w:r>
-    </w:p>
-    <w:p>
-      <w:pPr>
-        <w:pStyle w:val="ListNumber"/>
-      </w:pPr>
-      <w:r>
-        <w:rPr>
-          <w:rFonts w:ascii="DejaVu Sans" w:hAnsi="DejaVu Sans" w:eastAsia="DejaVu Sans"/>
-          <w:sz w:val="20"/>
-        </w:rPr>
-        <w:t>Pilot: ограниченный пилот с реальными фермерами и партнерами, но с осторожной юридической рамкой.</w:t>
-      </w:r>
-    </w:p>
-    <w:p>
-      <w:pPr>
-        <w:pStyle w:val="ListNumber"/>
-      </w:pPr>
-      <w:r>
-        <w:rPr>
-          <w:rFonts w:ascii="DejaVu Sans" w:hAnsi="DejaVu Sans" w:eastAsia="DejaVu Sans"/>
-          <w:sz w:val="20"/>
-        </w:rPr>
-        <w:t>Hybrid Funding: поддержка традиционных платежей и цифрового учета событий.</w:t>
-      </w:r>
-    </w:p>
-    <w:p>
-      <w:pPr>
-        <w:pStyle w:val="ListNumber"/>
-      </w:pPr>
-      <w:r>
-        <w:rPr>
-          <w:rFonts w:ascii="DejaVu Sans" w:hAnsi="DejaVu Sans" w:eastAsia="DejaVu Sans"/>
-          <w:sz w:val="20"/>
-        </w:rPr>
-        <w:t>Stablecoin Readiness: подготовка к возможному использованию USDT или других стейблкоинов через партнеров.</w:t>
-      </w:r>
-    </w:p>
-    <w:p>
-      <w:pPr>
-        <w:pStyle w:val="ListNumber"/>
-      </w:pPr>
-      <w:r>
-        <w:rPr>
-          <w:rFonts w:ascii="DejaVu Sans" w:hAnsi="DejaVu Sans" w:eastAsia="DejaVu Sans"/>
-          <w:sz w:val="20"/>
-        </w:rPr>
-        <w:t>Mainnet Readiness: техническая и юридическая подготовка к работе с основной сетью.</w:t>
-      </w:r>
-    </w:p>
-    <w:p>
-      <w:pPr>
-        <w:pStyle w:val="ListNumber"/>
-      </w:pPr>
-      <w:r>
-        <w:rPr>
-          <w:rFonts w:ascii="DejaVu Sans" w:hAnsi="DejaVu Sans" w:eastAsia="DejaVu Sans"/>
-          <w:sz w:val="20"/>
-        </w:rPr>
-        <w:t>Scale: расширение на новые типы сельхозпроектов, партнеров, регионов и инвесторов.</w:t>
-      </w:r>
-    </w:p>
-    <w:p>
-      <w:pPr>
-        <w:pStyle w:val="Heading1"/>
-      </w:pPr>
-      <w:r>
-        <w:rPr>
-          <w:rFonts w:ascii="DejaVu Sans" w:hAnsi="DejaVu Sans" w:eastAsia="DejaVu Sans"/>
-          <w:color w:val="005F41"/>
-        </w:rPr>
-        <w:t>18. Как правильно объяснять AgriPartners разным людям</w:t>
+        <w:t>Alpha v1.2 · прозрачные процессы агроинвестирования · NEAR Testnet</w:t>
       </w:r>
     </w:p>
     <w:tbl>
       <w:tblPr>
         <w:tblStyle w:val="TableGrid"/>
         <w:tblW w:type="auto" w:w="0"/>
-        <w:jc w:val="center"/>
+        <w:jc w:val="left"/>
+        <w:tblLayout w:type="fixed"/>
         <w:tblLook w:firstColumn="1" w:firstRow="1" w:lastColumn="0" w:lastRow="0" w:noHBand="0" w:noVBand="1" w:val="04A0"/>
+        <w:tblW w:w="9360" w:type="dxa"/>
+        <w:tblInd w:w="120" w:type="dxa"/>
       </w:tblPr>
       <w:tblGrid>
-        <w:gridCol w:w="3408"/>
-        <w:gridCol w:w="3408"/>
-        <w:gridCol w:w="3408"/>
+        <w:gridCol w:w="2500"/>
+        <w:gridCol w:w="6860"/>
       </w:tblGrid>
       <w:tr>
         <w:tc>
           <w:tcPr>
-            <w:tcW w:type="dxa" w:w="3408"/>
-            <w:shd w:fill="006B4A"/>
+            <w:tcW w:type="dxa" w:w="4680"/>
+            <w:tcW w:w="2500" w:type="dxa"/>
+            <w:vAlign w:val="center"/>
+            <w:shd w:fill="056246"/>
           </w:tcPr>
           <w:p>
+            <w:pPr>
+              <w:spacing w:after="0"/>
+              <w:jc w:val="center"/>
+            </w:pPr>
             <w:r>
               <w:rPr>
-                <w:rFonts w:ascii="DejaVu Sans" w:hAnsi="DejaVu Sans" w:eastAsia="DejaVu Sans"/>
-                <w:sz w:val="18"/>
+                <w:rFonts w:ascii="Arial" w:hAnsi="Arial" w:eastAsia="Arial"/>
+                <w:b/>
+                <w:i w:val="0"/>
+                <w:color w:val="FFFFFF"/>
+                <w:sz w:val="17"/>
               </w:rPr>
-            </w:r>
-            <w:r>
-              <w:rPr>
-                <w:rFonts w:ascii="DejaVu Sans" w:hAnsi="DejaVu Sans" w:eastAsia="DejaVu Sans"/>
-                <w:b/>
-                <w:color w:val="FFFFFF"/>
-                <w:sz w:val="18"/>
-              </w:rPr>
-              <w:t>Кому объясняем</w:t>
+              <w:t>Роль</w:t>
             </w:r>
           </w:p>
         </w:tc>
         <w:tc>
           <w:tcPr>
-            <w:tcW w:type="dxa" w:w="3408"/>
-            <w:shd w:fill="006B4A"/>
+            <w:tcW w:type="dxa" w:w="4680"/>
+            <w:tcW w:w="6860" w:type="dxa"/>
+            <w:vAlign w:val="center"/>
+            <w:shd w:fill="056246"/>
           </w:tcPr>
           <w:p>
+            <w:pPr>
+              <w:spacing w:after="0"/>
+              <w:jc w:val="center"/>
+            </w:pPr>
             <w:r>
               <w:rPr>
-                <w:rFonts w:ascii="DejaVu Sans" w:hAnsi="DejaVu Sans" w:eastAsia="DejaVu Sans"/>
-                <w:sz w:val="18"/>
+                <w:rFonts w:ascii="Arial" w:hAnsi="Arial" w:eastAsia="Arial"/>
+                <w:b/>
+                <w:i w:val="0"/>
+                <w:color w:val="FFFFFF"/>
+                <w:sz w:val="17"/>
               </w:rPr>
-            </w:r>
-            <w:r>
-              <w:rPr>
-                <w:rFonts w:ascii="DejaVu Sans" w:hAnsi="DejaVu Sans" w:eastAsia="DejaVu Sans"/>
-                <w:b/>
-                <w:color w:val="FFFFFF"/>
-                <w:sz w:val="18"/>
-              </w:rPr>
-              <w:t>Короткое объяснение</w:t>
-            </w:r>
-          </w:p>
-        </w:tc>
-        <w:tc>
-          <w:tcPr>
-            <w:tcW w:type="dxa" w:w="3408"/>
-            <w:shd w:fill="006B4A"/>
-          </w:tcPr>
-          <w:p>
-            <w:r>
-              <w:rPr>
-                <w:rFonts w:ascii="DejaVu Sans" w:hAnsi="DejaVu Sans" w:eastAsia="DejaVu Sans"/>
-                <w:sz w:val="18"/>
-              </w:rPr>
-            </w:r>
-            <w:r>
-              <w:rPr>
-                <w:rFonts w:ascii="DejaVu Sans" w:hAnsi="DejaVu Sans" w:eastAsia="DejaVu Sans"/>
-                <w:b/>
-                <w:color w:val="FFFFFF"/>
-                <w:sz w:val="18"/>
-              </w:rPr>
-              <w:t>Главный акцент</w:t>
+              <w:t>Ценность и ответственность</w:t>
             </w:r>
           </w:p>
         </w:tc>
@@ -1953,64 +1262,43 @@
       <w:tr>
         <w:tc>
           <w:tcPr>
-            <w:tcW w:type="dxa" w:w="3408"/>
+            <w:tcW w:type="dxa" w:w="2500"/>
           </w:tcPr>
           <w:p>
+            <w:pPr>
+              <w:spacing w:after="0"/>
+              <w:jc w:val="left"/>
+            </w:pPr>
             <w:r>
               <w:rPr>
-                <w:rFonts w:ascii="DejaVu Sans" w:hAnsi="DejaVu Sans" w:eastAsia="DejaVu Sans"/>
-                <w:sz w:val="18"/>
+                <w:rFonts w:ascii="Arial" w:hAnsi="Arial" w:eastAsia="Arial"/>
+                <w:b w:val="0"/>
+                <w:i w:val="0"/>
+                <w:color w:val="17212B"/>
+                <w:sz w:val="17"/>
               </w:rPr>
-            </w:r>
-            <w:r>
-              <w:rPr>
-                <w:rFonts w:ascii="DejaVu Sans" w:hAnsi="DejaVu Sans" w:eastAsia="DejaVu Sans"/>
-                <w:b w:val="0"/>
-                <w:sz w:val="18"/>
-              </w:rPr>
-              <w:t>Инвестору</w:t>
+              <w:t>Внешний инвестор</w:t>
             </w:r>
           </w:p>
         </w:tc>
         <w:tc>
           <w:tcPr>
-            <w:tcW w:type="dxa" w:w="3408"/>
+            <w:tcW w:type="dxa" w:w="6860"/>
           </w:tcPr>
           <w:p>
+            <w:pPr>
+              <w:spacing w:after="0"/>
+              <w:jc w:val="center"/>
+            </w:pPr>
             <w:r>
               <w:rPr>
-                <w:rFonts w:ascii="DejaVu Sans" w:hAnsi="DejaVu Sans" w:eastAsia="DejaVu Sans"/>
-                <w:sz w:val="18"/>
+                <w:rFonts w:ascii="Arial" w:hAnsi="Arial" w:eastAsia="Arial"/>
+                <w:b w:val="0"/>
+                <w:i w:val="0"/>
+                <w:color w:val="17212B"/>
+                <w:sz w:val="17"/>
               </w:rPr>
-            </w:r>
-            <w:r>
-              <w:rPr>
-                <w:rFonts w:ascii="DejaVu Sans" w:hAnsi="DejaVu Sans" w:eastAsia="DejaVu Sans"/>
-                <w:b w:val="0"/>
-                <w:sz w:val="18"/>
-              </w:rPr>
-              <w:t>Платформа помогает видеть сельхозпроект, статус, отчеты и результат.</w:t>
-            </w:r>
-          </w:p>
-        </w:tc>
-        <w:tc>
-          <w:tcPr>
-            <w:tcW w:type="dxa" w:w="3408"/>
-          </w:tcPr>
-          <w:p>
-            <w:r>
-              <w:rPr>
-                <w:rFonts w:ascii="DejaVu Sans" w:hAnsi="DejaVu Sans" w:eastAsia="DejaVu Sans"/>
-                <w:sz w:val="18"/>
-              </w:rPr>
-            </w:r>
-            <w:r>
-              <w:rPr>
-                <w:rFonts w:ascii="DejaVu Sans" w:hAnsi="DejaVu Sans" w:eastAsia="DejaVu Sans"/>
-                <w:b w:val="0"/>
-                <w:sz w:val="18"/>
-              </w:rPr>
-              <w:t>Прозрачность и контроль.</w:t>
+              <w:t>Договор только с AgriPartners OÜ; структурированная прозрачность и отчётность.</w:t>
             </w:r>
           </w:p>
         </w:tc>
@@ -2018,64 +1306,45 @@
       <w:tr>
         <w:tc>
           <w:tcPr>
-            <w:tcW w:type="dxa" w:w="3408"/>
+            <w:tcW w:type="dxa" w:w="2500"/>
+            <w:shd w:fill="F2F4F7"/>
           </w:tcPr>
           <w:p>
+            <w:pPr>
+              <w:spacing w:after="0"/>
+              <w:jc w:val="left"/>
+            </w:pPr>
             <w:r>
               <w:rPr>
-                <w:rFonts w:ascii="DejaVu Sans" w:hAnsi="DejaVu Sans" w:eastAsia="DejaVu Sans"/>
-                <w:sz w:val="18"/>
+                <w:rFonts w:ascii="Arial" w:hAnsi="Arial" w:eastAsia="Arial"/>
+                <w:b w:val="0"/>
+                <w:i w:val="0"/>
+                <w:color w:val="17212B"/>
+                <w:sz w:val="17"/>
               </w:rPr>
-            </w:r>
-            <w:r>
-              <w:rPr>
-                <w:rFonts w:ascii="DejaVu Sans" w:hAnsi="DejaVu Sans" w:eastAsia="DejaVu Sans"/>
-                <w:b w:val="0"/>
-                <w:sz w:val="18"/>
-              </w:rPr>
-              <w:t>Фермеру</w:t>
+              <w:t>AgriPartners OÜ</w:t>
             </w:r>
           </w:p>
         </w:tc>
         <w:tc>
           <w:tcPr>
-            <w:tcW w:type="dxa" w:w="3408"/>
+            <w:tcW w:type="dxa" w:w="6860"/>
+            <w:shd w:fill="F2F4F7"/>
           </w:tcPr>
           <w:p>
+            <w:pPr>
+              <w:spacing w:after="0"/>
+              <w:jc w:val="center"/>
+            </w:pPr>
             <w:r>
               <w:rPr>
-                <w:rFonts w:ascii="DejaVu Sans" w:hAnsi="DejaVu Sans" w:eastAsia="DejaVu Sans"/>
-                <w:sz w:val="18"/>
+                <w:rFonts w:ascii="Arial" w:hAnsi="Arial" w:eastAsia="Arial"/>
+                <w:b w:val="0"/>
+                <w:i w:val="0"/>
+                <w:color w:val="17212B"/>
+                <w:sz w:val="17"/>
               </w:rPr>
-            </w:r>
-            <w:r>
-              <w:rPr>
-                <w:rFonts w:ascii="DejaVu Sans" w:hAnsi="DejaVu Sans" w:eastAsia="DejaVu Sans"/>
-                <w:b w:val="0"/>
-                <w:sz w:val="18"/>
-              </w:rPr>
-              <w:t>Платформа помогает показать проект, получить доверие и вести отчетность.</w:t>
-            </w:r>
-          </w:p>
-        </w:tc>
-        <w:tc>
-          <w:tcPr>
-            <w:tcW w:type="dxa" w:w="3408"/>
-          </w:tcPr>
-          <w:p>
-            <w:r>
-              <w:rPr>
-                <w:rFonts w:ascii="DejaVu Sans" w:hAnsi="DejaVu Sans" w:eastAsia="DejaVu Sans"/>
-                <w:sz w:val="18"/>
-              </w:rPr>
-            </w:r>
-            <w:r>
-              <w:rPr>
-                <w:rFonts w:ascii="DejaVu Sans" w:hAnsi="DejaVu Sans" w:eastAsia="DejaVu Sans"/>
-                <w:b w:val="0"/>
-                <w:sz w:val="18"/>
-              </w:rPr>
-              <w:t>Репутация и доступ к финансированию.</w:t>
+              <w:t>Центральный юридический контрагент; управление, конвертация, банк, учёт и сверка.</w:t>
             </w:r>
           </w:p>
         </w:tc>
@@ -2083,64 +1352,43 @@
       <w:tr>
         <w:tc>
           <w:tcPr>
-            <w:tcW w:type="dxa" w:w="3408"/>
+            <w:tcW w:type="dxa" w:w="2500"/>
           </w:tcPr>
           <w:p>
+            <w:pPr>
+              <w:spacing w:after="0"/>
+              <w:jc w:val="left"/>
+            </w:pPr>
             <w:r>
               <w:rPr>
-                <w:rFonts w:ascii="DejaVu Sans" w:hAnsi="DejaVu Sans" w:eastAsia="DejaVu Sans"/>
-                <w:sz w:val="18"/>
+                <w:rFonts w:ascii="Arial" w:hAnsi="Arial" w:eastAsia="Arial"/>
+                <w:b w:val="0"/>
+                <w:i w:val="0"/>
+                <w:color w:val="17212B"/>
+                <w:sz w:val="17"/>
               </w:rPr>
-            </w:r>
-            <w:r>
-              <w:rPr>
-                <w:rFonts w:ascii="DejaVu Sans" w:hAnsi="DejaVu Sans" w:eastAsia="DejaVu Sans"/>
-                <w:b w:val="0"/>
-                <w:sz w:val="18"/>
-              </w:rPr>
-              <w:t>NEAR экосистеме</w:t>
+              <w:t>Оператор в Узбекистане</w:t>
             </w:r>
           </w:p>
         </w:tc>
         <w:tc>
           <w:tcPr>
-            <w:tcW w:type="dxa" w:w="3408"/>
+            <w:tcW w:type="dxa" w:w="6860"/>
           </w:tcPr>
           <w:p>
+            <w:pPr>
+              <w:spacing w:after="0"/>
+              <w:jc w:val="center"/>
+            </w:pPr>
             <w:r>
               <w:rPr>
-                <w:rFonts w:ascii="DejaVu Sans" w:hAnsi="DejaVu Sans" w:eastAsia="DejaVu Sans"/>
-                <w:sz w:val="18"/>
+                <w:rFonts w:ascii="Arial" w:hAnsi="Arial" w:eastAsia="Arial"/>
+                <w:b w:val="0"/>
+                <w:i w:val="0"/>
+                <w:color w:val="17212B"/>
+                <w:sz w:val="17"/>
               </w:rPr>
-            </w:r>
-            <w:r>
-              <w:rPr>
-                <w:rFonts w:ascii="DejaVu Sans" w:hAnsi="DejaVu Sans" w:eastAsia="DejaVu Sans"/>
-                <w:b w:val="0"/>
-                <w:sz w:val="18"/>
-              </w:rPr>
-              <w:t>AgriPartners показывает реальный RWA/use case для сельского хозяйства.</w:t>
-            </w:r>
-          </w:p>
-        </w:tc>
-        <w:tc>
-          <w:tcPr>
-            <w:tcW w:type="dxa" w:w="3408"/>
-          </w:tcPr>
-          <w:p>
-            <w:r>
-              <w:rPr>
-                <w:rFonts w:ascii="DejaVu Sans" w:hAnsi="DejaVu Sans" w:eastAsia="DejaVu Sans"/>
-                <w:sz w:val="18"/>
-              </w:rPr>
-            </w:r>
-            <w:r>
-              <w:rPr>
-                <w:rFonts w:ascii="DejaVu Sans" w:hAnsi="DejaVu Sans" w:eastAsia="DejaVu Sans"/>
-                <w:b w:val="0"/>
-                <w:sz w:val="18"/>
-              </w:rPr>
-              <w:t>Практическое применение блокчейна.</w:t>
+              <w:t>Отдельный договор; фиатная операционная организация, ответственная за результат и документы.</w:t>
             </w:r>
           </w:p>
         </w:tc>
@@ -2148,64 +1396,45 @@
       <w:tr>
         <w:tc>
           <w:tcPr>
-            <w:tcW w:type="dxa" w:w="3408"/>
+            <w:tcW w:type="dxa" w:w="2500"/>
+            <w:shd w:fill="F2F4F7"/>
           </w:tcPr>
           <w:p>
+            <w:pPr>
+              <w:spacing w:after="0"/>
+              <w:jc w:val="left"/>
+            </w:pPr>
             <w:r>
               <w:rPr>
-                <w:rFonts w:ascii="DejaVu Sans" w:hAnsi="DejaVu Sans" w:eastAsia="DejaVu Sans"/>
-                <w:sz w:val="18"/>
+                <w:rFonts w:ascii="Arial" w:hAnsi="Arial" w:eastAsia="Arial"/>
+                <w:b w:val="0"/>
+                <w:i w:val="0"/>
+                <w:color w:val="17212B"/>
+                <w:sz w:val="17"/>
               </w:rPr>
-            </w:r>
-            <w:r>
-              <w:rPr>
-                <w:rFonts w:ascii="DejaVu Sans" w:hAnsi="DejaVu Sans" w:eastAsia="DejaVu Sans"/>
-                <w:b w:val="0"/>
-                <w:sz w:val="18"/>
-              </w:rPr>
-              <w:t>Банку</w:t>
+              <w:t>Роль Farmer</w:t>
             </w:r>
           </w:p>
         </w:tc>
         <w:tc>
           <w:tcPr>
-            <w:tcW w:type="dxa" w:w="3408"/>
+            <w:tcW w:type="dxa" w:w="6860"/>
+            <w:shd w:fill="F2F4F7"/>
           </w:tcPr>
           <w:p>
+            <w:pPr>
+              <w:spacing w:after="0"/>
+              <w:jc w:val="center"/>
+            </w:pPr>
             <w:r>
               <w:rPr>
-                <w:rFonts w:ascii="DejaVu Sans" w:hAnsi="DejaVu Sans" w:eastAsia="DejaVu Sans"/>
-                <w:sz w:val="18"/>
+                <w:rFonts w:ascii="Arial" w:hAnsi="Arial" w:eastAsia="Arial"/>
+                <w:b w:val="0"/>
+                <w:i w:val="0"/>
+                <w:color w:val="17212B"/>
+                <w:sz w:val="17"/>
               </w:rPr>
-            </w:r>
-            <w:r>
-              <w:rPr>
-                <w:rFonts w:ascii="DejaVu Sans" w:hAnsi="DejaVu Sans" w:eastAsia="DejaVu Sans"/>
-                <w:b w:val="0"/>
-                <w:sz w:val="18"/>
-              </w:rPr>
-              <w:t>Платформа может быть цифровым слоем отчетности, а банк - платежным партнером.</w:t>
-            </w:r>
-          </w:p>
-        </w:tc>
-        <w:tc>
-          <w:tcPr>
-            <w:tcW w:type="dxa" w:w="3408"/>
-          </w:tcPr>
-          <w:p>
-            <w:r>
-              <w:rPr>
-                <w:rFonts w:ascii="DejaVu Sans" w:hAnsi="DejaVu Sans" w:eastAsia="DejaVu Sans"/>
-                <w:sz w:val="18"/>
-              </w:rPr>
-            </w:r>
-            <w:r>
-              <w:rPr>
-                <w:rFonts w:ascii="DejaVu Sans" w:hAnsi="DejaVu Sans" w:eastAsia="DejaVu Sans"/>
-                <w:b w:val="0"/>
-                <w:sz w:val="18"/>
-              </w:rPr>
-              <w:t>Контроль и соответствие правилам.</w:t>
+              <w:t>Операционная работа, отчёты и подтверждения; без кошелька и криптотранзакций.</w:t>
             </w:r>
           </w:p>
         </w:tc>
@@ -2213,749 +1442,699 @@
       <w:tr>
         <w:tc>
           <w:tcPr>
-            <w:tcW w:type="dxa" w:w="3408"/>
+            <w:tcW w:type="dxa" w:w="2500"/>
           </w:tcPr>
           <w:p>
+            <w:pPr>
+              <w:spacing w:after="0"/>
+              <w:jc w:val="left"/>
+            </w:pPr>
             <w:r>
               <w:rPr>
-                <w:rFonts w:ascii="DejaVu Sans" w:hAnsi="DejaVu Sans" w:eastAsia="DejaVu Sans"/>
-                <w:sz w:val="18"/>
+                <w:rFonts w:ascii="Arial" w:hAnsi="Arial" w:eastAsia="Arial"/>
+                <w:b w:val="0"/>
+                <w:i w:val="0"/>
+                <w:color w:val="17212B"/>
+                <w:sz w:val="17"/>
               </w:rPr>
-            </w:r>
-            <w:r>
-              <w:rPr>
-                <w:rFonts w:ascii="DejaVu Sans" w:hAnsi="DejaVu Sans" w:eastAsia="DejaVu Sans"/>
-                <w:b w:val="0"/>
-                <w:sz w:val="18"/>
-              </w:rPr>
-              <w:t>Юристу</w:t>
+              <w:t>Партнёры</w:t>
             </w:r>
           </w:p>
         </w:tc>
         <w:tc>
           <w:tcPr>
-            <w:tcW w:type="dxa" w:w="3408"/>
+            <w:tcW w:type="dxa" w:w="6860"/>
           </w:tcPr>
           <w:p>
+            <w:pPr>
+              <w:spacing w:after="0"/>
+              <w:jc w:val="center"/>
+            </w:pPr>
             <w:r>
               <w:rPr>
-                <w:rFonts w:ascii="DejaVu Sans" w:hAnsi="DejaVu Sans" w:eastAsia="DejaVu Sans"/>
-                <w:sz w:val="18"/>
+                <w:rFonts w:ascii="Arial" w:hAnsi="Arial" w:eastAsia="Arial"/>
+                <w:b w:val="0"/>
+                <w:i w:val="0"/>
+                <w:color w:val="17212B"/>
+                <w:sz w:val="17"/>
               </w:rPr>
+              <w:t>Юридические, банковские, платёжные, бухгалтерские, ветеринарные и операционные услуги после утверждения.</w:t>
             </w:r>
+          </w:p>
+        </w:tc>
+      </w:tr>
+      <w:tr>
+        <w:tc>
+          <w:tcPr>
+            <w:tcW w:type="dxa" w:w="2500"/>
+            <w:shd w:fill="F2F4F7"/>
+          </w:tcPr>
+          <w:p>
+            <w:pPr>
+              <w:spacing w:after="0"/>
+              <w:jc w:val="left"/>
+            </w:pPr>
             <w:r>
               <w:rPr>
-                <w:rFonts w:ascii="DejaVu Sans" w:hAnsi="DejaVu Sans" w:eastAsia="DejaVu Sans"/>
+                <w:rFonts w:ascii="Arial" w:hAnsi="Arial" w:eastAsia="Arial"/>
                 <w:b w:val="0"/>
-                <w:sz w:val="18"/>
+                <w:i w:val="0"/>
+                <w:color w:val="17212B"/>
+                <w:sz w:val="17"/>
               </w:rPr>
-              <w:t>Нужно определить допустимую модель работы с инвестициями и цифровыми активами.</w:t>
+              <w:t>NEAR</w:t>
             </w:r>
           </w:p>
         </w:tc>
         <w:tc>
           <w:tcPr>
-            <w:tcW w:type="dxa" w:w="3408"/>
+            <w:tcW w:type="dxa" w:w="6860"/>
+            <w:shd w:fill="F2F4F7"/>
           </w:tcPr>
           <w:p>
+            <w:pPr>
+              <w:spacing w:after="0"/>
+              <w:jc w:val="center"/>
+            </w:pPr>
             <w:r>
               <w:rPr>
-                <w:rFonts w:ascii="DejaVu Sans" w:hAnsi="DejaVu Sans" w:eastAsia="DejaVu Sans"/>
-                <w:sz w:val="18"/>
+                <w:rFonts w:ascii="Arial" w:hAnsi="Arial" w:eastAsia="Arial"/>
+                <w:b w:val="0"/>
+                <w:i w:val="0"/>
+                <w:color w:val="17212B"/>
+                <w:sz w:val="17"/>
               </w:rPr>
-            </w:r>
-            <w:r>
-              <w:rPr>
-                <w:rFonts w:ascii="DejaVu Sans" w:hAnsi="DejaVu Sans" w:eastAsia="DejaVu Sans"/>
-                <w:b w:val="0"/>
-                <w:sz w:val="18"/>
-              </w:rPr>
-              <w:t>KYC, AML, договоры и юрисдикция.</w:t>
+              <w:t>Testnet-аудит и автоматизация на стороне Эстонии/инвестора.</w:t>
             </w:r>
           </w:p>
         </w:tc>
       </w:tr>
     </w:tbl>
-    <w:p/>
     <w:p>
       <w:pPr>
-        <w:pStyle w:val="Heading1"/>
+        <w:pStyle w:val="Heading2"/>
       </w:pPr>
       <w:r>
         <w:rPr>
-          <w:rFonts w:ascii="DejaVu Sans" w:hAnsi="DejaVu Sans" w:eastAsia="DejaVu Sans"/>
-          <w:color w:val="005F41"/>
+          <w:rFonts w:ascii="Arial" w:hAnsi="Arial" w:eastAsia="Arial"/>
+          <w:b/>
+          <w:i w:val="0"/>
+          <w:color w:val="056246"/>
+          <w:sz w:val="26"/>
         </w:rPr>
-        <w:t>19. Приложение A. Словарь терминов</w:t>
+        <w:t>Зачем NEAR — и где предел</w:t>
       </w:r>
     </w:p>
     <w:p>
+      <w:pPr>
+        <w:pStyle w:val="ListBullet"/>
+        <w:spacing w:after="80"/>
+        <w:ind w:left="540" w:hanging="271"/>
+      </w:pPr>
       <w:r>
         <w:rPr>
-          <w:rFonts w:ascii="DejaVu Sans" w:hAnsi="DejaVu Sans" w:eastAsia="DejaVu Sans"/>
-          <w:b/>
-          <w:color w:val="005037"/>
-          <w:sz w:val="18"/>
+          <w:rFonts w:ascii="Arial" w:hAnsi="Arial" w:eastAsia="Arial"/>
+          <w:b w:val="0"/>
+          <w:i w:val="0"/>
+          <w:color w:val="17212B"/>
+          <w:sz w:val="20"/>
         </w:rPr>
-        <w:t>Alpha (альфа-версия)</w:t>
-      </w:r>
-      <w:r>
-        <w:rPr>
-          <w:rFonts w:ascii="DejaVu Sans" w:hAnsi="DejaVu Sans" w:eastAsia="DejaVu Sans"/>
-          <w:sz w:val="18"/>
-        </w:rPr>
-        <w:t xml:space="preserve"> - ранняя рабочая версия продукта для тестирования и обратной связи.</w:t>
+        <w:t>Демонстрация состояний процесса и событий со временем.</w:t>
       </w:r>
     </w:p>
     <w:p>
+      <w:pPr>
+        <w:pStyle w:val="ListBullet"/>
+        <w:spacing w:after="80"/>
+        <w:ind w:left="540" w:hanging="271"/>
+      </w:pPr>
       <w:r>
         <w:rPr>
-          <w:rFonts w:ascii="DejaVu Sans" w:hAnsi="DejaVu Sans" w:eastAsia="DejaVu Sans"/>
-          <w:b/>
-          <w:color w:val="005037"/>
-          <w:sz w:val="18"/>
+          <w:rFonts w:ascii="Arial" w:hAnsi="Arial" w:eastAsia="Arial"/>
+          <w:b w:val="0"/>
+          <w:i w:val="0"/>
+          <w:color w:val="17212B"/>
+          <w:sz w:val="20"/>
         </w:rPr>
-        <w:t>API (программный интерфейс)</w:t>
-      </w:r>
-      <w:r>
-        <w:rPr>
-          <w:rFonts w:ascii="DejaVu Sans" w:hAnsi="DejaVu Sans" w:eastAsia="DejaVu Sans"/>
-          <w:sz w:val="18"/>
-        </w:rPr>
-        <w:t xml:space="preserve"> - способ, с помощью которого разные системы могут обмениваться данными.</w:t>
+        <w:t>Эксперименты с автоматизацией и проверяемыми хешами утверждённых подтверждений.</w:t>
       </w:r>
     </w:p>
     <w:p>
+      <w:pPr>
+        <w:pStyle w:val="ListBullet"/>
+        <w:spacing w:after="80"/>
+        <w:ind w:left="540" w:hanging="271"/>
+      </w:pPr>
       <w:r>
         <w:rPr>
-          <w:rFonts w:ascii="DejaVu Sans" w:hAnsi="DejaVu Sans" w:eastAsia="DejaVu Sans"/>
-          <w:b/>
-          <w:color w:val="005037"/>
-          <w:sz w:val="18"/>
+          <w:rFonts w:ascii="Arial" w:hAnsi="Arial" w:eastAsia="Arial"/>
+          <w:b w:val="0"/>
+          <w:i w:val="0"/>
+          <w:color w:val="17212B"/>
+          <w:sz w:val="20"/>
         </w:rPr>
-        <w:t>APR (годовая процентная доходность)</w:t>
-      </w:r>
-      <w:r>
-        <w:rPr>
-          <w:rFonts w:ascii="DejaVu Sans" w:hAnsi="DejaVu Sans" w:eastAsia="DejaVu Sans"/>
-          <w:sz w:val="18"/>
-        </w:rPr>
-        <w:t xml:space="preserve"> - показатель доходности в пересчете на год.</w:t>
+        <w:t>Обратная связь экосистемы и техническая проверка Alpha.</w:t>
       </w:r>
     </w:p>
     <w:p>
-      <w:r>
-        <w:rPr>
-          <w:rFonts w:ascii="DejaVu Sans" w:hAnsi="DejaVu Sans" w:eastAsia="DejaVu Sans"/>
-          <w:b/>
-          <w:color w:val="005037"/>
-          <w:sz w:val="18"/>
-        </w:rPr>
-        <w:t>Audit Trail (аудиторский след)</w:t>
-      </w:r>
-      <w:r>
-        <w:rPr>
-          <w:rFonts w:ascii="DejaVu Sans" w:hAnsi="DejaVu Sans" w:eastAsia="DejaVu Sans"/>
-          <w:sz w:val="18"/>
-        </w:rPr>
-        <w:t xml:space="preserve"> - история действий, по которой можно проверить, кто и когда что сделал.</w:t>
-      </w:r>
-    </w:p>
-    <w:p>
-      <w:r>
-        <w:rPr>
-          <w:rFonts w:ascii="DejaVu Sans" w:hAnsi="DejaVu Sans" w:eastAsia="DejaVu Sans"/>
-          <w:b/>
-          <w:color w:val="005037"/>
-          <w:sz w:val="18"/>
-        </w:rPr>
-        <w:t>Blockchain (блокчейн)</w:t>
-      </w:r>
-      <w:r>
-        <w:rPr>
-          <w:rFonts w:ascii="DejaVu Sans" w:hAnsi="DejaVu Sans" w:eastAsia="DejaVu Sans"/>
-          <w:sz w:val="18"/>
-        </w:rPr>
-        <w:t xml:space="preserve"> - цифровой журнал записей, который сложно изменить задним числом.</w:t>
-      </w:r>
-    </w:p>
-    <w:p>
-      <w:r>
-        <w:rPr>
-          <w:rFonts w:ascii="DejaVu Sans" w:hAnsi="DejaVu Sans" w:eastAsia="DejaVu Sans"/>
-          <w:b/>
-          <w:color w:val="005037"/>
-          <w:sz w:val="18"/>
-        </w:rPr>
-        <w:t>Compliance (соблюдение правил)</w:t>
-      </w:r>
-      <w:r>
-        <w:rPr>
-          <w:rFonts w:ascii="DejaVu Sans" w:hAnsi="DejaVu Sans" w:eastAsia="DejaVu Sans"/>
-          <w:sz w:val="18"/>
-        </w:rPr>
-        <w:t xml:space="preserve"> - выполнение законов, банковских требований и внутренних процедур.</w:t>
-      </w:r>
-    </w:p>
-    <w:p>
-      <w:r>
-        <w:rPr>
-          <w:rFonts w:ascii="DejaVu Sans" w:hAnsi="DejaVu Sans" w:eastAsia="DejaVu Sans"/>
-          <w:b/>
-          <w:color w:val="005037"/>
-          <w:sz w:val="18"/>
-        </w:rPr>
-        <w:t>DeFi (децентрализованные финансы)</w:t>
-      </w:r>
-      <w:r>
-        <w:rPr>
-          <w:rFonts w:ascii="DejaVu Sans" w:hAnsi="DejaVu Sans" w:eastAsia="DejaVu Sans"/>
-          <w:sz w:val="18"/>
-        </w:rPr>
-        <w:t xml:space="preserve"> - финансовые сервисы на блокчейне без традиционного банка как центрального посредника.</w:t>
-      </w:r>
-    </w:p>
-    <w:p>
-      <w:r>
-        <w:rPr>
-          <w:rFonts w:ascii="DejaVu Sans" w:hAnsi="DejaVu Sans" w:eastAsia="DejaVu Sans"/>
-          <w:b/>
-          <w:color w:val="005037"/>
-          <w:sz w:val="18"/>
-        </w:rPr>
-        <w:t>Farmer Portal (кабинет фермера)</w:t>
-      </w:r>
-      <w:r>
-        <w:rPr>
-          <w:rFonts w:ascii="DejaVu Sans" w:hAnsi="DejaVu Sans" w:eastAsia="DejaVu Sans"/>
-          <w:sz w:val="18"/>
-        </w:rPr>
-        <w:t xml:space="preserve"> - раздел платформы, где фермер видит сделки и отправляет отчеты.</w:t>
-      </w:r>
-    </w:p>
-    <w:p>
-      <w:r>
-        <w:rPr>
-          <w:rFonts w:ascii="DejaVu Sans" w:hAnsi="DejaVu Sans" w:eastAsia="DejaVu Sans"/>
-          <w:b/>
-          <w:color w:val="005037"/>
-          <w:sz w:val="18"/>
-        </w:rPr>
-        <w:t>Founder Success (поддержка основателей)</w:t>
-      </w:r>
-      <w:r>
-        <w:rPr>
-          <w:rFonts w:ascii="DejaVu Sans" w:hAnsi="DejaVu Sans" w:eastAsia="DejaVu Sans"/>
-          <w:sz w:val="18"/>
-        </w:rPr>
-        <w:t xml:space="preserve"> - направление в экосистеме, которое помогает стартапам развиваться.</w:t>
-      </w:r>
-    </w:p>
-    <w:p>
-      <w:r>
-        <w:rPr>
-          <w:rFonts w:ascii="DejaVu Sans" w:hAnsi="DejaVu Sans" w:eastAsia="DejaVu Sans"/>
-          <w:b/>
-          <w:color w:val="005037"/>
-          <w:sz w:val="18"/>
-        </w:rPr>
-        <w:t>Investor Portal (кабинет инвестора)</w:t>
-      </w:r>
-      <w:r>
-        <w:rPr>
-          <w:rFonts w:ascii="DejaVu Sans" w:hAnsi="DejaVu Sans" w:eastAsia="DejaVu Sans"/>
-          <w:sz w:val="18"/>
-        </w:rPr>
-        <w:t xml:space="preserve"> - раздел платформы, где инвестор видит проекты, статусы и отчеты.</w:t>
-      </w:r>
-    </w:p>
-    <w:p>
-      <w:r>
-        <w:rPr>
-          <w:rFonts w:ascii="DejaVu Sans" w:hAnsi="DejaVu Sans" w:eastAsia="DejaVu Sans"/>
-          <w:b/>
-          <w:color w:val="005037"/>
-          <w:sz w:val="18"/>
-        </w:rPr>
-        <w:t>KYC (проверка клиента)</w:t>
-      </w:r>
-      <w:r>
-        <w:rPr>
-          <w:rFonts w:ascii="DejaVu Sans" w:hAnsi="DejaVu Sans" w:eastAsia="DejaVu Sans"/>
-          <w:sz w:val="18"/>
-        </w:rPr>
-        <w:t xml:space="preserve"> - процесс подтверждения личности участника.</w:t>
-      </w:r>
-    </w:p>
-    <w:p>
-      <w:r>
-        <w:rPr>
-          <w:rFonts w:ascii="DejaVu Sans" w:hAnsi="DejaVu Sans" w:eastAsia="DejaVu Sans"/>
-          <w:b/>
-          <w:color w:val="005037"/>
-          <w:sz w:val="18"/>
-        </w:rPr>
-        <w:t>AML (борьба с отмыванием денег)</w:t>
-      </w:r>
-      <w:r>
-        <w:rPr>
-          <w:rFonts w:ascii="DejaVu Sans" w:hAnsi="DejaVu Sans" w:eastAsia="DejaVu Sans"/>
-          <w:sz w:val="18"/>
-        </w:rPr>
-        <w:t xml:space="preserve"> - правила против незаконного происхождения средств.</w:t>
-      </w:r>
-    </w:p>
-    <w:p>
-      <w:r>
-        <w:rPr>
-          <w:rFonts w:ascii="DejaVu Sans" w:hAnsi="DejaVu Sans" w:eastAsia="DejaVu Sans"/>
-          <w:b/>
-          <w:color w:val="005037"/>
-          <w:sz w:val="18"/>
-        </w:rPr>
-        <w:t>Mainnet (основная сеть)</w:t>
-      </w:r>
-      <w:r>
-        <w:rPr>
-          <w:rFonts w:ascii="DejaVu Sans" w:hAnsi="DejaVu Sans" w:eastAsia="DejaVu Sans"/>
-          <w:sz w:val="18"/>
-        </w:rPr>
-        <w:t xml:space="preserve"> - реальная блокчейн-сеть, где операции имеют настоящую ценность.</w:t>
-      </w:r>
-    </w:p>
-    <w:p>
-      <w:r>
-        <w:rPr>
-          <w:rFonts w:ascii="DejaVu Sans" w:hAnsi="DejaVu Sans" w:eastAsia="DejaVu Sans"/>
-          <w:b/>
-          <w:color w:val="005037"/>
-          <w:sz w:val="18"/>
-        </w:rPr>
-        <w:t>Marketplace (маркетплейс)</w:t>
-      </w:r>
-      <w:r>
-        <w:rPr>
-          <w:rFonts w:ascii="DejaVu Sans" w:hAnsi="DejaVu Sans" w:eastAsia="DejaVu Sans"/>
-          <w:sz w:val="18"/>
-        </w:rPr>
-        <w:t xml:space="preserve"> - витрина проектов, где инвестор может выбирать возможности.</w:t>
-      </w:r>
-    </w:p>
-    <w:p>
-      <w:r>
-        <w:rPr>
-          <w:rFonts w:ascii="DejaVu Sans" w:hAnsi="DejaVu Sans" w:eastAsia="DejaVu Sans"/>
-          <w:b/>
-          <w:color w:val="005037"/>
-          <w:sz w:val="18"/>
-        </w:rPr>
-        <w:t>MVP (минимально жизнеспособный продукт)</w:t>
-      </w:r>
-      <w:r>
-        <w:rPr>
-          <w:rFonts w:ascii="DejaVu Sans" w:hAnsi="DejaVu Sans" w:eastAsia="DejaVu Sans"/>
-          <w:sz w:val="18"/>
-        </w:rPr>
-        <w:t xml:space="preserve"> - первая версия, которая уже показывает основную ценность.</w:t>
-      </w:r>
-    </w:p>
-    <w:p>
-      <w:r>
-        <w:rPr>
-          <w:rFonts w:ascii="DejaVu Sans" w:hAnsi="DejaVu Sans" w:eastAsia="DejaVu Sans"/>
-          <w:b/>
-          <w:color w:val="005037"/>
-          <w:sz w:val="18"/>
-        </w:rPr>
-        <w:t>NEAR (блокчейн-экосистема NEAR)</w:t>
-      </w:r>
-      <w:r>
-        <w:rPr>
-          <w:rFonts w:ascii="DejaVu Sans" w:hAnsi="DejaVu Sans" w:eastAsia="DejaVu Sans"/>
-          <w:sz w:val="18"/>
-        </w:rPr>
-        <w:t xml:space="preserve"> - технологическая среда для Web3-приложений.</w:t>
-      </w:r>
-    </w:p>
-    <w:p>
-      <w:r>
-        <w:rPr>
-          <w:rFonts w:ascii="DejaVu Sans" w:hAnsi="DejaVu Sans" w:eastAsia="DejaVu Sans"/>
-          <w:b/>
-          <w:color w:val="005037"/>
-          <w:sz w:val="18"/>
-        </w:rPr>
-        <w:t>Pilot (пилотный запуск)</w:t>
-      </w:r>
-      <w:r>
-        <w:rPr>
-          <w:rFonts w:ascii="DejaVu Sans" w:hAnsi="DejaVu Sans" w:eastAsia="DejaVu Sans"/>
-          <w:sz w:val="18"/>
-        </w:rPr>
-        <w:t xml:space="preserve"> - ограниченная проверка продукта на реальных или близких к реальным условиях.</w:t>
-      </w:r>
-    </w:p>
-    <w:p>
-      <w:r>
-        <w:rPr>
-          <w:rFonts w:ascii="DejaVu Sans" w:hAnsi="DejaVu Sans" w:eastAsia="DejaVu Sans"/>
-          <w:b/>
-          <w:color w:val="005037"/>
-          <w:sz w:val="18"/>
-        </w:rPr>
-        <w:t>Platform (платформа)</w:t>
-      </w:r>
-      <w:r>
-        <w:rPr>
-          <w:rFonts w:ascii="DejaVu Sans" w:hAnsi="DejaVu Sans" w:eastAsia="DejaVu Sans"/>
-          <w:sz w:val="18"/>
-        </w:rPr>
-        <w:t xml:space="preserve"> - единая интернет-система для участников процесса.</w:t>
-      </w:r>
-    </w:p>
-    <w:p>
-      <w:r>
-        <w:rPr>
-          <w:rFonts w:ascii="DejaVu Sans" w:hAnsi="DejaVu Sans" w:eastAsia="DejaVu Sans"/>
-          <w:b/>
-          <w:color w:val="005037"/>
-          <w:sz w:val="18"/>
-        </w:rPr>
-        <w:t>Reporting (отчетность)</w:t>
-      </w:r>
-      <w:r>
-        <w:rPr>
-          <w:rFonts w:ascii="DejaVu Sans" w:hAnsi="DejaVu Sans" w:eastAsia="DejaVu Sans"/>
-          <w:sz w:val="18"/>
-        </w:rPr>
-        <w:t xml:space="preserve"> - передача информации о ходе проекта и результатах.</w:t>
-      </w:r>
-    </w:p>
-    <w:p>
-      <w:r>
-        <w:rPr>
-          <w:rFonts w:ascii="DejaVu Sans" w:hAnsi="DejaVu Sans" w:eastAsia="DejaVu Sans"/>
-          <w:b/>
-          <w:color w:val="005037"/>
-          <w:sz w:val="18"/>
-        </w:rPr>
-        <w:t>ROI (доходность инвестиций)</w:t>
-      </w:r>
-      <w:r>
-        <w:rPr>
-          <w:rFonts w:ascii="DejaVu Sans" w:hAnsi="DejaVu Sans" w:eastAsia="DejaVu Sans"/>
-          <w:sz w:val="18"/>
-        </w:rPr>
-        <w:t xml:space="preserve"> - сколько прибыли получено относительно вложенной суммы.</w:t>
-      </w:r>
-    </w:p>
-    <w:p>
-      <w:r>
-        <w:rPr>
-          <w:rFonts w:ascii="DejaVu Sans" w:hAnsi="DejaVu Sans" w:eastAsia="DejaVu Sans"/>
-          <w:b/>
-          <w:color w:val="005037"/>
-          <w:sz w:val="18"/>
-        </w:rPr>
-        <w:t>RWA (реальные активы)</w:t>
-      </w:r>
-      <w:r>
-        <w:rPr>
-          <w:rFonts w:ascii="DejaVu Sans" w:hAnsi="DejaVu Sans" w:eastAsia="DejaVu Sans"/>
-          <w:sz w:val="18"/>
-        </w:rPr>
-        <w:t xml:space="preserve"> - активы из обычной экономики, например фермы, животные или теплицы.</w:t>
-      </w:r>
-    </w:p>
-    <w:p>
-      <w:r>
-        <w:rPr>
-          <w:rFonts w:ascii="DejaVu Sans" w:hAnsi="DejaVu Sans" w:eastAsia="DejaVu Sans"/>
-          <w:b/>
-          <w:color w:val="005037"/>
-          <w:sz w:val="18"/>
-        </w:rPr>
-        <w:t>SaaS (программное обеспечение как услуга)</w:t>
-      </w:r>
-      <w:r>
-        <w:rPr>
-          <w:rFonts w:ascii="DejaVu Sans" w:hAnsi="DejaVu Sans" w:eastAsia="DejaVu Sans"/>
-          <w:sz w:val="18"/>
-        </w:rPr>
-        <w:t xml:space="preserve"> - модель, где доступ к системе предоставляется как сервис.</w:t>
-      </w:r>
-    </w:p>
-    <w:p>
-      <w:r>
-        <w:rPr>
-          <w:rFonts w:ascii="DejaVu Sans" w:hAnsi="DejaVu Sans" w:eastAsia="DejaVu Sans"/>
-          <w:b/>
-          <w:color w:val="005037"/>
-          <w:sz w:val="18"/>
-        </w:rPr>
-        <w:t>Shadow Accounting (теневой учет)</w:t>
-      </w:r>
-      <w:r>
-        <w:rPr>
-          <w:rFonts w:ascii="DejaVu Sans" w:hAnsi="DejaVu Sans" w:eastAsia="DejaVu Sans"/>
-          <w:sz w:val="18"/>
-        </w:rPr>
-        <w:t xml:space="preserve"> - модельный учет, который показывает финансовую логику без заявления о реальном хранении средств.</w:t>
-      </w:r>
-    </w:p>
-    <w:p>
-      <w:r>
-        <w:rPr>
-          <w:rFonts w:ascii="DejaVu Sans" w:hAnsi="DejaVu Sans" w:eastAsia="DejaVu Sans"/>
-          <w:b/>
-          <w:color w:val="005037"/>
-          <w:sz w:val="18"/>
-        </w:rPr>
-        <w:t>Smart Contract (смарт-контракт)</w:t>
-      </w:r>
-      <w:r>
-        <w:rPr>
-          <w:rFonts w:ascii="DejaVu Sans" w:hAnsi="DejaVu Sans" w:eastAsia="DejaVu Sans"/>
-          <w:sz w:val="18"/>
-        </w:rPr>
-        <w:t xml:space="preserve"> - программа в блокчейне, которая выполняет заранее заданные правила.</w:t>
-      </w:r>
-    </w:p>
-    <w:p>
-      <w:r>
-        <w:rPr>
-          <w:rFonts w:ascii="DejaVu Sans" w:hAnsi="DejaVu Sans" w:eastAsia="DejaVu Sans"/>
-          <w:b/>
-          <w:color w:val="005037"/>
-          <w:sz w:val="18"/>
-        </w:rPr>
-        <w:t>Stablecoin (стейблкоин)</w:t>
-      </w:r>
-      <w:r>
-        <w:rPr>
-          <w:rFonts w:ascii="DejaVu Sans" w:hAnsi="DejaVu Sans" w:eastAsia="DejaVu Sans"/>
-          <w:sz w:val="18"/>
-        </w:rPr>
-        <w:t xml:space="preserve"> - криптовалюта, стоимость которой обычно привязана к обычной валюте, например доллару.</w:t>
-      </w:r>
-    </w:p>
-    <w:p>
-      <w:r>
-        <w:rPr>
-          <w:rFonts w:ascii="DejaVu Sans" w:hAnsi="DejaVu Sans" w:eastAsia="DejaVu Sans"/>
-          <w:b/>
-          <w:color w:val="005037"/>
-          <w:sz w:val="18"/>
-        </w:rPr>
-        <w:t>Stakeholder (заинтересованная сторона)</w:t>
-      </w:r>
-      <w:r>
-        <w:rPr>
-          <w:rFonts w:ascii="DejaVu Sans" w:hAnsi="DejaVu Sans" w:eastAsia="DejaVu Sans"/>
-          <w:sz w:val="18"/>
-        </w:rPr>
-        <w:t xml:space="preserve"> - участник, которому важен проект: инвестор, фермер, партнер, банк, регулятор.</w:t>
-      </w:r>
-    </w:p>
-    <w:p>
-      <w:r>
-        <w:rPr>
-          <w:rFonts w:ascii="DejaVu Sans" w:hAnsi="DejaVu Sans" w:eastAsia="DejaVu Sans"/>
-          <w:b/>
-          <w:color w:val="005037"/>
-          <w:sz w:val="18"/>
-        </w:rPr>
-        <w:t>Testnet (тестовая сеть)</w:t>
-      </w:r>
-      <w:r>
-        <w:rPr>
-          <w:rFonts w:ascii="DejaVu Sans" w:hAnsi="DejaVu Sans" w:eastAsia="DejaVu Sans"/>
-          <w:sz w:val="18"/>
-        </w:rPr>
-        <w:t xml:space="preserve"> - безопасная сеть для проверки блокчейн-логики без настоящих денег.</w:t>
-      </w:r>
-    </w:p>
-    <w:p>
-      <w:r>
-        <w:rPr>
-          <w:rFonts w:ascii="DejaVu Sans" w:hAnsi="DejaVu Sans" w:eastAsia="DejaVu Sans"/>
-          <w:b/>
-          <w:color w:val="005037"/>
-          <w:sz w:val="18"/>
-        </w:rPr>
-        <w:t>Treasury (казначейство)</w:t>
-      </w:r>
-      <w:r>
-        <w:rPr>
-          <w:rFonts w:ascii="DejaVu Sans" w:hAnsi="DejaVu Sans" w:eastAsia="DejaVu Sans"/>
-          <w:sz w:val="18"/>
-        </w:rPr>
-        <w:t xml:space="preserve"> - система учета и контроля денежных потоков.</w:t>
-      </w:r>
-    </w:p>
-    <w:p>
-      <w:r>
-        <w:rPr>
-          <w:rFonts w:ascii="DejaVu Sans" w:hAnsi="DejaVu Sans" w:eastAsia="DejaVu Sans"/>
-          <w:b/>
-          <w:color w:val="005037"/>
-          <w:sz w:val="18"/>
-        </w:rPr>
-        <w:t>USDT (Tether)</w:t>
-      </w:r>
-      <w:r>
-        <w:rPr>
-          <w:rFonts w:ascii="DejaVu Sans" w:hAnsi="DejaVu Sans" w:eastAsia="DejaVu Sans"/>
-          <w:sz w:val="18"/>
-        </w:rPr>
-        <w:t xml:space="preserve"> - стейблкоин, который обычно стремится быть равным одному доллару США.</w:t>
-      </w:r>
-    </w:p>
-    <w:p>
-      <w:r>
-        <w:rPr>
-          <w:rFonts w:ascii="DejaVu Sans" w:hAnsi="DejaVu Sans" w:eastAsia="DejaVu Sans"/>
-          <w:b/>
-          <w:color w:val="005037"/>
-          <w:sz w:val="18"/>
-        </w:rPr>
-        <w:t>Wallet (криптокошелек)</w:t>
-      </w:r>
-      <w:r>
-        <w:rPr>
-          <w:rFonts w:ascii="DejaVu Sans" w:hAnsi="DejaVu Sans" w:eastAsia="DejaVu Sans"/>
-          <w:sz w:val="18"/>
-        </w:rPr>
-        <w:t xml:space="preserve"> - цифровой кошелек для подтверждения действий и хранения цифровых активов.</w:t>
-      </w:r>
-    </w:p>
-    <w:p>
-      <w:r>
-        <w:rPr>
-          <w:rFonts w:ascii="DejaVu Sans" w:hAnsi="DejaVu Sans" w:eastAsia="DejaVu Sans"/>
-          <w:b/>
-          <w:color w:val="005037"/>
-          <w:sz w:val="18"/>
-        </w:rPr>
-        <w:t>Web3 (веб3)</w:t>
-      </w:r>
-      <w:r>
-        <w:rPr>
-          <w:rFonts w:ascii="DejaVu Sans" w:hAnsi="DejaVu Sans" w:eastAsia="DejaVu Sans"/>
-          <w:sz w:val="18"/>
-        </w:rPr>
-        <w:t xml:space="preserve"> - интернет-приложения с использованием блокчейна, кошельков и цифровых активов.</w:t>
-      </w:r>
-    </w:p>
-    <w:p>
-      <w:r>
-        <w:rPr>
-          <w:rFonts w:ascii="DejaVu Sans" w:hAnsi="DejaVu Sans" w:eastAsia="DejaVu Sans"/>
-          <w:b/>
-          <w:color w:val="005037"/>
-          <w:sz w:val="18"/>
-        </w:rPr>
-        <w:t>White Label (решение под брендом партнера)</w:t>
-      </w:r>
-      <w:r>
-        <w:rPr>
-          <w:rFonts w:ascii="DejaVu Sans" w:hAnsi="DejaVu Sans" w:eastAsia="DejaVu Sans"/>
-          <w:sz w:val="18"/>
-        </w:rPr>
-        <w:t xml:space="preserve"> - когда технология используется другой организацией под ее названием.</w:t>
-      </w:r>
-    </w:p>
-    <w:p>
-      <w:r>
-        <w:rPr>
-          <w:rFonts w:ascii="DejaVu Sans" w:hAnsi="DejaVu Sans" w:eastAsia="DejaVu Sans"/>
-          <w:b/>
-          <w:color w:val="005037"/>
-          <w:sz w:val="18"/>
-        </w:rPr>
-        <w:t>Workflow (рабочий процесс)</w:t>
-      </w:r>
-      <w:r>
-        <w:rPr>
-          <w:rFonts w:ascii="DejaVu Sans" w:hAnsi="DejaVu Sans" w:eastAsia="DejaVu Sans"/>
-          <w:sz w:val="18"/>
-        </w:rPr>
-        <w:t xml:space="preserve"> - последовательность действий от начала проекта до результата.</w:t>
-      </w:r>
-    </w:p>
-    <w:p/>
-    <w:p>
       <w:pPr>
-        <w:pStyle w:val="Heading1"/>
+        <w:pStyle w:val="ListBullet"/>
+        <w:spacing w:after="80"/>
+        <w:ind w:left="540" w:hanging="271"/>
       </w:pPr>
       <w:r>
         <w:rPr>
-          <w:rFonts w:ascii="DejaVu Sans" w:hAnsi="DejaVu Sans" w:eastAsia="DejaVu Sans"/>
-          <w:color w:val="005F41"/>
-        </w:rPr>
-        <w:t>20. Итоговая позиция AgriPartners</w:t>
-      </w:r>
-    </w:p>
-    <w:p>
-      <w:r>
-        <w:rPr>
-          <w:rFonts w:ascii="DejaVu Sans" w:hAnsi="DejaVu Sans" w:eastAsia="DejaVu Sans"/>
+          <w:rFonts w:ascii="Arial" w:hAnsi="Arial" w:eastAsia="Arial"/>
+          <w:b w:val="0"/>
+          <w:i w:val="0"/>
+          <w:color w:val="17212B"/>
           <w:sz w:val="20"/>
         </w:rPr>
-        <w:t>AgriPartners лучше позиционировать не как сервис для простого привлечения криптовалюты, а как прозрачную инфраструктуру для управления сельскохозяйственными инвестиционными процессами.</w:t>
-      </w:r>
-    </w:p>
-    <w:p>
-      <w:r>
-        <w:rPr>
-          <w:rFonts w:ascii="DejaVu Sans" w:hAnsi="DejaVu Sans" w:eastAsia="DejaVu Sans"/>
-          <w:sz w:val="20"/>
-        </w:rPr>
-        <w:t>Криптовалюта, NEAR, USDT, смарт-контракты и блокчейн - это инструменты. Главная ценность платформы - понятный workflow, отчетность, доверие, проверяемость и возможность постепенно подключать разные модели финансирования.</w:t>
+        <w:t>Без хранения средств, юридического титула, замены официальных документов и кошельков для Узбекистана.</w:t>
       </w:r>
     </w:p>
     <w:tbl>
       <w:tblPr>
         <w:tblW w:type="auto" w:w="0"/>
-        <w:jc w:val="center"/>
+        <w:jc w:val="left"/>
+        <w:tblLayout w:type="fixed"/>
         <w:tblLook w:firstColumn="1" w:firstRow="1" w:lastColumn="0" w:lastRow="0" w:noHBand="0" w:noVBand="1" w:val="04A0"/>
+        <w:tblW w:w="9360" w:type="dxa"/>
+        <w:tblInd w:w="120" w:type="dxa"/>
       </w:tblPr>
       <w:tblGrid>
-        <w:gridCol w:w="10224"/>
+        <w:gridCol w:w="9360"/>
       </w:tblGrid>
       <w:tr>
         <w:tc>
           <w:tcPr>
-            <w:tcW w:type="dxa" w:w="10224"/>
-            <w:shd w:fill="EAF4EF"/>
+            <w:tcW w:type="dxa" w:w="9360"/>
+            <w:tcW w:w="9360" w:type="dxa"/>
+            <w:vAlign w:val="center"/>
+            <w:shd w:fill="E8F5EF"/>
           </w:tcPr>
           <w:p>
+            <w:pPr>
+              <w:spacing w:after="0"/>
+            </w:pPr>
             <w:r>
               <w:rPr>
-                <w:rFonts w:ascii="DejaVu Sans" w:hAnsi="DejaVu Sans" w:eastAsia="DejaVu Sans"/>
+                <w:rFonts w:ascii="Arial" w:hAnsi="Arial" w:eastAsia="Arial"/>
                 <w:b/>
-                <w:color w:val="005A36"/>
-                <w:sz w:val="20"/>
+                <w:i w:val="0"/>
+                <w:color w:val="056246"/>
+                <w:sz w:val="19"/>
               </w:rPr>
-              <w:t>Одна фраза для заинтересованных сторон</w:t>
-              <w:br/>
-            </w:r>
-            <w:r>
-              <w:rPr>
-                <w:rFonts w:ascii="DejaVu Sans" w:hAnsi="DejaVu Sans" w:eastAsia="DejaVu Sans"/>
-                <w:sz w:val="18"/>
-              </w:rPr>
-              <w:t>AgriPartners - это Alpha/Testnet платформа для прозрачных сельскохозяйственных инвестиционных workflow, где NEAR используется как инфраструктура для проверки событий, ролей, отчетности и будущей автоматизации.</w:t>
+              <w:t>Запись NEAR не заменяет договоры, банковские выписки, бухгалтерский учёт, сверку, счета и доказательство зачисления фиата. Прямые криптопереводы участникам в Узбекистане запрещены.</w:t>
             </w:r>
           </w:p>
         </w:tc>
       </w:tr>
     </w:tbl>
-    <w:p/>
+    <w:p>
+      <w:pPr>
+        <w:spacing w:after="40" w:line="283" w:lineRule="auto"/>
+      </w:pPr>
+      <w:r>
+        <w:rPr>
+          <w:rFonts w:ascii="Arial" w:hAnsi="Arial" w:eastAsia="Arial"/>
+          <w:b w:val="0"/>
+          <w:i w:val="0"/>
+          <w:color w:val="17212B"/>
+          <w:sz w:val="2"/>
+        </w:rPr>
+      </w:r>
+    </w:p>
+    <w:p>
+      <w:r>
+        <w:br w:type="page"/>
+      </w:r>
+    </w:p>
+    <w:p>
+      <w:pPr>
+        <w:spacing w:after="60" w:line="283" w:lineRule="auto"/>
+        <w:jc w:val="center"/>
+      </w:pPr>
+      <w:r>
+        <w:rPr>
+          <w:rFonts w:ascii="Arial" w:hAnsi="Arial" w:eastAsia="Arial"/>
+          <w:b/>
+          <w:i w:val="0"/>
+          <w:color w:val="087F5B"/>
+          <w:sz w:val="18"/>
+        </w:rPr>
+        <w:t>AGRIPARTNERS</w:t>
+      </w:r>
+    </w:p>
+    <w:p>
+      <w:pPr>
+        <w:spacing w:after="80" w:line="283" w:lineRule="auto"/>
+        <w:jc w:val="center"/>
+      </w:pPr>
+      <w:r>
+        <w:rPr>
+          <w:rFonts w:ascii="Arial" w:hAnsi="Arial" w:eastAsia="Arial"/>
+          <w:b/>
+          <w:i w:val="0"/>
+          <w:color w:val="17324D"/>
+          <w:sz w:val="50"/>
+        </w:rPr>
+        <w:t>Статус, риски и следующее решение</w:t>
+      </w:r>
+    </w:p>
+    <w:p>
+      <w:pPr>
+        <w:spacing w:after="280" w:line="283" w:lineRule="auto"/>
+        <w:jc w:val="center"/>
+      </w:pPr>
+      <w:r>
+        <w:rPr>
+          <w:rFonts w:ascii="Arial" w:hAnsi="Arial" w:eastAsia="Arial"/>
+          <w:b w:val="0"/>
+          <w:i w:val="0"/>
+          <w:color w:val="5E6B78"/>
+          <w:sz w:val="25"/>
+        </w:rPr>
+        <w:t>Alpha v1.2 · прозрачные процессы агроинвестирования · NEAR Testnet</w:t>
+      </w:r>
+    </w:p>
+    <w:tbl>
+      <w:tblPr>
+        <w:tblStyle w:val="TableGrid"/>
+        <w:tblW w:type="auto" w:w="0"/>
+        <w:jc w:val="left"/>
+        <w:tblLayout w:type="fixed"/>
+        <w:tblLook w:firstColumn="1" w:firstRow="1" w:lastColumn="0" w:lastRow="0" w:noHBand="0" w:noVBand="1" w:val="04A0"/>
+        <w:tblW w:w="9360" w:type="dxa"/>
+        <w:tblInd w:w="120" w:type="dxa"/>
+      </w:tblPr>
+      <w:tblGrid>
+        <w:gridCol w:w="2200"/>
+        <w:gridCol w:w="7160"/>
+      </w:tblGrid>
+      <w:tr>
+        <w:tc>
+          <w:tcPr>
+            <w:tcW w:type="dxa" w:w="4680"/>
+            <w:tcW w:w="2200" w:type="dxa"/>
+            <w:vAlign w:val="center"/>
+            <w:shd w:fill="056246"/>
+          </w:tcPr>
+          <w:p>
+            <w:pPr>
+              <w:spacing w:after="0"/>
+              <w:jc w:val="center"/>
+            </w:pPr>
+            <w:r>
+              <w:rPr>
+                <w:rFonts w:ascii="Arial" w:hAnsi="Arial" w:eastAsia="Arial"/>
+                <w:b/>
+                <w:i w:val="0"/>
+                <w:color w:val="FFFFFF"/>
+                <w:sz w:val="18"/>
+              </w:rPr>
+              <w:t>Область</w:t>
+            </w:r>
+          </w:p>
+        </w:tc>
+        <w:tc>
+          <w:tcPr>
+            <w:tcW w:type="dxa" w:w="4680"/>
+            <w:tcW w:w="7160" w:type="dxa"/>
+            <w:vAlign w:val="center"/>
+            <w:shd w:fill="056246"/>
+          </w:tcPr>
+          <w:p>
+            <w:pPr>
+              <w:spacing w:after="0"/>
+              <w:jc w:val="center"/>
+            </w:pPr>
+            <w:r>
+              <w:rPr>
+                <w:rFonts w:ascii="Arial" w:hAnsi="Arial" w:eastAsia="Arial"/>
+                <w:b/>
+                <w:i w:val="0"/>
+                <w:color w:val="FFFFFF"/>
+                <w:sz w:val="18"/>
+              </w:rPr>
+              <w:t>Положение</w:t>
+            </w:r>
+          </w:p>
+        </w:tc>
+      </w:tr>
+      <w:tr>
+        <w:tc>
+          <w:tcPr>
+            <w:tcW w:type="dxa" w:w="2200"/>
+          </w:tcPr>
+          <w:p>
+            <w:pPr>
+              <w:spacing w:after="0"/>
+              <w:jc w:val="left"/>
+            </w:pPr>
+            <w:r>
+              <w:rPr>
+                <w:rFonts w:ascii="Arial" w:hAnsi="Arial" w:eastAsia="Arial"/>
+                <w:b w:val="0"/>
+                <w:i w:val="0"/>
+                <w:color w:val="17212B"/>
+                <w:sz w:val="18"/>
+              </w:rPr>
+              <w:t>Сейчас</w:t>
+            </w:r>
+          </w:p>
+        </w:tc>
+        <w:tc>
+          <w:tcPr>
+            <w:tcW w:type="dxa" w:w="7160"/>
+          </w:tcPr>
+          <w:p>
+            <w:pPr>
+              <w:spacing w:after="0"/>
+              <w:jc w:val="center"/>
+            </w:pPr>
+            <w:r>
+              <w:rPr>
+                <w:rFonts w:ascii="Arial" w:hAnsi="Arial" w:eastAsia="Arial"/>
+                <w:b w:val="0"/>
+                <w:i w:val="0"/>
+                <w:color w:val="17212B"/>
+                <w:sz w:val="18"/>
+              </w:rPr>
+              <w:t>Презентационный релиз Alpha v1.2 на NEAR Testnet.</w:t>
+            </w:r>
+          </w:p>
+        </w:tc>
+      </w:tr>
+      <w:tr>
+        <w:tc>
+          <w:tcPr>
+            <w:tcW w:type="dxa" w:w="2200"/>
+            <w:shd w:fill="F2F4F7"/>
+          </w:tcPr>
+          <w:p>
+            <w:pPr>
+              <w:spacing w:after="0"/>
+              <w:jc w:val="left"/>
+            </w:pPr>
+            <w:r>
+              <w:rPr>
+                <w:rFonts w:ascii="Arial" w:hAnsi="Arial" w:eastAsia="Arial"/>
+                <w:b w:val="0"/>
+                <w:i w:val="0"/>
+                <w:color w:val="17212B"/>
+                <w:sz w:val="18"/>
+              </w:rPr>
+              <w:t>Не сейчас</w:t>
+            </w:r>
+          </w:p>
+        </w:tc>
+        <w:tc>
+          <w:tcPr>
+            <w:tcW w:type="dxa" w:w="7160"/>
+            <w:shd w:fill="F2F4F7"/>
+          </w:tcPr>
+          <w:p>
+            <w:pPr>
+              <w:spacing w:after="0"/>
+              <w:jc w:val="center"/>
+            </w:pPr>
+            <w:r>
+              <w:rPr>
+                <w:rFonts w:ascii="Arial" w:hAnsi="Arial" w:eastAsia="Arial"/>
+                <w:b w:val="0"/>
+                <w:i w:val="0"/>
+                <w:color w:val="17212B"/>
+                <w:sz w:val="18"/>
+              </w:rPr>
+              <w:t>Mainnet, реальные средства, custody, лицензированная инвестиционная или коммерческая деятельность.</w:t>
+            </w:r>
+          </w:p>
+        </w:tc>
+      </w:tr>
+      <w:tr>
+        <w:tc>
+          <w:tcPr>
+            <w:tcW w:type="dxa" w:w="2200"/>
+          </w:tcPr>
+          <w:p>
+            <w:pPr>
+              <w:spacing w:after="0"/>
+              <w:jc w:val="left"/>
+            </w:pPr>
+            <w:r>
+              <w:rPr>
+                <w:rFonts w:ascii="Arial" w:hAnsi="Arial" w:eastAsia="Arial"/>
+                <w:b w:val="0"/>
+                <w:i w:val="0"/>
+                <w:color w:val="17212B"/>
+                <w:sz w:val="18"/>
+              </w:rPr>
+              <w:t>Основные риски</w:t>
+            </w:r>
+          </w:p>
+        </w:tc>
+        <w:tc>
+          <w:tcPr>
+            <w:tcW w:type="dxa" w:w="7160"/>
+          </w:tcPr>
+          <w:p>
+            <w:pPr>
+              <w:spacing w:after="0"/>
+              <w:jc w:val="center"/>
+            </w:pPr>
+            <w:r>
+              <w:rPr>
+                <w:rFonts w:ascii="Arial" w:hAnsi="Arial" w:eastAsia="Arial"/>
+                <w:b w:val="0"/>
+                <w:i w:val="0"/>
+                <w:color w:val="17212B"/>
+                <w:sz w:val="18"/>
+              </w:rPr>
+              <w:t>Право и регулирование, контрагенты, скот, рыночные цены, FX, качество подтверждений, исполнение и ликвидность.</w:t>
+            </w:r>
+          </w:p>
+        </w:tc>
+      </w:tr>
+      <w:tr>
+        <w:tc>
+          <w:tcPr>
+            <w:tcW w:type="dxa" w:w="2200"/>
+            <w:shd w:fill="F2F4F7"/>
+          </w:tcPr>
+          <w:p>
+            <w:pPr>
+              <w:spacing w:after="0"/>
+              <w:jc w:val="left"/>
+            </w:pPr>
+            <w:r>
+              <w:rPr>
+                <w:rFonts w:ascii="Arial" w:hAnsi="Arial" w:eastAsia="Arial"/>
+                <w:b w:val="0"/>
+                <w:i w:val="0"/>
+                <w:color w:val="17212B"/>
+                <w:sz w:val="18"/>
+              </w:rPr>
+              <w:t>Условие пилота</w:t>
+            </w:r>
+          </w:p>
+        </w:tc>
+        <w:tc>
+          <w:tcPr>
+            <w:tcW w:type="dxa" w:w="7160"/>
+            <w:shd w:fill="F2F4F7"/>
+          </w:tcPr>
+          <w:p>
+            <w:pPr>
+              <w:spacing w:after="0"/>
+              <w:jc w:val="center"/>
+            </w:pPr>
+            <w:r>
+              <w:rPr>
+                <w:rFonts w:ascii="Arial" w:hAnsi="Arial" w:eastAsia="Arial"/>
+                <w:b w:val="0"/>
+                <w:i w:val="0"/>
+                <w:color w:val="17212B"/>
+                <w:sz w:val="18"/>
+              </w:rPr>
+              <w:t>Финансирование, выбранные партнёры, утверждённые договоры, провайдеры, контроль и юридическая проверка.</w:t>
+            </w:r>
+          </w:p>
+        </w:tc>
+      </w:tr>
+    </w:tbl>
+    <w:p>
+      <w:pPr>
+        <w:pStyle w:val="Heading2"/>
+      </w:pPr>
+      <w:r>
+        <w:rPr>
+          <w:rFonts w:ascii="Arial" w:hAnsi="Arial" w:eastAsia="Arial"/>
+          <w:b/>
+          <w:i w:val="0"/>
+          <w:color w:val="056246"/>
+          <w:sz w:val="26"/>
+        </w:rPr>
+        <w:t>Рекомендуемые следующие шаги</w:t>
+      </w:r>
+    </w:p>
+    <w:p>
+      <w:pPr>
+        <w:pStyle w:val="ListBullet"/>
+        <w:spacing w:after="80"/>
+        <w:ind w:left="540" w:hanging="271"/>
+      </w:pPr>
+      <w:r>
+        <w:rPr>
+          <w:rFonts w:ascii="Arial" w:hAnsi="Arial" w:eastAsia="Arial"/>
+          <w:b w:val="0"/>
+          <w:i w:val="0"/>
+          <w:color w:val="17212B"/>
+          <w:sz w:val="20"/>
+        </w:rPr>
+        <w:t>Проверить процесс с инвесторами, операторами и профессиональными консультантами.</w:t>
+      </w:r>
+    </w:p>
+    <w:p>
+      <w:pPr>
+        <w:pStyle w:val="ListBullet"/>
+        <w:spacing w:after="80"/>
+        <w:ind w:left="540" w:hanging="271"/>
+      </w:pPr>
+      <w:r>
+        <w:rPr>
+          <w:rFonts w:ascii="Arial" w:hAnsi="Arial" w:eastAsia="Arial"/>
+          <w:b w:val="0"/>
+          <w:i w:val="0"/>
+          <w:color w:val="17212B"/>
+          <w:sz w:val="20"/>
+        </w:rPr>
+        <w:t>Подтвердить выбранного оператора, поставщиков, ветеринарный контроль и стандарты документов.</w:t>
+      </w:r>
+    </w:p>
+    <w:p>
+      <w:pPr>
+        <w:pStyle w:val="ListBullet"/>
+        <w:spacing w:after="80"/>
+        <w:ind w:left="540" w:hanging="271"/>
+      </w:pPr>
+      <w:r>
+        <w:rPr>
+          <w:rFonts w:ascii="Arial" w:hAnsi="Arial" w:eastAsia="Arial"/>
+          <w:b w:val="0"/>
+          <w:i w:val="0"/>
+          <w:color w:val="17212B"/>
+          <w:sz w:val="20"/>
+        </w:rPr>
+        <w:t>Утвердить банковскую, платёжную, бухгалтерскую, комплаенс- и crypto-to-fiat инфраструктуру в Эстонии.</w:t>
+      </w:r>
+    </w:p>
+    <w:p>
+      <w:pPr>
+        <w:pStyle w:val="ListBullet"/>
+        <w:spacing w:after="80"/>
+        <w:ind w:left="540" w:hanging="271"/>
+      </w:pPr>
+      <w:r>
+        <w:rPr>
+          <w:rFonts w:ascii="Arial" w:hAnsi="Arial" w:eastAsia="Arial"/>
+          <w:b w:val="0"/>
+          <w:i w:val="0"/>
+          <w:color w:val="17212B"/>
+          <w:sz w:val="20"/>
+        </w:rPr>
+        <w:t>Подписать отдельные договоры с инвестором и оператором до движения реальных средств.</w:t>
+      </w:r>
+    </w:p>
+    <w:p>
+      <w:pPr>
+        <w:pStyle w:val="ListBullet"/>
+        <w:spacing w:after="80"/>
+        <w:ind w:left="540" w:hanging="271"/>
+      </w:pPr>
+      <w:r>
+        <w:rPr>
+          <w:rFonts w:ascii="Arial" w:hAnsi="Arial" w:eastAsia="Arial"/>
+          <w:b w:val="0"/>
+          <w:i w:val="0"/>
+          <w:color w:val="17212B"/>
+          <w:sz w:val="20"/>
+        </w:rPr>
+        <w:t>Сохранять Alpha v1.2 в режиме Testnet-презентации до формального утверждения пилота.</w:t>
+      </w:r>
+    </w:p>
+    <w:tbl>
+      <w:tblPr>
+        <w:tblW w:type="auto" w:w="0"/>
+        <w:jc w:val="left"/>
+        <w:tblLayout w:type="fixed"/>
+        <w:tblLook w:firstColumn="1" w:firstRow="1" w:lastColumn="0" w:lastRow="0" w:noHBand="0" w:noVBand="1" w:val="04A0"/>
+        <w:tblW w:w="9360" w:type="dxa"/>
+        <w:tblInd w:w="120" w:type="dxa"/>
+      </w:tblPr>
+      <w:tblGrid>
+        <w:gridCol w:w="9360"/>
+      </w:tblGrid>
+      <w:tr>
+        <w:tc>
+          <w:tcPr>
+            <w:tcW w:type="dxa" w:w="9360"/>
+            <w:tcW w:w="9360" w:type="dxa"/>
+            <w:vAlign w:val="center"/>
+            <w:shd w:fill="E8F5EF"/>
+          </w:tcPr>
+          <w:p>
+            <w:pPr>
+              <w:spacing w:after="0"/>
+            </w:pPr>
+            <w:r>
+              <w:rPr>
+                <w:rFonts w:ascii="Arial" w:hAnsi="Arial" w:eastAsia="Arial"/>
+                <w:b/>
+                <w:i w:val="0"/>
+                <w:color w:val="056246"/>
+                <w:sz w:val="19"/>
+              </w:rPr>
+              <w:t>Сегодня AgriPartners следует оценивать как прозрачную Alpha-платформу для агропроцессов и подтверждений, а не как действующий инвестиционный продукт.</w:t>
+            </w:r>
+          </w:p>
+        </w:tc>
+      </w:tr>
+    </w:tbl>
+    <w:p>
+      <w:pPr>
+        <w:spacing w:after="40" w:line="283" w:lineRule="auto"/>
+      </w:pPr>
+      <w:r>
+        <w:rPr>
+          <w:rFonts w:ascii="Arial" w:hAnsi="Arial" w:eastAsia="Arial"/>
+          <w:b w:val="0"/>
+          <w:i w:val="0"/>
+          <w:color w:val="17212B"/>
+          <w:sz w:val="2"/>
+        </w:rPr>
+      </w:r>
+    </w:p>
+    <w:p>
+      <w:pPr>
+        <w:spacing w:after="80" w:line="283" w:lineRule="auto"/>
+      </w:pPr>
+      <w:r>
+        <w:rPr>
+          <w:rFonts w:ascii="Arial" w:hAnsi="Arial" w:eastAsia="Arial"/>
+          <w:b w:val="0"/>
+          <w:i w:val="0"/>
+          <w:color w:val="5E6B78"/>
+          <w:sz w:val="18"/>
+        </w:rPr>
+        <w:t>agripartners.vercel.app · github.com/farabek/agripartners</w:t>
+      </w:r>
+    </w:p>
     <w:sectPr>
-      <w:footerReference w:type="default" r:id="rId9"/>
+      <w:headerReference w:type="default" r:id="rId9"/>
+      <w:footerReference w:type="default" r:id="rId10"/>
       <w:pgSz w:w="12240" w:h="15840"/>
-      <w:pgMar w:top="936" w:right="1008" w:bottom="936" w:left="1008" w:header="720" w:footer="720" w:gutter="0"/>
+      <w:pgMar w:top="1440" w:right="1440" w:bottom="1440" w:left="1440" w:header="708" w:footer="708" w:gutter="0"/>
       <w:cols w:space="720"/>
       <w:docGrid w:linePitch="360"/>
     </w:sectPr>
@@ -2968,17 +2147,40 @@
   <w:p>
     <w:pPr>
       <w:pStyle w:val="Footer"/>
-      <w:jc w:val="center"/>
+      <w:jc w:val="right"/>
     </w:pPr>
     <w:r>
       <w:rPr>
-        <w:rFonts w:ascii="DejaVu Sans" w:hAnsi="DejaVu Sans" w:eastAsia="DejaVu Sans"/>
+        <w:rFonts w:ascii="Arial" w:hAnsi="Arial" w:eastAsia="Arial"/>
+        <w:b w:val="0"/>
+        <w:i w:val="0"/>
+        <w:color w:val="5E6B78"/>
         <w:sz w:val="16"/>
       </w:rPr>
-      <w:t>AgriPartners Platform Explained - Russian v2.0</w:t>
+      <w:t>AgriPartners · Alpha v1.2</w:t>
     </w:r>
   </w:p>
 </w:ftr>
+</file>
+
+<file path=word/header1.xml><?xml version="1.0" encoding="utf-8"?>
+<w:hdr xmlns:m="http://schemas.openxmlformats.org/officeDocument/2006/math" xmlns:mc="http://schemas.openxmlformats.org/markup-compatibility/2006" xmlns:mo="http://schemas.microsoft.com/office/mac/office/2008/main" xmlns:mv="urn:schemas-microsoft-com:mac:vml" xmlns:o="urn:schemas-microsoft-com:office:office" xmlns:r="http://schemas.openxmlformats.org/officeDocument/2006/relationships" xmlns:v="urn:schemas-microsoft-com:vml" xmlns:w10="urn:schemas-microsoft-com:office:word" xmlns:w14="http://schemas.microsoft.com/office/word/2010/wordml" xmlns:w="http://schemas.openxmlformats.org/wordprocessingml/2006/main" xmlns:wne="http://schemas.microsoft.com/office/word/2006/wordml" xmlns:wp14="http://schemas.microsoft.com/office/word/2010/wordprocessingDrawing" xmlns:wp="http://schemas.openxmlformats.org/drawingml/2006/wordprocessingDrawing" xmlns:wpc="http://schemas.microsoft.com/office/word/2010/wordprocessingCanvas" xmlns:wpg="http://schemas.microsoft.com/office/word/2010/wordprocessingGroup" xmlns:wpi="http://schemas.microsoft.com/office/word/2010/wordprocessingInk" xmlns:wps="http://schemas.microsoft.com/office/word/2010/wordprocessingShape" mc:Ignorable="w14 wp14">
+  <w:p>
+    <w:pPr>
+      <w:pStyle w:val="Header"/>
+    </w:pPr>
+    <w:r>
+      <w:rPr>
+        <w:rFonts w:ascii="Arial" w:hAnsi="Arial" w:eastAsia="Arial"/>
+        <w:b/>
+        <w:i w:val="0"/>
+        <w:color w:val="5E6B78"/>
+        <w:sz w:val="16"/>
+      </w:rPr>
+      <w:t>AgriPartners | Platform Explained | RU | Alpha v1.2</w:t>
+    </w:r>
+  </w:p>
+</w:hdr>
 </file>
 
 <file path=word/numbering.xml><?xml version="1.0" encoding="utf-8"?>
@@ -3344,9 +2546,12 @@
     <w:name w:val="Normal"/>
     <w:qFormat/>
     <w:rsid w:val="00FC693F"/>
+    <w:pPr>
+      <w:spacing w:after="120" w:line="283" w:lineRule="auto"/>
+    </w:pPr>
     <w:rPr>
-      <w:rFonts w:ascii="DejaVu Sans" w:hAnsi="DejaVu Sans" w:eastAsia="DejaVu Sans"/>
-      <w:sz w:val="20"/>
+      <w:rFonts w:ascii="Arial" w:hAnsi="Arial"/>
+      <w:sz w:val="21"/>
     </w:rPr>
   </w:style>
   <w:style w:type="paragraph" w:styleId="Header">
@@ -3404,15 +2609,15 @@
     <w:pPr>
       <w:keepNext/>
       <w:keepLines/>
-      <w:spacing w:before="480" w:after="0"/>
+      <w:spacing w:before="360" w:after="200"/>
       <w:outlineLvl w:val="0"/>
     </w:pPr>
     <w:rPr>
-      <w:rFonts w:asciiTheme="majorHAnsi" w:eastAsiaTheme="majorEastAsia" w:hAnsiTheme="majorHAnsi" w:cstheme="majorBidi" w:ascii="DejaVu Sans" w:hAnsi="DejaVu Sans" w:eastAsia="DejaVu Sans"/>
+      <w:rFonts w:asciiTheme="majorHAnsi" w:eastAsiaTheme="majorEastAsia" w:hAnsiTheme="majorHAnsi" w:cstheme="majorBidi" w:ascii="Arial" w:hAnsi="Arial"/>
       <w:b/>
       <w:bCs/>
-      <w:color w:val="365F91" w:themeColor="accent1" w:themeShade="BF"/>
-      <w:sz w:val="28"/>
+      <w:color w:val="056246"/>
+      <w:sz w:val="32"/>
       <w:szCs w:val="28"/>
     </w:rPr>
   </w:style>
@@ -3428,14 +2633,14 @@
     <w:pPr>
       <w:keepNext/>
       <w:keepLines/>
-      <w:spacing w:before="200" w:after="0"/>
+      <w:spacing w:before="280" w:after="140"/>
       <w:outlineLvl w:val="1"/>
     </w:pPr>
     <w:rPr>
-      <w:rFonts w:asciiTheme="majorHAnsi" w:eastAsiaTheme="majorEastAsia" w:hAnsiTheme="majorHAnsi" w:cstheme="majorBidi" w:ascii="DejaVu Sans" w:hAnsi="DejaVu Sans" w:eastAsia="DejaVu Sans"/>
+      <w:rFonts w:asciiTheme="majorHAnsi" w:eastAsiaTheme="majorEastAsia" w:hAnsiTheme="majorHAnsi" w:cstheme="majorBidi" w:ascii="Arial" w:hAnsi="Arial"/>
       <w:b/>
       <w:bCs/>
-      <w:color w:val="4F81BD" w:themeColor="accent1"/>
+      <w:color w:val="056246"/>
       <w:sz w:val="26"/>
       <w:szCs w:val="26"/>
     </w:rPr>
@@ -3452,14 +2657,15 @@
     <w:pPr>
       <w:keepNext/>
       <w:keepLines/>
-      <w:spacing w:before="200" w:after="0"/>
+      <w:spacing w:before="200" w:after="100"/>
       <w:outlineLvl w:val="2"/>
     </w:pPr>
     <w:rPr>
-      <w:rFonts w:asciiTheme="majorHAnsi" w:eastAsiaTheme="majorEastAsia" w:hAnsiTheme="majorHAnsi" w:cstheme="majorBidi" w:ascii="DejaVu Sans" w:hAnsi="DejaVu Sans" w:eastAsia="DejaVu Sans"/>
+      <w:rFonts w:asciiTheme="majorHAnsi" w:eastAsiaTheme="majorEastAsia" w:hAnsiTheme="majorHAnsi" w:cstheme="majorBidi" w:ascii="Arial" w:hAnsi="Arial"/>
       <w:b/>
       <w:bCs/>
-      <w:color w:val="4F81BD" w:themeColor="accent1"/>
+      <w:color w:val="056246"/>
+      <w:sz w:val="24"/>
     </w:rPr>
   </w:style>
   <w:style w:type="paragraph" w:styleId="Heading4">
@@ -3697,7 +2903,7 @@
       <w:contextualSpacing/>
     </w:pPr>
     <w:rPr>
-      <w:rFonts w:asciiTheme="majorHAnsi" w:eastAsiaTheme="majorEastAsia" w:hAnsiTheme="majorHAnsi" w:cstheme="majorBidi" w:ascii="DejaVu Sans" w:hAnsi="DejaVu Sans" w:eastAsia="DejaVu Sans"/>
+      <w:rFonts w:asciiTheme="majorHAnsi" w:eastAsiaTheme="majorEastAsia" w:hAnsiTheme="majorHAnsi" w:cstheme="majorBidi"/>
       <w:color w:val="17365D" w:themeColor="text2" w:themeShade="BF"/>
       <w:spacing w:val="5"/>
       <w:kern w:val="28"/>
@@ -3877,9 +3083,6 @@
       </w:numPr>
       <w:contextualSpacing/>
     </w:pPr>
-    <w:rPr>
-      <w:rFonts w:ascii="DejaVu Sans" w:hAnsi="DejaVu Sans" w:eastAsia="DejaVu Sans"/>
-    </w:rPr>
   </w:style>
   <w:style w:type="paragraph" w:styleId="ListBullet2">
     <w:name w:val="List Bullet 2"/>
@@ -3919,9 +3122,6 @@
       </w:numPr>
       <w:contextualSpacing/>
     </w:pPr>
-    <w:rPr>
-      <w:rFonts w:ascii="DejaVu Sans" w:hAnsi="DejaVu Sans" w:eastAsia="DejaVu Sans"/>
-    </w:rPr>
   </w:style>
   <w:style w:type="paragraph" w:styleId="ListNumber2">
     <w:name w:val="List Number 2"/>

</xml_diff>

<commit_message>
docs: streamline public PDF package (#12)
</commit_message>
<xml_diff>
--- a/docs/platform/PLATFORM_EXPLAINED_RU.docx
+++ b/docs/platform/PLATFORM_EXPLAINED_RU.docx
@@ -4,399 +4,662 @@
   <w:body>
     <w:p>
       <w:pPr>
+        <w:spacing w:after="60" w:line="283" w:lineRule="auto"/>
         <w:jc w:val="center"/>
       </w:pPr>
       <w:r>
         <w:rPr>
-          <w:rFonts w:ascii="DejaVu Sans" w:hAnsi="DejaVu Sans" w:eastAsia="DejaVu Sans"/>
+          <w:rFonts w:ascii="Arial" w:hAnsi="Arial" w:eastAsia="Arial"/>
           <w:b/>
-          <w:color w:val="00965A"/>
-          <w:sz w:val="48"/>
+          <w:i w:val="0"/>
+          <w:color w:val="087F5B"/>
+          <w:sz w:val="18"/>
         </w:rPr>
-        <w:t>AgriPartners</w:t>
+        <w:t>AGRIPARTNERS</w:t>
       </w:r>
     </w:p>
     <w:p>
       <w:pPr>
+        <w:spacing w:after="80" w:line="283" w:lineRule="auto"/>
         <w:jc w:val="center"/>
       </w:pPr>
       <w:r>
         <w:rPr>
-          <w:rFonts w:ascii="DejaVu Sans" w:hAnsi="DejaVu Sans" w:eastAsia="DejaVu Sans"/>
+          <w:rFonts w:ascii="Arial" w:hAnsi="Arial" w:eastAsia="Arial"/>
           <w:b/>
-          <w:sz w:val="32"/>
+          <w:i w:val="0"/>
+          <w:color w:val="17324D"/>
+          <w:sz w:val="50"/>
         </w:rPr>
-        <w:t>Концепция платформы, модель финансирования и выгоды для участников</w:t>
+        <w:t>Платформа AgriPartners — краткое объяснение</w:t>
       </w:r>
     </w:p>
     <w:p>
       <w:pPr>
+        <w:spacing w:after="280" w:line="283" w:lineRule="auto"/>
         <w:jc w:val="center"/>
       </w:pPr>
       <w:r>
         <w:rPr>
-          <w:rFonts w:ascii="DejaVu Sans" w:hAnsi="DejaVu Sans" w:eastAsia="DejaVu Sans"/>
-          <w:i/>
-          <w:sz w:val="22"/>
+          <w:rFonts w:ascii="Arial" w:hAnsi="Arial" w:eastAsia="Arial"/>
+          <w:b w:val="0"/>
+          <w:i w:val="0"/>
+          <w:color w:val="5E6B78"/>
+          <w:sz w:val="25"/>
         </w:rPr>
-        <w:t>Русская версия 2.0 с простыми пояснениями английских терминов</w:t>
+        <w:t>Alpha v1.2 · прозрачные процессы агроинвестирования · NEAR Testnet</w:t>
       </w:r>
     </w:p>
     <w:tbl>
       <w:tblPr>
         <w:tblW w:type="auto" w:w="0"/>
-        <w:jc w:val="center"/>
+        <w:jc w:val="left"/>
+        <w:tblLayout w:type="fixed"/>
         <w:tblLook w:firstColumn="1" w:firstRow="1" w:lastColumn="0" w:lastRow="0" w:noHBand="0" w:noVBand="1" w:val="04A0"/>
+        <w:tblW w:w="9360" w:type="dxa"/>
+        <w:tblInd w:w="120" w:type="dxa"/>
       </w:tblPr>
       <w:tblGrid>
-        <w:gridCol w:w="10224"/>
+        <w:gridCol w:w="9360"/>
       </w:tblGrid>
       <w:tr>
         <w:tc>
           <w:tcPr>
-            <w:tcW w:type="dxa" w:w="10224"/>
-            <w:shd w:fill="EAF4EF"/>
+            <w:tcW w:type="dxa" w:w="9360"/>
+            <w:tcW w:w="9360" w:type="dxa"/>
+            <w:vAlign w:val="center"/>
+            <w:shd w:fill="E8F5EF"/>
           </w:tcPr>
           <w:p>
+            <w:pPr>
+              <w:spacing w:after="0"/>
+            </w:pPr>
             <w:r>
               <w:rPr>
-                <w:rFonts w:ascii="DejaVu Sans" w:hAnsi="DejaVu Sans" w:eastAsia="DejaVu Sans"/>
+                <w:rFonts w:ascii="Arial" w:hAnsi="Arial" w:eastAsia="Arial"/>
                 <w:b/>
-                <w:color w:val="005A36"/>
-                <w:sz w:val="20"/>
+                <w:i w:val="0"/>
+                <w:color w:val="056246"/>
+                <w:sz w:val="19"/>
               </w:rPr>
-              <w:t>Как читать этот документ</w:t>
-              <w:br/>
-            </w:r>
-            <w:r>
-              <w:rPr>
-                <w:rFonts w:ascii="DejaVu Sans" w:hAnsi="DejaVu Sans" w:eastAsia="DejaVu Sans"/>
-                <w:sz w:val="18"/>
-              </w:rPr>
-              <w:t>Если рядом с английским термином указано пояснение в скобках, его нужно понимать как простое русское объяснение смысла. Например, Testnet - это тестовая сеть, где система проверяется без настоящих денег.</w:t>
+              <w:t>AgriPartners — Alpha-платформа для организации сельскохозяйственных проектов, подтверждений, отчётности и прозрачности для инвестора. Это презентация и Testnet-демонстрация, а не действующая инвестиционная платформа, кастодиальный сервис или система реальных расчётов.</w:t>
             </w:r>
           </w:p>
         </w:tc>
       </w:tr>
     </w:tbl>
-    <w:p/>
     <w:p>
       <w:pPr>
-        <w:pStyle w:val="Heading1"/>
+        <w:spacing w:after="40" w:line="283" w:lineRule="auto"/>
       </w:pPr>
       <w:r>
         <w:rPr>
-          <w:rFonts w:ascii="DejaVu Sans" w:hAnsi="DejaVu Sans" w:eastAsia="DejaVu Sans"/>
-          <w:color w:val="005F41"/>
+          <w:rFonts w:ascii="Arial" w:hAnsi="Arial" w:eastAsia="Arial"/>
+          <w:b w:val="0"/>
+          <w:i w:val="0"/>
+          <w:color w:val="17212B"/>
+          <w:sz w:val="2"/>
         </w:rPr>
-        <w:t>1. Краткое резюме</w:t>
-      </w:r>
-    </w:p>
-    <w:p>
-      <w:r>
-        <w:rPr>
-          <w:rFonts w:ascii="DejaVu Sans" w:hAnsi="DejaVu Sans" w:eastAsia="DejaVu Sans"/>
-          <w:sz w:val="20"/>
-        </w:rPr>
-        <w:t>AgriPartners - это платформа для прозрачного управления инвестиционными процессами в сельском хозяйстве. Слово Platform (платформа) здесь означает интернет-систему, через которую инвесторы, фермеры и администраторы видят сделки, отчеты, статусы и финансовую картину проекта.</w:t>
-      </w:r>
-    </w:p>
-    <w:p>
-      <w:r>
-        <w:rPr>
-          <w:rFonts w:ascii="DejaVu Sans" w:hAnsi="DejaVu Sans" w:eastAsia="DejaVu Sans"/>
-          <w:sz w:val="20"/>
-        </w:rPr>
-        <w:t>Главная идея AgriPartners не в том, чтобы просто «привлечь криптовалюту». Главная идея - создать понятный и проверяемый рабочий процесс: от выбора сельскохозяйственного проекта до отчетности фермера и возврата результата инвестору.</w:t>
-      </w:r>
-    </w:p>
-    <w:p>
-      <w:r>
-        <w:rPr>
-          <w:rFonts w:ascii="DejaVu Sans" w:hAnsi="DejaVu Sans" w:eastAsia="DejaVu Sans"/>
-          <w:sz w:val="20"/>
-        </w:rPr>
-        <w:t>На текущем этапе AgriPartners находится в Alpha (альфа-версии). Простыми словами, Alpha - это ранняя рабочая версия продукта, которую можно показывать партнерам, тестировать, улучшать и использовать для обратной связи, но не считать полностью готовой коммерческой системой.</w:t>
-      </w:r>
-    </w:p>
-    <w:p>
-      <w:r>
-        <w:rPr>
-          <w:rFonts w:ascii="DejaVu Sans" w:hAnsi="DejaVu Sans" w:eastAsia="DejaVu Sans"/>
-          <w:sz w:val="20"/>
-        </w:rPr>
-        <w:t>Платформа использует NEAR Testnet. NEAR - это блокчейн-экосистема, а Testnet (тестовая сеть) - безопасная учебная сеть, где можно проверять логику без настоящих денег и без риска для инвесторов или фермеров.</w:t>
       </w:r>
     </w:p>
     <w:p>
       <w:pPr>
-        <w:pStyle w:val="Heading1"/>
+        <w:pStyle w:val="Heading2"/>
       </w:pPr>
       <w:r>
         <w:rPr>
-          <w:rFonts w:ascii="DejaVu Sans" w:hAnsi="DejaVu Sans" w:eastAsia="DejaVu Sans"/>
-          <w:color w:val="005F41"/>
+          <w:rFonts w:ascii="Arial" w:hAnsi="Arial" w:eastAsia="Arial"/>
+          <w:b/>
+          <w:i w:val="0"/>
+          <w:color w:val="056246"/>
+          <w:sz w:val="26"/>
         </w:rPr>
-        <w:t>2. Какую проблему решает AgriPartners</w:t>
-      </w:r>
-    </w:p>
-    <w:p>
-      <w:r>
-        <w:rPr>
-          <w:rFonts w:ascii="DejaVu Sans" w:hAnsi="DejaVu Sans" w:eastAsia="DejaVu Sans"/>
-          <w:sz w:val="20"/>
-        </w:rPr>
-        <w:t>В сельском хозяйстве инвестиционные процессы часто ведутся через таблицы, сообщения, PDF-договоры и устные договоренности. Инвестору сложно понять, где находятся деньги, что уже куплено, начался ли производственный цикл и есть ли отчет от фермера.</w:t>
-      </w:r>
-    </w:p>
-    <w:p>
-      <w:r>
-        <w:rPr>
-          <w:rFonts w:ascii="DejaVu Sans" w:hAnsi="DejaVu Sans" w:eastAsia="DejaVu Sans"/>
-          <w:sz w:val="20"/>
-        </w:rPr>
-        <w:t>Фермеру также сложно: нужно объяснять, что сделано, когда получены средства, какие расходы были понесены и когда ждать результат. Администратор вынужден вручную сводить информацию из разных источников.</w:t>
-      </w:r>
-    </w:p>
-    <w:p>
-      <w:r>
-        <w:rPr>
-          <w:rFonts w:ascii="DejaVu Sans" w:hAnsi="DejaVu Sans" w:eastAsia="DejaVu Sans"/>
-          <w:sz w:val="20"/>
-        </w:rPr>
-        <w:t>AgriPartners объединяет эти процессы в единый Workflow (рабочий процесс). Простыми словами, Workflow - это последовательность действий: создать проект, показать его инвестору, подтвердить финансирование, начать цикл, принять отчет, зафиксировать результат.</w:t>
+        <w:t>Проблема и продукт</w:t>
       </w:r>
     </w:p>
     <w:p>
       <w:pPr>
-        <w:pStyle w:val="Heading1"/>
+        <w:pStyle w:val="ListBullet"/>
+        <w:spacing w:after="80"/>
+        <w:ind w:left="540" w:hanging="271"/>
       </w:pPr>
       <w:r>
         <w:rPr>
-          <w:rFonts w:ascii="DejaVu Sans" w:hAnsi="DejaVu Sans" w:eastAsia="DejaVu Sans"/>
-          <w:color w:val="005F41"/>
-        </w:rPr>
-        <w:t>3. Почему сельское хозяйство</w:t>
-      </w:r>
-    </w:p>
-    <w:p>
-      <w:r>
-        <w:rPr>
-          <w:rFonts w:ascii="DejaVu Sans" w:hAnsi="DejaVu Sans" w:eastAsia="DejaVu Sans"/>
+          <w:rFonts w:ascii="Arial" w:hAnsi="Arial" w:eastAsia="Arial"/>
+          <w:b w:val="0"/>
+          <w:i w:val="0"/>
+          <w:color w:val="17212B"/>
           <w:sz w:val="20"/>
         </w:rPr>
-        <w:t>Сельское хозяйство - это реальный сектор экономики. Здесь есть физические активы: животные, теплицы, урожай, корма, оборудование, земля и производственные циклы. Поэтому этот сектор хорошо подходит для модели прозрачного учета и отчетности.</w:t>
-      </w:r>
-    </w:p>
-    <w:p>
-      <w:r>
-        <w:rPr>
-          <w:rFonts w:ascii="DejaVu Sans" w:hAnsi="DejaVu Sans" w:eastAsia="DejaVu Sans"/>
-          <w:sz w:val="20"/>
-        </w:rPr>
-        <w:t>В контексте Web3 такие активы часто называют RWA (Real World Assets). Простыми словами, RWA - это реальные активы из обычной экономики, которые можно описать, учесть и представить в цифровой системе.</w:t>
-      </w:r>
-    </w:p>
-    <w:p>
-      <w:r>
-        <w:rPr>
-          <w:rFonts w:ascii="DejaVu Sans" w:hAnsi="DejaVu Sans" w:eastAsia="DejaVu Sans"/>
-          <w:sz w:val="20"/>
-        </w:rPr>
-        <w:t>Для AgriPartners RWA - это не модный термин. Это практическая идея: сельскохозяйственный проект должен быть понятен инвестору, фермеру и администратору, а его история должна быть проверяемой.</w:t>
+        <w:t>Агропроекты трудно оценивать, когда бюджеты, этапы, отчёты и подтверждения разрознены.</w:t>
       </w:r>
     </w:p>
     <w:p>
       <w:pPr>
-        <w:pStyle w:val="Heading1"/>
+        <w:pStyle w:val="ListBullet"/>
+        <w:spacing w:after="80"/>
+        <w:ind w:left="540" w:hanging="271"/>
       </w:pPr>
       <w:r>
         <w:rPr>
-          <w:rFonts w:ascii="DejaVu Sans" w:hAnsi="DejaVu Sans" w:eastAsia="DejaVu Sans"/>
-          <w:color w:val="005F41"/>
-        </w:rPr>
-        <w:t>4. Почему блокчейн и NEAR</w:t>
-      </w:r>
-    </w:p>
-    <w:p>
-      <w:r>
-        <w:rPr>
-          <w:rFonts w:ascii="DejaVu Sans" w:hAnsi="DejaVu Sans" w:eastAsia="DejaVu Sans"/>
+          <w:rFonts w:ascii="Arial" w:hAnsi="Arial" w:eastAsia="Arial"/>
+          <w:b w:val="0"/>
+          <w:i w:val="0"/>
+          <w:color w:val="17212B"/>
           <w:sz w:val="20"/>
         </w:rPr>
-        <w:t>Blockchain (блокчейн) - это цифровой журнал записей, где события можно фиксировать так, чтобы их было сложно задним числом изменить незаметно. Простыми словами, блокчейн помогает создать доверие к истории событий.</w:t>
-      </w:r>
-    </w:p>
-    <w:p>
-      <w:r>
-        <w:rPr>
-          <w:rFonts w:ascii="DejaVu Sans" w:hAnsi="DejaVu Sans" w:eastAsia="DejaVu Sans"/>
-          <w:sz w:val="20"/>
-        </w:rPr>
-        <w:t>NEAR выбран как инфраструктурная среда для экспериментов, потому что он подходит для построения приложений, где важны учет событий, кошельки пользователей, смарт-контракты и интеграция с Web3-сообществом.</w:t>
-      </w:r>
-    </w:p>
-    <w:p>
-      <w:r>
-        <w:rPr>
-          <w:rFonts w:ascii="DejaVu Sans" w:hAnsi="DejaVu Sans" w:eastAsia="DejaVu Sans"/>
-          <w:sz w:val="20"/>
-        </w:rPr>
-        <w:t>Web3 (веб3) означает новый тип интернет-приложений, где пользователи могут взаимодействовать через кошельки, цифровые активы и блокчейн-записи, а не только через обычные логины и пароли.</w:t>
-      </w:r>
-    </w:p>
-    <w:tbl>
-      <w:tblPr>
-        <w:tblW w:type="auto" w:w="0"/>
-        <w:jc w:val="center"/>
-        <w:tblLook w:firstColumn="1" w:firstRow="1" w:lastColumn="0" w:lastRow="0" w:noHBand="0" w:noVBand="1" w:val="04A0"/>
-      </w:tblPr>
-      <w:tblGrid>
-        <w:gridCol w:w="10224"/>
-      </w:tblGrid>
-      <w:tr>
-        <w:tc>
-          <w:tcPr>
-            <w:tcW w:type="dxa" w:w="10224"/>
-            <w:shd w:fill="EAF4EF"/>
-          </w:tcPr>
-          <w:p>
-            <w:r>
-              <w:rPr>
-                <w:rFonts w:ascii="DejaVu Sans" w:hAnsi="DejaVu Sans" w:eastAsia="DejaVu Sans"/>
-                <w:b/>
-                <w:color w:val="005A36"/>
-                <w:sz w:val="20"/>
-              </w:rPr>
-              <w:t>Простыми словами</w:t>
-              <w:br/>
-            </w:r>
-            <w:r>
-              <w:rPr>
-                <w:rFonts w:ascii="DejaVu Sans" w:hAnsi="DejaVu Sans" w:eastAsia="DejaVu Sans"/>
-                <w:sz w:val="18"/>
-              </w:rPr>
-              <w:t>NEAR для AgriPartners - это не просто криптовалюта. Это техническая среда, где можно проверять прозрачные инвестиционные рабочие процессы, цифровые подтверждения и будущую автоматизацию.</w:t>
-            </w:r>
-          </w:p>
-        </w:tc>
-      </w:tr>
-    </w:tbl>
-    <w:p/>
-    <w:p>
-      <w:pPr>
-        <w:pStyle w:val="Heading1"/>
-      </w:pPr>
-      <w:r>
-        <w:rPr>
-          <w:rFonts w:ascii="DejaVu Sans" w:hAnsi="DejaVu Sans" w:eastAsia="DejaVu Sans"/>
-          <w:color w:val="005F41"/>
-        </w:rPr>
-        <w:t>5. Первоначальная идея движения средств</w:t>
-      </w:r>
-    </w:p>
-    <w:p>
-      <w:r>
-        <w:rPr>
-          <w:rFonts w:ascii="DejaVu Sans" w:hAnsi="DejaVu Sans" w:eastAsia="DejaVu Sans"/>
-          <w:sz w:val="20"/>
-        </w:rPr>
-        <w:t>Изначальная модель может выглядеть так: инвестор использует NEAR или другой цифровой актив, затем средства могут быть конвертированы в USDT, далее в USD или местную валюту, после чего фермер получает финансирование для покупки животных, кормов или оборудования.</w:t>
-      </w:r>
-    </w:p>
-    <w:p>
-      <w:r>
-        <w:rPr>
-          <w:rFonts w:ascii="DejaVu Sans" w:hAnsi="DejaVu Sans" w:eastAsia="DejaVu Sans"/>
-          <w:sz w:val="20"/>
-        </w:rPr>
-        <w:t>USDT (Tether) - это Stablecoin (стейблкоин). Простыми словами, стейблкоин - это криптовалюта, которая старается сохранять стоимость около 1 доллара США. USD - это обычный доллар США.</w:t>
-      </w:r>
-    </w:p>
-    <w:p>
-      <w:r>
-        <w:rPr>
-          <w:rFonts w:ascii="DejaVu Sans" w:hAnsi="DejaVu Sans" w:eastAsia="DejaVu Sans"/>
-          <w:sz w:val="20"/>
-        </w:rPr>
-        <w:t>Такая схема технически возможна, но на практике она требует юридической, налоговой, банковской и комплаенс-проверки. Compliance (комплаенс) означает соблюдение правил: законов, требований банков, KYC и AML.</w:t>
-      </w:r>
-    </w:p>
-    <w:p>
-      <w:r>
-        <w:rPr>
-          <w:rFonts w:ascii="DejaVu Sans" w:hAnsi="DejaVu Sans" w:eastAsia="DejaVu Sans"/>
-          <w:sz w:val="20"/>
-        </w:rPr>
-        <w:t>KYC (Know Your Customer) - это проверка личности клиента. AML (Anti-Money Laundering) - это правила против отмывания денег. Простыми словами, если платформа работает с реальными деньгами, она должна понимать, кто отправляет средства, кто получает средства и зачем.</w:t>
+        <w:t>Инвестору нужна своевременная прозрачность без прямого управления операциями и переводов местным участникам.</w:t>
       </w:r>
     </w:p>
     <w:p>
       <w:pPr>
-        <w:pStyle w:val="Heading1"/>
+        <w:pStyle w:val="ListBullet"/>
+        <w:spacing w:after="80"/>
+        <w:ind w:left="540" w:hanging="271"/>
       </w:pPr>
       <w:r>
         <w:rPr>
-          <w:rFonts w:ascii="DejaVu Sans" w:hAnsi="DejaVu Sans" w:eastAsia="DejaVu Sans"/>
-          <w:color w:val="005F41"/>
+          <w:rFonts w:ascii="Arial" w:hAnsi="Arial" w:eastAsia="Arial"/>
+          <w:b w:val="0"/>
+          <w:i w:val="0"/>
+          <w:color w:val="17212B"/>
+          <w:sz w:val="20"/>
         </w:rPr>
-        <w:t>6. Упрощенная схема движения средств</w:t>
+        <w:t>Оператору нужен понятный фиатный процесс получения средств, подтверждения работ и возврата выручки.</w:t>
       </w:r>
     </w:p>
     <w:tbl>
       <w:tblPr>
         <w:tblStyle w:val="TableGrid"/>
         <w:tblW w:type="auto" w:w="0"/>
-        <w:jc w:val="center"/>
+        <w:jc w:val="left"/>
+        <w:tblLayout w:type="fixed"/>
         <w:tblLook w:firstColumn="1" w:firstRow="1" w:lastColumn="0" w:lastRow="0" w:noHBand="0" w:noVBand="1" w:val="04A0"/>
+        <w:tblW w:w="9360" w:type="dxa"/>
+        <w:tblInd w:w="120" w:type="dxa"/>
       </w:tblPr>
       <w:tblGrid>
-        <w:gridCol w:w="3408"/>
-        <w:gridCol w:w="3408"/>
-        <w:gridCol w:w="3408"/>
+        <w:gridCol w:w="2700"/>
+        <w:gridCol w:w="6660"/>
       </w:tblGrid>
       <w:tr>
         <w:tc>
           <w:tcPr>
-            <w:tcW w:type="dxa" w:w="3408"/>
-            <w:shd w:fill="006B4A"/>
+            <w:tcW w:type="dxa" w:w="4680"/>
+            <w:tcW w:w="2700" w:type="dxa"/>
+            <w:vAlign w:val="center"/>
+            <w:shd w:fill="056246"/>
           </w:tcPr>
           <w:p>
+            <w:pPr>
+              <w:spacing w:after="0"/>
+              <w:jc w:val="center"/>
+            </w:pPr>
             <w:r>
               <w:rPr>
-                <w:rFonts w:ascii="DejaVu Sans" w:hAnsi="DejaVu Sans" w:eastAsia="DejaVu Sans"/>
-                <w:sz w:val="18"/>
-              </w:rPr>
-            </w:r>
-            <w:r>
-              <w:rPr>
-                <w:rFonts w:ascii="DejaVu Sans" w:hAnsi="DejaVu Sans" w:eastAsia="DejaVu Sans"/>
+                <w:rFonts w:ascii="Arial" w:hAnsi="Arial" w:eastAsia="Arial"/>
                 <w:b/>
+                <w:i w:val="0"/>
                 <w:color w:val="FFFFFF"/>
                 <w:sz w:val="18"/>
               </w:rPr>
-              <w:t>Шаг</w:t>
+              <w:t>Возможность</w:t>
             </w:r>
           </w:p>
         </w:tc>
         <w:tc>
           <w:tcPr>
-            <w:tcW w:type="dxa" w:w="3408"/>
-            <w:shd w:fill="006B4A"/>
+            <w:tcW w:type="dxa" w:w="4680"/>
+            <w:tcW w:w="6660" w:type="dxa"/>
+            <w:vAlign w:val="center"/>
+            <w:shd w:fill="056246"/>
           </w:tcPr>
           <w:p>
+            <w:pPr>
+              <w:spacing w:after="0"/>
+              <w:jc w:val="center"/>
+            </w:pPr>
             <w:r>
               <w:rPr>
-                <w:rFonts w:ascii="DejaVu Sans" w:hAnsi="DejaVu Sans" w:eastAsia="DejaVu Sans"/>
+                <w:rFonts w:ascii="Arial" w:hAnsi="Arial" w:eastAsia="Arial"/>
+                <w:b/>
+                <w:i w:val="0"/>
+                <w:color w:val="FFFFFF"/>
                 <w:sz w:val="18"/>
               </w:rPr>
+              <w:t>Ценность</w:t>
             </w:r>
+          </w:p>
+        </w:tc>
+      </w:tr>
+      <w:tr>
+        <w:tc>
+          <w:tcPr>
+            <w:tcW w:type="dxa" w:w="2700"/>
+          </w:tcPr>
+          <w:p>
+            <w:pPr>
+              <w:spacing w:after="0"/>
+              <w:jc w:val="left"/>
+            </w:pPr>
             <w:r>
               <w:rPr>
-                <w:rFonts w:ascii="DejaVu Sans" w:hAnsi="DejaVu Sans" w:eastAsia="DejaVu Sans"/>
+                <w:rFonts w:ascii="Arial" w:hAnsi="Arial" w:eastAsia="Arial"/>
+                <w:b w:val="0"/>
+                <w:i w:val="0"/>
+                <w:color w:val="17212B"/>
+                <w:sz w:val="18"/>
+              </w:rPr>
+              <w:t>Рабочее пространство проекта</w:t>
+            </w:r>
+          </w:p>
+        </w:tc>
+        <w:tc>
+          <w:tcPr>
+            <w:tcW w:type="dxa" w:w="6660"/>
+          </w:tcPr>
+          <w:p>
+            <w:pPr>
+              <w:spacing w:after="0"/>
+              <w:jc w:val="center"/>
+            </w:pPr>
+            <w:r>
+              <w:rPr>
+                <w:rFonts w:ascii="Arial" w:hAnsi="Arial" w:eastAsia="Arial"/>
+                <w:b w:val="0"/>
+                <w:i w:val="0"/>
+                <w:color w:val="17212B"/>
+                <w:sz w:val="18"/>
+              </w:rPr>
+              <w:t>Бюджет, этапы, подтверждения, отчёты, риски и статус в одном процессе.</w:t>
+            </w:r>
+          </w:p>
+        </w:tc>
+      </w:tr>
+      <w:tr>
+        <w:tc>
+          <w:tcPr>
+            <w:tcW w:type="dxa" w:w="2700"/>
+            <w:shd w:fill="F2F4F7"/>
+          </w:tcPr>
+          <w:p>
+            <w:pPr>
+              <w:spacing w:after="0"/>
+              <w:jc w:val="left"/>
+            </w:pPr>
+            <w:r>
+              <w:rPr>
+                <w:rFonts w:ascii="Arial" w:hAnsi="Arial" w:eastAsia="Arial"/>
+                <w:b w:val="0"/>
+                <w:i w:val="0"/>
+                <w:color w:val="17212B"/>
+                <w:sz w:val="18"/>
+              </w:rPr>
+              <w:t>Кабинет инвестора</w:t>
+            </w:r>
+          </w:p>
+        </w:tc>
+        <w:tc>
+          <w:tcPr>
+            <w:tcW w:type="dxa" w:w="6660"/>
+            <w:shd w:fill="F2F4F7"/>
+          </w:tcPr>
+          <w:p>
+            <w:pPr>
+              <w:spacing w:after="0"/>
+              <w:jc w:val="center"/>
+            </w:pPr>
+            <w:r>
+              <w:rPr>
+                <w:rFonts w:ascii="Arial" w:hAnsi="Arial" w:eastAsia="Arial"/>
+                <w:b w:val="0"/>
+                <w:i w:val="0"/>
+                <w:color w:val="17212B"/>
+                <w:sz w:val="18"/>
+              </w:rPr>
+              <w:t>Понятный прогресс и аудиторский след без прямого операционного контроля.</w:t>
+            </w:r>
+          </w:p>
+        </w:tc>
+      </w:tr>
+      <w:tr>
+        <w:tc>
+          <w:tcPr>
+            <w:tcW w:type="dxa" w:w="2700"/>
+          </w:tcPr>
+          <w:p>
+            <w:pPr>
+              <w:spacing w:after="0"/>
+              <w:jc w:val="left"/>
+            </w:pPr>
+            <w:r>
+              <w:rPr>
+                <w:rFonts w:ascii="Arial" w:hAnsi="Arial" w:eastAsia="Arial"/>
+                <w:b w:val="0"/>
+                <w:i w:val="0"/>
+                <w:color w:val="17212B"/>
+                <w:sz w:val="18"/>
+              </w:rPr>
+              <w:t>Процесс оператора</w:t>
+            </w:r>
+          </w:p>
+        </w:tc>
+        <w:tc>
+          <w:tcPr>
+            <w:tcW w:type="dxa" w:w="6660"/>
+          </w:tcPr>
+          <w:p>
+            <w:pPr>
+              <w:spacing w:after="0"/>
+              <w:jc w:val="center"/>
+            </w:pPr>
+            <w:r>
+              <w:rPr>
+                <w:rFonts w:ascii="Arial" w:hAnsi="Arial" w:eastAsia="Arial"/>
+                <w:b w:val="0"/>
+                <w:i w:val="0"/>
+                <w:color w:val="17212B"/>
+                <w:sz w:val="18"/>
+              </w:rPr>
+              <w:t>Фиатные поступления, операционные подтверждения и документы.</w:t>
+            </w:r>
+          </w:p>
+        </w:tc>
+      </w:tr>
+      <w:tr>
+        <w:tc>
+          <w:tcPr>
+            <w:tcW w:type="dxa" w:w="2700"/>
+            <w:shd w:fill="F2F4F7"/>
+          </w:tcPr>
+          <w:p>
+            <w:pPr>
+              <w:spacing w:after="0"/>
+              <w:jc w:val="left"/>
+            </w:pPr>
+            <w:r>
+              <w:rPr>
+                <w:rFonts w:ascii="Arial" w:hAnsi="Arial" w:eastAsia="Arial"/>
+                <w:b w:val="0"/>
+                <w:i w:val="0"/>
+                <w:color w:val="17212B"/>
+                <w:sz w:val="18"/>
+              </w:rPr>
+              <w:t>Режим презентации</w:t>
+            </w:r>
+          </w:p>
+        </w:tc>
+        <w:tc>
+          <w:tcPr>
+            <w:tcW w:type="dxa" w:w="6660"/>
+            <w:shd w:fill="F2F4F7"/>
+          </w:tcPr>
+          <w:p>
+            <w:pPr>
+              <w:spacing w:after="0"/>
+              <w:jc w:val="center"/>
+            </w:pPr>
+            <w:r>
+              <w:rPr>
+                <w:rFonts w:ascii="Arial" w:hAnsi="Arial" w:eastAsia="Arial"/>
+                <w:b w:val="0"/>
+                <w:i w:val="0"/>
+                <w:color w:val="17212B"/>
+                <w:sz w:val="18"/>
+              </w:rPr>
+              <w:t>Управляемая демонстрация Alpha v1.2 для инвесторов, партнёров и грантовых экспертов.</w:t>
+            </w:r>
+          </w:p>
+        </w:tc>
+      </w:tr>
+    </w:tbl>
+    <w:p>
+      <w:pPr>
+        <w:pStyle w:val="Heading2"/>
+      </w:pPr>
+      <w:r>
+        <w:rPr>
+          <w:rFonts w:ascii="Arial" w:hAnsi="Arial" w:eastAsia="Arial"/>
+          <w:b/>
+          <w:i w:val="0"/>
+          <w:color w:val="056246"/>
+          <w:sz w:val="26"/>
+        </w:rPr>
+        <w:t>Что показывает Alpha v1.2</w:t>
+      </w:r>
+    </w:p>
+    <w:p>
+      <w:pPr>
+        <w:pStyle w:val="ListBullet"/>
+        <w:spacing w:after="80"/>
+        <w:ind w:left="540" w:hanging="271"/>
+      </w:pPr>
+      <w:r>
+        <w:rPr>
+          <w:rFonts w:ascii="Arial" w:hAnsi="Arial" w:eastAsia="Arial"/>
+          <w:b w:val="0"/>
+          <w:i w:val="0"/>
+          <w:color w:val="17212B"/>
+          <w:sz w:val="20"/>
+        </w:rPr>
+        <w:t>Ролевой процесс и публичную презентацию.</w:t>
+      </w:r>
+    </w:p>
+    <w:p>
+      <w:pPr>
+        <w:pStyle w:val="ListBullet"/>
+        <w:spacing w:after="80"/>
+        <w:ind w:left="540" w:hanging="271"/>
+      </w:pPr>
+      <w:r>
+        <w:rPr>
+          <w:rFonts w:ascii="Arial" w:hAnsi="Arial" w:eastAsia="Arial"/>
+          <w:b w:val="0"/>
+          <w:i w:val="0"/>
+          <w:color w:val="17212B"/>
+          <w:sz w:val="20"/>
+        </w:rPr>
+        <w:t>Концепции проекта, расходов, подтверждений и отчётности.</w:t>
+      </w:r>
+    </w:p>
+    <w:p>
+      <w:pPr>
+        <w:pStyle w:val="ListBullet"/>
+        <w:spacing w:after="80"/>
+        <w:ind w:left="540" w:hanging="271"/>
+      </w:pPr>
+      <w:r>
+        <w:rPr>
+          <w:rFonts w:ascii="Arial" w:hAnsi="Arial" w:eastAsia="Arial"/>
+          <w:b w:val="0"/>
+          <w:i w:val="0"/>
+          <w:color w:val="17212B"/>
+          <w:sz w:val="20"/>
+        </w:rPr>
+        <w:t>События NEAR Testnet для демо-аудита и автоматизации на стороне Эстонии/инвестора.</w:t>
+      </w:r>
+    </w:p>
+    <w:p>
+      <w:pPr>
+        <w:pStyle w:val="ListBullet"/>
+        <w:spacing w:after="80"/>
+        <w:ind w:left="540" w:hanging="271"/>
+      </w:pPr>
+      <w:r>
+        <w:rPr>
+          <w:rFonts w:ascii="Arial" w:hAnsi="Arial" w:eastAsia="Arial"/>
+          <w:b w:val="0"/>
+          <w:i w:val="0"/>
+          <w:color w:val="17212B"/>
+          <w:sz w:val="20"/>
+        </w:rPr>
+        <w:t>Основу для проверки партнёрами и будущего формально утверждённого пилота.</w:t>
+      </w:r>
+    </w:p>
+    <w:p>
+      <w:r>
+        <w:br w:type="page"/>
+      </w:r>
+    </w:p>
+    <w:p>
+      <w:pPr>
+        <w:spacing w:after="60" w:line="283" w:lineRule="auto"/>
+        <w:jc w:val="center"/>
+      </w:pPr>
+      <w:r>
+        <w:rPr>
+          <w:rFonts w:ascii="Arial" w:hAnsi="Arial" w:eastAsia="Arial"/>
+          <w:b/>
+          <w:i w:val="0"/>
+          <w:color w:val="087F5B"/>
+          <w:sz w:val="18"/>
+        </w:rPr>
+        <w:t>AGRIPARTNERS</w:t>
+      </w:r>
+    </w:p>
+    <w:p>
+      <w:pPr>
+        <w:spacing w:after="80" w:line="283" w:lineRule="auto"/>
+        <w:jc w:val="center"/>
+      </w:pPr>
+      <w:r>
+        <w:rPr>
+          <w:rFonts w:ascii="Arial" w:hAnsi="Arial" w:eastAsia="Arial"/>
+          <w:b/>
+          <w:i w:val="0"/>
+          <w:color w:val="17324D"/>
+          <w:sz w:val="50"/>
+        </w:rPr>
+        <w:t>Обязательная финансовая и юридическая граница</w:t>
+      </w:r>
+    </w:p>
+    <w:p>
+      <w:pPr>
+        <w:spacing w:after="280" w:line="283" w:lineRule="auto"/>
+        <w:jc w:val="center"/>
+      </w:pPr>
+      <w:r>
+        <w:rPr>
+          <w:rFonts w:ascii="Arial" w:hAnsi="Arial" w:eastAsia="Arial"/>
+          <w:b w:val="0"/>
+          <w:i w:val="0"/>
+          <w:color w:val="5E6B78"/>
+          <w:sz w:val="25"/>
+        </w:rPr>
+        <w:t>Alpha v1.2 · прозрачные процессы агроинвестирования · NEAR Testnet</w:t>
+      </w:r>
+    </w:p>
+    <w:tbl>
+      <w:tblPr>
+        <w:tblW w:type="auto" w:w="0"/>
+        <w:jc w:val="left"/>
+        <w:tblLayout w:type="fixed"/>
+        <w:tblLook w:firstColumn="1" w:firstRow="1" w:lastColumn="0" w:lastRow="0" w:noHBand="0" w:noVBand="1" w:val="04A0"/>
+        <w:tblW w:w="9360" w:type="dxa"/>
+        <w:tblInd w:w="120" w:type="dxa"/>
+      </w:tblPr>
+      <w:tblGrid>
+        <w:gridCol w:w="9360"/>
+      </w:tblGrid>
+      <w:tr>
+        <w:tc>
+          <w:tcPr>
+            <w:tcW w:type="dxa" w:w="9360"/>
+            <w:tcW w:w="9360" w:type="dxa"/>
+            <w:vAlign w:val="center"/>
+            <w:shd w:fill="E8F5EF"/>
+          </w:tcPr>
+          <w:p>
+            <w:pPr>
+              <w:spacing w:after="0"/>
+            </w:pPr>
+            <w:r>
+              <w:rPr>
+                <w:rFonts w:ascii="Arial" w:hAnsi="Arial" w:eastAsia="Arial"/>
                 <w:b/>
+                <w:i w:val="0"/>
+                <w:color w:val="056246"/>
+                <w:sz w:val="19"/>
+              </w:rPr>
+              <w:t>Внешний инвестор → AgriPartners OÜ (Эстония) → одобренная конвертация и зачисленный фиат → оператор откормочного комплекса в Узбекистане по отдельному письменному договору. Криптовалюта остаётся в Эстонии. Оператор, роль Farmer, поставщики и сотрудники в Узбекистане получают и возвращают только фиат.</w:t>
+            </w:r>
+          </w:p>
+        </w:tc>
+      </w:tr>
+    </w:tbl>
+    <w:p>
+      <w:pPr>
+        <w:spacing w:after="40" w:line="283" w:lineRule="auto"/>
+      </w:pPr>
+      <w:r>
+        <w:rPr>
+          <w:rFonts w:ascii="Arial" w:hAnsi="Arial" w:eastAsia="Arial"/>
+          <w:b w:val="0"/>
+          <w:i w:val="0"/>
+          <w:color w:val="17212B"/>
+          <w:sz w:val="2"/>
+        </w:rPr>
+      </w:r>
+    </w:p>
+    <w:tbl>
+      <w:tblPr>
+        <w:tblStyle w:val="TableGrid"/>
+        <w:tblW w:type="auto" w:w="0"/>
+        <w:jc w:val="left"/>
+        <w:tblLayout w:type="fixed"/>
+        <w:tblLook w:firstColumn="1" w:firstRow="1" w:lastColumn="0" w:lastRow="0" w:noHBand="0" w:noVBand="1" w:val="04A0"/>
+        <w:tblW w:w="9360" w:type="dxa"/>
+        <w:tblInd w:w="120" w:type="dxa"/>
+      </w:tblPr>
+      <w:tblGrid>
+        <w:gridCol w:w="1800"/>
+        <w:gridCol w:w="4080"/>
+        <w:gridCol w:w="3480"/>
+      </w:tblGrid>
+      <w:tr>
+        <w:tc>
+          <w:tcPr>
+            <w:tcW w:type="dxa" w:w="3120"/>
+            <w:tcW w:w="1800" w:type="dxa"/>
+            <w:vAlign w:val="center"/>
+            <w:shd w:fill="056246"/>
+          </w:tcPr>
+          <w:p>
+            <w:pPr>
+              <w:spacing w:after="0"/>
+              <w:jc w:val="center"/>
+            </w:pPr>
+            <w:r>
+              <w:rPr>
+                <w:rFonts w:ascii="Arial" w:hAnsi="Arial" w:eastAsia="Arial"/>
+                <w:b/>
+                <w:i w:val="0"/>
                 <w:color w:val="FFFFFF"/>
-                <w:sz w:val="18"/>
+                <w:sz w:val="16"/>
+              </w:rPr>
+              <w:t>Этап</w:t>
+            </w:r>
+          </w:p>
+        </w:tc>
+        <w:tc>
+          <w:tcPr>
+            <w:tcW w:type="dxa" w:w="3120"/>
+            <w:tcW w:w="4080" w:type="dxa"/>
+            <w:vAlign w:val="center"/>
+            <w:shd w:fill="056246"/>
+          </w:tcPr>
+          <w:p>
+            <w:pPr>
+              <w:spacing w:after="0"/>
+              <w:jc w:val="center"/>
+            </w:pPr>
+            <w:r>
+              <w:rPr>
+                <w:rFonts w:ascii="Arial" w:hAnsi="Arial" w:eastAsia="Arial"/>
+                <w:b/>
+                <w:i w:val="0"/>
+                <w:color w:val="FFFFFF"/>
+                <w:sz w:val="16"/>
               </w:rPr>
               <w:t>Что происходит</w:t>
             </w:r>
@@ -404,24 +667,25 @@
         </w:tc>
         <w:tc>
           <w:tcPr>
-            <w:tcW w:type="dxa" w:w="3408"/>
-            <w:shd w:fill="006B4A"/>
+            <w:tcW w:type="dxa" w:w="3120"/>
+            <w:tcW w:w="3480" w:type="dxa"/>
+            <w:vAlign w:val="center"/>
+            <w:shd w:fill="056246"/>
           </w:tcPr>
           <w:p>
+            <w:pPr>
+              <w:spacing w:after="0"/>
+              <w:jc w:val="center"/>
+            </w:pPr>
             <w:r>
               <w:rPr>
-                <w:rFonts w:ascii="DejaVu Sans" w:hAnsi="DejaVu Sans" w:eastAsia="DejaVu Sans"/>
-                <w:sz w:val="18"/>
+                <w:rFonts w:ascii="Arial" w:hAnsi="Arial" w:eastAsia="Arial"/>
+                <w:b/>
+                <w:i w:val="0"/>
+                <w:color w:val="FFFFFF"/>
+                <w:sz w:val="16"/>
               </w:rPr>
-            </w:r>
-            <w:r>
-              <w:rPr>
-                <w:rFonts w:ascii="DejaVu Sans" w:hAnsi="DejaVu Sans" w:eastAsia="DejaVu Sans"/>
-                <w:b/>
-                <w:color w:val="FFFFFF"/>
-                <w:sz w:val="18"/>
-              </w:rPr>
-              <w:t>Как понимать простыми словами</w:t>
+              <w:t>Официальные подтверждения</w:t>
             </w:r>
           </w:p>
         </w:tc>
@@ -429,64 +693,64 @@
       <w:tr>
         <w:tc>
           <w:tcPr>
-            <w:tcW w:type="dxa" w:w="3408"/>
+            <w:tcW w:type="dxa" w:w="1800"/>
           </w:tcPr>
           <w:p>
+            <w:pPr>
+              <w:spacing w:after="0"/>
+              <w:jc w:val="left"/>
+            </w:pPr>
             <w:r>
               <w:rPr>
-                <w:rFonts w:ascii="DejaVu Sans" w:hAnsi="DejaVu Sans" w:eastAsia="DejaVu Sans"/>
-                <w:sz w:val="18"/>
+                <w:rFonts w:ascii="Arial" w:hAnsi="Arial" w:eastAsia="Arial"/>
+                <w:b w:val="0"/>
+                <w:i w:val="0"/>
+                <w:color w:val="17212B"/>
+                <w:sz w:val="16"/>
               </w:rPr>
-            </w:r>
-            <w:r>
-              <w:rPr>
-                <w:rFonts w:ascii="DejaVu Sans" w:hAnsi="DejaVu Sans" w:eastAsia="DejaVu Sans"/>
-                <w:b w:val="0"/>
-                <w:sz w:val="18"/>
-              </w:rPr>
-              <w:t>1</w:t>
+              <w:t>1. Финансирование</w:t>
             </w:r>
           </w:p>
         </w:tc>
         <w:tc>
           <w:tcPr>
-            <w:tcW w:type="dxa" w:w="3408"/>
+            <w:tcW w:type="dxa" w:w="4080"/>
           </w:tcPr>
           <w:p>
+            <w:pPr>
+              <w:spacing w:after="0"/>
+              <w:jc w:val="center"/>
+            </w:pPr>
             <w:r>
               <w:rPr>
-                <w:rFonts w:ascii="DejaVu Sans" w:hAnsi="DejaVu Sans" w:eastAsia="DejaVu Sans"/>
-                <w:sz w:val="18"/>
+                <w:rFonts w:ascii="Arial" w:hAnsi="Arial" w:eastAsia="Arial"/>
+                <w:b w:val="0"/>
+                <w:i w:val="0"/>
+                <w:color w:val="17212B"/>
+                <w:sz w:val="16"/>
               </w:rPr>
-            </w:r>
-            <w:r>
-              <w:rPr>
-                <w:rFonts w:ascii="DejaVu Sans" w:hAnsi="DejaVu Sans" w:eastAsia="DejaVu Sans"/>
-                <w:b w:val="0"/>
-                <w:sz w:val="18"/>
-              </w:rPr>
-              <w:t>Investor (инвестор) выбирает проект</w:t>
+              <w:t>Инвестор заключает договор с AgriPartners OÜ; разрешённые средства поступают в Эстонии.</w:t>
             </w:r>
           </w:p>
         </w:tc>
         <w:tc>
           <w:tcPr>
-            <w:tcW w:type="dxa" w:w="3408"/>
+            <w:tcW w:type="dxa" w:w="3480"/>
           </w:tcPr>
           <w:p>
+            <w:pPr>
+              <w:spacing w:after="0"/>
+              <w:jc w:val="center"/>
+            </w:pPr>
             <w:r>
               <w:rPr>
-                <w:rFonts w:ascii="DejaVu Sans" w:hAnsi="DejaVu Sans" w:eastAsia="DejaVu Sans"/>
-                <w:sz w:val="18"/>
+                <w:rFonts w:ascii="Arial" w:hAnsi="Arial" w:eastAsia="Arial"/>
+                <w:b w:val="0"/>
+                <w:i w:val="0"/>
+                <w:color w:val="17212B"/>
+                <w:sz w:val="16"/>
               </w:rPr>
-            </w:r>
-            <w:r>
-              <w:rPr>
-                <w:rFonts w:ascii="DejaVu Sans" w:hAnsi="DejaVu Sans" w:eastAsia="DejaVu Sans"/>
-                <w:b w:val="0"/>
-                <w:sz w:val="18"/>
-              </w:rPr>
-              <w:t>Человек или организация решает профинансировать сельхозпроект.</w:t>
+              <w:t>Договор, записи провайдера и учёта</w:t>
             </w:r>
           </w:p>
         </w:tc>
@@ -494,64 +758,67 @@
       <w:tr>
         <w:tc>
           <w:tcPr>
-            <w:tcW w:type="dxa" w:w="3408"/>
+            <w:tcW w:type="dxa" w:w="1800"/>
+            <w:shd w:fill="F2F4F7"/>
           </w:tcPr>
           <w:p>
+            <w:pPr>
+              <w:spacing w:after="0"/>
+              <w:jc w:val="left"/>
+            </w:pPr>
             <w:r>
               <w:rPr>
-                <w:rFonts w:ascii="DejaVu Sans" w:hAnsi="DejaVu Sans" w:eastAsia="DejaVu Sans"/>
-                <w:sz w:val="18"/>
+                <w:rFonts w:ascii="Arial" w:hAnsi="Arial" w:eastAsia="Arial"/>
+                <w:b w:val="0"/>
+                <w:i w:val="0"/>
+                <w:color w:val="17212B"/>
+                <w:sz w:val="16"/>
               </w:rPr>
-            </w:r>
-            <w:r>
-              <w:rPr>
-                <w:rFonts w:ascii="DejaVu Sans" w:hAnsi="DejaVu Sans" w:eastAsia="DejaVu Sans"/>
-                <w:b w:val="0"/>
-                <w:sz w:val="18"/>
-              </w:rPr>
-              <w:t>2</w:t>
+              <w:t>2. Конвертация</w:t>
             </w:r>
           </w:p>
         </w:tc>
         <w:tc>
           <w:tcPr>
-            <w:tcW w:type="dxa" w:w="3408"/>
+            <w:tcW w:type="dxa" w:w="4080"/>
+            <w:shd w:fill="F2F4F7"/>
           </w:tcPr>
           <w:p>
+            <w:pPr>
+              <w:spacing w:after="0"/>
+              <w:jc w:val="center"/>
+            </w:pPr>
             <w:r>
               <w:rPr>
-                <w:rFonts w:ascii="DejaVu Sans" w:hAnsi="DejaVu Sans" w:eastAsia="DejaVu Sans"/>
-                <w:sz w:val="18"/>
+                <w:rFonts w:ascii="Arial" w:hAnsi="Arial" w:eastAsia="Arial"/>
+                <w:b w:val="0"/>
+                <w:i w:val="0"/>
+                <w:color w:val="17212B"/>
+                <w:sz w:val="16"/>
               </w:rPr>
-            </w:r>
-            <w:r>
-              <w:rPr>
-                <w:rFonts w:ascii="DejaVu Sans" w:hAnsi="DejaVu Sans" w:eastAsia="DejaVu Sans"/>
-                <w:b w:val="0"/>
-                <w:sz w:val="18"/>
-              </w:rPr>
-              <w:t>Средства могут быть внесены через NEAR, USDT или другой канал</w:t>
+              <w:t>Разрешённая криптовалюта конвертируется через одобренную инфраструктуру; фиат должен быть зачислен.</w:t>
             </w:r>
           </w:p>
         </w:tc>
         <w:tc>
           <w:tcPr>
-            <w:tcW w:type="dxa" w:w="3408"/>
+            <w:tcW w:type="dxa" w:w="3480"/>
+            <w:shd w:fill="F2F4F7"/>
           </w:tcPr>
           <w:p>
+            <w:pPr>
+              <w:spacing w:after="0"/>
+              <w:jc w:val="center"/>
+            </w:pPr>
             <w:r>
               <w:rPr>
-                <w:rFonts w:ascii="DejaVu Sans" w:hAnsi="DejaVu Sans" w:eastAsia="DejaVu Sans"/>
-                <w:sz w:val="18"/>
+                <w:rFonts w:ascii="Arial" w:hAnsi="Arial" w:eastAsia="Arial"/>
+                <w:b w:val="0"/>
+                <w:i w:val="0"/>
+                <w:color w:val="17212B"/>
+                <w:sz w:val="16"/>
               </w:rPr>
-            </w:r>
-            <w:r>
-              <w:rPr>
-                <w:rFonts w:ascii="DejaVu Sans" w:hAnsi="DejaVu Sans" w:eastAsia="DejaVu Sans"/>
-                <w:b w:val="0"/>
-                <w:sz w:val="18"/>
-              </w:rPr>
-              <w:t>Источник финансирования может быть криптовалютным или традиционным.</w:t>
+              <w:t>Провайдер, банк и сверка</w:t>
             </w:r>
           </w:p>
         </w:tc>
@@ -559,64 +826,64 @@
       <w:tr>
         <w:tc>
           <w:tcPr>
-            <w:tcW w:type="dxa" w:w="3408"/>
+            <w:tcW w:type="dxa" w:w="1800"/>
           </w:tcPr>
           <w:p>
+            <w:pPr>
+              <w:spacing w:after="0"/>
+              <w:jc w:val="left"/>
+            </w:pPr>
             <w:r>
               <w:rPr>
-                <w:rFonts w:ascii="DejaVu Sans" w:hAnsi="DejaVu Sans" w:eastAsia="DejaVu Sans"/>
-                <w:sz w:val="18"/>
+                <w:rFonts w:ascii="Arial" w:hAnsi="Arial" w:eastAsia="Arial"/>
+                <w:b w:val="0"/>
+                <w:i w:val="0"/>
+                <w:color w:val="17212B"/>
+                <w:sz w:val="16"/>
               </w:rPr>
-            </w:r>
-            <w:r>
-              <w:rPr>
-                <w:rFonts w:ascii="DejaVu Sans" w:hAnsi="DejaVu Sans" w:eastAsia="DejaVu Sans"/>
-                <w:b w:val="0"/>
-                <w:sz w:val="18"/>
-              </w:rPr>
-              <w:t>3</w:t>
+              <w:t>3. Финансирование оператора</w:t>
             </w:r>
           </w:p>
         </w:tc>
         <w:tc>
           <w:tcPr>
-            <w:tcW w:type="dxa" w:w="3408"/>
+            <w:tcW w:type="dxa" w:w="4080"/>
           </w:tcPr>
           <w:p>
+            <w:pPr>
+              <w:spacing w:after="0"/>
+              <w:jc w:val="center"/>
+            </w:pPr>
             <w:r>
               <w:rPr>
-                <w:rFonts w:ascii="DejaVu Sans" w:hAnsi="DejaVu Sans" w:eastAsia="DejaVu Sans"/>
-                <w:sz w:val="18"/>
+                <w:rFonts w:ascii="Arial" w:hAnsi="Arial" w:eastAsia="Arial"/>
+                <w:b w:val="0"/>
+                <w:i w:val="0"/>
+                <w:color w:val="17212B"/>
+                <w:sz w:val="16"/>
               </w:rPr>
-            </w:r>
-            <w:r>
-              <w:rPr>
-                <w:rFonts w:ascii="DejaVu Sans" w:hAnsi="DejaVu Sans" w:eastAsia="DejaVu Sans"/>
-                <w:b w:val="0"/>
-                <w:sz w:val="18"/>
-              </w:rPr>
-              <w:t>Конвертация в USD или местную валюту</w:t>
+              <w:t>AgriPartners OÜ переводит оператору в Узбекистане только фиат по отдельному договору.</w:t>
             </w:r>
           </w:p>
         </w:tc>
         <w:tc>
           <w:tcPr>
-            <w:tcW w:type="dxa" w:w="3408"/>
+            <w:tcW w:type="dxa" w:w="3480"/>
           </w:tcPr>
           <w:p>
+            <w:pPr>
+              <w:spacing w:after="0"/>
+              <w:jc w:val="center"/>
+            </w:pPr>
             <w:r>
               <w:rPr>
-                <w:rFonts w:ascii="DejaVu Sans" w:hAnsi="DejaVu Sans" w:eastAsia="DejaVu Sans"/>
-                <w:sz w:val="18"/>
+                <w:rFonts w:ascii="Arial" w:hAnsi="Arial" w:eastAsia="Arial"/>
+                <w:b w:val="0"/>
+                <w:i w:val="0"/>
+                <w:color w:val="17212B"/>
+                <w:sz w:val="16"/>
               </w:rPr>
-            </w:r>
-            <w:r>
-              <w:rPr>
-                <w:rFonts w:ascii="DejaVu Sans" w:hAnsi="DejaVu Sans" w:eastAsia="DejaVu Sans"/>
-                <w:b w:val="0"/>
-                <w:sz w:val="18"/>
-              </w:rPr>
-              <w:t>Для покупки реальных товаров фермеру чаще всего нужны обычные деньги.</w:t>
+              <w:t>Договор оператора и банковские записи</w:t>
             </w:r>
           </w:p>
         </w:tc>
@@ -624,64 +891,67 @@
       <w:tr>
         <w:tc>
           <w:tcPr>
-            <w:tcW w:type="dxa" w:w="3408"/>
+            <w:tcW w:type="dxa" w:w="1800"/>
+            <w:shd w:fill="F2F4F7"/>
           </w:tcPr>
           <w:p>
+            <w:pPr>
+              <w:spacing w:after="0"/>
+              <w:jc w:val="left"/>
+            </w:pPr>
             <w:r>
               <w:rPr>
-                <w:rFonts w:ascii="DejaVu Sans" w:hAnsi="DejaVu Sans" w:eastAsia="DejaVu Sans"/>
-                <w:sz w:val="18"/>
+                <w:rFonts w:ascii="Arial" w:hAnsi="Arial" w:eastAsia="Arial"/>
+                <w:b w:val="0"/>
+                <w:i w:val="0"/>
+                <w:color w:val="17212B"/>
+                <w:sz w:val="16"/>
               </w:rPr>
-            </w:r>
-            <w:r>
-              <w:rPr>
-                <w:rFonts w:ascii="DejaVu Sans" w:hAnsi="DejaVu Sans" w:eastAsia="DejaVu Sans"/>
-                <w:b w:val="0"/>
-                <w:sz w:val="18"/>
-              </w:rPr>
-              <w:t>4</w:t>
+              <w:t>4. Операции</w:t>
             </w:r>
           </w:p>
         </w:tc>
         <w:tc>
           <w:tcPr>
-            <w:tcW w:type="dxa" w:w="3408"/>
+            <w:tcW w:type="dxa" w:w="4080"/>
+            <w:shd w:fill="F2F4F7"/>
           </w:tcPr>
           <w:p>
+            <w:pPr>
+              <w:spacing w:after="0"/>
+              <w:jc w:val="center"/>
+            </w:pPr>
             <w:r>
               <w:rPr>
-                <w:rFonts w:ascii="DejaVu Sans" w:hAnsi="DejaVu Sans" w:eastAsia="DejaVu Sans"/>
-                <w:sz w:val="18"/>
+                <w:rFonts w:ascii="Arial" w:hAnsi="Arial" w:eastAsia="Arial"/>
+                <w:b w:val="0"/>
+                <w:i w:val="0"/>
+                <w:color w:val="17212B"/>
+                <w:sz w:val="16"/>
               </w:rPr>
-            </w:r>
-            <w:r>
-              <w:rPr>
-                <w:rFonts w:ascii="DejaVu Sans" w:hAnsi="DejaVu Sans" w:eastAsia="DejaVu Sans"/>
-                <w:b w:val="0"/>
-                <w:sz w:val="18"/>
-              </w:rPr>
-              <w:t>Farmer (фермер) получает финансирование</w:t>
+              <w:t>Оператор выполняет работы и предоставляет отчёты, счета и подтверждения.</w:t>
             </w:r>
           </w:p>
         </w:tc>
         <w:tc>
           <w:tcPr>
-            <w:tcW w:type="dxa" w:w="3408"/>
+            <w:tcW w:type="dxa" w:w="3480"/>
+            <w:shd w:fill="F2F4F7"/>
           </w:tcPr>
           <w:p>
+            <w:pPr>
+              <w:spacing w:after="0"/>
+              <w:jc w:val="center"/>
+            </w:pPr>
             <w:r>
               <w:rPr>
-                <w:rFonts w:ascii="DejaVu Sans" w:hAnsi="DejaVu Sans" w:eastAsia="DejaVu Sans"/>
-                <w:sz w:val="18"/>
+                <w:rFonts w:ascii="Arial" w:hAnsi="Arial" w:eastAsia="Arial"/>
+                <w:b w:val="0"/>
+                <w:i w:val="0"/>
+                <w:color w:val="17212B"/>
+                <w:sz w:val="16"/>
               </w:rPr>
-            </w:r>
-            <w:r>
-              <w:rPr>
-                <w:rFonts w:ascii="DejaVu Sans" w:hAnsi="DejaVu Sans" w:eastAsia="DejaVu Sans"/>
-                <w:b w:val="0"/>
-                <w:sz w:val="18"/>
-              </w:rPr>
-              <w:t>Фермер покупает животных, корма, оборудование или запускает цикл.</w:t>
+              <w:t>Операционные, ветеринарные и бухгалтерские документы</w:t>
             </w:r>
           </w:p>
         </w:tc>
@@ -689,64 +959,64 @@
       <w:tr>
         <w:tc>
           <w:tcPr>
-            <w:tcW w:type="dxa" w:w="3408"/>
+            <w:tcW w:type="dxa" w:w="1800"/>
           </w:tcPr>
           <w:p>
+            <w:pPr>
+              <w:spacing w:after="0"/>
+              <w:jc w:val="left"/>
+            </w:pPr>
             <w:r>
               <w:rPr>
-                <w:rFonts w:ascii="DejaVu Sans" w:hAnsi="DejaVu Sans" w:eastAsia="DejaVu Sans"/>
-                <w:sz w:val="18"/>
+                <w:rFonts w:ascii="Arial" w:hAnsi="Arial" w:eastAsia="Arial"/>
+                <w:b w:val="0"/>
+                <w:i w:val="0"/>
+                <w:color w:val="17212B"/>
+                <w:sz w:val="16"/>
               </w:rPr>
-            </w:r>
-            <w:r>
-              <w:rPr>
-                <w:rFonts w:ascii="DejaVu Sans" w:hAnsi="DejaVu Sans" w:eastAsia="DejaVu Sans"/>
-                <w:b w:val="0"/>
-                <w:sz w:val="18"/>
-              </w:rPr>
-              <w:t>5</w:t>
+              <w:t>5. Выручка</w:t>
             </w:r>
           </w:p>
         </w:tc>
         <w:tc>
           <w:tcPr>
-            <w:tcW w:type="dxa" w:w="3408"/>
+            <w:tcW w:type="dxa" w:w="4080"/>
           </w:tcPr>
           <w:p>
+            <w:pPr>
+              <w:spacing w:after="0"/>
+              <w:jc w:val="center"/>
+            </w:pPr>
             <w:r>
               <w:rPr>
-                <w:rFonts w:ascii="DejaVu Sans" w:hAnsi="DejaVu Sans" w:eastAsia="DejaVu Sans"/>
-                <w:sz w:val="18"/>
+                <w:rFonts w:ascii="Arial" w:hAnsi="Arial" w:eastAsia="Arial"/>
+                <w:b w:val="0"/>
+                <w:i w:val="0"/>
+                <w:color w:val="17212B"/>
+                <w:sz w:val="16"/>
               </w:rPr>
-            </w:r>
-            <w:r>
-              <w:rPr>
-                <w:rFonts w:ascii="DejaVu Sans" w:hAnsi="DejaVu Sans" w:eastAsia="DejaVu Sans"/>
-                <w:b w:val="0"/>
-                <w:sz w:val="18"/>
-              </w:rPr>
-              <w:t>Reporting (отчетность)</w:t>
+              <w:t>Узбекистан возвращает разрешённую выручку только по фиатным каналам.</w:t>
             </w:r>
           </w:p>
         </w:tc>
         <w:tc>
           <w:tcPr>
-            <w:tcW w:type="dxa" w:w="3408"/>
+            <w:tcW w:type="dxa" w:w="3480"/>
           </w:tcPr>
           <w:p>
+            <w:pPr>
+              <w:spacing w:after="0"/>
+              <w:jc w:val="center"/>
+            </w:pPr>
             <w:r>
               <w:rPr>
-                <w:rFonts w:ascii="DejaVu Sans" w:hAnsi="DejaVu Sans" w:eastAsia="DejaVu Sans"/>
-                <w:sz w:val="18"/>
+                <w:rFonts w:ascii="Arial" w:hAnsi="Arial" w:eastAsia="Arial"/>
+                <w:b w:val="0"/>
+                <w:i w:val="0"/>
+                <w:color w:val="17212B"/>
+                <w:sz w:val="16"/>
               </w:rPr>
-            </w:r>
-            <w:r>
-              <w:rPr>
-                <w:rFonts w:ascii="DejaVu Sans" w:hAnsi="DejaVu Sans" w:eastAsia="DejaVu Sans"/>
-                <w:b w:val="0"/>
-                <w:sz w:val="18"/>
-              </w:rPr>
-              <w:t>Фермер показывает, что сделано и как идет проект.</w:t>
+              <w:t>Банк, бухгалтерия и сверка</w:t>
             </w:r>
           </w:p>
         </w:tc>
@@ -754,1198 +1024,237 @@
       <w:tr>
         <w:tc>
           <w:tcPr>
-            <w:tcW w:type="dxa" w:w="3408"/>
+            <w:tcW w:type="dxa" w:w="1800"/>
+            <w:shd w:fill="F2F4F7"/>
           </w:tcPr>
           <w:p>
+            <w:pPr>
+              <w:spacing w:after="0"/>
+              <w:jc w:val="left"/>
+            </w:pPr>
             <w:r>
               <w:rPr>
-                <w:rFonts w:ascii="DejaVu Sans" w:hAnsi="DejaVu Sans" w:eastAsia="DejaVu Sans"/>
-                <w:sz w:val="18"/>
+                <w:rFonts w:ascii="Arial" w:hAnsi="Arial" w:eastAsia="Arial"/>
+                <w:b w:val="0"/>
+                <w:i w:val="0"/>
+                <w:color w:val="17212B"/>
+                <w:sz w:val="16"/>
               </w:rPr>
-            </w:r>
-            <w:r>
-              <w:rPr>
-                <w:rFonts w:ascii="DejaVu Sans" w:hAnsi="DejaVu Sans" w:eastAsia="DejaVu Sans"/>
-                <w:b w:val="0"/>
-                <w:sz w:val="18"/>
-              </w:rPr>
-              <w:t>6</w:t>
+              <w:t>6. Расчёт</w:t>
             </w:r>
           </w:p>
         </w:tc>
         <w:tc>
           <w:tcPr>
-            <w:tcW w:type="dxa" w:w="3408"/>
+            <w:tcW w:type="dxa" w:w="4080"/>
+            <w:shd w:fill="F2F4F7"/>
           </w:tcPr>
           <w:p>
+            <w:pPr>
+              <w:spacing w:after="0"/>
+              <w:jc w:val="center"/>
+            </w:pPr>
             <w:r>
               <w:rPr>
-                <w:rFonts w:ascii="DejaVu Sans" w:hAnsi="DejaVu Sans" w:eastAsia="DejaVu Sans"/>
-                <w:sz w:val="18"/>
+                <w:rFonts w:ascii="Arial" w:hAnsi="Arial" w:eastAsia="Arial"/>
+                <w:b w:val="0"/>
+                <w:i w:val="0"/>
+                <w:color w:val="17212B"/>
+                <w:sz w:val="16"/>
               </w:rPr>
-            </w:r>
-            <w:r>
-              <w:rPr>
-                <w:rFonts w:ascii="DejaVu Sans" w:hAnsi="DejaVu Sans" w:eastAsia="DejaVu Sans"/>
-                <w:b w:val="0"/>
-                <w:sz w:val="18"/>
-              </w:rPr>
-              <w:t>Returns (возврат результата)</w:t>
+              <w:t>AgriPartners OÜ определяет расчёт с инвестором по действующим договорам.</w:t>
             </w:r>
           </w:p>
         </w:tc>
         <w:tc>
           <w:tcPr>
-            <w:tcW w:type="dxa" w:w="3408"/>
+            <w:tcW w:type="dxa" w:w="3480"/>
+            <w:shd w:fill="F2F4F7"/>
           </w:tcPr>
           <w:p>
+            <w:pPr>
+              <w:spacing w:after="0"/>
+              <w:jc w:val="center"/>
+            </w:pPr>
             <w:r>
               <w:rPr>
-                <w:rFonts w:ascii="DejaVu Sans" w:hAnsi="DejaVu Sans" w:eastAsia="DejaVu Sans"/>
-                <w:sz w:val="18"/>
+                <w:rFonts w:ascii="Arial" w:hAnsi="Arial" w:eastAsia="Arial"/>
+                <w:b w:val="0"/>
+                <w:i w:val="0"/>
+                <w:color w:val="17212B"/>
+                <w:sz w:val="16"/>
               </w:rPr>
-            </w:r>
-            <w:r>
-              <w:rPr>
-                <w:rFonts w:ascii="DejaVu Sans" w:hAnsi="DejaVu Sans" w:eastAsia="DejaVu Sans"/>
-                <w:b w:val="0"/>
-                <w:sz w:val="18"/>
-              </w:rPr>
-              <w:t>Инвестор видит итог, доходность, возврат или следующий цикл.</w:t>
+              <w:t>Договоры, учёт и документы расчёта</w:t>
             </w:r>
           </w:p>
         </w:tc>
       </w:tr>
     </w:tbl>
-    <w:p/>
     <w:tbl>
       <w:tblPr>
         <w:tblW w:type="auto" w:w="0"/>
-        <w:jc w:val="center"/>
+        <w:jc w:val="left"/>
+        <w:tblLayout w:type="fixed"/>
         <w:tblLook w:firstColumn="1" w:firstRow="1" w:lastColumn="0" w:lastRow="0" w:noHBand="0" w:noVBand="1" w:val="04A0"/>
+        <w:tblW w:w="9360" w:type="dxa"/>
+        <w:tblInd w:w="120" w:type="dxa"/>
       </w:tblPr>
       <w:tblGrid>
-        <w:gridCol w:w="10224"/>
+        <w:gridCol w:w="9360"/>
       </w:tblGrid>
       <w:tr>
         <w:tc>
           <w:tcPr>
-            <w:tcW w:type="dxa" w:w="10224"/>
-            <w:shd w:fill="EAF4EF"/>
+            <w:tcW w:type="dxa" w:w="9360"/>
+            <w:tcW w:w="9360" w:type="dxa"/>
+            <w:vAlign w:val="center"/>
+            <w:shd w:fill="E8F5EF"/>
           </w:tcPr>
           <w:p>
+            <w:pPr>
+              <w:spacing w:after="0"/>
+            </w:pPr>
             <w:r>
               <w:rPr>
-                <w:rFonts w:ascii="DejaVu Sans" w:hAnsi="DejaVu Sans" w:eastAsia="DejaVu Sans"/>
+                <w:rFonts w:ascii="Arial" w:hAnsi="Arial" w:eastAsia="Arial"/>
                 <w:b/>
-                <w:color w:val="005A36"/>
-                <w:sz w:val="20"/>
+                <w:i w:val="0"/>
+                <w:color w:val="056246"/>
+                <w:sz w:val="19"/>
               </w:rPr>
-              <w:t>Важно</w:t>
-              <w:br/>
-            </w:r>
-            <w:r>
-              <w:rPr>
-                <w:rFonts w:ascii="DejaVu Sans" w:hAnsi="DejaVu Sans" w:eastAsia="DejaVu Sans"/>
-                <w:sz w:val="18"/>
-              </w:rPr>
-              <w:t>В Alpha-версии AgriPartners не должен описываться как готовая система хранения средств, выплат или расчетов. Правильнее говорить: платформа моделирует и демонстрирует прозрачный рабочий процесс на NEAR Testnet.</w:t>
+              <w:t>Запись NEAR не заменяет договоры, банковские выписки, бухгалтерский учёт, сверку, счета и доказательство зачисления фиата. Прямые криптопереводы участникам в Узбекистане запрещены.</w:t>
             </w:r>
           </w:p>
         </w:tc>
       </w:tr>
     </w:tbl>
-    <w:p/>
     <w:p>
       <w:pPr>
-        <w:pStyle w:val="Heading1"/>
+        <w:spacing w:after="40" w:line="283" w:lineRule="auto"/>
       </w:pPr>
       <w:r>
         <w:rPr>
-          <w:rFonts w:ascii="DejaVu Sans" w:hAnsi="DejaVu Sans" w:eastAsia="DejaVu Sans"/>
-          <w:color w:val="005F41"/>
+          <w:rFonts w:ascii="Arial" w:hAnsi="Arial" w:eastAsia="Arial"/>
+          <w:b w:val="0"/>
+          <w:i w:val="0"/>
+          <w:color w:val="17212B"/>
+          <w:sz w:val="2"/>
         </w:rPr>
-        <w:t>7. Почему не только USDT</w:t>
       </w:r>
     </w:p>
     <w:p>
       <w:r>
-        <w:rPr>
-          <w:rFonts w:ascii="DejaVu Sans" w:hAnsi="DejaVu Sans" w:eastAsia="DejaVu Sans"/>
-          <w:sz w:val="20"/>
-        </w:rPr>
-        <w:t>Можно спросить: если USDT уже похож на доллар, зачем нужен NEAR? Ответ: USDT может быть удобен как средство расчетов, но AgriPartners решает более широкую задачу - управление процессом, событиями, отчетностью и прозрачностью.</w:t>
-      </w:r>
-    </w:p>
-    <w:p>
-      <w:r>
-        <w:rPr>
-          <w:rFonts w:ascii="DejaVu Sans" w:hAnsi="DejaVu Sans" w:eastAsia="DejaVu Sans"/>
-          <w:sz w:val="20"/>
-        </w:rPr>
-        <w:t>NEAR может использоваться не только как актив. NEAR может быть инфраструктурой для Smart Contracts (смарт-контрактов), Wallet (кошельков), цифровых подтверждений и истории событий.</w:t>
-      </w:r>
-    </w:p>
-    <w:p>
-      <w:r>
-        <w:rPr>
-          <w:rFonts w:ascii="DejaVu Sans" w:hAnsi="DejaVu Sans" w:eastAsia="DejaVu Sans"/>
-          <w:sz w:val="20"/>
-        </w:rPr>
-        <w:t>Smart Contract (смарт-контракт) - это программа в блокчейне, которая выполняет заранее заданные правила. Простыми словами: если выполнено условие, система может автоматически зафиксировать событие или разрешить следующий шаг.</w:t>
-      </w:r>
-    </w:p>
-    <w:p>
-      <w:r>
-        <w:rPr>
-          <w:rFonts w:ascii="DejaVu Sans" w:hAnsi="DejaVu Sans" w:eastAsia="DejaVu Sans"/>
-          <w:sz w:val="20"/>
-        </w:rPr>
-        <w:t>Wallet (криптокошелек) - это цифровой кошелек пользователя. Через него пользователь подтверждает действия в Web3-системе.</w:t>
+        <w:br w:type="page"/>
       </w:r>
     </w:p>
     <w:p>
       <w:pPr>
-        <w:pStyle w:val="Heading1"/>
+        <w:spacing w:after="60" w:line="283" w:lineRule="auto"/>
+        <w:jc w:val="center"/>
       </w:pPr>
       <w:r>
         <w:rPr>
-          <w:rFonts w:ascii="DejaVu Sans" w:hAnsi="DejaVu Sans" w:eastAsia="DejaVu Sans"/>
-          <w:color w:val="005F41"/>
+          <w:rFonts w:ascii="Arial" w:hAnsi="Arial" w:eastAsia="Arial"/>
+          <w:b/>
+          <w:i w:val="0"/>
+          <w:color w:val="087F5B"/>
+          <w:sz w:val="18"/>
         </w:rPr>
-        <w:t>8. Текущая архитектура Alpha</w:t>
-      </w:r>
-    </w:p>
-    <w:p>
-      <w:r>
-        <w:rPr>
-          <w:rFonts w:ascii="DejaVu Sans" w:hAnsi="DejaVu Sans" w:eastAsia="DejaVu Sans"/>
-          <w:sz w:val="20"/>
-        </w:rPr>
-        <w:t>В текущей Alpha v1.2 AgriPartners уже включает несколько ключевых модулей. Module (модуль) - это отдельная часть системы, которая выполняет конкретную функцию.</w:t>
+        <w:t>AGRIPARTNERS</w:t>
       </w:r>
     </w:p>
     <w:p>
       <w:pPr>
-        <w:pStyle w:val="ListBullet"/>
+        <w:spacing w:after="80" w:line="283" w:lineRule="auto"/>
+        <w:jc w:val="center"/>
       </w:pPr>
       <w:r>
         <w:rPr>
-          <w:rFonts w:ascii="DejaVu Sans" w:hAnsi="DejaVu Sans" w:eastAsia="DejaVu Sans"/>
-          <w:sz w:val="20"/>
+          <w:rFonts w:ascii="Arial" w:hAnsi="Arial" w:eastAsia="Arial"/>
+          <w:b/>
+          <w:i w:val="0"/>
+          <w:color w:val="17324D"/>
+          <w:sz w:val="50"/>
         </w:rPr>
-        <w:t>Investor Portal (кабинет инвестора) - место, где инвестор видит сделки, статусы, отчеты и финансовую информацию.</w:t>
+        <w:t>Роли и ценность</w:t>
       </w:r>
     </w:p>
     <w:p>
       <w:pPr>
-        <w:pStyle w:val="ListBullet"/>
+        <w:spacing w:after="280" w:line="283" w:lineRule="auto"/>
+        <w:jc w:val="center"/>
       </w:pPr>
       <w:r>
         <w:rPr>
-          <w:rFonts w:ascii="DejaVu Sans" w:hAnsi="DejaVu Sans" w:eastAsia="DejaVu Sans"/>
-          <w:sz w:val="20"/>
+          <w:rFonts w:ascii="Arial" w:hAnsi="Arial" w:eastAsia="Arial"/>
+          <w:b w:val="0"/>
+          <w:i w:val="0"/>
+          <w:color w:val="5E6B78"/>
+          <w:sz w:val="25"/>
         </w:rPr>
-        <w:t>Farmer Portal (кабинет фермера) - место, где фермер видит свои активные сделки, циклы и отправляет отчеты.</w:t>
-      </w:r>
-    </w:p>
-    <w:p>
-      <w:pPr>
-        <w:pStyle w:val="ListBullet"/>
-      </w:pPr>
-      <w:r>
-        <w:rPr>
-          <w:rFonts w:ascii="DejaVu Sans" w:hAnsi="DejaVu Sans" w:eastAsia="DejaVu Sans"/>
-          <w:sz w:val="20"/>
-        </w:rPr>
-        <w:t>Admin Portal (административная панель) - инструмент оператора платформы для контроля сделок и статусов.</w:t>
-      </w:r>
-    </w:p>
-    <w:p>
-      <w:pPr>
-        <w:pStyle w:val="ListBullet"/>
-      </w:pPr>
-      <w:r>
-        <w:rPr>
-          <w:rFonts w:ascii="DejaVu Sans" w:hAnsi="DejaVu Sans" w:eastAsia="DejaVu Sans"/>
-          <w:sz w:val="20"/>
-        </w:rPr>
-        <w:t>Treasury Dashboard (панель казначейства) - экран для учета и анализа финансовых потоков.</w:t>
-      </w:r>
-    </w:p>
-    <w:p>
-      <w:pPr>
-        <w:pStyle w:val="ListBullet"/>
-      </w:pPr>
-      <w:r>
-        <w:rPr>
-          <w:rFonts w:ascii="DejaVu Sans" w:hAnsi="DejaVu Sans" w:eastAsia="DejaVu Sans"/>
-          <w:sz w:val="20"/>
-        </w:rPr>
-        <w:t>Treasury Shadow Accounting (теневой учет казначейства) - модель учета, которая показывает финансовую логику без утверждения, что платформа уже хранит или выплачивает реальные средства.</w:t>
-      </w:r>
-    </w:p>
-    <w:p>
-      <w:pPr>
-        <w:pStyle w:val="ListBullet"/>
-      </w:pPr>
-      <w:r>
-        <w:rPr>
-          <w:rFonts w:ascii="DejaVu Sans" w:hAnsi="DejaVu Sans" w:eastAsia="DejaVu Sans"/>
-          <w:sz w:val="20"/>
-        </w:rPr>
-        <w:t>Presentation Mode (режим презентации) - демонстрационный режим для инвесторов, партнеров и экосистемы NEAR.</w:t>
-      </w:r>
-    </w:p>
-    <w:p>
-      <w:pPr>
-        <w:pStyle w:val="ListBullet"/>
-      </w:pPr>
-      <w:r>
-        <w:rPr>
-          <w:rFonts w:ascii="DejaVu Sans" w:hAnsi="DejaVu Sans" w:eastAsia="DejaVu Sans"/>
-          <w:sz w:val="20"/>
-        </w:rPr>
-        <w:t>NEAR Testnet Integration (интеграция с тестовой сетью NEAR) - подключение к тестовой блокчейн-среде для проверки логики.</w:t>
-      </w:r>
-    </w:p>
-    <w:p>
-      <w:pPr>
-        <w:pStyle w:val="Heading1"/>
-      </w:pPr>
-      <w:r>
-        <w:rPr>
-          <w:rFonts w:ascii="DejaVu Sans" w:hAnsi="DejaVu Sans" w:eastAsia="DejaVu Sans"/>
-          <w:color w:val="005F41"/>
-        </w:rPr>
-        <w:t>9. Какие модели финансирования возможны</w:t>
-      </w:r>
-    </w:p>
-    <w:p>
-      <w:r>
-        <w:rPr>
-          <w:rFonts w:ascii="DejaVu Sans" w:hAnsi="DejaVu Sans" w:eastAsia="DejaVu Sans"/>
-          <w:sz w:val="20"/>
-        </w:rPr>
-        <w:t>AgriPartners не обязан ограничиваться только одной моделью финансирования. Платформа может работать как операционная система для разных вариантов.</w:t>
-      </w:r>
-    </w:p>
-    <w:p>
-      <w:pPr>
-        <w:pStyle w:val="ListBullet"/>
-      </w:pPr>
-      <w:r>
-        <w:rPr>
-          <w:rFonts w:ascii="DejaVu Sans" w:hAnsi="DejaVu Sans" w:eastAsia="DejaVu Sans"/>
-          <w:sz w:val="20"/>
-        </w:rPr>
-        <w:t>Crypto-first модель: инвестор использует криптовалюту, например NEAR или USDT, а дальнейшая конвертация делается через партнерскую инфраструктуру.</w:t>
-      </w:r>
-    </w:p>
-    <w:p>
-      <w:pPr>
-        <w:pStyle w:val="ListBullet"/>
-      </w:pPr>
-      <w:r>
-        <w:rPr>
-          <w:rFonts w:ascii="DejaVu Sans" w:hAnsi="DejaVu Sans" w:eastAsia="DejaVu Sans"/>
-          <w:sz w:val="20"/>
-        </w:rPr>
-        <w:t>Hybrid модель: инвестор может переводить средства традиционным способом, а блокчейн используется для прозрачной фиксации событий и отчетов.</w:t>
-      </w:r>
-    </w:p>
-    <w:p>
-      <w:pPr>
-        <w:pStyle w:val="ListBullet"/>
-      </w:pPr>
-      <w:r>
-        <w:rPr>
-          <w:rFonts w:ascii="DejaVu Sans" w:hAnsi="DejaVu Sans" w:eastAsia="DejaVu Sans"/>
-          <w:sz w:val="20"/>
-        </w:rPr>
-        <w:t>Bank-partner модель: банк или платежный партнер отвечает за реальные денежные переводы, а AgriPartners ведет цифровой workflow и отчетность.</w:t>
-      </w:r>
-    </w:p>
-    <w:p>
-      <w:pPr>
-        <w:pStyle w:val="ListBullet"/>
-      </w:pPr>
-      <w:r>
-        <w:rPr>
-          <w:rFonts w:ascii="DejaVu Sans" w:hAnsi="DejaVu Sans" w:eastAsia="DejaVu Sans"/>
-          <w:sz w:val="20"/>
-        </w:rPr>
-        <w:t>White Label модель: другая организация использует AgriPartners под своим брендом. White Label означает, что технология предоставляется партнеру, а внешне может выглядеть как его собственная платформа.</w:t>
-      </w:r>
-    </w:p>
-    <w:p>
-      <w:pPr>
-        <w:pStyle w:val="ListBullet"/>
-      </w:pPr>
-      <w:r>
-        <w:rPr>
-          <w:rFonts w:ascii="DejaVu Sans" w:hAnsi="DejaVu Sans" w:eastAsia="DejaVu Sans"/>
-          <w:sz w:val="20"/>
-        </w:rPr>
-        <w:t>SaaS модель: AgriPartners предоставляет доступ к платформе за подписку или сервисную плату. SaaS означает Software as a Service, то есть программное обеспечение как услуга.</w:t>
-      </w:r>
-    </w:p>
-    <w:p>
-      <w:pPr>
-        <w:pStyle w:val="ListBullet"/>
-      </w:pPr>
-      <w:r>
-        <w:rPr>
-          <w:rFonts w:ascii="DejaVu Sans" w:hAnsi="DejaVu Sans" w:eastAsia="DejaVu Sans"/>
-          <w:sz w:val="20"/>
-        </w:rPr>
-        <w:t>Data &amp; Analytics модель: со временем платформа может предоставлять аналитику по проектам, рискам, доходности и отчетности. Analytics означает анализ данных для принятия решений.</w:t>
-      </w:r>
-    </w:p>
-    <w:p>
-      <w:pPr>
-        <w:pStyle w:val="Heading1"/>
-      </w:pPr>
-      <w:r>
-        <w:rPr>
-          <w:rFonts w:ascii="DejaVu Sans" w:hAnsi="DejaVu Sans" w:eastAsia="DejaVu Sans"/>
-          <w:color w:val="005F41"/>
-        </w:rPr>
-        <w:t>10. Выгоды для инвестора</w:t>
-      </w:r>
-    </w:p>
-    <w:p>
-      <w:r>
-        <w:rPr>
-          <w:rFonts w:ascii="DejaVu Sans" w:hAnsi="DejaVu Sans" w:eastAsia="DejaVu Sans"/>
-          <w:sz w:val="20"/>
-        </w:rPr>
-        <w:t>Investor (инвестор) получает больше прозрачности. Он может видеть, какой проект финансируется, кто фермер, какой статус сделки, есть ли отчет и какой ожидается результат.</w:t>
-      </w:r>
-    </w:p>
-    <w:p>
-      <w:pPr>
-        <w:pStyle w:val="ListBullet"/>
-      </w:pPr>
-      <w:r>
-        <w:rPr>
-          <w:rFonts w:ascii="DejaVu Sans" w:hAnsi="DejaVu Sans" w:eastAsia="DejaVu Sans"/>
-          <w:sz w:val="20"/>
-        </w:rPr>
-        <w:t>Единый кабинет вместо разрозненных сообщений и таблиц.</w:t>
-      </w:r>
-    </w:p>
-    <w:p>
-      <w:pPr>
-        <w:pStyle w:val="ListBullet"/>
-      </w:pPr>
-      <w:r>
-        <w:rPr>
-          <w:rFonts w:ascii="DejaVu Sans" w:hAnsi="DejaVu Sans" w:eastAsia="DejaVu Sans"/>
-          <w:sz w:val="20"/>
-        </w:rPr>
-        <w:t>Понимание статуса проекта: создан, профинансирован, активен, завершен.</w:t>
-      </w:r>
-    </w:p>
-    <w:p>
-      <w:pPr>
-        <w:pStyle w:val="ListBullet"/>
-      </w:pPr>
-      <w:r>
-        <w:rPr>
-          <w:rFonts w:ascii="DejaVu Sans" w:hAnsi="DejaVu Sans" w:eastAsia="DejaVu Sans"/>
-          <w:sz w:val="20"/>
-        </w:rPr>
-        <w:t>Доступ к отчетам фермера.</w:t>
-      </w:r>
-    </w:p>
-    <w:p>
-      <w:pPr>
-        <w:pStyle w:val="ListBullet"/>
-      </w:pPr>
-      <w:r>
-        <w:rPr>
-          <w:rFonts w:ascii="DejaVu Sans" w:hAnsi="DejaVu Sans" w:eastAsia="DejaVu Sans"/>
-          <w:sz w:val="20"/>
-        </w:rPr>
-        <w:t>Возможность видеть историю проекта.</w:t>
-      </w:r>
-    </w:p>
-    <w:p>
-      <w:pPr>
-        <w:pStyle w:val="ListBullet"/>
-      </w:pPr>
-      <w:r>
-        <w:rPr>
-          <w:rFonts w:ascii="DejaVu Sans" w:hAnsi="DejaVu Sans" w:eastAsia="DejaVu Sans"/>
-          <w:sz w:val="20"/>
-        </w:rPr>
-        <w:t>Потенциальная интеграция с блокчейн-записями для проверки событий.</w:t>
-      </w:r>
-    </w:p>
-    <w:p>
-      <w:r>
-        <w:rPr>
-          <w:rFonts w:ascii="DejaVu Sans" w:hAnsi="DejaVu Sans" w:eastAsia="DejaVu Sans"/>
-          <w:sz w:val="20"/>
-        </w:rPr>
-        <w:t>ROI (Return on Investment) - это доходность инвестиций. Простыми словами, ROI показывает, сколько инвестор заработал относительно вложенной суммы. APR (Annual Percentage Rate) - годовая процентная доходность, то есть примерная доходность в пересчете на год.</w:t>
-      </w:r>
-    </w:p>
-    <w:p>
-      <w:pPr>
-        <w:pStyle w:val="Heading1"/>
-      </w:pPr>
-      <w:r>
-        <w:rPr>
-          <w:rFonts w:ascii="DejaVu Sans" w:hAnsi="DejaVu Sans" w:eastAsia="DejaVu Sans"/>
-          <w:color w:val="005F41"/>
-        </w:rPr>
-        <w:t>11. Выгоды для фермера</w:t>
-      </w:r>
-    </w:p>
-    <w:p>
-      <w:r>
-        <w:rPr>
-          <w:rFonts w:ascii="DejaVu Sans" w:hAnsi="DejaVu Sans" w:eastAsia="DejaVu Sans"/>
-          <w:sz w:val="20"/>
-        </w:rPr>
-        <w:t>Farmer (фермер) получает более структурированный способ работать с инвесторами. Ему не нужно каждый раз объяснять все вручную: проект, циклы, отчеты и подтверждения можно вести внутри платформы.</w:t>
-      </w:r>
-    </w:p>
-    <w:p>
-      <w:pPr>
-        <w:pStyle w:val="ListBullet"/>
-      </w:pPr>
-      <w:r>
-        <w:rPr>
-          <w:rFonts w:ascii="DejaVu Sans" w:hAnsi="DejaVu Sans" w:eastAsia="DejaVu Sans"/>
-          <w:sz w:val="20"/>
-        </w:rPr>
-        <w:t>Фермер может показать историю своей работы.</w:t>
-      </w:r>
-    </w:p>
-    <w:p>
-      <w:pPr>
-        <w:pStyle w:val="ListBullet"/>
-      </w:pPr>
-      <w:r>
-        <w:rPr>
-          <w:rFonts w:ascii="DejaVu Sans" w:hAnsi="DejaVu Sans" w:eastAsia="DejaVu Sans"/>
-          <w:sz w:val="20"/>
-        </w:rPr>
-        <w:t>Фермер получает цифровую репутацию.</w:t>
-      </w:r>
-    </w:p>
-    <w:p>
-      <w:pPr>
-        <w:pStyle w:val="ListBullet"/>
-      </w:pPr>
-      <w:r>
-        <w:rPr>
-          <w:rFonts w:ascii="DejaVu Sans" w:hAnsi="DejaVu Sans" w:eastAsia="DejaVu Sans"/>
-          <w:sz w:val="20"/>
-        </w:rPr>
-        <w:t>Фермеру проще готовить отчеты по циклам.</w:t>
-      </w:r>
-    </w:p>
-    <w:p>
-      <w:pPr>
-        <w:pStyle w:val="ListBullet"/>
-      </w:pPr>
-      <w:r>
-        <w:rPr>
-          <w:rFonts w:ascii="DejaVu Sans" w:hAnsi="DejaVu Sans" w:eastAsia="DejaVu Sans"/>
-          <w:sz w:val="20"/>
-        </w:rPr>
-        <w:t>Инвесторам легче доверять фермеру, если информация прозрачна.</w:t>
-      </w:r>
-    </w:p>
-    <w:p>
-      <w:pPr>
-        <w:pStyle w:val="ListBullet"/>
-      </w:pPr>
-      <w:r>
-        <w:rPr>
-          <w:rFonts w:ascii="DejaVu Sans" w:hAnsi="DejaVu Sans" w:eastAsia="DejaVu Sans"/>
-          <w:sz w:val="20"/>
-        </w:rPr>
-        <w:t>В будущем успешные фермеры могут получать финансирование быстрее.</w:t>
-      </w:r>
-    </w:p>
-    <w:p>
-      <w:pPr>
-        <w:pStyle w:val="Heading1"/>
-      </w:pPr>
-      <w:r>
-        <w:rPr>
-          <w:rFonts w:ascii="DejaVu Sans" w:hAnsi="DejaVu Sans" w:eastAsia="DejaVu Sans"/>
-          <w:color w:val="005F41"/>
-        </w:rPr>
-        <w:t>12. Выгоды для администратора платформы</w:t>
-      </w:r>
-    </w:p>
-    <w:p>
-      <w:r>
-        <w:rPr>
-          <w:rFonts w:ascii="DejaVu Sans" w:hAnsi="DejaVu Sans" w:eastAsia="DejaVu Sans"/>
-          <w:sz w:val="20"/>
-        </w:rPr>
-        <w:t>Administrator (администратор) - это человек или команда, которая управляет процессом внутри платформы. Администратор видит сделки, статусы, отчеты, роли пользователей и финансовую логику.</w:t>
-      </w:r>
-    </w:p>
-    <w:p>
-      <w:pPr>
-        <w:pStyle w:val="ListBullet"/>
-      </w:pPr>
-      <w:r>
-        <w:rPr>
-          <w:rFonts w:ascii="DejaVu Sans" w:hAnsi="DejaVu Sans" w:eastAsia="DejaVu Sans"/>
-          <w:sz w:val="20"/>
-        </w:rPr>
-        <w:t>Меньше ручной работы с таблицами.</w:t>
-      </w:r>
-    </w:p>
-    <w:p>
-      <w:pPr>
-        <w:pStyle w:val="ListBullet"/>
-      </w:pPr>
-      <w:r>
-        <w:rPr>
-          <w:rFonts w:ascii="DejaVu Sans" w:hAnsi="DejaVu Sans" w:eastAsia="DejaVu Sans"/>
-          <w:sz w:val="20"/>
-        </w:rPr>
-        <w:t>Единая история сделок.</w:t>
-      </w:r>
-    </w:p>
-    <w:p>
-      <w:pPr>
-        <w:pStyle w:val="ListBullet"/>
-      </w:pPr>
-      <w:r>
-        <w:rPr>
-          <w:rFonts w:ascii="DejaVu Sans" w:hAnsi="DejaVu Sans" w:eastAsia="DejaVu Sans"/>
-          <w:sz w:val="20"/>
-        </w:rPr>
-        <w:t>Более понятный контроль статусов.</w:t>
-      </w:r>
-    </w:p>
-    <w:p>
-      <w:pPr>
-        <w:pStyle w:val="ListBullet"/>
-      </w:pPr>
-      <w:r>
-        <w:rPr>
-          <w:rFonts w:ascii="DejaVu Sans" w:hAnsi="DejaVu Sans" w:eastAsia="DejaVu Sans"/>
-          <w:sz w:val="20"/>
-        </w:rPr>
-        <w:t>Удобная подготовка материалов для инвесторов.</w:t>
-      </w:r>
-    </w:p>
-    <w:p>
-      <w:pPr>
-        <w:pStyle w:val="ListBullet"/>
-      </w:pPr>
-      <w:r>
-        <w:rPr>
-          <w:rFonts w:ascii="DejaVu Sans" w:hAnsi="DejaVu Sans" w:eastAsia="DejaVu Sans"/>
-          <w:sz w:val="20"/>
-        </w:rPr>
-        <w:t>Audit Trail (аудиторский след) - история действий, по которой можно понять, кто и когда что сделал.</w:t>
-      </w:r>
-    </w:p>
-    <w:p>
-      <w:pPr>
-        <w:pStyle w:val="Heading1"/>
-      </w:pPr>
-      <w:r>
-        <w:rPr>
-          <w:rFonts w:ascii="DejaVu Sans" w:hAnsi="DejaVu Sans" w:eastAsia="DejaVu Sans"/>
-          <w:color w:val="005F41"/>
-        </w:rPr>
-        <w:t>13. Выгоды для экосистемы NEAR</w:t>
-      </w:r>
-    </w:p>
-    <w:p>
-      <w:r>
-        <w:rPr>
-          <w:rFonts w:ascii="DejaVu Sans" w:hAnsi="DejaVu Sans" w:eastAsia="DejaVu Sans"/>
-          <w:sz w:val="20"/>
-        </w:rPr>
-        <w:t>Для NEAR экосистемы AgriPartners может стать примером практического применения блокчейна в реальном секторе. Это не только торговля токенами, а use case (практический сценарий использования) для сельского хозяйства, инвестиций и отчетности.</w:t>
-      </w:r>
-    </w:p>
-    <w:p>
-      <w:pPr>
-        <w:pStyle w:val="ListBullet"/>
-      </w:pPr>
-      <w:r>
-        <w:rPr>
-          <w:rFonts w:ascii="DejaVu Sans" w:hAnsi="DejaVu Sans" w:eastAsia="DejaVu Sans"/>
-          <w:sz w:val="20"/>
-        </w:rPr>
-        <w:t>Показывает RWA-направление в сельском хозяйстве.</w:t>
-      </w:r>
-    </w:p>
-    <w:p>
-      <w:pPr>
-        <w:pStyle w:val="ListBullet"/>
-      </w:pPr>
-      <w:r>
-        <w:rPr>
-          <w:rFonts w:ascii="DejaVu Sans" w:hAnsi="DejaVu Sans" w:eastAsia="DejaVu Sans"/>
-          <w:sz w:val="20"/>
-        </w:rPr>
-        <w:t>Демонстрирует применение NEAR Testnet для реальных процессов.</w:t>
-      </w:r>
-    </w:p>
-    <w:p>
-      <w:pPr>
-        <w:pStyle w:val="ListBullet"/>
-      </w:pPr>
-      <w:r>
-        <w:rPr>
-          <w:rFonts w:ascii="DejaVu Sans" w:hAnsi="DejaVu Sans" w:eastAsia="DejaVu Sans"/>
-          <w:sz w:val="20"/>
-        </w:rPr>
-        <w:t>Создает потенциальный путь к партнерствам с фермерами, инвесторами и организациями.</w:t>
-      </w:r>
-    </w:p>
-    <w:p>
-      <w:pPr>
-        <w:pStyle w:val="ListBullet"/>
-      </w:pPr>
-      <w:r>
-        <w:rPr>
-          <w:rFonts w:ascii="DejaVu Sans" w:hAnsi="DejaVu Sans" w:eastAsia="DejaVu Sans"/>
-          <w:sz w:val="20"/>
-        </w:rPr>
-        <w:t>Помогает экосистеме показать, что блокчейн может использоваться для прозрачных рабочих процессов, а не только для спекуляций.</w:t>
-      </w:r>
-    </w:p>
-    <w:p>
-      <w:pPr>
-        <w:pStyle w:val="Heading1"/>
-      </w:pPr>
-      <w:r>
-        <w:rPr>
-          <w:rFonts w:ascii="DejaVu Sans" w:hAnsi="DejaVu Sans" w:eastAsia="DejaVu Sans"/>
-          <w:color w:val="005F41"/>
-        </w:rPr>
-        <w:t>14. Выгоды для банков, партнеров и регуляторов</w:t>
-      </w:r>
-    </w:p>
-    <w:p>
-      <w:r>
-        <w:rPr>
-          <w:rFonts w:ascii="DejaVu Sans" w:hAnsi="DejaVu Sans" w:eastAsia="DejaVu Sans"/>
-          <w:sz w:val="20"/>
-        </w:rPr>
-        <w:t>Банки и регуляторы обычно осторожно относятся к криптовалютам. Поэтому AgriPartners должен показывать не только технологию, но и управляемость процесса: кто участвует, откуда деньги, куда они идут, какие отчеты есть и какие правила соблюдаются.</w:t>
-      </w:r>
-    </w:p>
-    <w:p>
-      <w:pPr>
-        <w:pStyle w:val="ListBullet"/>
-      </w:pPr>
-      <w:r>
-        <w:rPr>
-          <w:rFonts w:ascii="DejaVu Sans" w:hAnsi="DejaVu Sans" w:eastAsia="DejaVu Sans"/>
-          <w:sz w:val="20"/>
-        </w:rPr>
-        <w:t>Банки могут быть платежными партнерами для конвертации и расчетов.</w:t>
-      </w:r>
-    </w:p>
-    <w:p>
-      <w:pPr>
-        <w:pStyle w:val="ListBullet"/>
-      </w:pPr>
-      <w:r>
-        <w:rPr>
-          <w:rFonts w:ascii="DejaVu Sans" w:hAnsi="DejaVu Sans" w:eastAsia="DejaVu Sans"/>
-          <w:sz w:val="20"/>
-        </w:rPr>
-        <w:t>Юристы могут помочь определить допустимую модель работы.</w:t>
-      </w:r>
-    </w:p>
-    <w:p>
-      <w:pPr>
-        <w:pStyle w:val="ListBullet"/>
-      </w:pPr>
-      <w:r>
-        <w:rPr>
-          <w:rFonts w:ascii="DejaVu Sans" w:hAnsi="DejaVu Sans" w:eastAsia="DejaVu Sans"/>
-          <w:sz w:val="20"/>
-        </w:rPr>
-        <w:t>Государственные органы могут видеть более прозрачную отчетность по агропроектам.</w:t>
-      </w:r>
-    </w:p>
-    <w:p>
-      <w:pPr>
-        <w:pStyle w:val="ListBullet"/>
-      </w:pPr>
-      <w:r>
-        <w:rPr>
-          <w:rFonts w:ascii="DejaVu Sans" w:hAnsi="DejaVu Sans" w:eastAsia="DejaVu Sans"/>
-          <w:sz w:val="20"/>
-        </w:rPr>
-        <w:t>Партнеры могут использовать платформу как инструмент контроля и отчетности.</w:t>
-      </w:r>
-    </w:p>
-    <w:p>
-      <w:pPr>
-        <w:pStyle w:val="Heading1"/>
-      </w:pPr>
-      <w:r>
-        <w:rPr>
-          <w:rFonts w:ascii="DejaVu Sans" w:hAnsi="DejaVu Sans" w:eastAsia="DejaVu Sans"/>
-          <w:color w:val="005F41"/>
-        </w:rPr>
-        <w:t>15. Юридические и регуляторные ограничения</w:t>
-      </w:r>
-    </w:p>
-    <w:p>
-      <w:r>
-        <w:rPr>
-          <w:rFonts w:ascii="DejaVu Sans" w:hAnsi="DejaVu Sans" w:eastAsia="DejaVu Sans"/>
-          <w:sz w:val="20"/>
-        </w:rPr>
-        <w:t>Если AgriPartners в будущем будет работать с реальными деньгами, криптовалютой, USDT или выплатами, потребуется юридическая модель. Это может включать KYC, AML, договоры, налоговый учет, ограничения по юрисдикциям и правила защиты инвесторов.</w:t>
-      </w:r>
-    </w:p>
-    <w:p>
-      <w:r>
-        <w:rPr>
-          <w:rFonts w:ascii="DejaVu Sans" w:hAnsi="DejaVu Sans" w:eastAsia="DejaVu Sans"/>
-          <w:sz w:val="20"/>
-        </w:rPr>
-        <w:t>Поэтому на текущем этапе правильнее позиционировать AgriPartners как Alpha/Testnet платформу для прозрачных инвестиционных workflow, а не как готовый инвестиционный, платежный, депозитарный или расчетный сервис.</w:t>
-      </w:r>
-    </w:p>
-    <w:tbl>
-      <w:tblPr>
-        <w:tblW w:type="auto" w:w="0"/>
-        <w:jc w:val="center"/>
-        <w:tblLook w:firstColumn="1" w:firstRow="1" w:lastColumn="0" w:lastRow="0" w:noHBand="0" w:noVBand="1" w:val="04A0"/>
-      </w:tblPr>
-      <w:tblGrid>
-        <w:gridCol w:w="10224"/>
-      </w:tblGrid>
-      <w:tr>
-        <w:tc>
-          <w:tcPr>
-            <w:tcW w:type="dxa" w:w="10224"/>
-            <w:shd w:fill="EAF4EF"/>
-          </w:tcPr>
-          <w:p>
-            <w:r>
-              <w:rPr>
-                <w:rFonts w:ascii="DejaVu Sans" w:hAnsi="DejaVu Sans" w:eastAsia="DejaVu Sans"/>
-                <w:b/>
-                <w:color w:val="005A36"/>
-                <w:sz w:val="20"/>
-              </w:rPr>
-              <w:t>Простыми словами</w:t>
-              <w:br/>
-            </w:r>
-            <w:r>
-              <w:rPr>
-                <w:rFonts w:ascii="DejaVu Sans" w:hAnsi="DejaVu Sans" w:eastAsia="DejaVu Sans"/>
-                <w:sz w:val="18"/>
-              </w:rPr>
-              <w:t>Сейчас важно показывать ценность платформы: прозрачность, отчетность, роли, статусы и проверяемость. Реальные платежи и выплаты должны внедряться только после юридической и партнерской подготовки.</w:t>
-            </w:r>
-          </w:p>
-        </w:tc>
-      </w:tr>
-    </w:tbl>
-    <w:p/>
-    <w:p>
-      <w:pPr>
-        <w:pStyle w:val="Heading1"/>
-      </w:pPr>
-      <w:r>
-        <w:rPr>
-          <w:rFonts w:ascii="DejaVu Sans" w:hAnsi="DejaVu Sans" w:eastAsia="DejaVu Sans"/>
-          <w:color w:val="005F41"/>
-        </w:rPr>
-        <w:t>16. Частые вопросы заинтересованных сторон</w:t>
-      </w:r>
-    </w:p>
-    <w:p>
-      <w:r>
-        <w:rPr>
-          <w:rFonts w:ascii="DejaVu Sans" w:hAnsi="DejaVu Sans" w:eastAsia="DejaVu Sans"/>
-          <w:b/>
-          <w:sz w:val="20"/>
-        </w:rPr>
-        <w:t>Q: AgriPartners - это криптовалютный проект?</w:t>
-      </w:r>
-    </w:p>
-    <w:p>
-      <w:r>
-        <w:rPr>
-          <w:rFonts w:ascii="DejaVu Sans" w:hAnsi="DejaVu Sans" w:eastAsia="DejaVu Sans"/>
-          <w:sz w:val="20"/>
-        </w:rPr>
-        <w:t>A: Не только. Это платформа для прозрачных сельскохозяйственных инвестиционных процессов. Криптовалюта и блокчейн могут быть частью инфраструктуры, но главная ценность - прозрачность workflow и отчетности.</w:t>
-      </w:r>
-    </w:p>
-    <w:p>
-      <w:r>
-        <w:rPr>
-          <w:rFonts w:ascii="DejaVu Sans" w:hAnsi="DejaVu Sans" w:eastAsia="DejaVu Sans"/>
-          <w:b/>
-          <w:sz w:val="20"/>
-        </w:rPr>
-        <w:t>Q: Можно ли финансировать проекты через NEAR?</w:t>
-      </w:r>
-    </w:p>
-    <w:p>
-      <w:r>
-        <w:rPr>
-          <w:rFonts w:ascii="DejaVu Sans" w:hAnsi="DejaVu Sans" w:eastAsia="DejaVu Sans"/>
-          <w:sz w:val="20"/>
-        </w:rPr>
-        <w:t>A: Технически такой вариант возможен, но для реального использования нужны юридическая модель, KYC/AML, партнеры для конвертации и понятные правила расчетов.</w:t>
-      </w:r>
-    </w:p>
-    <w:p>
-      <w:r>
-        <w:rPr>
-          <w:rFonts w:ascii="DejaVu Sans" w:hAnsi="DejaVu Sans" w:eastAsia="DejaVu Sans"/>
-          <w:b/>
-          <w:sz w:val="20"/>
-        </w:rPr>
-        <w:t>Q: Почему не использовать только USDT?</w:t>
-      </w:r>
-    </w:p>
-    <w:p>
-      <w:r>
-        <w:rPr>
-          <w:rFonts w:ascii="DejaVu Sans" w:hAnsi="DejaVu Sans" w:eastAsia="DejaVu Sans"/>
-          <w:sz w:val="20"/>
-        </w:rPr>
-        <w:t>A: USDT может быть удобным средством расчетов, но он не решает всю задачу: нужно управлять сделками, отчетами, статусами, ролями и историей событий.</w:t>
-      </w:r>
-    </w:p>
-    <w:p>
-      <w:r>
-        <w:rPr>
-          <w:rFonts w:ascii="DejaVu Sans" w:hAnsi="DejaVu Sans" w:eastAsia="DejaVu Sans"/>
-          <w:b/>
-          <w:sz w:val="20"/>
-        </w:rPr>
-        <w:t>Q: AgriPartners хранит деньги пользователей?</w:t>
-      </w:r>
-    </w:p>
-    <w:p>
-      <w:r>
-        <w:rPr>
-          <w:rFonts w:ascii="DejaVu Sans" w:hAnsi="DejaVu Sans" w:eastAsia="DejaVu Sans"/>
-          <w:sz w:val="20"/>
-        </w:rPr>
-        <w:t>A: В текущей Alpha/Testnet версии AgriPartners не должен позиционироваться как сервис хранения или выплаты реальных средств. Он демонстрирует рабочую логику и учет.</w:t>
-      </w:r>
-    </w:p>
-    <w:p>
-      <w:r>
-        <w:rPr>
-          <w:rFonts w:ascii="DejaVu Sans" w:hAnsi="DejaVu Sans" w:eastAsia="DejaVu Sans"/>
-          <w:b/>
-          <w:sz w:val="20"/>
-        </w:rPr>
-        <w:t>Q: Зачем фермеру такая система?</w:t>
-      </w:r>
-    </w:p>
-    <w:p>
-      <w:r>
-        <w:rPr>
-          <w:rFonts w:ascii="DejaVu Sans" w:hAnsi="DejaVu Sans" w:eastAsia="DejaVu Sans"/>
-          <w:sz w:val="20"/>
-        </w:rPr>
-        <w:t>A: Фермер получает структурированный способ показывать проект, подтверждать этапы и формировать репутацию для будущего финансирования.</w:t>
-      </w:r>
-    </w:p>
-    <w:p>
-      <w:r>
-        <w:rPr>
-          <w:rFonts w:ascii="DejaVu Sans" w:hAnsi="DejaVu Sans" w:eastAsia="DejaVu Sans"/>
-          <w:b/>
-          <w:sz w:val="20"/>
-        </w:rPr>
-        <w:t>Q: Зачем инвестору такая система?</w:t>
-      </w:r>
-    </w:p>
-    <w:p>
-      <w:r>
-        <w:rPr>
-          <w:rFonts w:ascii="DejaVu Sans" w:hAnsi="DejaVu Sans" w:eastAsia="DejaVu Sans"/>
-          <w:sz w:val="20"/>
-        </w:rPr>
-        <w:t>A: Инвестор получает больше прозрачности: он видит проект, статус, отчеты, ожидаемый результат и историю действий.</w:t>
-      </w:r>
-    </w:p>
-    <w:p>
-      <w:r>
-        <w:rPr>
-          <w:rFonts w:ascii="DejaVu Sans" w:hAnsi="DejaVu Sans" w:eastAsia="DejaVu Sans"/>
-          <w:b/>
-          <w:sz w:val="20"/>
-        </w:rPr>
-        <w:t>Q: Можно ли использовать платформу без криптовалюты?</w:t>
-      </w:r>
-    </w:p>
-    <w:p>
-      <w:r>
-        <w:rPr>
-          <w:rFonts w:ascii="DejaVu Sans" w:hAnsi="DejaVu Sans" w:eastAsia="DejaVu Sans"/>
-          <w:sz w:val="20"/>
-        </w:rPr>
-        <w:t>A: Да, возможно. Платформа может поддерживать гибридную модель, где деньги идут через банк или партнера, а блокчейн используется для прозрачности событий.</w:t>
-      </w:r>
-    </w:p>
-    <w:p>
-      <w:r>
-        <w:rPr>
-          <w:rFonts w:ascii="DejaVu Sans" w:hAnsi="DejaVu Sans" w:eastAsia="DejaVu Sans"/>
-          <w:b/>
-          <w:sz w:val="20"/>
-        </w:rPr>
-        <w:t>Q: Что означает Testnet?</w:t>
-      </w:r>
-    </w:p>
-    <w:p>
-      <w:r>
-        <w:rPr>
-          <w:rFonts w:ascii="DejaVu Sans" w:hAnsi="DejaVu Sans" w:eastAsia="DejaVu Sans"/>
-          <w:sz w:val="20"/>
-        </w:rPr>
-        <w:t>A: Testnet - это тестовая сеть. Простыми словами, это безопасная среда, где можно проверять систему без настоящих денег.</w:t>
-      </w:r>
-    </w:p>
-    <w:p>
-      <w:r>
-        <w:rPr>
-          <w:rFonts w:ascii="DejaVu Sans" w:hAnsi="DejaVu Sans" w:eastAsia="DejaVu Sans"/>
-          <w:b/>
-          <w:sz w:val="20"/>
-        </w:rPr>
-        <w:t>Q: Когда возможен Mainnet?</w:t>
-      </w:r>
-    </w:p>
-    <w:p>
-      <w:r>
-        <w:rPr>
-          <w:rFonts w:ascii="DejaVu Sans" w:hAnsi="DejaVu Sans" w:eastAsia="DejaVu Sans"/>
-          <w:sz w:val="20"/>
-        </w:rPr>
-        <w:t>A: Mainnet - это основная сеть с реальными активами. Переход к Mainnet возможен только после технической, юридической и партнерской готовности.</w:t>
-      </w:r>
-    </w:p>
-    <w:p>
-      <w:r>
-        <w:rPr>
-          <w:rFonts w:ascii="DejaVu Sans" w:hAnsi="DejaVu Sans" w:eastAsia="DejaVu Sans"/>
-          <w:b/>
-          <w:sz w:val="20"/>
-        </w:rPr>
-        <w:t>Q: Что получает NEAR экосистема?</w:t>
-      </w:r>
-    </w:p>
-    <w:p>
-      <w:r>
-        <w:rPr>
-          <w:rFonts w:ascii="DejaVu Sans" w:hAnsi="DejaVu Sans" w:eastAsia="DejaVu Sans"/>
-          <w:sz w:val="20"/>
-        </w:rPr>
-        <w:t>A: NEAR получает реальный пример применения блокчейна в сельском хозяйстве, RWA, отчетности и прозрачных инвестиционных процессах.</w:t>
-      </w:r>
-    </w:p>
-    <w:p>
-      <w:pPr>
-        <w:pStyle w:val="Heading1"/>
-      </w:pPr>
-      <w:r>
-        <w:rPr>
-          <w:rFonts w:ascii="DejaVu Sans" w:hAnsi="DejaVu Sans" w:eastAsia="DejaVu Sans"/>
-          <w:color w:val="005F41"/>
-        </w:rPr>
-        <w:t>17. Дорожная карта развития</w:t>
-      </w:r>
-    </w:p>
-    <w:p>
-      <w:r>
-        <w:rPr>
-          <w:rFonts w:ascii="DejaVu Sans" w:hAnsi="DejaVu Sans" w:eastAsia="DejaVu Sans"/>
-          <w:sz w:val="20"/>
-        </w:rPr>
-        <w:t>Roadmap (дорожная карта) - это план развития продукта по этапам. Для AgriPartners логичная дорожная карта выглядит так:</w:t>
-      </w:r>
-    </w:p>
-    <w:p>
-      <w:pPr>
-        <w:pStyle w:val="ListNumber"/>
-      </w:pPr>
-      <w:r>
-        <w:rPr>
-          <w:rFonts w:ascii="DejaVu Sans" w:hAnsi="DejaVu Sans" w:eastAsia="DejaVu Sans"/>
-          <w:sz w:val="20"/>
-        </w:rPr>
-        <w:t>Alpha/Testnet: демонстрация рабочих процессов, ролей, отчетности и тестовой блокчейн-логики.</w:t>
-      </w:r>
-    </w:p>
-    <w:p>
-      <w:pPr>
-        <w:pStyle w:val="ListNumber"/>
-      </w:pPr>
-      <w:r>
-        <w:rPr>
-          <w:rFonts w:ascii="DejaVu Sans" w:hAnsi="DejaVu Sans" w:eastAsia="DejaVu Sans"/>
-          <w:sz w:val="20"/>
-        </w:rPr>
-        <w:t>Pilot: ограниченный пилот с реальными фермерами и партнерами, но с осторожной юридической рамкой.</w:t>
-      </w:r>
-    </w:p>
-    <w:p>
-      <w:pPr>
-        <w:pStyle w:val="ListNumber"/>
-      </w:pPr>
-      <w:r>
-        <w:rPr>
-          <w:rFonts w:ascii="DejaVu Sans" w:hAnsi="DejaVu Sans" w:eastAsia="DejaVu Sans"/>
-          <w:sz w:val="20"/>
-        </w:rPr>
-        <w:t>Hybrid Funding: поддержка традиционных платежей и цифрового учета событий.</w:t>
-      </w:r>
-    </w:p>
-    <w:p>
-      <w:pPr>
-        <w:pStyle w:val="ListNumber"/>
-      </w:pPr>
-      <w:r>
-        <w:rPr>
-          <w:rFonts w:ascii="DejaVu Sans" w:hAnsi="DejaVu Sans" w:eastAsia="DejaVu Sans"/>
-          <w:sz w:val="20"/>
-        </w:rPr>
-        <w:t>Stablecoin Readiness: подготовка к возможному использованию USDT или других стейблкоинов через партнеров.</w:t>
-      </w:r>
-    </w:p>
-    <w:p>
-      <w:pPr>
-        <w:pStyle w:val="ListNumber"/>
-      </w:pPr>
-      <w:r>
-        <w:rPr>
-          <w:rFonts w:ascii="DejaVu Sans" w:hAnsi="DejaVu Sans" w:eastAsia="DejaVu Sans"/>
-          <w:sz w:val="20"/>
-        </w:rPr>
-        <w:t>Mainnet Readiness: техническая и юридическая подготовка к работе с основной сетью.</w:t>
-      </w:r>
-    </w:p>
-    <w:p>
-      <w:pPr>
-        <w:pStyle w:val="ListNumber"/>
-      </w:pPr>
-      <w:r>
-        <w:rPr>
-          <w:rFonts w:ascii="DejaVu Sans" w:hAnsi="DejaVu Sans" w:eastAsia="DejaVu Sans"/>
-          <w:sz w:val="20"/>
-        </w:rPr>
-        <w:t>Scale: расширение на новые типы сельхозпроектов, партнеров, регионов и инвесторов.</w:t>
-      </w:r>
-    </w:p>
-    <w:p>
-      <w:pPr>
-        <w:pStyle w:val="Heading1"/>
-      </w:pPr>
-      <w:r>
-        <w:rPr>
-          <w:rFonts w:ascii="DejaVu Sans" w:hAnsi="DejaVu Sans" w:eastAsia="DejaVu Sans"/>
-          <w:color w:val="005F41"/>
-        </w:rPr>
-        <w:t>18. Как правильно объяснять AgriPartners разным людям</w:t>
+        <w:t>Alpha v1.2 · прозрачные процессы агроинвестирования · NEAR Testnet</w:t>
       </w:r>
     </w:p>
     <w:tbl>
       <w:tblPr>
         <w:tblStyle w:val="TableGrid"/>
         <w:tblW w:type="auto" w:w="0"/>
-        <w:jc w:val="center"/>
+        <w:jc w:val="left"/>
+        <w:tblLayout w:type="fixed"/>
         <w:tblLook w:firstColumn="1" w:firstRow="1" w:lastColumn="0" w:lastRow="0" w:noHBand="0" w:noVBand="1" w:val="04A0"/>
+        <w:tblW w:w="9360" w:type="dxa"/>
+        <w:tblInd w:w="120" w:type="dxa"/>
       </w:tblPr>
       <w:tblGrid>
-        <w:gridCol w:w="3408"/>
-        <w:gridCol w:w="3408"/>
-        <w:gridCol w:w="3408"/>
+        <w:gridCol w:w="2500"/>
+        <w:gridCol w:w="6860"/>
       </w:tblGrid>
       <w:tr>
         <w:tc>
           <w:tcPr>
-            <w:tcW w:type="dxa" w:w="3408"/>
-            <w:shd w:fill="006B4A"/>
+            <w:tcW w:type="dxa" w:w="4680"/>
+            <w:tcW w:w="2500" w:type="dxa"/>
+            <w:vAlign w:val="center"/>
+            <w:shd w:fill="056246"/>
           </w:tcPr>
           <w:p>
+            <w:pPr>
+              <w:spacing w:after="0"/>
+              <w:jc w:val="center"/>
+            </w:pPr>
             <w:r>
               <w:rPr>
-                <w:rFonts w:ascii="DejaVu Sans" w:hAnsi="DejaVu Sans" w:eastAsia="DejaVu Sans"/>
-                <w:sz w:val="18"/>
+                <w:rFonts w:ascii="Arial" w:hAnsi="Arial" w:eastAsia="Arial"/>
+                <w:b/>
+                <w:i w:val="0"/>
+                <w:color w:val="FFFFFF"/>
+                <w:sz w:val="17"/>
               </w:rPr>
-            </w:r>
-            <w:r>
-              <w:rPr>
-                <w:rFonts w:ascii="DejaVu Sans" w:hAnsi="DejaVu Sans" w:eastAsia="DejaVu Sans"/>
-                <w:b/>
-                <w:color w:val="FFFFFF"/>
-                <w:sz w:val="18"/>
-              </w:rPr>
-              <w:t>Кому объясняем</w:t>
+              <w:t>Роль</w:t>
             </w:r>
           </w:p>
         </w:tc>
         <w:tc>
           <w:tcPr>
-            <w:tcW w:type="dxa" w:w="3408"/>
-            <w:shd w:fill="006B4A"/>
+            <w:tcW w:type="dxa" w:w="4680"/>
+            <w:tcW w:w="6860" w:type="dxa"/>
+            <w:vAlign w:val="center"/>
+            <w:shd w:fill="056246"/>
           </w:tcPr>
           <w:p>
+            <w:pPr>
+              <w:spacing w:after="0"/>
+              <w:jc w:val="center"/>
+            </w:pPr>
             <w:r>
               <w:rPr>
-                <w:rFonts w:ascii="DejaVu Sans" w:hAnsi="DejaVu Sans" w:eastAsia="DejaVu Sans"/>
-                <w:sz w:val="18"/>
+                <w:rFonts w:ascii="Arial" w:hAnsi="Arial" w:eastAsia="Arial"/>
+                <w:b/>
+                <w:i w:val="0"/>
+                <w:color w:val="FFFFFF"/>
+                <w:sz w:val="17"/>
               </w:rPr>
-            </w:r>
-            <w:r>
-              <w:rPr>
-                <w:rFonts w:ascii="DejaVu Sans" w:hAnsi="DejaVu Sans" w:eastAsia="DejaVu Sans"/>
-                <w:b/>
-                <w:color w:val="FFFFFF"/>
-                <w:sz w:val="18"/>
-              </w:rPr>
-              <w:t>Короткое объяснение</w:t>
-            </w:r>
-          </w:p>
-        </w:tc>
-        <w:tc>
-          <w:tcPr>
-            <w:tcW w:type="dxa" w:w="3408"/>
-            <w:shd w:fill="006B4A"/>
-          </w:tcPr>
-          <w:p>
-            <w:r>
-              <w:rPr>
-                <w:rFonts w:ascii="DejaVu Sans" w:hAnsi="DejaVu Sans" w:eastAsia="DejaVu Sans"/>
-                <w:sz w:val="18"/>
-              </w:rPr>
-            </w:r>
-            <w:r>
-              <w:rPr>
-                <w:rFonts w:ascii="DejaVu Sans" w:hAnsi="DejaVu Sans" w:eastAsia="DejaVu Sans"/>
-                <w:b/>
-                <w:color w:val="FFFFFF"/>
-                <w:sz w:val="18"/>
-              </w:rPr>
-              <w:t>Главный акцент</w:t>
+              <w:t>Ценность и ответственность</w:t>
             </w:r>
           </w:p>
         </w:tc>
@@ -1953,64 +1262,43 @@
       <w:tr>
         <w:tc>
           <w:tcPr>
-            <w:tcW w:type="dxa" w:w="3408"/>
+            <w:tcW w:type="dxa" w:w="2500"/>
           </w:tcPr>
           <w:p>
+            <w:pPr>
+              <w:spacing w:after="0"/>
+              <w:jc w:val="left"/>
+            </w:pPr>
             <w:r>
               <w:rPr>
-                <w:rFonts w:ascii="DejaVu Sans" w:hAnsi="DejaVu Sans" w:eastAsia="DejaVu Sans"/>
-                <w:sz w:val="18"/>
+                <w:rFonts w:ascii="Arial" w:hAnsi="Arial" w:eastAsia="Arial"/>
+                <w:b w:val="0"/>
+                <w:i w:val="0"/>
+                <w:color w:val="17212B"/>
+                <w:sz w:val="17"/>
               </w:rPr>
-            </w:r>
-            <w:r>
-              <w:rPr>
-                <w:rFonts w:ascii="DejaVu Sans" w:hAnsi="DejaVu Sans" w:eastAsia="DejaVu Sans"/>
-                <w:b w:val="0"/>
-                <w:sz w:val="18"/>
-              </w:rPr>
-              <w:t>Инвестору</w:t>
+              <w:t>Внешний инвестор</w:t>
             </w:r>
           </w:p>
         </w:tc>
         <w:tc>
           <w:tcPr>
-            <w:tcW w:type="dxa" w:w="3408"/>
+            <w:tcW w:type="dxa" w:w="6860"/>
           </w:tcPr>
           <w:p>
+            <w:pPr>
+              <w:spacing w:after="0"/>
+              <w:jc w:val="center"/>
+            </w:pPr>
             <w:r>
               <w:rPr>
-                <w:rFonts w:ascii="DejaVu Sans" w:hAnsi="DejaVu Sans" w:eastAsia="DejaVu Sans"/>
-                <w:sz w:val="18"/>
+                <w:rFonts w:ascii="Arial" w:hAnsi="Arial" w:eastAsia="Arial"/>
+                <w:b w:val="0"/>
+                <w:i w:val="0"/>
+                <w:color w:val="17212B"/>
+                <w:sz w:val="17"/>
               </w:rPr>
-            </w:r>
-            <w:r>
-              <w:rPr>
-                <w:rFonts w:ascii="DejaVu Sans" w:hAnsi="DejaVu Sans" w:eastAsia="DejaVu Sans"/>
-                <w:b w:val="0"/>
-                <w:sz w:val="18"/>
-              </w:rPr>
-              <w:t>Платформа помогает видеть сельхозпроект, статус, отчеты и результат.</w:t>
-            </w:r>
-          </w:p>
-        </w:tc>
-        <w:tc>
-          <w:tcPr>
-            <w:tcW w:type="dxa" w:w="3408"/>
-          </w:tcPr>
-          <w:p>
-            <w:r>
-              <w:rPr>
-                <w:rFonts w:ascii="DejaVu Sans" w:hAnsi="DejaVu Sans" w:eastAsia="DejaVu Sans"/>
-                <w:sz w:val="18"/>
-              </w:rPr>
-            </w:r>
-            <w:r>
-              <w:rPr>
-                <w:rFonts w:ascii="DejaVu Sans" w:hAnsi="DejaVu Sans" w:eastAsia="DejaVu Sans"/>
-                <w:b w:val="0"/>
-                <w:sz w:val="18"/>
-              </w:rPr>
-              <w:t>Прозрачность и контроль.</w:t>
+              <w:t>Договор только с AgriPartners OÜ; структурированная прозрачность и отчётность.</w:t>
             </w:r>
           </w:p>
         </w:tc>
@@ -2018,64 +1306,45 @@
       <w:tr>
         <w:tc>
           <w:tcPr>
-            <w:tcW w:type="dxa" w:w="3408"/>
+            <w:tcW w:type="dxa" w:w="2500"/>
+            <w:shd w:fill="F2F4F7"/>
           </w:tcPr>
           <w:p>
+            <w:pPr>
+              <w:spacing w:after="0"/>
+              <w:jc w:val="left"/>
+            </w:pPr>
             <w:r>
               <w:rPr>
-                <w:rFonts w:ascii="DejaVu Sans" w:hAnsi="DejaVu Sans" w:eastAsia="DejaVu Sans"/>
-                <w:sz w:val="18"/>
+                <w:rFonts w:ascii="Arial" w:hAnsi="Arial" w:eastAsia="Arial"/>
+                <w:b w:val="0"/>
+                <w:i w:val="0"/>
+                <w:color w:val="17212B"/>
+                <w:sz w:val="17"/>
               </w:rPr>
-            </w:r>
-            <w:r>
-              <w:rPr>
-                <w:rFonts w:ascii="DejaVu Sans" w:hAnsi="DejaVu Sans" w:eastAsia="DejaVu Sans"/>
-                <w:b w:val="0"/>
-                <w:sz w:val="18"/>
-              </w:rPr>
-              <w:t>Фермеру</w:t>
+              <w:t>AgriPartners OÜ</w:t>
             </w:r>
           </w:p>
         </w:tc>
         <w:tc>
           <w:tcPr>
-            <w:tcW w:type="dxa" w:w="3408"/>
+            <w:tcW w:type="dxa" w:w="6860"/>
+            <w:shd w:fill="F2F4F7"/>
           </w:tcPr>
           <w:p>
+            <w:pPr>
+              <w:spacing w:after="0"/>
+              <w:jc w:val="center"/>
+            </w:pPr>
             <w:r>
               <w:rPr>
-                <w:rFonts w:ascii="DejaVu Sans" w:hAnsi="DejaVu Sans" w:eastAsia="DejaVu Sans"/>
-                <w:sz w:val="18"/>
+                <w:rFonts w:ascii="Arial" w:hAnsi="Arial" w:eastAsia="Arial"/>
+                <w:b w:val="0"/>
+                <w:i w:val="0"/>
+                <w:color w:val="17212B"/>
+                <w:sz w:val="17"/>
               </w:rPr>
-            </w:r>
-            <w:r>
-              <w:rPr>
-                <w:rFonts w:ascii="DejaVu Sans" w:hAnsi="DejaVu Sans" w:eastAsia="DejaVu Sans"/>
-                <w:b w:val="0"/>
-                <w:sz w:val="18"/>
-              </w:rPr>
-              <w:t>Платформа помогает показать проект, получить доверие и вести отчетность.</w:t>
-            </w:r>
-          </w:p>
-        </w:tc>
-        <w:tc>
-          <w:tcPr>
-            <w:tcW w:type="dxa" w:w="3408"/>
-          </w:tcPr>
-          <w:p>
-            <w:r>
-              <w:rPr>
-                <w:rFonts w:ascii="DejaVu Sans" w:hAnsi="DejaVu Sans" w:eastAsia="DejaVu Sans"/>
-                <w:sz w:val="18"/>
-              </w:rPr>
-            </w:r>
-            <w:r>
-              <w:rPr>
-                <w:rFonts w:ascii="DejaVu Sans" w:hAnsi="DejaVu Sans" w:eastAsia="DejaVu Sans"/>
-                <w:b w:val="0"/>
-                <w:sz w:val="18"/>
-              </w:rPr>
-              <w:t>Репутация и доступ к финансированию.</w:t>
+              <w:t>Центральный юридический контрагент; управление, конвертация, банк, учёт и сверка.</w:t>
             </w:r>
           </w:p>
         </w:tc>
@@ -2083,64 +1352,43 @@
       <w:tr>
         <w:tc>
           <w:tcPr>
-            <w:tcW w:type="dxa" w:w="3408"/>
+            <w:tcW w:type="dxa" w:w="2500"/>
           </w:tcPr>
           <w:p>
+            <w:pPr>
+              <w:spacing w:after="0"/>
+              <w:jc w:val="left"/>
+            </w:pPr>
             <w:r>
               <w:rPr>
-                <w:rFonts w:ascii="DejaVu Sans" w:hAnsi="DejaVu Sans" w:eastAsia="DejaVu Sans"/>
-                <w:sz w:val="18"/>
+                <w:rFonts w:ascii="Arial" w:hAnsi="Arial" w:eastAsia="Arial"/>
+                <w:b w:val="0"/>
+                <w:i w:val="0"/>
+                <w:color w:val="17212B"/>
+                <w:sz w:val="17"/>
               </w:rPr>
-            </w:r>
-            <w:r>
-              <w:rPr>
-                <w:rFonts w:ascii="DejaVu Sans" w:hAnsi="DejaVu Sans" w:eastAsia="DejaVu Sans"/>
-                <w:b w:val="0"/>
-                <w:sz w:val="18"/>
-              </w:rPr>
-              <w:t>NEAR экосистеме</w:t>
+              <w:t>Оператор в Узбекистане</w:t>
             </w:r>
           </w:p>
         </w:tc>
         <w:tc>
           <w:tcPr>
-            <w:tcW w:type="dxa" w:w="3408"/>
+            <w:tcW w:type="dxa" w:w="6860"/>
           </w:tcPr>
           <w:p>
+            <w:pPr>
+              <w:spacing w:after="0"/>
+              <w:jc w:val="center"/>
+            </w:pPr>
             <w:r>
               <w:rPr>
-                <w:rFonts w:ascii="DejaVu Sans" w:hAnsi="DejaVu Sans" w:eastAsia="DejaVu Sans"/>
-                <w:sz w:val="18"/>
+                <w:rFonts w:ascii="Arial" w:hAnsi="Arial" w:eastAsia="Arial"/>
+                <w:b w:val="0"/>
+                <w:i w:val="0"/>
+                <w:color w:val="17212B"/>
+                <w:sz w:val="17"/>
               </w:rPr>
-            </w:r>
-            <w:r>
-              <w:rPr>
-                <w:rFonts w:ascii="DejaVu Sans" w:hAnsi="DejaVu Sans" w:eastAsia="DejaVu Sans"/>
-                <w:b w:val="0"/>
-                <w:sz w:val="18"/>
-              </w:rPr>
-              <w:t>AgriPartners показывает реальный RWA/use case для сельского хозяйства.</w:t>
-            </w:r>
-          </w:p>
-        </w:tc>
-        <w:tc>
-          <w:tcPr>
-            <w:tcW w:type="dxa" w:w="3408"/>
-          </w:tcPr>
-          <w:p>
-            <w:r>
-              <w:rPr>
-                <w:rFonts w:ascii="DejaVu Sans" w:hAnsi="DejaVu Sans" w:eastAsia="DejaVu Sans"/>
-                <w:sz w:val="18"/>
-              </w:rPr>
-            </w:r>
-            <w:r>
-              <w:rPr>
-                <w:rFonts w:ascii="DejaVu Sans" w:hAnsi="DejaVu Sans" w:eastAsia="DejaVu Sans"/>
-                <w:b w:val="0"/>
-                <w:sz w:val="18"/>
-              </w:rPr>
-              <w:t>Практическое применение блокчейна.</w:t>
+              <w:t>Отдельный договор; фиатная операционная организация, ответственная за результат и документы.</w:t>
             </w:r>
           </w:p>
         </w:tc>
@@ -2148,64 +1396,45 @@
       <w:tr>
         <w:tc>
           <w:tcPr>
-            <w:tcW w:type="dxa" w:w="3408"/>
+            <w:tcW w:type="dxa" w:w="2500"/>
+            <w:shd w:fill="F2F4F7"/>
           </w:tcPr>
           <w:p>
+            <w:pPr>
+              <w:spacing w:after="0"/>
+              <w:jc w:val="left"/>
+            </w:pPr>
             <w:r>
               <w:rPr>
-                <w:rFonts w:ascii="DejaVu Sans" w:hAnsi="DejaVu Sans" w:eastAsia="DejaVu Sans"/>
-                <w:sz w:val="18"/>
+                <w:rFonts w:ascii="Arial" w:hAnsi="Arial" w:eastAsia="Arial"/>
+                <w:b w:val="0"/>
+                <w:i w:val="0"/>
+                <w:color w:val="17212B"/>
+                <w:sz w:val="17"/>
               </w:rPr>
-            </w:r>
-            <w:r>
-              <w:rPr>
-                <w:rFonts w:ascii="DejaVu Sans" w:hAnsi="DejaVu Sans" w:eastAsia="DejaVu Sans"/>
-                <w:b w:val="0"/>
-                <w:sz w:val="18"/>
-              </w:rPr>
-              <w:t>Банку</w:t>
+              <w:t>Роль Farmer</w:t>
             </w:r>
           </w:p>
         </w:tc>
         <w:tc>
           <w:tcPr>
-            <w:tcW w:type="dxa" w:w="3408"/>
+            <w:tcW w:type="dxa" w:w="6860"/>
+            <w:shd w:fill="F2F4F7"/>
           </w:tcPr>
           <w:p>
+            <w:pPr>
+              <w:spacing w:after="0"/>
+              <w:jc w:val="center"/>
+            </w:pPr>
             <w:r>
               <w:rPr>
-                <w:rFonts w:ascii="DejaVu Sans" w:hAnsi="DejaVu Sans" w:eastAsia="DejaVu Sans"/>
-                <w:sz w:val="18"/>
+                <w:rFonts w:ascii="Arial" w:hAnsi="Arial" w:eastAsia="Arial"/>
+                <w:b w:val="0"/>
+                <w:i w:val="0"/>
+                <w:color w:val="17212B"/>
+                <w:sz w:val="17"/>
               </w:rPr>
-            </w:r>
-            <w:r>
-              <w:rPr>
-                <w:rFonts w:ascii="DejaVu Sans" w:hAnsi="DejaVu Sans" w:eastAsia="DejaVu Sans"/>
-                <w:b w:val="0"/>
-                <w:sz w:val="18"/>
-              </w:rPr>
-              <w:t>Платформа может быть цифровым слоем отчетности, а банк - платежным партнером.</w:t>
-            </w:r>
-          </w:p>
-        </w:tc>
-        <w:tc>
-          <w:tcPr>
-            <w:tcW w:type="dxa" w:w="3408"/>
-          </w:tcPr>
-          <w:p>
-            <w:r>
-              <w:rPr>
-                <w:rFonts w:ascii="DejaVu Sans" w:hAnsi="DejaVu Sans" w:eastAsia="DejaVu Sans"/>
-                <w:sz w:val="18"/>
-              </w:rPr>
-            </w:r>
-            <w:r>
-              <w:rPr>
-                <w:rFonts w:ascii="DejaVu Sans" w:hAnsi="DejaVu Sans" w:eastAsia="DejaVu Sans"/>
-                <w:b w:val="0"/>
-                <w:sz w:val="18"/>
-              </w:rPr>
-              <w:t>Контроль и соответствие правилам.</w:t>
+              <w:t>Операционная работа, отчёты и подтверждения; без кошелька и криптотранзакций.</w:t>
             </w:r>
           </w:p>
         </w:tc>
@@ -2213,749 +1442,699 @@
       <w:tr>
         <w:tc>
           <w:tcPr>
-            <w:tcW w:type="dxa" w:w="3408"/>
+            <w:tcW w:type="dxa" w:w="2500"/>
           </w:tcPr>
           <w:p>
+            <w:pPr>
+              <w:spacing w:after="0"/>
+              <w:jc w:val="left"/>
+            </w:pPr>
             <w:r>
               <w:rPr>
-                <w:rFonts w:ascii="DejaVu Sans" w:hAnsi="DejaVu Sans" w:eastAsia="DejaVu Sans"/>
-                <w:sz w:val="18"/>
+                <w:rFonts w:ascii="Arial" w:hAnsi="Arial" w:eastAsia="Arial"/>
+                <w:b w:val="0"/>
+                <w:i w:val="0"/>
+                <w:color w:val="17212B"/>
+                <w:sz w:val="17"/>
               </w:rPr>
-            </w:r>
-            <w:r>
-              <w:rPr>
-                <w:rFonts w:ascii="DejaVu Sans" w:hAnsi="DejaVu Sans" w:eastAsia="DejaVu Sans"/>
-                <w:b w:val="0"/>
-                <w:sz w:val="18"/>
-              </w:rPr>
-              <w:t>Юристу</w:t>
+              <w:t>Партнёры</w:t>
             </w:r>
           </w:p>
         </w:tc>
         <w:tc>
           <w:tcPr>
-            <w:tcW w:type="dxa" w:w="3408"/>
+            <w:tcW w:type="dxa" w:w="6860"/>
           </w:tcPr>
           <w:p>
+            <w:pPr>
+              <w:spacing w:after="0"/>
+              <w:jc w:val="center"/>
+            </w:pPr>
             <w:r>
               <w:rPr>
-                <w:rFonts w:ascii="DejaVu Sans" w:hAnsi="DejaVu Sans" w:eastAsia="DejaVu Sans"/>
-                <w:sz w:val="18"/>
+                <w:rFonts w:ascii="Arial" w:hAnsi="Arial" w:eastAsia="Arial"/>
+                <w:b w:val="0"/>
+                <w:i w:val="0"/>
+                <w:color w:val="17212B"/>
+                <w:sz w:val="17"/>
               </w:rPr>
+              <w:t>Юридические, банковские, платёжные, бухгалтерские, ветеринарные и операционные услуги после утверждения.</w:t>
             </w:r>
+          </w:p>
+        </w:tc>
+      </w:tr>
+      <w:tr>
+        <w:tc>
+          <w:tcPr>
+            <w:tcW w:type="dxa" w:w="2500"/>
+            <w:shd w:fill="F2F4F7"/>
+          </w:tcPr>
+          <w:p>
+            <w:pPr>
+              <w:spacing w:after="0"/>
+              <w:jc w:val="left"/>
+            </w:pPr>
             <w:r>
               <w:rPr>
-                <w:rFonts w:ascii="DejaVu Sans" w:hAnsi="DejaVu Sans" w:eastAsia="DejaVu Sans"/>
+                <w:rFonts w:ascii="Arial" w:hAnsi="Arial" w:eastAsia="Arial"/>
                 <w:b w:val="0"/>
-                <w:sz w:val="18"/>
+                <w:i w:val="0"/>
+                <w:color w:val="17212B"/>
+                <w:sz w:val="17"/>
               </w:rPr>
-              <w:t>Нужно определить допустимую модель работы с инвестициями и цифровыми активами.</w:t>
+              <w:t>NEAR</w:t>
             </w:r>
           </w:p>
         </w:tc>
         <w:tc>
           <w:tcPr>
-            <w:tcW w:type="dxa" w:w="3408"/>
+            <w:tcW w:type="dxa" w:w="6860"/>
+            <w:shd w:fill="F2F4F7"/>
           </w:tcPr>
           <w:p>
+            <w:pPr>
+              <w:spacing w:after="0"/>
+              <w:jc w:val="center"/>
+            </w:pPr>
             <w:r>
               <w:rPr>
-                <w:rFonts w:ascii="DejaVu Sans" w:hAnsi="DejaVu Sans" w:eastAsia="DejaVu Sans"/>
-                <w:sz w:val="18"/>
+                <w:rFonts w:ascii="Arial" w:hAnsi="Arial" w:eastAsia="Arial"/>
+                <w:b w:val="0"/>
+                <w:i w:val="0"/>
+                <w:color w:val="17212B"/>
+                <w:sz w:val="17"/>
               </w:rPr>
-            </w:r>
-            <w:r>
-              <w:rPr>
-                <w:rFonts w:ascii="DejaVu Sans" w:hAnsi="DejaVu Sans" w:eastAsia="DejaVu Sans"/>
-                <w:b w:val="0"/>
-                <w:sz w:val="18"/>
-              </w:rPr>
-              <w:t>KYC, AML, договоры и юрисдикция.</w:t>
+              <w:t>Testnet-аудит и автоматизация на стороне Эстонии/инвестора.</w:t>
             </w:r>
           </w:p>
         </w:tc>
       </w:tr>
     </w:tbl>
-    <w:p/>
     <w:p>
       <w:pPr>
-        <w:pStyle w:val="Heading1"/>
+        <w:pStyle w:val="Heading2"/>
       </w:pPr>
       <w:r>
         <w:rPr>
-          <w:rFonts w:ascii="DejaVu Sans" w:hAnsi="DejaVu Sans" w:eastAsia="DejaVu Sans"/>
-          <w:color w:val="005F41"/>
+          <w:rFonts w:ascii="Arial" w:hAnsi="Arial" w:eastAsia="Arial"/>
+          <w:b/>
+          <w:i w:val="0"/>
+          <w:color w:val="056246"/>
+          <w:sz w:val="26"/>
         </w:rPr>
-        <w:t>19. Приложение A. Словарь терминов</w:t>
+        <w:t>Зачем NEAR — и где предел</w:t>
       </w:r>
     </w:p>
     <w:p>
+      <w:pPr>
+        <w:pStyle w:val="ListBullet"/>
+        <w:spacing w:after="80"/>
+        <w:ind w:left="540" w:hanging="271"/>
+      </w:pPr>
       <w:r>
         <w:rPr>
-          <w:rFonts w:ascii="DejaVu Sans" w:hAnsi="DejaVu Sans" w:eastAsia="DejaVu Sans"/>
-          <w:b/>
-          <w:color w:val="005037"/>
-          <w:sz w:val="18"/>
+          <w:rFonts w:ascii="Arial" w:hAnsi="Arial" w:eastAsia="Arial"/>
+          <w:b w:val="0"/>
+          <w:i w:val="0"/>
+          <w:color w:val="17212B"/>
+          <w:sz w:val="20"/>
         </w:rPr>
-        <w:t>Alpha (альфа-версия)</w:t>
-      </w:r>
-      <w:r>
-        <w:rPr>
-          <w:rFonts w:ascii="DejaVu Sans" w:hAnsi="DejaVu Sans" w:eastAsia="DejaVu Sans"/>
-          <w:sz w:val="18"/>
-        </w:rPr>
-        <w:t xml:space="preserve"> - ранняя рабочая версия продукта для тестирования и обратной связи.</w:t>
+        <w:t>Демонстрация состояний процесса и событий со временем.</w:t>
       </w:r>
     </w:p>
     <w:p>
+      <w:pPr>
+        <w:pStyle w:val="ListBullet"/>
+        <w:spacing w:after="80"/>
+        <w:ind w:left="540" w:hanging="271"/>
+      </w:pPr>
       <w:r>
         <w:rPr>
-          <w:rFonts w:ascii="DejaVu Sans" w:hAnsi="DejaVu Sans" w:eastAsia="DejaVu Sans"/>
-          <w:b/>
-          <w:color w:val="005037"/>
-          <w:sz w:val="18"/>
+          <w:rFonts w:ascii="Arial" w:hAnsi="Arial" w:eastAsia="Arial"/>
+          <w:b w:val="0"/>
+          <w:i w:val="0"/>
+          <w:color w:val="17212B"/>
+          <w:sz w:val="20"/>
         </w:rPr>
-        <w:t>API (программный интерфейс)</w:t>
-      </w:r>
-      <w:r>
-        <w:rPr>
-          <w:rFonts w:ascii="DejaVu Sans" w:hAnsi="DejaVu Sans" w:eastAsia="DejaVu Sans"/>
-          <w:sz w:val="18"/>
-        </w:rPr>
-        <w:t xml:space="preserve"> - способ, с помощью которого разные системы могут обмениваться данными.</w:t>
+        <w:t>Эксперименты с автоматизацией и проверяемыми хешами утверждённых подтверждений.</w:t>
       </w:r>
     </w:p>
     <w:p>
+      <w:pPr>
+        <w:pStyle w:val="ListBullet"/>
+        <w:spacing w:after="80"/>
+        <w:ind w:left="540" w:hanging="271"/>
+      </w:pPr>
       <w:r>
         <w:rPr>
-          <w:rFonts w:ascii="DejaVu Sans" w:hAnsi="DejaVu Sans" w:eastAsia="DejaVu Sans"/>
-          <w:b/>
-          <w:color w:val="005037"/>
-          <w:sz w:val="18"/>
+          <w:rFonts w:ascii="Arial" w:hAnsi="Arial" w:eastAsia="Arial"/>
+          <w:b w:val="0"/>
+          <w:i w:val="0"/>
+          <w:color w:val="17212B"/>
+          <w:sz w:val="20"/>
         </w:rPr>
-        <w:t>APR (годовая процентная доходность)</w:t>
-      </w:r>
-      <w:r>
-        <w:rPr>
-          <w:rFonts w:ascii="DejaVu Sans" w:hAnsi="DejaVu Sans" w:eastAsia="DejaVu Sans"/>
-          <w:sz w:val="18"/>
-        </w:rPr>
-        <w:t xml:space="preserve"> - показатель доходности в пересчете на год.</w:t>
+        <w:t>Обратная связь экосистемы и техническая проверка Alpha.</w:t>
       </w:r>
     </w:p>
     <w:p>
-      <w:r>
-        <w:rPr>
-          <w:rFonts w:ascii="DejaVu Sans" w:hAnsi="DejaVu Sans" w:eastAsia="DejaVu Sans"/>
-          <w:b/>
-          <w:color w:val="005037"/>
-          <w:sz w:val="18"/>
-        </w:rPr>
-        <w:t>Audit Trail (аудиторский след)</w:t>
-      </w:r>
-      <w:r>
-        <w:rPr>
-          <w:rFonts w:ascii="DejaVu Sans" w:hAnsi="DejaVu Sans" w:eastAsia="DejaVu Sans"/>
-          <w:sz w:val="18"/>
-        </w:rPr>
-        <w:t xml:space="preserve"> - история действий, по которой можно проверить, кто и когда что сделал.</w:t>
-      </w:r>
-    </w:p>
-    <w:p>
-      <w:r>
-        <w:rPr>
-          <w:rFonts w:ascii="DejaVu Sans" w:hAnsi="DejaVu Sans" w:eastAsia="DejaVu Sans"/>
-          <w:b/>
-          <w:color w:val="005037"/>
-          <w:sz w:val="18"/>
-        </w:rPr>
-        <w:t>Blockchain (блокчейн)</w:t>
-      </w:r>
-      <w:r>
-        <w:rPr>
-          <w:rFonts w:ascii="DejaVu Sans" w:hAnsi="DejaVu Sans" w:eastAsia="DejaVu Sans"/>
-          <w:sz w:val="18"/>
-        </w:rPr>
-        <w:t xml:space="preserve"> - цифровой журнал записей, который сложно изменить задним числом.</w:t>
-      </w:r>
-    </w:p>
-    <w:p>
-      <w:r>
-        <w:rPr>
-          <w:rFonts w:ascii="DejaVu Sans" w:hAnsi="DejaVu Sans" w:eastAsia="DejaVu Sans"/>
-          <w:b/>
-          <w:color w:val="005037"/>
-          <w:sz w:val="18"/>
-        </w:rPr>
-        <w:t>Compliance (соблюдение правил)</w:t>
-      </w:r>
-      <w:r>
-        <w:rPr>
-          <w:rFonts w:ascii="DejaVu Sans" w:hAnsi="DejaVu Sans" w:eastAsia="DejaVu Sans"/>
-          <w:sz w:val="18"/>
-        </w:rPr>
-        <w:t xml:space="preserve"> - выполнение законов, банковских требований и внутренних процедур.</w:t>
-      </w:r>
-    </w:p>
-    <w:p>
-      <w:r>
-        <w:rPr>
-          <w:rFonts w:ascii="DejaVu Sans" w:hAnsi="DejaVu Sans" w:eastAsia="DejaVu Sans"/>
-          <w:b/>
-          <w:color w:val="005037"/>
-          <w:sz w:val="18"/>
-        </w:rPr>
-        <w:t>DeFi (децентрализованные финансы)</w:t>
-      </w:r>
-      <w:r>
-        <w:rPr>
-          <w:rFonts w:ascii="DejaVu Sans" w:hAnsi="DejaVu Sans" w:eastAsia="DejaVu Sans"/>
-          <w:sz w:val="18"/>
-        </w:rPr>
-        <w:t xml:space="preserve"> - финансовые сервисы на блокчейне без традиционного банка как центрального посредника.</w:t>
-      </w:r>
-    </w:p>
-    <w:p>
-      <w:r>
-        <w:rPr>
-          <w:rFonts w:ascii="DejaVu Sans" w:hAnsi="DejaVu Sans" w:eastAsia="DejaVu Sans"/>
-          <w:b/>
-          <w:color w:val="005037"/>
-          <w:sz w:val="18"/>
-        </w:rPr>
-        <w:t>Farmer Portal (кабинет фермера)</w:t>
-      </w:r>
-      <w:r>
-        <w:rPr>
-          <w:rFonts w:ascii="DejaVu Sans" w:hAnsi="DejaVu Sans" w:eastAsia="DejaVu Sans"/>
-          <w:sz w:val="18"/>
-        </w:rPr>
-        <w:t xml:space="preserve"> - раздел платформы, где фермер видит сделки и отправляет отчеты.</w:t>
-      </w:r>
-    </w:p>
-    <w:p>
-      <w:r>
-        <w:rPr>
-          <w:rFonts w:ascii="DejaVu Sans" w:hAnsi="DejaVu Sans" w:eastAsia="DejaVu Sans"/>
-          <w:b/>
-          <w:color w:val="005037"/>
-          <w:sz w:val="18"/>
-        </w:rPr>
-        <w:t>Founder Success (поддержка основателей)</w:t>
-      </w:r>
-      <w:r>
-        <w:rPr>
-          <w:rFonts w:ascii="DejaVu Sans" w:hAnsi="DejaVu Sans" w:eastAsia="DejaVu Sans"/>
-          <w:sz w:val="18"/>
-        </w:rPr>
-        <w:t xml:space="preserve"> - направление в экосистеме, которое помогает стартапам развиваться.</w:t>
-      </w:r>
-    </w:p>
-    <w:p>
-      <w:r>
-        <w:rPr>
-          <w:rFonts w:ascii="DejaVu Sans" w:hAnsi="DejaVu Sans" w:eastAsia="DejaVu Sans"/>
-          <w:b/>
-          <w:color w:val="005037"/>
-          <w:sz w:val="18"/>
-        </w:rPr>
-        <w:t>Investor Portal (кабинет инвестора)</w:t>
-      </w:r>
-      <w:r>
-        <w:rPr>
-          <w:rFonts w:ascii="DejaVu Sans" w:hAnsi="DejaVu Sans" w:eastAsia="DejaVu Sans"/>
-          <w:sz w:val="18"/>
-        </w:rPr>
-        <w:t xml:space="preserve"> - раздел платформы, где инвестор видит проекты, статусы и отчеты.</w:t>
-      </w:r>
-    </w:p>
-    <w:p>
-      <w:r>
-        <w:rPr>
-          <w:rFonts w:ascii="DejaVu Sans" w:hAnsi="DejaVu Sans" w:eastAsia="DejaVu Sans"/>
-          <w:b/>
-          <w:color w:val="005037"/>
-          <w:sz w:val="18"/>
-        </w:rPr>
-        <w:t>KYC (проверка клиента)</w:t>
-      </w:r>
-      <w:r>
-        <w:rPr>
-          <w:rFonts w:ascii="DejaVu Sans" w:hAnsi="DejaVu Sans" w:eastAsia="DejaVu Sans"/>
-          <w:sz w:val="18"/>
-        </w:rPr>
-        <w:t xml:space="preserve"> - процесс подтверждения личности участника.</w:t>
-      </w:r>
-    </w:p>
-    <w:p>
-      <w:r>
-        <w:rPr>
-          <w:rFonts w:ascii="DejaVu Sans" w:hAnsi="DejaVu Sans" w:eastAsia="DejaVu Sans"/>
-          <w:b/>
-          <w:color w:val="005037"/>
-          <w:sz w:val="18"/>
-        </w:rPr>
-        <w:t>AML (борьба с отмыванием денег)</w:t>
-      </w:r>
-      <w:r>
-        <w:rPr>
-          <w:rFonts w:ascii="DejaVu Sans" w:hAnsi="DejaVu Sans" w:eastAsia="DejaVu Sans"/>
-          <w:sz w:val="18"/>
-        </w:rPr>
-        <w:t xml:space="preserve"> - правила против незаконного происхождения средств.</w:t>
-      </w:r>
-    </w:p>
-    <w:p>
-      <w:r>
-        <w:rPr>
-          <w:rFonts w:ascii="DejaVu Sans" w:hAnsi="DejaVu Sans" w:eastAsia="DejaVu Sans"/>
-          <w:b/>
-          <w:color w:val="005037"/>
-          <w:sz w:val="18"/>
-        </w:rPr>
-        <w:t>Mainnet (основная сеть)</w:t>
-      </w:r>
-      <w:r>
-        <w:rPr>
-          <w:rFonts w:ascii="DejaVu Sans" w:hAnsi="DejaVu Sans" w:eastAsia="DejaVu Sans"/>
-          <w:sz w:val="18"/>
-        </w:rPr>
-        <w:t xml:space="preserve"> - реальная блокчейн-сеть, где операции имеют настоящую ценность.</w:t>
-      </w:r>
-    </w:p>
-    <w:p>
-      <w:r>
-        <w:rPr>
-          <w:rFonts w:ascii="DejaVu Sans" w:hAnsi="DejaVu Sans" w:eastAsia="DejaVu Sans"/>
-          <w:b/>
-          <w:color w:val="005037"/>
-          <w:sz w:val="18"/>
-        </w:rPr>
-        <w:t>Marketplace (маркетплейс)</w:t>
-      </w:r>
-      <w:r>
-        <w:rPr>
-          <w:rFonts w:ascii="DejaVu Sans" w:hAnsi="DejaVu Sans" w:eastAsia="DejaVu Sans"/>
-          <w:sz w:val="18"/>
-        </w:rPr>
-        <w:t xml:space="preserve"> - витрина проектов, где инвестор может выбирать возможности.</w:t>
-      </w:r>
-    </w:p>
-    <w:p>
-      <w:r>
-        <w:rPr>
-          <w:rFonts w:ascii="DejaVu Sans" w:hAnsi="DejaVu Sans" w:eastAsia="DejaVu Sans"/>
-          <w:b/>
-          <w:color w:val="005037"/>
-          <w:sz w:val="18"/>
-        </w:rPr>
-        <w:t>MVP (минимально жизнеспособный продукт)</w:t>
-      </w:r>
-      <w:r>
-        <w:rPr>
-          <w:rFonts w:ascii="DejaVu Sans" w:hAnsi="DejaVu Sans" w:eastAsia="DejaVu Sans"/>
-          <w:sz w:val="18"/>
-        </w:rPr>
-        <w:t xml:space="preserve"> - первая версия, которая уже показывает основную ценность.</w:t>
-      </w:r>
-    </w:p>
-    <w:p>
-      <w:r>
-        <w:rPr>
-          <w:rFonts w:ascii="DejaVu Sans" w:hAnsi="DejaVu Sans" w:eastAsia="DejaVu Sans"/>
-          <w:b/>
-          <w:color w:val="005037"/>
-          <w:sz w:val="18"/>
-        </w:rPr>
-        <w:t>NEAR (блокчейн-экосистема NEAR)</w:t>
-      </w:r>
-      <w:r>
-        <w:rPr>
-          <w:rFonts w:ascii="DejaVu Sans" w:hAnsi="DejaVu Sans" w:eastAsia="DejaVu Sans"/>
-          <w:sz w:val="18"/>
-        </w:rPr>
-        <w:t xml:space="preserve"> - технологическая среда для Web3-приложений.</w:t>
-      </w:r>
-    </w:p>
-    <w:p>
-      <w:r>
-        <w:rPr>
-          <w:rFonts w:ascii="DejaVu Sans" w:hAnsi="DejaVu Sans" w:eastAsia="DejaVu Sans"/>
-          <w:b/>
-          <w:color w:val="005037"/>
-          <w:sz w:val="18"/>
-        </w:rPr>
-        <w:t>Pilot (пилотный запуск)</w:t>
-      </w:r>
-      <w:r>
-        <w:rPr>
-          <w:rFonts w:ascii="DejaVu Sans" w:hAnsi="DejaVu Sans" w:eastAsia="DejaVu Sans"/>
-          <w:sz w:val="18"/>
-        </w:rPr>
-        <w:t xml:space="preserve"> - ограниченная проверка продукта на реальных или близких к реальным условиях.</w:t>
-      </w:r>
-    </w:p>
-    <w:p>
-      <w:r>
-        <w:rPr>
-          <w:rFonts w:ascii="DejaVu Sans" w:hAnsi="DejaVu Sans" w:eastAsia="DejaVu Sans"/>
-          <w:b/>
-          <w:color w:val="005037"/>
-          <w:sz w:val="18"/>
-        </w:rPr>
-        <w:t>Platform (платформа)</w:t>
-      </w:r>
-      <w:r>
-        <w:rPr>
-          <w:rFonts w:ascii="DejaVu Sans" w:hAnsi="DejaVu Sans" w:eastAsia="DejaVu Sans"/>
-          <w:sz w:val="18"/>
-        </w:rPr>
-        <w:t xml:space="preserve"> - единая интернет-система для участников процесса.</w:t>
-      </w:r>
-    </w:p>
-    <w:p>
-      <w:r>
-        <w:rPr>
-          <w:rFonts w:ascii="DejaVu Sans" w:hAnsi="DejaVu Sans" w:eastAsia="DejaVu Sans"/>
-          <w:b/>
-          <w:color w:val="005037"/>
-          <w:sz w:val="18"/>
-        </w:rPr>
-        <w:t>Reporting (отчетность)</w:t>
-      </w:r>
-      <w:r>
-        <w:rPr>
-          <w:rFonts w:ascii="DejaVu Sans" w:hAnsi="DejaVu Sans" w:eastAsia="DejaVu Sans"/>
-          <w:sz w:val="18"/>
-        </w:rPr>
-        <w:t xml:space="preserve"> - передача информации о ходе проекта и результатах.</w:t>
-      </w:r>
-    </w:p>
-    <w:p>
-      <w:r>
-        <w:rPr>
-          <w:rFonts w:ascii="DejaVu Sans" w:hAnsi="DejaVu Sans" w:eastAsia="DejaVu Sans"/>
-          <w:b/>
-          <w:color w:val="005037"/>
-          <w:sz w:val="18"/>
-        </w:rPr>
-        <w:t>ROI (доходность инвестиций)</w:t>
-      </w:r>
-      <w:r>
-        <w:rPr>
-          <w:rFonts w:ascii="DejaVu Sans" w:hAnsi="DejaVu Sans" w:eastAsia="DejaVu Sans"/>
-          <w:sz w:val="18"/>
-        </w:rPr>
-        <w:t xml:space="preserve"> - сколько прибыли получено относительно вложенной суммы.</w:t>
-      </w:r>
-    </w:p>
-    <w:p>
-      <w:r>
-        <w:rPr>
-          <w:rFonts w:ascii="DejaVu Sans" w:hAnsi="DejaVu Sans" w:eastAsia="DejaVu Sans"/>
-          <w:b/>
-          <w:color w:val="005037"/>
-          <w:sz w:val="18"/>
-        </w:rPr>
-        <w:t>RWA (реальные активы)</w:t>
-      </w:r>
-      <w:r>
-        <w:rPr>
-          <w:rFonts w:ascii="DejaVu Sans" w:hAnsi="DejaVu Sans" w:eastAsia="DejaVu Sans"/>
-          <w:sz w:val="18"/>
-        </w:rPr>
-        <w:t xml:space="preserve"> - активы из обычной экономики, например фермы, животные или теплицы.</w:t>
-      </w:r>
-    </w:p>
-    <w:p>
-      <w:r>
-        <w:rPr>
-          <w:rFonts w:ascii="DejaVu Sans" w:hAnsi="DejaVu Sans" w:eastAsia="DejaVu Sans"/>
-          <w:b/>
-          <w:color w:val="005037"/>
-          <w:sz w:val="18"/>
-        </w:rPr>
-        <w:t>SaaS (программное обеспечение как услуга)</w:t>
-      </w:r>
-      <w:r>
-        <w:rPr>
-          <w:rFonts w:ascii="DejaVu Sans" w:hAnsi="DejaVu Sans" w:eastAsia="DejaVu Sans"/>
-          <w:sz w:val="18"/>
-        </w:rPr>
-        <w:t xml:space="preserve"> - модель, где доступ к системе предоставляется как сервис.</w:t>
-      </w:r>
-    </w:p>
-    <w:p>
-      <w:r>
-        <w:rPr>
-          <w:rFonts w:ascii="DejaVu Sans" w:hAnsi="DejaVu Sans" w:eastAsia="DejaVu Sans"/>
-          <w:b/>
-          <w:color w:val="005037"/>
-          <w:sz w:val="18"/>
-        </w:rPr>
-        <w:t>Shadow Accounting (теневой учет)</w:t>
-      </w:r>
-      <w:r>
-        <w:rPr>
-          <w:rFonts w:ascii="DejaVu Sans" w:hAnsi="DejaVu Sans" w:eastAsia="DejaVu Sans"/>
-          <w:sz w:val="18"/>
-        </w:rPr>
-        <w:t xml:space="preserve"> - модельный учет, который показывает финансовую логику без заявления о реальном хранении средств.</w:t>
-      </w:r>
-    </w:p>
-    <w:p>
-      <w:r>
-        <w:rPr>
-          <w:rFonts w:ascii="DejaVu Sans" w:hAnsi="DejaVu Sans" w:eastAsia="DejaVu Sans"/>
-          <w:b/>
-          <w:color w:val="005037"/>
-          <w:sz w:val="18"/>
-        </w:rPr>
-        <w:t>Smart Contract (смарт-контракт)</w:t>
-      </w:r>
-      <w:r>
-        <w:rPr>
-          <w:rFonts w:ascii="DejaVu Sans" w:hAnsi="DejaVu Sans" w:eastAsia="DejaVu Sans"/>
-          <w:sz w:val="18"/>
-        </w:rPr>
-        <w:t xml:space="preserve"> - программа в блокчейне, которая выполняет заранее заданные правила.</w:t>
-      </w:r>
-    </w:p>
-    <w:p>
-      <w:r>
-        <w:rPr>
-          <w:rFonts w:ascii="DejaVu Sans" w:hAnsi="DejaVu Sans" w:eastAsia="DejaVu Sans"/>
-          <w:b/>
-          <w:color w:val="005037"/>
-          <w:sz w:val="18"/>
-        </w:rPr>
-        <w:t>Stablecoin (стейблкоин)</w:t>
-      </w:r>
-      <w:r>
-        <w:rPr>
-          <w:rFonts w:ascii="DejaVu Sans" w:hAnsi="DejaVu Sans" w:eastAsia="DejaVu Sans"/>
-          <w:sz w:val="18"/>
-        </w:rPr>
-        <w:t xml:space="preserve"> - криптовалюта, стоимость которой обычно привязана к обычной валюте, например доллару.</w:t>
-      </w:r>
-    </w:p>
-    <w:p>
-      <w:r>
-        <w:rPr>
-          <w:rFonts w:ascii="DejaVu Sans" w:hAnsi="DejaVu Sans" w:eastAsia="DejaVu Sans"/>
-          <w:b/>
-          <w:color w:val="005037"/>
-          <w:sz w:val="18"/>
-        </w:rPr>
-        <w:t>Stakeholder (заинтересованная сторона)</w:t>
-      </w:r>
-      <w:r>
-        <w:rPr>
-          <w:rFonts w:ascii="DejaVu Sans" w:hAnsi="DejaVu Sans" w:eastAsia="DejaVu Sans"/>
-          <w:sz w:val="18"/>
-        </w:rPr>
-        <w:t xml:space="preserve"> - участник, которому важен проект: инвестор, фермер, партнер, банк, регулятор.</w:t>
-      </w:r>
-    </w:p>
-    <w:p>
-      <w:r>
-        <w:rPr>
-          <w:rFonts w:ascii="DejaVu Sans" w:hAnsi="DejaVu Sans" w:eastAsia="DejaVu Sans"/>
-          <w:b/>
-          <w:color w:val="005037"/>
-          <w:sz w:val="18"/>
-        </w:rPr>
-        <w:t>Testnet (тестовая сеть)</w:t>
-      </w:r>
-      <w:r>
-        <w:rPr>
-          <w:rFonts w:ascii="DejaVu Sans" w:hAnsi="DejaVu Sans" w:eastAsia="DejaVu Sans"/>
-          <w:sz w:val="18"/>
-        </w:rPr>
-        <w:t xml:space="preserve"> - безопасная сеть для проверки блокчейн-логики без настоящих денег.</w:t>
-      </w:r>
-    </w:p>
-    <w:p>
-      <w:r>
-        <w:rPr>
-          <w:rFonts w:ascii="DejaVu Sans" w:hAnsi="DejaVu Sans" w:eastAsia="DejaVu Sans"/>
-          <w:b/>
-          <w:color w:val="005037"/>
-          <w:sz w:val="18"/>
-        </w:rPr>
-        <w:t>Treasury (казначейство)</w:t>
-      </w:r>
-      <w:r>
-        <w:rPr>
-          <w:rFonts w:ascii="DejaVu Sans" w:hAnsi="DejaVu Sans" w:eastAsia="DejaVu Sans"/>
-          <w:sz w:val="18"/>
-        </w:rPr>
-        <w:t xml:space="preserve"> - система учета и контроля денежных потоков.</w:t>
-      </w:r>
-    </w:p>
-    <w:p>
-      <w:r>
-        <w:rPr>
-          <w:rFonts w:ascii="DejaVu Sans" w:hAnsi="DejaVu Sans" w:eastAsia="DejaVu Sans"/>
-          <w:b/>
-          <w:color w:val="005037"/>
-          <w:sz w:val="18"/>
-        </w:rPr>
-        <w:t>USDT (Tether)</w:t>
-      </w:r>
-      <w:r>
-        <w:rPr>
-          <w:rFonts w:ascii="DejaVu Sans" w:hAnsi="DejaVu Sans" w:eastAsia="DejaVu Sans"/>
-          <w:sz w:val="18"/>
-        </w:rPr>
-        <w:t xml:space="preserve"> - стейблкоин, который обычно стремится быть равным одному доллару США.</w:t>
-      </w:r>
-    </w:p>
-    <w:p>
-      <w:r>
-        <w:rPr>
-          <w:rFonts w:ascii="DejaVu Sans" w:hAnsi="DejaVu Sans" w:eastAsia="DejaVu Sans"/>
-          <w:b/>
-          <w:color w:val="005037"/>
-          <w:sz w:val="18"/>
-        </w:rPr>
-        <w:t>Wallet (криптокошелек)</w:t>
-      </w:r>
-      <w:r>
-        <w:rPr>
-          <w:rFonts w:ascii="DejaVu Sans" w:hAnsi="DejaVu Sans" w:eastAsia="DejaVu Sans"/>
-          <w:sz w:val="18"/>
-        </w:rPr>
-        <w:t xml:space="preserve"> - цифровой кошелек для подтверждения действий и хранения цифровых активов.</w:t>
-      </w:r>
-    </w:p>
-    <w:p>
-      <w:r>
-        <w:rPr>
-          <w:rFonts w:ascii="DejaVu Sans" w:hAnsi="DejaVu Sans" w:eastAsia="DejaVu Sans"/>
-          <w:b/>
-          <w:color w:val="005037"/>
-          <w:sz w:val="18"/>
-        </w:rPr>
-        <w:t>Web3 (веб3)</w:t>
-      </w:r>
-      <w:r>
-        <w:rPr>
-          <w:rFonts w:ascii="DejaVu Sans" w:hAnsi="DejaVu Sans" w:eastAsia="DejaVu Sans"/>
-          <w:sz w:val="18"/>
-        </w:rPr>
-        <w:t xml:space="preserve"> - интернет-приложения с использованием блокчейна, кошельков и цифровых активов.</w:t>
-      </w:r>
-    </w:p>
-    <w:p>
-      <w:r>
-        <w:rPr>
-          <w:rFonts w:ascii="DejaVu Sans" w:hAnsi="DejaVu Sans" w:eastAsia="DejaVu Sans"/>
-          <w:b/>
-          <w:color w:val="005037"/>
-          <w:sz w:val="18"/>
-        </w:rPr>
-        <w:t>White Label (решение под брендом партнера)</w:t>
-      </w:r>
-      <w:r>
-        <w:rPr>
-          <w:rFonts w:ascii="DejaVu Sans" w:hAnsi="DejaVu Sans" w:eastAsia="DejaVu Sans"/>
-          <w:sz w:val="18"/>
-        </w:rPr>
-        <w:t xml:space="preserve"> - когда технология используется другой организацией под ее названием.</w:t>
-      </w:r>
-    </w:p>
-    <w:p>
-      <w:r>
-        <w:rPr>
-          <w:rFonts w:ascii="DejaVu Sans" w:hAnsi="DejaVu Sans" w:eastAsia="DejaVu Sans"/>
-          <w:b/>
-          <w:color w:val="005037"/>
-          <w:sz w:val="18"/>
-        </w:rPr>
-        <w:t>Workflow (рабочий процесс)</w:t>
-      </w:r>
-      <w:r>
-        <w:rPr>
-          <w:rFonts w:ascii="DejaVu Sans" w:hAnsi="DejaVu Sans" w:eastAsia="DejaVu Sans"/>
-          <w:sz w:val="18"/>
-        </w:rPr>
-        <w:t xml:space="preserve"> - последовательность действий от начала проекта до результата.</w:t>
-      </w:r>
-    </w:p>
-    <w:p/>
-    <w:p>
       <w:pPr>
-        <w:pStyle w:val="Heading1"/>
+        <w:pStyle w:val="ListBullet"/>
+        <w:spacing w:after="80"/>
+        <w:ind w:left="540" w:hanging="271"/>
       </w:pPr>
       <w:r>
         <w:rPr>
-          <w:rFonts w:ascii="DejaVu Sans" w:hAnsi="DejaVu Sans" w:eastAsia="DejaVu Sans"/>
-          <w:color w:val="005F41"/>
-        </w:rPr>
-        <w:t>20. Итоговая позиция AgriPartners</w:t>
-      </w:r>
-    </w:p>
-    <w:p>
-      <w:r>
-        <w:rPr>
-          <w:rFonts w:ascii="DejaVu Sans" w:hAnsi="DejaVu Sans" w:eastAsia="DejaVu Sans"/>
+          <w:rFonts w:ascii="Arial" w:hAnsi="Arial" w:eastAsia="Arial"/>
+          <w:b w:val="0"/>
+          <w:i w:val="0"/>
+          <w:color w:val="17212B"/>
           <w:sz w:val="20"/>
         </w:rPr>
-        <w:t>AgriPartners лучше позиционировать не как сервис для простого привлечения криптовалюты, а как прозрачную инфраструктуру для управления сельскохозяйственными инвестиционными процессами.</w:t>
-      </w:r>
-    </w:p>
-    <w:p>
-      <w:r>
-        <w:rPr>
-          <w:rFonts w:ascii="DejaVu Sans" w:hAnsi="DejaVu Sans" w:eastAsia="DejaVu Sans"/>
-          <w:sz w:val="20"/>
-        </w:rPr>
-        <w:t>Криптовалюта, NEAR, USDT, смарт-контракты и блокчейн - это инструменты. Главная ценность платформы - понятный workflow, отчетность, доверие, проверяемость и возможность постепенно подключать разные модели финансирования.</w:t>
+        <w:t>Без хранения средств, юридического титула, замены официальных документов и кошельков для Узбекистана.</w:t>
       </w:r>
     </w:p>
     <w:tbl>
       <w:tblPr>
         <w:tblW w:type="auto" w:w="0"/>
-        <w:jc w:val="center"/>
+        <w:jc w:val="left"/>
+        <w:tblLayout w:type="fixed"/>
         <w:tblLook w:firstColumn="1" w:firstRow="1" w:lastColumn="0" w:lastRow="0" w:noHBand="0" w:noVBand="1" w:val="04A0"/>
+        <w:tblW w:w="9360" w:type="dxa"/>
+        <w:tblInd w:w="120" w:type="dxa"/>
       </w:tblPr>
       <w:tblGrid>
-        <w:gridCol w:w="10224"/>
+        <w:gridCol w:w="9360"/>
       </w:tblGrid>
       <w:tr>
         <w:tc>
           <w:tcPr>
-            <w:tcW w:type="dxa" w:w="10224"/>
-            <w:shd w:fill="EAF4EF"/>
+            <w:tcW w:type="dxa" w:w="9360"/>
+            <w:tcW w:w="9360" w:type="dxa"/>
+            <w:vAlign w:val="center"/>
+            <w:shd w:fill="E8F5EF"/>
           </w:tcPr>
           <w:p>
+            <w:pPr>
+              <w:spacing w:after="0"/>
+            </w:pPr>
             <w:r>
               <w:rPr>
-                <w:rFonts w:ascii="DejaVu Sans" w:hAnsi="DejaVu Sans" w:eastAsia="DejaVu Sans"/>
+                <w:rFonts w:ascii="Arial" w:hAnsi="Arial" w:eastAsia="Arial"/>
                 <w:b/>
-                <w:color w:val="005A36"/>
-                <w:sz w:val="20"/>
+                <w:i w:val="0"/>
+                <w:color w:val="056246"/>
+                <w:sz w:val="19"/>
               </w:rPr>
-              <w:t>Одна фраза для заинтересованных сторон</w:t>
-              <w:br/>
-            </w:r>
-            <w:r>
-              <w:rPr>
-                <w:rFonts w:ascii="DejaVu Sans" w:hAnsi="DejaVu Sans" w:eastAsia="DejaVu Sans"/>
-                <w:sz w:val="18"/>
-              </w:rPr>
-              <w:t>AgriPartners - это Alpha/Testnet платформа для прозрачных сельскохозяйственных инвестиционных workflow, где NEAR используется как инфраструктура для проверки событий, ролей, отчетности и будущей автоматизации.</w:t>
+              <w:t>Запись NEAR не заменяет договоры, банковские выписки, бухгалтерский учёт, сверку, счета и доказательство зачисления фиата. Прямые криптопереводы участникам в Узбекистане запрещены.</w:t>
             </w:r>
           </w:p>
         </w:tc>
       </w:tr>
     </w:tbl>
-    <w:p/>
+    <w:p>
+      <w:pPr>
+        <w:spacing w:after="40" w:line="283" w:lineRule="auto"/>
+      </w:pPr>
+      <w:r>
+        <w:rPr>
+          <w:rFonts w:ascii="Arial" w:hAnsi="Arial" w:eastAsia="Arial"/>
+          <w:b w:val="0"/>
+          <w:i w:val="0"/>
+          <w:color w:val="17212B"/>
+          <w:sz w:val="2"/>
+        </w:rPr>
+      </w:r>
+    </w:p>
+    <w:p>
+      <w:r>
+        <w:br w:type="page"/>
+      </w:r>
+    </w:p>
+    <w:p>
+      <w:pPr>
+        <w:spacing w:after="60" w:line="283" w:lineRule="auto"/>
+        <w:jc w:val="center"/>
+      </w:pPr>
+      <w:r>
+        <w:rPr>
+          <w:rFonts w:ascii="Arial" w:hAnsi="Arial" w:eastAsia="Arial"/>
+          <w:b/>
+          <w:i w:val="0"/>
+          <w:color w:val="087F5B"/>
+          <w:sz w:val="18"/>
+        </w:rPr>
+        <w:t>AGRIPARTNERS</w:t>
+      </w:r>
+    </w:p>
+    <w:p>
+      <w:pPr>
+        <w:spacing w:after="80" w:line="283" w:lineRule="auto"/>
+        <w:jc w:val="center"/>
+      </w:pPr>
+      <w:r>
+        <w:rPr>
+          <w:rFonts w:ascii="Arial" w:hAnsi="Arial" w:eastAsia="Arial"/>
+          <w:b/>
+          <w:i w:val="0"/>
+          <w:color w:val="17324D"/>
+          <w:sz w:val="50"/>
+        </w:rPr>
+        <w:t>Статус, риски и следующее решение</w:t>
+      </w:r>
+    </w:p>
+    <w:p>
+      <w:pPr>
+        <w:spacing w:after="280" w:line="283" w:lineRule="auto"/>
+        <w:jc w:val="center"/>
+      </w:pPr>
+      <w:r>
+        <w:rPr>
+          <w:rFonts w:ascii="Arial" w:hAnsi="Arial" w:eastAsia="Arial"/>
+          <w:b w:val="0"/>
+          <w:i w:val="0"/>
+          <w:color w:val="5E6B78"/>
+          <w:sz w:val="25"/>
+        </w:rPr>
+        <w:t>Alpha v1.2 · прозрачные процессы агроинвестирования · NEAR Testnet</w:t>
+      </w:r>
+    </w:p>
+    <w:tbl>
+      <w:tblPr>
+        <w:tblStyle w:val="TableGrid"/>
+        <w:tblW w:type="auto" w:w="0"/>
+        <w:jc w:val="left"/>
+        <w:tblLayout w:type="fixed"/>
+        <w:tblLook w:firstColumn="1" w:firstRow="1" w:lastColumn="0" w:lastRow="0" w:noHBand="0" w:noVBand="1" w:val="04A0"/>
+        <w:tblW w:w="9360" w:type="dxa"/>
+        <w:tblInd w:w="120" w:type="dxa"/>
+      </w:tblPr>
+      <w:tblGrid>
+        <w:gridCol w:w="2200"/>
+        <w:gridCol w:w="7160"/>
+      </w:tblGrid>
+      <w:tr>
+        <w:tc>
+          <w:tcPr>
+            <w:tcW w:type="dxa" w:w="4680"/>
+            <w:tcW w:w="2200" w:type="dxa"/>
+            <w:vAlign w:val="center"/>
+            <w:shd w:fill="056246"/>
+          </w:tcPr>
+          <w:p>
+            <w:pPr>
+              <w:spacing w:after="0"/>
+              <w:jc w:val="center"/>
+            </w:pPr>
+            <w:r>
+              <w:rPr>
+                <w:rFonts w:ascii="Arial" w:hAnsi="Arial" w:eastAsia="Arial"/>
+                <w:b/>
+                <w:i w:val="0"/>
+                <w:color w:val="FFFFFF"/>
+                <w:sz w:val="18"/>
+              </w:rPr>
+              <w:t>Область</w:t>
+            </w:r>
+          </w:p>
+        </w:tc>
+        <w:tc>
+          <w:tcPr>
+            <w:tcW w:type="dxa" w:w="4680"/>
+            <w:tcW w:w="7160" w:type="dxa"/>
+            <w:vAlign w:val="center"/>
+            <w:shd w:fill="056246"/>
+          </w:tcPr>
+          <w:p>
+            <w:pPr>
+              <w:spacing w:after="0"/>
+              <w:jc w:val="center"/>
+            </w:pPr>
+            <w:r>
+              <w:rPr>
+                <w:rFonts w:ascii="Arial" w:hAnsi="Arial" w:eastAsia="Arial"/>
+                <w:b/>
+                <w:i w:val="0"/>
+                <w:color w:val="FFFFFF"/>
+                <w:sz w:val="18"/>
+              </w:rPr>
+              <w:t>Положение</w:t>
+            </w:r>
+          </w:p>
+        </w:tc>
+      </w:tr>
+      <w:tr>
+        <w:tc>
+          <w:tcPr>
+            <w:tcW w:type="dxa" w:w="2200"/>
+          </w:tcPr>
+          <w:p>
+            <w:pPr>
+              <w:spacing w:after="0"/>
+              <w:jc w:val="left"/>
+            </w:pPr>
+            <w:r>
+              <w:rPr>
+                <w:rFonts w:ascii="Arial" w:hAnsi="Arial" w:eastAsia="Arial"/>
+                <w:b w:val="0"/>
+                <w:i w:val="0"/>
+                <w:color w:val="17212B"/>
+                <w:sz w:val="18"/>
+              </w:rPr>
+              <w:t>Сейчас</w:t>
+            </w:r>
+          </w:p>
+        </w:tc>
+        <w:tc>
+          <w:tcPr>
+            <w:tcW w:type="dxa" w:w="7160"/>
+          </w:tcPr>
+          <w:p>
+            <w:pPr>
+              <w:spacing w:after="0"/>
+              <w:jc w:val="center"/>
+            </w:pPr>
+            <w:r>
+              <w:rPr>
+                <w:rFonts w:ascii="Arial" w:hAnsi="Arial" w:eastAsia="Arial"/>
+                <w:b w:val="0"/>
+                <w:i w:val="0"/>
+                <w:color w:val="17212B"/>
+                <w:sz w:val="18"/>
+              </w:rPr>
+              <w:t>Презентационный релиз Alpha v1.2 на NEAR Testnet.</w:t>
+            </w:r>
+          </w:p>
+        </w:tc>
+      </w:tr>
+      <w:tr>
+        <w:tc>
+          <w:tcPr>
+            <w:tcW w:type="dxa" w:w="2200"/>
+            <w:shd w:fill="F2F4F7"/>
+          </w:tcPr>
+          <w:p>
+            <w:pPr>
+              <w:spacing w:after="0"/>
+              <w:jc w:val="left"/>
+            </w:pPr>
+            <w:r>
+              <w:rPr>
+                <w:rFonts w:ascii="Arial" w:hAnsi="Arial" w:eastAsia="Arial"/>
+                <w:b w:val="0"/>
+                <w:i w:val="0"/>
+                <w:color w:val="17212B"/>
+                <w:sz w:val="18"/>
+              </w:rPr>
+              <w:t>Не сейчас</w:t>
+            </w:r>
+          </w:p>
+        </w:tc>
+        <w:tc>
+          <w:tcPr>
+            <w:tcW w:type="dxa" w:w="7160"/>
+            <w:shd w:fill="F2F4F7"/>
+          </w:tcPr>
+          <w:p>
+            <w:pPr>
+              <w:spacing w:after="0"/>
+              <w:jc w:val="center"/>
+            </w:pPr>
+            <w:r>
+              <w:rPr>
+                <w:rFonts w:ascii="Arial" w:hAnsi="Arial" w:eastAsia="Arial"/>
+                <w:b w:val="0"/>
+                <w:i w:val="0"/>
+                <w:color w:val="17212B"/>
+                <w:sz w:val="18"/>
+              </w:rPr>
+              <w:t>Mainnet, реальные средства, custody, лицензированная инвестиционная или коммерческая деятельность.</w:t>
+            </w:r>
+          </w:p>
+        </w:tc>
+      </w:tr>
+      <w:tr>
+        <w:tc>
+          <w:tcPr>
+            <w:tcW w:type="dxa" w:w="2200"/>
+          </w:tcPr>
+          <w:p>
+            <w:pPr>
+              <w:spacing w:after="0"/>
+              <w:jc w:val="left"/>
+            </w:pPr>
+            <w:r>
+              <w:rPr>
+                <w:rFonts w:ascii="Arial" w:hAnsi="Arial" w:eastAsia="Arial"/>
+                <w:b w:val="0"/>
+                <w:i w:val="0"/>
+                <w:color w:val="17212B"/>
+                <w:sz w:val="18"/>
+              </w:rPr>
+              <w:t>Основные риски</w:t>
+            </w:r>
+          </w:p>
+        </w:tc>
+        <w:tc>
+          <w:tcPr>
+            <w:tcW w:type="dxa" w:w="7160"/>
+          </w:tcPr>
+          <w:p>
+            <w:pPr>
+              <w:spacing w:after="0"/>
+              <w:jc w:val="center"/>
+            </w:pPr>
+            <w:r>
+              <w:rPr>
+                <w:rFonts w:ascii="Arial" w:hAnsi="Arial" w:eastAsia="Arial"/>
+                <w:b w:val="0"/>
+                <w:i w:val="0"/>
+                <w:color w:val="17212B"/>
+                <w:sz w:val="18"/>
+              </w:rPr>
+              <w:t>Право и регулирование, контрагенты, скот, рыночные цены, FX, качество подтверждений, исполнение и ликвидность.</w:t>
+            </w:r>
+          </w:p>
+        </w:tc>
+      </w:tr>
+      <w:tr>
+        <w:tc>
+          <w:tcPr>
+            <w:tcW w:type="dxa" w:w="2200"/>
+            <w:shd w:fill="F2F4F7"/>
+          </w:tcPr>
+          <w:p>
+            <w:pPr>
+              <w:spacing w:after="0"/>
+              <w:jc w:val="left"/>
+            </w:pPr>
+            <w:r>
+              <w:rPr>
+                <w:rFonts w:ascii="Arial" w:hAnsi="Arial" w:eastAsia="Arial"/>
+                <w:b w:val="0"/>
+                <w:i w:val="0"/>
+                <w:color w:val="17212B"/>
+                <w:sz w:val="18"/>
+              </w:rPr>
+              <w:t>Условие пилота</w:t>
+            </w:r>
+          </w:p>
+        </w:tc>
+        <w:tc>
+          <w:tcPr>
+            <w:tcW w:type="dxa" w:w="7160"/>
+            <w:shd w:fill="F2F4F7"/>
+          </w:tcPr>
+          <w:p>
+            <w:pPr>
+              <w:spacing w:after="0"/>
+              <w:jc w:val="center"/>
+            </w:pPr>
+            <w:r>
+              <w:rPr>
+                <w:rFonts w:ascii="Arial" w:hAnsi="Arial" w:eastAsia="Arial"/>
+                <w:b w:val="0"/>
+                <w:i w:val="0"/>
+                <w:color w:val="17212B"/>
+                <w:sz w:val="18"/>
+              </w:rPr>
+              <w:t>Финансирование, выбранные партнёры, утверждённые договоры, провайдеры, контроль и юридическая проверка.</w:t>
+            </w:r>
+          </w:p>
+        </w:tc>
+      </w:tr>
+    </w:tbl>
+    <w:p>
+      <w:pPr>
+        <w:pStyle w:val="Heading2"/>
+      </w:pPr>
+      <w:r>
+        <w:rPr>
+          <w:rFonts w:ascii="Arial" w:hAnsi="Arial" w:eastAsia="Arial"/>
+          <w:b/>
+          <w:i w:val="0"/>
+          <w:color w:val="056246"/>
+          <w:sz w:val="26"/>
+        </w:rPr>
+        <w:t>Рекомендуемые следующие шаги</w:t>
+      </w:r>
+    </w:p>
+    <w:p>
+      <w:pPr>
+        <w:pStyle w:val="ListBullet"/>
+        <w:spacing w:after="80"/>
+        <w:ind w:left="540" w:hanging="271"/>
+      </w:pPr>
+      <w:r>
+        <w:rPr>
+          <w:rFonts w:ascii="Arial" w:hAnsi="Arial" w:eastAsia="Arial"/>
+          <w:b w:val="0"/>
+          <w:i w:val="0"/>
+          <w:color w:val="17212B"/>
+          <w:sz w:val="20"/>
+        </w:rPr>
+        <w:t>Проверить процесс с инвесторами, операторами и профессиональными консультантами.</w:t>
+      </w:r>
+    </w:p>
+    <w:p>
+      <w:pPr>
+        <w:pStyle w:val="ListBullet"/>
+        <w:spacing w:after="80"/>
+        <w:ind w:left="540" w:hanging="271"/>
+      </w:pPr>
+      <w:r>
+        <w:rPr>
+          <w:rFonts w:ascii="Arial" w:hAnsi="Arial" w:eastAsia="Arial"/>
+          <w:b w:val="0"/>
+          <w:i w:val="0"/>
+          <w:color w:val="17212B"/>
+          <w:sz w:val="20"/>
+        </w:rPr>
+        <w:t>Подтвердить выбранного оператора, поставщиков, ветеринарный контроль и стандарты документов.</w:t>
+      </w:r>
+    </w:p>
+    <w:p>
+      <w:pPr>
+        <w:pStyle w:val="ListBullet"/>
+        <w:spacing w:after="80"/>
+        <w:ind w:left="540" w:hanging="271"/>
+      </w:pPr>
+      <w:r>
+        <w:rPr>
+          <w:rFonts w:ascii="Arial" w:hAnsi="Arial" w:eastAsia="Arial"/>
+          <w:b w:val="0"/>
+          <w:i w:val="0"/>
+          <w:color w:val="17212B"/>
+          <w:sz w:val="20"/>
+        </w:rPr>
+        <w:t>Утвердить банковскую, платёжную, бухгалтерскую, комплаенс- и crypto-to-fiat инфраструктуру в Эстонии.</w:t>
+      </w:r>
+    </w:p>
+    <w:p>
+      <w:pPr>
+        <w:pStyle w:val="ListBullet"/>
+        <w:spacing w:after="80"/>
+        <w:ind w:left="540" w:hanging="271"/>
+      </w:pPr>
+      <w:r>
+        <w:rPr>
+          <w:rFonts w:ascii="Arial" w:hAnsi="Arial" w:eastAsia="Arial"/>
+          <w:b w:val="0"/>
+          <w:i w:val="0"/>
+          <w:color w:val="17212B"/>
+          <w:sz w:val="20"/>
+        </w:rPr>
+        <w:t>Подписать отдельные договоры с инвестором и оператором до движения реальных средств.</w:t>
+      </w:r>
+    </w:p>
+    <w:p>
+      <w:pPr>
+        <w:pStyle w:val="ListBullet"/>
+        <w:spacing w:after="80"/>
+        <w:ind w:left="540" w:hanging="271"/>
+      </w:pPr>
+      <w:r>
+        <w:rPr>
+          <w:rFonts w:ascii="Arial" w:hAnsi="Arial" w:eastAsia="Arial"/>
+          <w:b w:val="0"/>
+          <w:i w:val="0"/>
+          <w:color w:val="17212B"/>
+          <w:sz w:val="20"/>
+        </w:rPr>
+        <w:t>Сохранять Alpha v1.2 в режиме Testnet-презентации до формального утверждения пилота.</w:t>
+      </w:r>
+    </w:p>
+    <w:tbl>
+      <w:tblPr>
+        <w:tblW w:type="auto" w:w="0"/>
+        <w:jc w:val="left"/>
+        <w:tblLayout w:type="fixed"/>
+        <w:tblLook w:firstColumn="1" w:firstRow="1" w:lastColumn="0" w:lastRow="0" w:noHBand="0" w:noVBand="1" w:val="04A0"/>
+        <w:tblW w:w="9360" w:type="dxa"/>
+        <w:tblInd w:w="120" w:type="dxa"/>
+      </w:tblPr>
+      <w:tblGrid>
+        <w:gridCol w:w="9360"/>
+      </w:tblGrid>
+      <w:tr>
+        <w:tc>
+          <w:tcPr>
+            <w:tcW w:type="dxa" w:w="9360"/>
+            <w:tcW w:w="9360" w:type="dxa"/>
+            <w:vAlign w:val="center"/>
+            <w:shd w:fill="E8F5EF"/>
+          </w:tcPr>
+          <w:p>
+            <w:pPr>
+              <w:spacing w:after="0"/>
+            </w:pPr>
+            <w:r>
+              <w:rPr>
+                <w:rFonts w:ascii="Arial" w:hAnsi="Arial" w:eastAsia="Arial"/>
+                <w:b/>
+                <w:i w:val="0"/>
+                <w:color w:val="056246"/>
+                <w:sz w:val="19"/>
+              </w:rPr>
+              <w:t>Сегодня AgriPartners следует оценивать как прозрачную Alpha-платформу для агропроцессов и подтверждений, а не как действующий инвестиционный продукт.</w:t>
+            </w:r>
+          </w:p>
+        </w:tc>
+      </w:tr>
+    </w:tbl>
+    <w:p>
+      <w:pPr>
+        <w:spacing w:after="40" w:line="283" w:lineRule="auto"/>
+      </w:pPr>
+      <w:r>
+        <w:rPr>
+          <w:rFonts w:ascii="Arial" w:hAnsi="Arial" w:eastAsia="Arial"/>
+          <w:b w:val="0"/>
+          <w:i w:val="0"/>
+          <w:color w:val="17212B"/>
+          <w:sz w:val="2"/>
+        </w:rPr>
+      </w:r>
+    </w:p>
+    <w:p>
+      <w:pPr>
+        <w:spacing w:after="80" w:line="283" w:lineRule="auto"/>
+      </w:pPr>
+      <w:r>
+        <w:rPr>
+          <w:rFonts w:ascii="Arial" w:hAnsi="Arial" w:eastAsia="Arial"/>
+          <w:b w:val="0"/>
+          <w:i w:val="0"/>
+          <w:color w:val="5E6B78"/>
+          <w:sz w:val="18"/>
+        </w:rPr>
+        <w:t>agripartners.vercel.app · github.com/farabek/agripartners</w:t>
+      </w:r>
+    </w:p>
     <w:sectPr>
-      <w:footerReference w:type="default" r:id="rId9"/>
+      <w:headerReference w:type="default" r:id="rId9"/>
+      <w:footerReference w:type="default" r:id="rId10"/>
       <w:pgSz w:w="12240" w:h="15840"/>
-      <w:pgMar w:top="936" w:right="1008" w:bottom="936" w:left="1008" w:header="720" w:footer="720" w:gutter="0"/>
+      <w:pgMar w:top="1440" w:right="1440" w:bottom="1440" w:left="1440" w:header="708" w:footer="708" w:gutter="0"/>
       <w:cols w:space="720"/>
       <w:docGrid w:linePitch="360"/>
     </w:sectPr>
@@ -2968,17 +2147,40 @@
   <w:p>
     <w:pPr>
       <w:pStyle w:val="Footer"/>
-      <w:jc w:val="center"/>
+      <w:jc w:val="right"/>
     </w:pPr>
     <w:r>
       <w:rPr>
-        <w:rFonts w:ascii="DejaVu Sans" w:hAnsi="DejaVu Sans" w:eastAsia="DejaVu Sans"/>
+        <w:rFonts w:ascii="Arial" w:hAnsi="Arial" w:eastAsia="Arial"/>
+        <w:b w:val="0"/>
+        <w:i w:val="0"/>
+        <w:color w:val="5E6B78"/>
         <w:sz w:val="16"/>
       </w:rPr>
-      <w:t>AgriPartners Platform Explained - Russian v2.0</w:t>
+      <w:t>AgriPartners · Alpha v1.2</w:t>
     </w:r>
   </w:p>
 </w:ftr>
+</file>
+
+<file path=word/header1.xml><?xml version="1.0" encoding="utf-8"?>
+<w:hdr xmlns:m="http://schemas.openxmlformats.org/officeDocument/2006/math" xmlns:mc="http://schemas.openxmlformats.org/markup-compatibility/2006" xmlns:mo="http://schemas.microsoft.com/office/mac/office/2008/main" xmlns:mv="urn:schemas-microsoft-com:mac:vml" xmlns:o="urn:schemas-microsoft-com:office:office" xmlns:r="http://schemas.openxmlformats.org/officeDocument/2006/relationships" xmlns:v="urn:schemas-microsoft-com:vml" xmlns:w10="urn:schemas-microsoft-com:office:word" xmlns:w14="http://schemas.microsoft.com/office/word/2010/wordml" xmlns:w="http://schemas.openxmlformats.org/wordprocessingml/2006/main" xmlns:wne="http://schemas.microsoft.com/office/word/2006/wordml" xmlns:wp14="http://schemas.microsoft.com/office/word/2010/wordprocessingDrawing" xmlns:wp="http://schemas.openxmlformats.org/drawingml/2006/wordprocessingDrawing" xmlns:wpc="http://schemas.microsoft.com/office/word/2010/wordprocessingCanvas" xmlns:wpg="http://schemas.microsoft.com/office/word/2010/wordprocessingGroup" xmlns:wpi="http://schemas.microsoft.com/office/word/2010/wordprocessingInk" xmlns:wps="http://schemas.microsoft.com/office/word/2010/wordprocessingShape" mc:Ignorable="w14 wp14">
+  <w:p>
+    <w:pPr>
+      <w:pStyle w:val="Header"/>
+    </w:pPr>
+    <w:r>
+      <w:rPr>
+        <w:rFonts w:ascii="Arial" w:hAnsi="Arial" w:eastAsia="Arial"/>
+        <w:b/>
+        <w:i w:val="0"/>
+        <w:color w:val="5E6B78"/>
+        <w:sz w:val="16"/>
+      </w:rPr>
+      <w:t>AgriPartners | Platform Explained | RU | Alpha v1.2</w:t>
+    </w:r>
+  </w:p>
+</w:hdr>
 </file>
 
 <file path=word/numbering.xml><?xml version="1.0" encoding="utf-8"?>
@@ -3344,9 +2546,12 @@
     <w:name w:val="Normal"/>
     <w:qFormat/>
     <w:rsid w:val="00FC693F"/>
+    <w:pPr>
+      <w:spacing w:after="120" w:line="283" w:lineRule="auto"/>
+    </w:pPr>
     <w:rPr>
-      <w:rFonts w:ascii="DejaVu Sans" w:hAnsi="DejaVu Sans" w:eastAsia="DejaVu Sans"/>
-      <w:sz w:val="20"/>
+      <w:rFonts w:ascii="Arial" w:hAnsi="Arial"/>
+      <w:sz w:val="21"/>
     </w:rPr>
   </w:style>
   <w:style w:type="paragraph" w:styleId="Header">
@@ -3404,15 +2609,15 @@
     <w:pPr>
       <w:keepNext/>
       <w:keepLines/>
-      <w:spacing w:before="480" w:after="0"/>
+      <w:spacing w:before="360" w:after="200"/>
       <w:outlineLvl w:val="0"/>
     </w:pPr>
     <w:rPr>
-      <w:rFonts w:asciiTheme="majorHAnsi" w:eastAsiaTheme="majorEastAsia" w:hAnsiTheme="majorHAnsi" w:cstheme="majorBidi" w:ascii="DejaVu Sans" w:hAnsi="DejaVu Sans" w:eastAsia="DejaVu Sans"/>
+      <w:rFonts w:asciiTheme="majorHAnsi" w:eastAsiaTheme="majorEastAsia" w:hAnsiTheme="majorHAnsi" w:cstheme="majorBidi" w:ascii="Arial" w:hAnsi="Arial"/>
       <w:b/>
       <w:bCs/>
-      <w:color w:val="365F91" w:themeColor="accent1" w:themeShade="BF"/>
-      <w:sz w:val="28"/>
+      <w:color w:val="056246"/>
+      <w:sz w:val="32"/>
       <w:szCs w:val="28"/>
     </w:rPr>
   </w:style>
@@ -3428,14 +2633,14 @@
     <w:pPr>
       <w:keepNext/>
       <w:keepLines/>
-      <w:spacing w:before="200" w:after="0"/>
+      <w:spacing w:before="280" w:after="140"/>
       <w:outlineLvl w:val="1"/>
     </w:pPr>
     <w:rPr>
-      <w:rFonts w:asciiTheme="majorHAnsi" w:eastAsiaTheme="majorEastAsia" w:hAnsiTheme="majorHAnsi" w:cstheme="majorBidi" w:ascii="DejaVu Sans" w:hAnsi="DejaVu Sans" w:eastAsia="DejaVu Sans"/>
+      <w:rFonts w:asciiTheme="majorHAnsi" w:eastAsiaTheme="majorEastAsia" w:hAnsiTheme="majorHAnsi" w:cstheme="majorBidi" w:ascii="Arial" w:hAnsi="Arial"/>
       <w:b/>
       <w:bCs/>
-      <w:color w:val="4F81BD" w:themeColor="accent1"/>
+      <w:color w:val="056246"/>
       <w:sz w:val="26"/>
       <w:szCs w:val="26"/>
     </w:rPr>
@@ -3452,14 +2657,15 @@
     <w:pPr>
       <w:keepNext/>
       <w:keepLines/>
-      <w:spacing w:before="200" w:after="0"/>
+      <w:spacing w:before="200" w:after="100"/>
       <w:outlineLvl w:val="2"/>
     </w:pPr>
     <w:rPr>
-      <w:rFonts w:asciiTheme="majorHAnsi" w:eastAsiaTheme="majorEastAsia" w:hAnsiTheme="majorHAnsi" w:cstheme="majorBidi" w:ascii="DejaVu Sans" w:hAnsi="DejaVu Sans" w:eastAsia="DejaVu Sans"/>
+      <w:rFonts w:asciiTheme="majorHAnsi" w:eastAsiaTheme="majorEastAsia" w:hAnsiTheme="majorHAnsi" w:cstheme="majorBidi" w:ascii="Arial" w:hAnsi="Arial"/>
       <w:b/>
       <w:bCs/>
-      <w:color w:val="4F81BD" w:themeColor="accent1"/>
+      <w:color w:val="056246"/>
+      <w:sz w:val="24"/>
     </w:rPr>
   </w:style>
   <w:style w:type="paragraph" w:styleId="Heading4">
@@ -3697,7 +2903,7 @@
       <w:contextualSpacing/>
     </w:pPr>
     <w:rPr>
-      <w:rFonts w:asciiTheme="majorHAnsi" w:eastAsiaTheme="majorEastAsia" w:hAnsiTheme="majorHAnsi" w:cstheme="majorBidi" w:ascii="DejaVu Sans" w:hAnsi="DejaVu Sans" w:eastAsia="DejaVu Sans"/>
+      <w:rFonts w:asciiTheme="majorHAnsi" w:eastAsiaTheme="majorEastAsia" w:hAnsiTheme="majorHAnsi" w:cstheme="majorBidi"/>
       <w:color w:val="17365D" w:themeColor="text2" w:themeShade="BF"/>
       <w:spacing w:val="5"/>
       <w:kern w:val="28"/>
@@ -3877,9 +3083,6 @@
       </w:numPr>
       <w:contextualSpacing/>
     </w:pPr>
-    <w:rPr>
-      <w:rFonts w:ascii="DejaVu Sans" w:hAnsi="DejaVu Sans" w:eastAsia="DejaVu Sans"/>
-    </w:rPr>
   </w:style>
   <w:style w:type="paragraph" w:styleId="ListBullet2">
     <w:name w:val="List Bullet 2"/>
@@ -3919,9 +3122,6 @@
       </w:numPr>
       <w:contextualSpacing/>
     </w:pPr>
-    <w:rPr>
-      <w:rFonts w:ascii="DejaVu Sans" w:hAnsi="DejaVu Sans" w:eastAsia="DejaVu Sans"/>
-    </w:rPr>
   </w:style>
   <w:style w:type="paragraph" w:styleId="ListNumber2">
     <w:name w:val="List Number 2"/>

</xml_diff>